<commit_message>
docs: cierre de la tarea 4 (spec con Spec Kit)
- Bitácora y panel: tarea 4 hecha (app#7, app#8, app#9); tarea 5 siguiente,
  con plan, tareas y esqueleto de la aplicación.
- Memoria: sección de la tarea 4 (Spec Kit en el harness, fallo seguro del
  sandbox, spec generada), fase 7 del registro (iteraciones 44 a 48), prueba
  del sandbox, incidencias, métricas, pasos reproducibles y solución de
  problemas.

Co-Authored-By: Claude Opus 5.5 <noreply@anthropic.com>
Claude-Session: https://claude.ai/code/session_01DJozxnTfKm9YzN69MVZq7X
</commit_message>
<xml_diff>
--- a/docs/tfm/TFM-ALM-agentico.docx
+++ b/docs/tfm/TFM-ALM-agentico.docx
@@ -12116,6 +12116,898 @@
         <w:rPr>
           <w:rFonts w:ascii="Calibri" w:cs="Calibri" w:eastAsia="Calibri" w:hAnsi="Calibri"/>
         </w:rPr>
+        <w:t xml:space="preserve">Tarea 4: especificación con Spec Kit</w:t>
+      </w:r>
+    </w:p>
+    <w:p>
+      <w:pPr>
+        <w:keepNext w:val="false"/>
+        <w:spacing w:after="140" w:line="288"/>
+        <w:jc w:val="both"/>
+      </w:pPr>
+      <w:r>
+        <w:rPr>
+          <w:rFonts w:ascii="Calibri" w:cs="Calibri" w:eastAsia="Calibri" w:hAnsi="Calibri"/>
+        </w:rPr>
+        <w:t xml:space="preserve">La petición del catálogo de productos (issue #5) recibió una propuesta de triage con cinco preguntas abiertas. El responsable las contestó en un comentario y añadió la etiqueta </w:t>
+      </w:r>
+      <w:r>
+        <w:rPr>
+          <w:rFonts w:ascii="Consolas" w:cs="Consolas" w:eastAsia="Consolas" w:hAnsi="Consolas"/>
+          <w:color w:val="2E3A36"/>
+          <w:sz w:val="20"/>
+          <w:szCs w:val="20"/>
+        </w:rPr>
+        <w:t xml:space="preserve">aprobado</w:t>
+      </w:r>
+      <w:r>
+        <w:rPr>
+          <w:rFonts w:ascii="Calibri" w:cs="Calibri" w:eastAsia="Calibri" w:hAnsi="Calibri"/>
+        </w:rPr>
+        <w:t xml:space="preserve">. Las respuestas fijan el origen de los datos (un fichero del repositorio con 5 a 10 productos), el precio (euros, 2 decimales, IVA incluido), la ausencia de paginación y de autenticación, el formato del 404 y las rutas bajo </w:t>
+      </w:r>
+      <w:r>
+        <w:rPr>
+          <w:rFonts w:ascii="Consolas" w:cs="Consolas" w:eastAsia="Consolas" w:hAnsi="Consolas"/>
+          <w:color w:val="2E3A36"/>
+          <w:sz w:val="20"/>
+          <w:szCs w:val="20"/>
+        </w:rPr>
+        <w:t xml:space="preserve">/api/v1</w:t>
+      </w:r>
+      <w:r>
+        <w:rPr>
+          <w:rFonts w:ascii="Calibri" w:cs="Calibri" w:eastAsia="Calibri" w:hAnsi="Calibri"/>
+        </w:rPr>
+        <w:t xml:space="preserve">. También reformulan un criterio que no podía cumplirse tal como estaba escrito: con los datos en un fichero, un cambio de precio llega con un despliegue y no «al momento».</w:t>
+      </w:r>
+    </w:p>
+    <w:p>
+      <w:pPr>
+        <w:pStyle w:val="Heading3"/>
+        <w:keepNext/>
+      </w:pPr>
+      <w:r>
+        <w:rPr>
+          <w:rFonts w:ascii="Calibri" w:cs="Calibri" w:eastAsia="Calibri" w:hAnsi="Calibri"/>
+        </w:rPr>
+        <w:t xml:space="preserve">Spec Kit dentro del harness</w:t>
+      </w:r>
+    </w:p>
+    <w:p>
+      <w:pPr>
+        <w:keepNext w:val="false"/>
+        <w:spacing w:after="140" w:line="288"/>
+        <w:jc w:val="both"/>
+      </w:pPr>
+      <w:r>
+        <w:rPr>
+          <w:rFonts w:ascii="Calibri" w:cs="Calibri" w:eastAsia="Calibri" w:hAnsi="Calibri"/>
+        </w:rPr>
+        <w:t xml:space="preserve">Spec Kit 1.1.0 se añadió al repositorio de app con </w:t>
+      </w:r>
+      <w:r>
+        <w:rPr>
+          <w:rFonts w:ascii="Consolas" w:cs="Consolas" w:eastAsia="Consolas" w:hAnsi="Consolas"/>
+          <w:color w:val="2E3A36"/>
+          <w:sz w:val="20"/>
+          <w:szCs w:val="20"/>
+        </w:rPr>
+        <w:t xml:space="preserve">specify init</w:t>
+      </w:r>
+      <w:r>
+        <w:rPr>
+          <w:rFonts w:ascii="Calibri" w:cs="Calibri" w:eastAsia="Calibri" w:hAnsi="Calibri"/>
+        </w:rPr>
+        <w:t xml:space="preserve"> para la integración de Claude Code. Genera diez </w:t>
+      </w:r>
+      <w:r>
+        <w:rPr>
+          <w:rFonts w:ascii="Calibri" w:cs="Calibri" w:eastAsia="Calibri" w:hAnsi="Calibri"/>
+          <w:i/>
+          <w:iCs/>
+        </w:rPr>
+        <w:t xml:space="preserve">skills</w:t>
+      </w:r>
+      <w:r>
+        <w:rPr>
+          <w:rFonts w:ascii="Calibri" w:cs="Calibri" w:eastAsia="Calibri" w:hAnsi="Calibri"/>
+        </w:rPr>
+        <w:t xml:space="preserve"> (</w:t>
+      </w:r>
+      <w:r>
+        <w:rPr>
+          <w:rFonts w:ascii="Consolas" w:cs="Consolas" w:eastAsia="Consolas" w:hAnsi="Consolas"/>
+          <w:color w:val="2E3A36"/>
+          <w:sz w:val="20"/>
+          <w:szCs w:val="20"/>
+        </w:rPr>
+        <w:t xml:space="preserve">/speckit-specify</w:t>
+      </w:r>
+      <w:r>
+        <w:rPr>
+          <w:rFonts w:ascii="Calibri" w:cs="Calibri" w:eastAsia="Calibri" w:hAnsi="Calibri"/>
+        </w:rPr>
+        <w:t xml:space="preserve">, </w:t>
+      </w:r>
+      <w:r>
+        <w:rPr>
+          <w:rFonts w:ascii="Consolas" w:cs="Consolas" w:eastAsia="Consolas" w:hAnsi="Consolas"/>
+          <w:color w:val="2E3A36"/>
+          <w:sz w:val="20"/>
+          <w:szCs w:val="20"/>
+        </w:rPr>
+        <w:t xml:space="preserve">/speckit-plan</w:t>
+      </w:r>
+      <w:r>
+        <w:rPr>
+          <w:rFonts w:ascii="Calibri" w:cs="Calibri" w:eastAsia="Calibri" w:hAnsi="Calibri"/>
+        </w:rPr>
+        <w:t xml:space="preserve">, </w:t>
+      </w:r>
+      <w:r>
+        <w:rPr>
+          <w:rFonts w:ascii="Consolas" w:cs="Consolas" w:eastAsia="Consolas" w:hAnsi="Consolas"/>
+          <w:color w:val="2E3A36"/>
+          <w:sz w:val="20"/>
+          <w:szCs w:val="20"/>
+        </w:rPr>
+        <w:t xml:space="preserve">/speckit-tasks</w:t>
+      </w:r>
+      <w:r>
+        <w:rPr>
+          <w:rFonts w:ascii="Calibri" w:cs="Calibri" w:eastAsia="Calibri" w:hAnsi="Calibri"/>
+        </w:rPr>
+        <w:t xml:space="preserve">, </w:t>
+      </w:r>
+      <w:r>
+        <w:rPr>
+          <w:rFonts w:ascii="Consolas" w:cs="Consolas" w:eastAsia="Consolas" w:hAnsi="Consolas"/>
+          <w:color w:val="2E3A36"/>
+          <w:sz w:val="20"/>
+          <w:szCs w:val="20"/>
+        </w:rPr>
+        <w:t xml:space="preserve">/speckit-implement</w:t>
+      </w:r>
+      <w:r>
+        <w:rPr>
+          <w:rFonts w:ascii="Calibri" w:cs="Calibri" w:eastAsia="Calibri" w:hAnsi="Calibri"/>
+        </w:rPr>
+        <w:t xml:space="preserve"> y otras opcionales) y las plantillas y scripts de </w:t>
+      </w:r>
+      <w:r>
+        <w:rPr>
+          <w:rFonts w:ascii="Consolas" w:cs="Consolas" w:eastAsia="Consolas" w:hAnsi="Consolas"/>
+          <w:color w:val="2E3A36"/>
+          <w:sz w:val="20"/>
+          <w:szCs w:val="20"/>
+        </w:rPr>
+        <w:t xml:space="preserve">.specify/</w:t>
+      </w:r>
+      <w:r>
+        <w:rPr>
+          <w:rFonts w:ascii="Calibri" w:cs="Calibri" w:eastAsia="Calibri" w:hAnsi="Calibri"/>
+        </w:rPr>
+        <w:t xml:space="preserve">. Se instaló desde la etiqueta de GitHub porque el paquete de PyPI iba una versión por detrás, y se comprobó en una copia del repositorio que </w:t>
+      </w:r>
+      <w:r>
+        <w:rPr>
+          <w:rFonts w:ascii="Consolas" w:cs="Consolas" w:eastAsia="Consolas" w:hAnsi="Consolas"/>
+          <w:color w:val="2E3A36"/>
+          <w:sz w:val="20"/>
+          <w:szCs w:val="20"/>
+        </w:rPr>
+        <w:t xml:space="preserve">specify init</w:t>
+      </w:r>
+      <w:r>
+        <w:rPr>
+          <w:rFonts w:ascii="Calibri" w:cs="Calibri" w:eastAsia="Calibri" w:hAnsi="Calibri"/>
+        </w:rPr>
+        <w:t xml:space="preserve"> no modificaba la constitución, </w:t>
+      </w:r>
+      <w:r>
+        <w:rPr>
+          <w:rFonts w:ascii="Consolas" w:cs="Consolas" w:eastAsia="Consolas" w:hAnsi="Consolas"/>
+          <w:color w:val="2E3A36"/>
+          <w:sz w:val="20"/>
+          <w:szCs w:val="20"/>
+        </w:rPr>
+        <w:t xml:space="preserve">CLAUDE.md</w:t>
+      </w:r>
+      <w:r>
+        <w:rPr>
+          <w:rFonts w:ascii="Calibri" w:cs="Calibri" w:eastAsia="Calibri" w:hAnsi="Calibri"/>
+        </w:rPr>
+        <w:t xml:space="preserve"> ni los permisos.</w:t>
+      </w:r>
+    </w:p>
+    <w:p>
+      <w:pPr>
+        <w:keepNext/>
+        <w:spacing w:after="140" w:line="288"/>
+        <w:jc w:val="both"/>
+      </w:pPr>
+      <w:r>
+        <w:rPr>
+          <w:rFonts w:ascii="Calibri" w:cs="Calibri" w:eastAsia="Calibri" w:hAnsi="Calibri"/>
+        </w:rPr>
+        <w:t xml:space="preserve">Los ficheros generados se versionan, de modo que el agente no instala nada. Pasan a formar parte del harness:</w:t>
+      </w:r>
+    </w:p>
+    <w:tbl>
+      <w:tblPr>
+        <w:tblW w:type="dxa" w:w="9070"/>
+        <w:tblBorders>
+          <w:top w:val="single" w:color="C9D3CF" w:sz="4"/>
+          <w:left w:val="single" w:color="C9D3CF" w:sz="4"/>
+          <w:bottom w:val="single" w:color="C9D3CF" w:sz="4"/>
+          <w:right w:val="single" w:color="C9D3CF" w:sz="4"/>
+          <w:insideH w:val="single" w:color="C9D3CF" w:sz="4"/>
+          <w:insideV w:val="single" w:color="C9D3CF" w:sz="4"/>
+        </w:tblBorders>
+      </w:tblPr>
+      <w:tblGrid>
+        <w:gridCol w:w="3362"/>
+        <w:gridCol w:w="5708"/>
+      </w:tblGrid>
+      <w:tr>
+        <w:trPr>
+          <w:tblHeader/>
+        </w:trPr>
+        <w:tc>
+          <w:tcPr>
+            <w:tcW w:type="dxa" w:w="3362"/>
+            <w:shd w:fill="E3EEEA" w:color="auto" w:val="clear"/>
+            <w:tcMar>
+              <w:top w:type="dxa" w:w="60"/>
+              <w:left w:type="dxa" w:w="100"/>
+              <w:bottom w:type="dxa" w:w="60"/>
+              <w:right w:type="dxa" w:w="100"/>
+            </w:tcMar>
+          </w:tcPr>
+          <w:p>
+            <w:pPr>
+              <w:spacing w:after="0" w:before="0" w:line="252"/>
+            </w:pPr>
+            <w:r>
+              <w:rPr>
+                <w:rFonts w:ascii="Calibri" w:cs="Calibri" w:eastAsia="Calibri" w:hAnsi="Calibri"/>
+                <w:b/>
+                <w:bCs/>
+                <w:sz w:val="18"/>
+                <w:szCs w:val="18"/>
+              </w:rPr>
+              <w:t xml:space="preserve">Elemento</w:t>
+            </w:r>
+          </w:p>
+        </w:tc>
+        <w:tc>
+          <w:tcPr>
+            <w:tcW w:type="dxa" w:w="5708"/>
+            <w:shd w:fill="E3EEEA" w:color="auto" w:val="clear"/>
+            <w:tcMar>
+              <w:top w:type="dxa" w:w="60"/>
+              <w:left w:type="dxa" w:w="100"/>
+              <w:bottom w:type="dxa" w:w="60"/>
+              <w:right w:type="dxa" w:w="100"/>
+            </w:tcMar>
+          </w:tcPr>
+          <w:p>
+            <w:pPr>
+              <w:spacing w:after="0" w:before="0" w:line="252"/>
+            </w:pPr>
+            <w:r>
+              <w:rPr>
+                <w:rFonts w:ascii="Calibri" w:cs="Calibri" w:eastAsia="Calibri" w:hAnsi="Calibri"/>
+                <w:b/>
+                <w:bCs/>
+                <w:sz w:val="18"/>
+                <w:szCs w:val="18"/>
+              </w:rPr>
+              <w:t xml:space="preserve">Protección</w:t>
+            </w:r>
+          </w:p>
+        </w:tc>
+      </w:tr>
+      <w:tr>
+        <w:trPr>
+          <w:cantSplit/>
+        </w:trPr>
+        <w:tc>
+          <w:tcPr>
+            <w:tcW w:type="dxa" w:w="3362"/>
+            <w:tcMar>
+              <w:top w:type="dxa" w:w="60"/>
+              <w:left w:type="dxa" w:w="100"/>
+              <w:bottom w:type="dxa" w:w="60"/>
+              <w:right w:type="dxa" w:w="100"/>
+            </w:tcMar>
+          </w:tcPr>
+          <w:p>
+            <w:pPr>
+              <w:spacing w:after="0" w:before="0" w:line="252"/>
+            </w:pPr>
+            <w:r>
+              <w:rPr>
+                <w:rFonts w:ascii="Calibri" w:cs="Calibri" w:eastAsia="Calibri" w:hAnsi="Calibri"/>
+                <w:i/>
+                <w:iCs/>
+                <w:sz w:val="18"/>
+                <w:szCs w:val="18"/>
+              </w:rPr>
+              <w:t xml:space="preserve">Skills</w:t>
+            </w:r>
+            <w:r>
+              <w:rPr>
+                <w:rFonts w:ascii="Calibri" w:cs="Calibri" w:eastAsia="Calibri" w:hAnsi="Calibri"/>
+                <w:sz w:val="18"/>
+                <w:szCs w:val="18"/>
+              </w:rPr>
+              <w:t xml:space="preserve"> en </w:t>
+            </w:r>
+            <w:r>
+              <w:rPr>
+                <w:rFonts w:ascii="Consolas" w:cs="Consolas" w:eastAsia="Consolas" w:hAnsi="Consolas"/>
+                <w:color w:val="2E3A36"/>
+                <w:sz w:val="16"/>
+                <w:szCs w:val="16"/>
+              </w:rPr>
+              <w:t xml:space="preserve">.claude/skills/</w:t>
+            </w:r>
+          </w:p>
+        </w:tc>
+        <w:tc>
+          <w:tcPr>
+            <w:tcW w:type="dxa" w:w="5708"/>
+            <w:tcMar>
+              <w:top w:type="dxa" w:w="60"/>
+              <w:left w:type="dxa" w:w="100"/>
+              <w:bottom w:type="dxa" w:w="60"/>
+              <w:right w:type="dxa" w:w="100"/>
+            </w:tcMar>
+          </w:tcPr>
+          <w:p>
+            <w:pPr>
+              <w:spacing w:after="0" w:before="0" w:line="252"/>
+            </w:pPr>
+            <w:r>
+              <w:rPr>
+                <w:rFonts w:ascii="Calibri" w:cs="Calibri" w:eastAsia="Calibri" w:hAnsi="Calibri"/>
+                <w:sz w:val="18"/>
+                <w:szCs w:val="18"/>
+              </w:rPr>
+              <w:t xml:space="preserve">Ya protegidas por el hook y los permisos, como todo </w:t>
+            </w:r>
+            <w:r>
+              <w:rPr>
+                <w:rFonts w:ascii="Consolas" w:cs="Consolas" w:eastAsia="Consolas" w:hAnsi="Consolas"/>
+                <w:color w:val="2E3A36"/>
+                <w:sz w:val="16"/>
+                <w:szCs w:val="16"/>
+              </w:rPr>
+              <w:t xml:space="preserve">.claude/</w:t>
+            </w:r>
+          </w:p>
+        </w:tc>
+      </w:tr>
+      <w:tr>
+        <w:trPr>
+          <w:cantSplit/>
+        </w:trPr>
+        <w:tc>
+          <w:tcPr>
+            <w:tcW w:type="dxa" w:w="3362"/>
+            <w:tcMar>
+              <w:top w:type="dxa" w:w="60"/>
+              <w:left w:type="dxa" w:w="100"/>
+              <w:bottom w:type="dxa" w:w="60"/>
+              <w:right w:type="dxa" w:w="100"/>
+            </w:tcMar>
+          </w:tcPr>
+          <w:p>
+            <w:pPr>
+              <w:spacing w:after="0" w:before="0" w:line="252"/>
+            </w:pPr>
+            <w:r>
+              <w:rPr>
+                <w:rFonts w:ascii="Calibri" w:cs="Calibri" w:eastAsia="Calibri" w:hAnsi="Calibri"/>
+                <w:sz w:val="18"/>
+                <w:szCs w:val="18"/>
+              </w:rPr>
+              <w:t xml:space="preserve">Plantillas, scripts y configuración de </w:t>
+            </w:r>
+            <w:r>
+              <w:rPr>
+                <w:rFonts w:ascii="Consolas" w:cs="Consolas" w:eastAsia="Consolas" w:hAnsi="Consolas"/>
+                <w:color w:val="2E3A36"/>
+                <w:sz w:val="16"/>
+                <w:szCs w:val="16"/>
+              </w:rPr>
+              <w:t xml:space="preserve">.specify/</w:t>
+            </w:r>
+          </w:p>
+        </w:tc>
+        <w:tc>
+          <w:tcPr>
+            <w:tcW w:type="dxa" w:w="5708"/>
+            <w:tcMar>
+              <w:top w:type="dxa" w:w="60"/>
+              <w:left w:type="dxa" w:w="100"/>
+              <w:bottom w:type="dxa" w:w="60"/>
+              <w:right w:type="dxa" w:w="100"/>
+            </w:tcMar>
+          </w:tcPr>
+          <w:p>
+            <w:pPr>
+              <w:spacing w:after="0" w:before="0" w:line="252"/>
+            </w:pPr>
+            <w:r>
+              <w:rPr>
+                <w:rFonts w:ascii="Calibri" w:cs="Calibri" w:eastAsia="Calibri" w:hAnsi="Calibri"/>
+                <w:sz w:val="18"/>
+                <w:szCs w:val="18"/>
+              </w:rPr>
+              <w:t xml:space="preserve">Reglas </w:t>
+            </w:r>
+            <w:r>
+              <w:rPr>
+                <w:rFonts w:ascii="Consolas" w:cs="Consolas" w:eastAsia="Consolas" w:hAnsi="Consolas"/>
+                <w:color w:val="2E3A36"/>
+                <w:sz w:val="16"/>
+                <w:szCs w:val="16"/>
+              </w:rPr>
+              <w:t xml:space="preserve">deny</w:t>
+            </w:r>
+            <w:r>
+              <w:rPr>
+                <w:rFonts w:ascii="Calibri" w:cs="Calibri" w:eastAsia="Calibri" w:hAnsi="Calibri"/>
+                <w:sz w:val="18"/>
+                <w:szCs w:val="18"/>
+              </w:rPr>
+              <w:t xml:space="preserve"> de edición en </w:t>
+            </w:r>
+            <w:r>
+              <w:rPr>
+                <w:rFonts w:ascii="Consolas" w:cs="Consolas" w:eastAsia="Consolas" w:hAnsi="Consolas"/>
+                <w:color w:val="2E3A36"/>
+                <w:sz w:val="16"/>
+                <w:szCs w:val="16"/>
+              </w:rPr>
+              <w:t xml:space="preserve">settings.json</w:t>
+            </w:r>
+            <w:r>
+              <w:rPr>
+                <w:rFonts w:ascii="Calibri" w:cs="Calibri" w:eastAsia="Calibri" w:hAnsi="Calibri"/>
+                <w:sz w:val="18"/>
+                <w:szCs w:val="18"/>
+              </w:rPr>
+              <w:t xml:space="preserve"> y CODEOWNERS sobre </w:t>
+            </w:r>
+            <w:r>
+              <w:rPr>
+                <w:rFonts w:ascii="Consolas" w:cs="Consolas" w:eastAsia="Consolas" w:hAnsi="Consolas"/>
+                <w:color w:val="2E3A36"/>
+                <w:sz w:val="16"/>
+                <w:szCs w:val="16"/>
+              </w:rPr>
+              <w:t xml:space="preserve">.specify/</w:t>
+            </w:r>
+          </w:p>
+        </w:tc>
+      </w:tr>
+      <w:tr>
+        <w:trPr>
+          <w:cantSplit/>
+        </w:trPr>
+        <w:tc>
+          <w:tcPr>
+            <w:tcW w:type="dxa" w:w="3362"/>
+            <w:tcMar>
+              <w:top w:type="dxa" w:w="60"/>
+              <w:left w:type="dxa" w:w="100"/>
+              <w:bottom w:type="dxa" w:w="60"/>
+              <w:right w:type="dxa" w:w="100"/>
+            </w:tcMar>
+          </w:tcPr>
+          <w:p>
+            <w:pPr>
+              <w:spacing w:after="0" w:before="0" w:line="252"/>
+            </w:pPr>
+            <w:r>
+              <w:rPr>
+                <w:rFonts w:ascii="Calibri" w:cs="Calibri" w:eastAsia="Calibri" w:hAnsi="Calibri"/>
+                <w:sz w:val="18"/>
+                <w:szCs w:val="18"/>
+              </w:rPr>
+              <w:t xml:space="preserve">Scripts de Spec Kit</w:t>
+            </w:r>
+          </w:p>
+        </w:tc>
+        <w:tc>
+          <w:tcPr>
+            <w:tcW w:type="dxa" w:w="5708"/>
+            <w:tcMar>
+              <w:top w:type="dxa" w:w="60"/>
+              <w:left w:type="dxa" w:w="100"/>
+              <w:bottom w:type="dxa" w:w="60"/>
+              <w:right w:type="dxa" w:w="100"/>
+            </w:tcMar>
+          </w:tcPr>
+          <w:p>
+            <w:pPr>
+              <w:spacing w:after="0" w:before="0" w:line="252"/>
+            </w:pPr>
+            <w:r>
+              <w:rPr>
+                <w:rFonts w:ascii="Calibri" w:cs="Calibri" w:eastAsia="Calibri" w:hAnsi="Calibri"/>
+                <w:sz w:val="18"/>
+                <w:szCs w:val="18"/>
+              </w:rPr>
+              <w:t xml:space="preserve">Permitido ejecutarlos (</w:t>
+            </w:r>
+            <w:r>
+              <w:rPr>
+                <w:rFonts w:ascii="Consolas" w:cs="Consolas" w:eastAsia="Consolas" w:hAnsi="Consolas"/>
+                <w:color w:val="2E3A36"/>
+                <w:sz w:val="16"/>
+                <w:szCs w:val="16"/>
+              </w:rPr>
+              <w:t xml:space="preserve">.specify/scripts/bash/*</w:t>
+            </w:r>
+            <w:r>
+              <w:rPr>
+                <w:rFonts w:ascii="Calibri" w:cs="Calibri" w:eastAsia="Calibri" w:hAnsi="Calibri"/>
+                <w:sz w:val="18"/>
+                <w:szCs w:val="18"/>
+              </w:rPr>
+              <w:t xml:space="preserve">) y crear carpetas en </w:t>
+            </w:r>
+            <w:r>
+              <w:rPr>
+                <w:rFonts w:ascii="Consolas" w:cs="Consolas" w:eastAsia="Consolas" w:hAnsi="Consolas"/>
+                <w:color w:val="2E3A36"/>
+                <w:sz w:val="16"/>
+                <w:szCs w:val="16"/>
+              </w:rPr>
+              <w:t xml:space="preserve">specs/</w:t>
+            </w:r>
+          </w:p>
+        </w:tc>
+      </w:tr>
+    </w:tbl>
+    <w:p>
+      <w:pPr>
+        <w:spacing w:after="120"/>
+      </w:pPr>
+    </w:p>
+    <w:p>
+      <w:pPr>
+        <w:keepNext w:val="false"/>
+        <w:spacing w:after="140" w:line="288"/>
+        <w:jc w:val="both"/>
+      </w:pPr>
+      <w:r>
+        <w:rPr>
+          <w:rFonts w:ascii="Calibri" w:cs="Calibri" w:eastAsia="Calibri" w:hAnsi="Calibri"/>
+        </w:rPr>
+        <w:t xml:space="preserve">El hook solo protege </w:t>
+      </w:r>
+      <w:r>
+        <w:rPr>
+          <w:rFonts w:ascii="Consolas" w:cs="Consolas" w:eastAsia="Consolas" w:hAnsi="Consolas"/>
+          <w:color w:val="2E3A36"/>
+          <w:sz w:val="20"/>
+          <w:szCs w:val="20"/>
+        </w:rPr>
+        <w:t xml:space="preserve">.specify/memory/</w:t>
+      </w:r>
+      <w:r>
+        <w:rPr>
+          <w:rFonts w:ascii="Calibri" w:cs="Calibri" w:eastAsia="Calibri" w:hAnsi="Calibri"/>
+        </w:rPr>
+        <w:t xml:space="preserve">, así que una escritura en las plantillas desde la shell no la bloquearía. Ese cambio aparecería en el PR y necesitaría la aprobación de Code Owners; la tarea 7 añadirá una comprobación de CI para cerrarlo.</w:t>
+      </w:r>
+    </w:p>
+    <w:p>
+      <w:pPr>
+        <w:keepNext w:val="false"/>
+        <w:spacing w:after="140" w:line="288"/>
+        <w:jc w:val="both"/>
+      </w:pPr>
+      <w:r>
+        <w:rPr>
+          <w:rFonts w:ascii="Consolas" w:cs="Consolas" w:eastAsia="Consolas" w:hAnsi="Consolas"/>
+          <w:color w:val="2E3A36"/>
+          <w:sz w:val="20"/>
+          <w:szCs w:val="20"/>
+        </w:rPr>
+        <w:t xml:space="preserve">AGENTS.md</w:t>
+      </w:r>
+      <w:r>
+        <w:rPr>
+          <w:rFonts w:ascii="Calibri" w:cs="Calibri" w:eastAsia="Calibri" w:hAnsi="Calibri"/>
+        </w:rPr>
+        <w:t xml:space="preserve"> describe el flujo en dos PRs: primero la spec, en una rama </w:t>
+      </w:r>
+      <w:r>
+        <w:rPr>
+          <w:rFonts w:ascii="Consolas" w:cs="Consolas" w:eastAsia="Consolas" w:hAnsi="Consolas"/>
+          <w:color w:val="2E3A36"/>
+          <w:sz w:val="20"/>
+          <w:szCs w:val="20"/>
+        </w:rPr>
+        <w:t xml:space="preserve">spec/&lt;issue&gt;-&lt;slug&gt;</w:t>
+      </w:r>
+      <w:r>
+        <w:rPr>
+          <w:rFonts w:ascii="Calibri" w:cs="Calibri" w:eastAsia="Calibri" w:hAnsi="Calibri"/>
+        </w:rPr>
+        <w:t xml:space="preserve">, y solo cuando está fusionada el plan, las tareas y el código en </w:t>
+      </w:r>
+      <w:r>
+        <w:rPr>
+          <w:rFonts w:ascii="Consolas" w:cs="Consolas" w:eastAsia="Consolas" w:hAnsi="Consolas"/>
+          <w:color w:val="2E3A36"/>
+          <w:sz w:val="20"/>
+          <w:szCs w:val="20"/>
+        </w:rPr>
+        <w:t xml:space="preserve">feat/&lt;issue&gt;-&lt;slug&gt;</w:t>
+      </w:r>
+      <w:r>
+        <w:rPr>
+          <w:rFonts w:ascii="Calibri" w:cs="Calibri" w:eastAsia="Calibri" w:hAnsi="Calibri"/>
+        </w:rPr>
+        <w:t xml:space="preserve">.</w:t>
+      </w:r>
+    </w:p>
+    <w:p>
+      <w:pPr>
+        <w:pStyle w:val="Heading3"/>
+        <w:keepNext/>
+      </w:pPr>
+      <w:r>
+        <w:rPr>
+          <w:rFonts w:ascii="Calibri" w:cs="Calibri" w:eastAsia="Calibri" w:hAnsi="Calibri"/>
+        </w:rPr>
+        <w:t xml:space="preserve">El sandbox no arrancaba en el devcontainer</w:t>
+      </w:r>
+    </w:p>
+    <w:p>
+      <w:pPr>
+        <w:keepNext/>
+        <w:spacing w:after="140" w:line="288"/>
+        <w:jc w:val="both"/>
+      </w:pPr>
+      <w:r>
+        <w:rPr>
+          <w:rFonts w:ascii="Calibri" w:cs="Calibri" w:eastAsia="Calibri" w:hAnsi="Calibri"/>
+        </w:rPr>
+        <w:t xml:space="preserve">En el primer intento el agente no pudo ejecutar ningún comando. Bubblewrap, que aísla cada comando del agente, necesita crear </w:t>
+      </w:r>
+      <w:r>
+        <w:rPr>
+          <w:rFonts w:ascii="Calibri" w:cs="Calibri" w:eastAsia="Calibri" w:hAnsi="Calibri"/>
+          <w:i/>
+          <w:iCs/>
+        </w:rPr>
+        <w:t xml:space="preserve">user namespaces</w:t>
+      </w:r>
+      <w:r>
+        <w:rPr>
+          <w:rFonts w:ascii="Calibri" w:cs="Calibri" w:eastAsia="Calibri" w:hAnsi="Calibri"/>
+        </w:rPr>
+        <w:t xml:space="preserve">, y el perfil seccomp por defecto de Docker lo impide a un usuario sin privilegios:</w:t>
+      </w:r>
+    </w:p>
+    <w:p>
+      <w:pPr>
+        <w:shd w:fill="F2F4F3" w:color="auto" w:val="clear"/>
+        <w:spacing w:after="0" w:before="120" w:line="240"/>
+        <w:ind w:left="200" w:right="200"/>
+      </w:pPr>
+      <w:r>
+        <w:rPr>
+          <w:rFonts w:ascii="Consolas" w:cs="Consolas" w:eastAsia="Consolas" w:hAnsi="Consolas"/>
+          <w:color w:val="1F2A27"/>
+          <w:sz w:val="17"/>
+          <w:szCs w:val="17"/>
+        </w:rPr>
+        <w:t xml:space="preserve">bwrap: No permissions to create a new namespace, likely because the kernel</w:t>
+      </w:r>
+    </w:p>
+    <w:p>
+      <w:pPr>
+        <w:shd w:fill="F2F4F3" w:color="auto" w:val="clear"/>
+        <w:spacing w:after="160" w:before="0" w:line="240"/>
+        <w:ind w:left="200" w:right="200"/>
+      </w:pPr>
+      <w:r>
+        <w:rPr>
+          <w:rFonts w:ascii="Consolas" w:cs="Consolas" w:eastAsia="Consolas" w:hAnsi="Consolas"/>
+          <w:color w:val="1F2A27"/>
+          <w:sz w:val="17"/>
+          <w:szCs w:val="17"/>
+        </w:rPr>
+        <w:t xml:space="preserve">does not allow non-privileged user namespaces.</w:t>
+      </w:r>
+    </w:p>
+    <w:p>
+      <w:pPr>
+        <w:keepNext w:val="false"/>
+        <w:spacing w:after="140" w:line="288"/>
+        <w:jc w:val="both"/>
+      </w:pPr>
+      <w:r>
+        <w:rPr>
+          <w:rFonts w:ascii="Calibri" w:cs="Calibri" w:eastAsia="Calibri" w:hAnsi="Calibri"/>
+        </w:rPr>
+        <w:t xml:space="preserve">Como el harness exige el sandbox (</w:t>
+      </w:r>
+      <w:r>
+        <w:rPr>
+          <w:rFonts w:ascii="Consolas" w:cs="Consolas" w:eastAsia="Consolas" w:hAnsi="Consolas"/>
+          <w:color w:val="2E3A36"/>
+          <w:sz w:val="20"/>
+          <w:szCs w:val="20"/>
+        </w:rPr>
+        <w:t xml:space="preserve">failIfUnavailable</w:t>
+      </w:r>
+      <w:r>
+        <w:rPr>
+          <w:rFonts w:ascii="Calibri" w:cs="Calibri" w:eastAsia="Calibri" w:hAnsi="Calibri"/>
+        </w:rPr>
+        <w:t xml:space="preserve">) y prohíbe ejecutar fuera de él (</w:t>
+      </w:r>
+      <w:r>
+        <w:rPr>
+          <w:rFonts w:ascii="Consolas" w:cs="Consolas" w:eastAsia="Consolas" w:hAnsi="Consolas"/>
+          <w:color w:val="2E3A36"/>
+          <w:sz w:val="20"/>
+          <w:szCs w:val="20"/>
+        </w:rPr>
+        <w:t xml:space="preserve">allowUnsandboxedCommands: false</w:t>
+      </w:r>
+      <w:r>
+        <w:rPr>
+          <w:rFonts w:ascii="Calibri" w:cs="Calibri" w:eastAsia="Calibri" w:hAnsi="Calibri"/>
+        </w:rPr>
+        <w:t xml:space="preserve">), el agente se quedó sin shell. No buscó otra vía: explicó el error, citó la regla del repositorio que le impide rodear un bloqueo y propuso dos salidas para que decidiera el responsable. Se eligió arrancar el contenedor con </w:t>
+      </w:r>
+      <w:r>
+        <w:rPr>
+          <w:rFonts w:ascii="Consolas" w:cs="Consolas" w:eastAsia="Consolas" w:hAnsi="Consolas"/>
+          <w:color w:val="2E3A36"/>
+          <w:sz w:val="20"/>
+          <w:szCs w:val="20"/>
+        </w:rPr>
+        <w:t xml:space="preserve">--security-opt seccomp=unconfined</w:t>
+      </w:r>
+      <w:r>
+        <w:rPr>
+          <w:rFonts w:ascii="Calibri" w:cs="Calibri" w:eastAsia="Calibri" w:hAnsi="Calibri"/>
+        </w:rPr>
+        <w:t xml:space="preserve">, que retira el filtro del contenedor exterior y mantiene el sandbox por comando, el que limita la red y oculta los secretos. Desactivar el sandbox se descartó porque eliminaba una capa.</w:t>
+      </w:r>
+    </w:p>
+    <w:p>
+      <w:pPr>
+        <w:keepNext w:val="false"/>
+        <w:spacing w:after="140" w:line="288"/>
+        <w:jc w:val="both"/>
+      </w:pPr>
+      <w:r>
+        <w:rPr>
+          <w:rFonts w:ascii="Calibri" w:cs="Calibri" w:eastAsia="Calibri" w:hAnsi="Calibri"/>
+        </w:rPr>
+        <w:t xml:space="preserve">El fallo no había aparecido en las pruebas de la tarea 3 porque allí todos los bloqueos ocurrieron antes de ejecutar nada (en el contexto, los permisos o el hook) y ningún comando llegó al sandbox.</w:t>
+      </w:r>
+    </w:p>
+    <w:p>
+      <w:pPr>
+        <w:pStyle w:val="Heading3"/>
+        <w:keepNext/>
+      </w:pPr>
+      <w:r>
+        <w:rPr>
+          <w:rFonts w:ascii="Calibri" w:cs="Calibri" w:eastAsia="Calibri" w:hAnsi="Calibri"/>
+        </w:rPr>
+        <w:t xml:space="preserve">La spec generada</w:t>
+      </w:r>
+    </w:p>
+    <w:p>
+      <w:pPr>
+        <w:keepNext w:val="false"/>
+        <w:spacing w:after="140" w:line="288"/>
+        <w:jc w:val="both"/>
+      </w:pPr>
+      <w:r>
+        <w:rPr>
+          <w:rFonts w:ascii="Calibri" w:cs="Calibri" w:eastAsia="Calibri" w:hAnsi="Calibri"/>
+        </w:rPr>
+        <w:t xml:space="preserve">Con el sandbox operativo, el agente leyó el issue, creó la rama, ejecutó </w:t>
+      </w:r>
+      <w:r>
+        <w:rPr>
+          <w:rFonts w:ascii="Consolas" w:cs="Consolas" w:eastAsia="Consolas" w:hAnsi="Consolas"/>
+          <w:color w:val="2E3A36"/>
+          <w:sz w:val="20"/>
+          <w:szCs w:val="20"/>
+        </w:rPr>
+        <w:t xml:space="preserve">/speckit-specify</w:t>
+      </w:r>
+      <w:r>
+        <w:rPr>
+          <w:rFonts w:ascii="Calibri" w:cs="Calibri" w:eastAsia="Calibri" w:hAnsi="Calibri"/>
+        </w:rPr>
+        <w:t xml:space="preserve"> y abrió el PR #9 con dos ficheros: </w:t>
+      </w:r>
+      <w:r>
+        <w:rPr>
+          <w:rFonts w:ascii="Consolas" w:cs="Consolas" w:eastAsia="Consolas" w:hAnsi="Consolas"/>
+          <w:color w:val="2E3A36"/>
+          <w:sz w:val="20"/>
+          <w:szCs w:val="20"/>
+        </w:rPr>
+        <w:t xml:space="preserve">specs/001-catalogo-productos/spec.md</w:t>
+      </w:r>
+      <w:r>
+        <w:rPr>
+          <w:rFonts w:ascii="Calibri" w:cs="Calibri" w:eastAsia="Calibri" w:hAnsi="Calibri"/>
+        </w:rPr>
+        <w:t xml:space="preserve"> y su checklist de calidad. La spec tiene tres historias de usuario priorizadas, 12 requisitos funcionales y 5 criterios de éxito medibles. Lo que el issue no fijaba (tipo del identificador, orden del listado, contenido inicial) aparece como supuesto explícito y no como requisito inventado. Dos requisitos vienen de la constitución y el PR lo indica: validar el catálogo antes de publicarlo y registrar métricas y logs por endpoint.</w:t>
+      </w:r>
+    </w:p>
+    <w:p>
+      <w:pPr>
+        <w:keepNext w:val="false"/>
+        <w:spacing w:after="140" w:line="288"/>
+        <w:jc w:val="both"/>
+      </w:pPr>
+      <w:r>
+        <w:rPr>
+          <w:rFonts w:ascii="Calibri" w:cs="Calibri" w:eastAsia="Calibri" w:hAnsi="Calibri"/>
+        </w:rPr>
+        <w:t xml:space="preserve">El PR también señaló que el repositorio aún no tenía la aplicación base. El responsable decidió que la cree el PR de implementación de la tarea 5, aprobó la spec y la fusionó. Fue la primera vez que el flujo previsto se cumplió entero: el autor del PR era </w:t>
+      </w:r>
+      <w:r>
+        <w:rPr>
+          <w:rFonts w:ascii="Consolas" w:cs="Consolas" w:eastAsia="Consolas" w:hAnsi="Consolas"/>
+          <w:color w:val="2E3A36"/>
+          <w:sz w:val="20"/>
+          <w:szCs w:val="20"/>
+        </w:rPr>
+        <w:t xml:space="preserve">almagentic-agent[bot]</w:t>
+      </w:r>
+      <w:r>
+        <w:rPr>
+          <w:rFonts w:ascii="Calibri" w:cs="Calibri" w:eastAsia="Calibri" w:hAnsi="Calibri"/>
+        </w:rPr>
+        <w:t xml:space="preserve"> y el responsable pudo aprobarlo con su cuenta, sin </w:t>
+      </w:r>
+      <w:r>
+        <w:rPr>
+          <w:rFonts w:ascii="Calibri" w:cs="Calibri" w:eastAsia="Calibri" w:hAnsi="Calibri"/>
+          <w:i/>
+          <w:iCs/>
+        </w:rPr>
+        <w:t xml:space="preserve">bypass</w:t>
+      </w:r>
+      <w:r>
+        <w:rPr>
+          <w:rFonts w:ascii="Calibri" w:cs="Calibri" w:eastAsia="Calibri" w:hAnsi="Calibri"/>
+        </w:rPr>
+        <w:t xml:space="preserve">.</w:t>
+      </w:r>
+    </w:p>
+    <w:p>
+      <w:pPr>
+        <w:pStyle w:val="Heading2"/>
+        <w:keepNext/>
+      </w:pPr>
+      <w:r>
+        <w:rPr>
+          <w:rFonts w:ascii="Calibri" w:cs="Calibri" w:eastAsia="Calibri" w:hAnsi="Calibri"/>
+        </w:rPr>
         <w:t xml:space="preserve">Tareas pendientes</w:t>
       </w:r>
     </w:p>
@@ -12134,7 +13026,7 @@
           <w:sz w:val="21"/>
           <w:szCs w:val="21"/>
         </w:rPr>
-        <w:t xml:space="preserve">Las secciones de las tareas 4 a 12 y de las extensiones B a E se añadirán a medida que se implementen: especificación con Spec Kit, implementación por el agente, CI, análisis de seguridad, agente revisor, cadena de suministro, despliegue GitOps, </w:t>
+        <w:t xml:space="preserve">Las secciones de las tareas 5 a 12 y de las extensiones B a E se añadirán a medida que se implementen: implementación por el agente, CI, análisis de seguridad, agente revisor, cadena de suministro, despliegue GitOps, </w:t>
       </w:r>
       <w:r>
         <w:rPr>
@@ -18373,6 +19265,738 @@
     </w:p>
     <w:p>
       <w:pPr>
+        <w:pStyle w:val="Heading3"/>
+        <w:keepNext/>
+      </w:pPr>
+      <w:r>
+        <w:rPr>
+          <w:rFonts w:ascii="Calibri" w:cs="Calibri" w:eastAsia="Calibri" w:hAnsi="Calibri"/>
+        </w:rPr>
+        <w:t xml:space="preserve">Fase 7 · Especificación con Spec Kit (5 de octubre)</w:t>
+      </w:r>
+    </w:p>
+    <w:tbl>
+      <w:tblPr>
+        <w:tblW w:type="dxa" w:w="9070"/>
+        <w:tblBorders>
+          <w:top w:val="single" w:color="C9D3CF" w:sz="4"/>
+          <w:left w:val="single" w:color="C9D3CF" w:sz="4"/>
+          <w:bottom w:val="single" w:color="C9D3CF" w:sz="4"/>
+          <w:right w:val="single" w:color="C9D3CF" w:sz="4"/>
+          <w:insideH w:val="single" w:color="C9D3CF" w:sz="4"/>
+          <w:insideV w:val="single" w:color="C9D3CF" w:sz="4"/>
+        </w:tblBorders>
+      </w:tblPr>
+      <w:tblGrid>
+        <w:gridCol w:w="700"/>
+        <w:gridCol w:w="2701"/>
+        <w:gridCol w:w="3736"/>
+        <w:gridCol w:w="1933"/>
+      </w:tblGrid>
+      <w:tr>
+        <w:trPr>
+          <w:tblHeader/>
+        </w:trPr>
+        <w:tc>
+          <w:tcPr>
+            <w:tcW w:type="dxa" w:w="700"/>
+            <w:shd w:fill="E3EEEA" w:color="auto" w:val="clear"/>
+            <w:tcMar>
+              <w:top w:type="dxa" w:w="60"/>
+              <w:left w:type="dxa" w:w="100"/>
+              <w:bottom w:type="dxa" w:w="60"/>
+              <w:right w:type="dxa" w:w="100"/>
+            </w:tcMar>
+          </w:tcPr>
+          <w:p>
+            <w:pPr>
+              <w:spacing w:after="0" w:before="0" w:line="252"/>
+            </w:pPr>
+            <w:r>
+              <w:rPr>
+                <w:rFonts w:ascii="Calibri" w:cs="Calibri" w:eastAsia="Calibri" w:hAnsi="Calibri"/>
+                <w:b/>
+                <w:bCs/>
+                <w:sz w:val="18"/>
+                <w:szCs w:val="18"/>
+              </w:rPr>
+              <w:t xml:space="preserve">#</w:t>
+            </w:r>
+          </w:p>
+        </w:tc>
+        <w:tc>
+          <w:tcPr>
+            <w:tcW w:type="dxa" w:w="2701"/>
+            <w:shd w:fill="E3EEEA" w:color="auto" w:val="clear"/>
+            <w:tcMar>
+              <w:top w:type="dxa" w:w="60"/>
+              <w:left w:type="dxa" w:w="100"/>
+              <w:bottom w:type="dxa" w:w="60"/>
+              <w:right w:type="dxa" w:w="100"/>
+            </w:tcMar>
+          </w:tcPr>
+          <w:p>
+            <w:pPr>
+              <w:spacing w:after="0" w:before="0" w:line="252"/>
+            </w:pPr>
+            <w:r>
+              <w:rPr>
+                <w:rFonts w:ascii="Calibri" w:cs="Calibri" w:eastAsia="Calibri" w:hAnsi="Calibri"/>
+                <w:b/>
+                <w:bCs/>
+                <w:sz w:val="18"/>
+                <w:szCs w:val="18"/>
+              </w:rPr>
+              <w:t xml:space="preserve">Petición del autor</w:t>
+            </w:r>
+          </w:p>
+        </w:tc>
+        <w:tc>
+          <w:tcPr>
+            <w:tcW w:type="dxa" w:w="3736"/>
+            <w:shd w:fill="E3EEEA" w:color="auto" w:val="clear"/>
+            <w:tcMar>
+              <w:top w:type="dxa" w:w="60"/>
+              <w:left w:type="dxa" w:w="100"/>
+              <w:bottom w:type="dxa" w:w="60"/>
+              <w:right w:type="dxa" w:w="100"/>
+            </w:tcMar>
+          </w:tcPr>
+          <w:p>
+            <w:pPr>
+              <w:spacing w:after="0" w:before="0" w:line="252"/>
+            </w:pPr>
+            <w:r>
+              <w:rPr>
+                <w:rFonts w:ascii="Calibri" w:cs="Calibri" w:eastAsia="Calibri" w:hAnsi="Calibri"/>
+                <w:b/>
+                <w:bCs/>
+                <w:sz w:val="18"/>
+                <w:szCs w:val="18"/>
+              </w:rPr>
+              <w:t xml:space="preserve">Respuesta y acción del modelo</w:t>
+            </w:r>
+          </w:p>
+        </w:tc>
+        <w:tc>
+          <w:tcPr>
+            <w:tcW w:type="dxa" w:w="1933"/>
+            <w:shd w:fill="E3EEEA" w:color="auto" w:val="clear"/>
+            <w:tcMar>
+              <w:top w:type="dxa" w:w="60"/>
+              <w:left w:type="dxa" w:w="100"/>
+              <w:bottom w:type="dxa" w:w="60"/>
+              <w:right w:type="dxa" w:w="100"/>
+            </w:tcMar>
+          </w:tcPr>
+          <w:p>
+            <w:pPr>
+              <w:spacing w:after="0" w:before="0" w:line="252"/>
+            </w:pPr>
+            <w:r>
+              <w:rPr>
+                <w:rFonts w:ascii="Calibri" w:cs="Calibri" w:eastAsia="Calibri" w:hAnsi="Calibri"/>
+                <w:b/>
+                <w:bCs/>
+                <w:sz w:val="18"/>
+                <w:szCs w:val="18"/>
+              </w:rPr>
+              <w:t xml:space="preserve">Resultado</w:t>
+            </w:r>
+          </w:p>
+        </w:tc>
+      </w:tr>
+      <w:tr>
+        <w:trPr>
+          <w:cantSplit/>
+        </w:trPr>
+        <w:tc>
+          <w:tcPr>
+            <w:tcW w:type="dxa" w:w="700"/>
+            <w:tcMar>
+              <w:top w:type="dxa" w:w="60"/>
+              <w:left w:type="dxa" w:w="100"/>
+              <w:bottom w:type="dxa" w:w="60"/>
+              <w:right w:type="dxa" w:w="100"/>
+            </w:tcMar>
+          </w:tcPr>
+          <w:p>
+            <w:pPr>
+              <w:spacing w:after="0" w:before="0" w:line="252"/>
+            </w:pPr>
+            <w:r>
+              <w:rPr>
+                <w:rFonts w:ascii="Calibri" w:cs="Calibri" w:eastAsia="Calibri" w:hAnsi="Calibri"/>
+                <w:sz w:val="18"/>
+                <w:szCs w:val="18"/>
+              </w:rPr>
+              <w:t xml:space="preserve">44</w:t>
+            </w:r>
+          </w:p>
+        </w:tc>
+        <w:tc>
+          <w:tcPr>
+            <w:tcW w:type="dxa" w:w="2701"/>
+            <w:tcMar>
+              <w:top w:type="dxa" w:w="60"/>
+              <w:left w:type="dxa" w:w="100"/>
+              <w:bottom w:type="dxa" w:w="60"/>
+              <w:right w:type="dxa" w:w="100"/>
+            </w:tcMar>
+          </w:tcPr>
+          <w:p>
+            <w:pPr>
+              <w:spacing w:after="0" w:before="0" w:line="252"/>
+            </w:pPr>
+            <w:r>
+              <w:rPr>
+                <w:rFonts w:ascii="Calibri" w:cs="Calibri" w:eastAsia="Calibri" w:hAnsi="Calibri"/>
+                <w:sz w:val="18"/>
+                <w:szCs w:val="18"/>
+              </w:rPr>
+              <w:t xml:space="preserve">«Estábamos en el punto de responder al #5. Añado un comentario con la respuesta, ¿verdad? ¿Solo comento o cierro con el comentario?»</w:t>
+            </w:r>
+          </w:p>
+        </w:tc>
+        <w:tc>
+          <w:tcPr>
+            <w:tcW w:type="dxa" w:w="3736"/>
+            <w:tcMar>
+              <w:top w:type="dxa" w:w="60"/>
+              <w:left w:type="dxa" w:w="100"/>
+              <w:bottom w:type="dxa" w:w="60"/>
+              <w:right w:type="dxa" w:w="100"/>
+            </w:tcMar>
+          </w:tcPr>
+          <w:p>
+            <w:pPr>
+              <w:spacing w:after="0" w:before="0" w:line="252"/>
+            </w:pPr>
+            <w:r>
+              <w:rPr>
+                <w:rFonts w:ascii="Calibri" w:cs="Calibri" w:eastAsia="Calibri" w:hAnsi="Calibri"/>
+                <w:sz w:val="18"/>
+                <w:szCs w:val="18"/>
+              </w:rPr>
+              <w:t xml:space="preserve">Aclara que el #5 es un issue y no un PR. Recomienda solo comentar: el issue se cierra con el PR de implementación y reabrirlo relanzaría el triage. Redacta las respuestas a las cinco preguntas</w:t>
+            </w:r>
+          </w:p>
+        </w:tc>
+        <w:tc>
+          <w:tcPr>
+            <w:tcW w:type="dxa" w:w="1933"/>
+            <w:tcMar>
+              <w:top w:type="dxa" w:w="60"/>
+              <w:left w:type="dxa" w:w="100"/>
+              <w:bottom w:type="dxa" w:w="60"/>
+              <w:right w:type="dxa" w:w="100"/>
+            </w:tcMar>
+          </w:tcPr>
+          <w:p>
+            <w:pPr>
+              <w:spacing w:after="0" w:before="0" w:line="252"/>
+            </w:pPr>
+            <w:r>
+              <w:rPr>
+                <w:rFonts w:ascii="Calibri" w:cs="Calibri" w:eastAsia="Calibri" w:hAnsi="Calibri"/>
+                <w:sz w:val="18"/>
+                <w:szCs w:val="18"/>
+              </w:rPr>
+              <w:t xml:space="preserve">Respuestas publicadas en el issue</w:t>
+            </w:r>
+          </w:p>
+        </w:tc>
+      </w:tr>
+      <w:tr>
+        <w:trPr>
+          <w:cantSplit/>
+        </w:trPr>
+        <w:tc>
+          <w:tcPr>
+            <w:tcW w:type="dxa" w:w="700"/>
+            <w:tcMar>
+              <w:top w:type="dxa" w:w="60"/>
+              <w:left w:type="dxa" w:w="100"/>
+              <w:bottom w:type="dxa" w:w="60"/>
+              <w:right w:type="dxa" w:w="100"/>
+            </w:tcMar>
+          </w:tcPr>
+          <w:p>
+            <w:pPr>
+              <w:spacing w:after="0" w:before="0" w:line="252"/>
+            </w:pPr>
+            <w:r>
+              <w:rPr>
+                <w:rFonts w:ascii="Calibri" w:cs="Calibri" w:eastAsia="Calibri" w:hAnsi="Calibri"/>
+                <w:sz w:val="18"/>
+                <w:szCs w:val="18"/>
+              </w:rPr>
+              <w:t xml:space="preserve">45</w:t>
+            </w:r>
+          </w:p>
+        </w:tc>
+        <w:tc>
+          <w:tcPr>
+            <w:tcW w:type="dxa" w:w="2701"/>
+            <w:tcMar>
+              <w:top w:type="dxa" w:w="60"/>
+              <w:left w:type="dxa" w:w="100"/>
+              <w:bottom w:type="dxa" w:w="60"/>
+              <w:right w:type="dxa" w:w="100"/>
+            </w:tcMar>
+          </w:tcPr>
+          <w:p>
+            <w:pPr>
+              <w:spacing w:after="0" w:before="0" w:line="252"/>
+            </w:pPr>
+            <w:r>
+              <w:rPr>
+                <w:rFonts w:ascii="Calibri" w:cs="Calibri" w:eastAsia="Calibri" w:hAnsi="Calibri"/>
+                <w:sz w:val="18"/>
+                <w:szCs w:val="18"/>
+              </w:rPr>
+              <w:t xml:space="preserve">«Comentado y aprobado»</w:t>
+            </w:r>
+          </w:p>
+        </w:tc>
+        <w:tc>
+          <w:tcPr>
+            <w:tcW w:type="dxa" w:w="3736"/>
+            <w:tcMar>
+              <w:top w:type="dxa" w:w="60"/>
+              <w:left w:type="dxa" w:w="100"/>
+              <w:bottom w:type="dxa" w:w="60"/>
+              <w:right w:type="dxa" w:w="100"/>
+            </w:tcMar>
+          </w:tcPr>
+          <w:p>
+            <w:pPr>
+              <w:spacing w:after="0" w:before="0" w:line="252"/>
+            </w:pPr>
+            <w:r>
+              <w:rPr>
+                <w:rFonts w:ascii="Calibri" w:cs="Calibri" w:eastAsia="Calibri" w:hAnsi="Calibri"/>
+                <w:sz w:val="18"/>
+                <w:szCs w:val="18"/>
+              </w:rPr>
+              <w:t xml:space="preserve">Añade Spec Kit 1.1.0 (app#7) tras comprobar en una copia que no toca la constitución ni los permisos. Detecta su propio error: había propuesto rutas </w:t>
+            </w:r>
+            <w:r>
+              <w:rPr>
+                <w:rFonts w:ascii="Consolas" w:cs="Consolas" w:eastAsia="Consolas" w:hAnsi="Consolas"/>
+                <w:color w:val="2E3A36"/>
+                <w:sz w:val="16"/>
+                <w:szCs w:val="16"/>
+              </w:rPr>
+              <w:t xml:space="preserve">/v1</w:t>
+            </w:r>
+            <w:r>
+              <w:rPr>
+                <w:rFonts w:ascii="Calibri" w:cs="Calibri" w:eastAsia="Calibri" w:hAnsi="Calibri"/>
+                <w:sz w:val="18"/>
+                <w:szCs w:val="18"/>
+              </w:rPr>
+              <w:t xml:space="preserve"> cuando </w:t>
+            </w:r>
+            <w:r>
+              <w:rPr>
+                <w:rFonts w:ascii="Consolas" w:cs="Consolas" w:eastAsia="Consolas" w:hAnsi="Consolas"/>
+                <w:color w:val="2E3A36"/>
+                <w:sz w:val="16"/>
+                <w:szCs w:val="16"/>
+              </w:rPr>
+              <w:t xml:space="preserve">AGENTS.md</w:t>
+            </w:r>
+            <w:r>
+              <w:rPr>
+                <w:rFonts w:ascii="Calibri" w:cs="Calibri" w:eastAsia="Calibri" w:hAnsi="Calibri"/>
+                <w:sz w:val="18"/>
+                <w:szCs w:val="18"/>
+              </w:rPr>
+              <w:t xml:space="preserve"> exige </w:t>
+            </w:r>
+            <w:r>
+              <w:rPr>
+                <w:rFonts w:ascii="Consolas" w:cs="Consolas" w:eastAsia="Consolas" w:hAnsi="Consolas"/>
+                <w:color w:val="2E3A36"/>
+                <w:sz w:val="16"/>
+                <w:szCs w:val="16"/>
+              </w:rPr>
+              <w:t xml:space="preserve">/api/v1</w:t>
+            </w:r>
+            <w:r>
+              <w:rPr>
+                <w:rFonts w:ascii="Calibri" w:cs="Calibri" w:eastAsia="Calibri" w:hAnsi="Calibri"/>
+                <w:sz w:val="18"/>
+                <w:szCs w:val="18"/>
+              </w:rPr>
+              <w:t xml:space="preserve">, y pide corregir el comentario</w:t>
+            </w:r>
+          </w:p>
+        </w:tc>
+        <w:tc>
+          <w:tcPr>
+            <w:tcW w:type="dxa" w:w="1933"/>
+            <w:tcMar>
+              <w:top w:type="dxa" w:w="60"/>
+              <w:left w:type="dxa" w:w="100"/>
+              <w:bottom w:type="dxa" w:w="60"/>
+              <w:right w:type="dxa" w:w="100"/>
+            </w:tcMar>
+          </w:tcPr>
+          <w:p>
+            <w:pPr>
+              <w:spacing w:after="0" w:before="0" w:line="252"/>
+            </w:pPr>
+            <w:r>
+              <w:rPr>
+                <w:rFonts w:ascii="Calibri" w:cs="Calibri" w:eastAsia="Calibri" w:hAnsi="Calibri"/>
+                <w:sz w:val="18"/>
+                <w:szCs w:val="18"/>
+              </w:rPr>
+              <w:t xml:space="preserve">Spec Kit en el repo; ruta corregida</w:t>
+            </w:r>
+          </w:p>
+        </w:tc>
+      </w:tr>
+      <w:tr>
+        <w:trPr>
+          <w:cantSplit/>
+        </w:trPr>
+        <w:tc>
+          <w:tcPr>
+            <w:tcW w:type="dxa" w:w="700"/>
+            <w:tcMar>
+              <w:top w:type="dxa" w:w="60"/>
+              <w:left w:type="dxa" w:w="100"/>
+              <w:bottom w:type="dxa" w:w="60"/>
+              <w:right w:type="dxa" w:w="100"/>
+            </w:tcMar>
+          </w:tcPr>
+          <w:p>
+            <w:pPr>
+              <w:spacing w:after="0" w:before="0" w:line="252"/>
+            </w:pPr>
+            <w:r>
+              <w:rPr>
+                <w:rFonts w:ascii="Calibri" w:cs="Calibri" w:eastAsia="Calibri" w:hAnsi="Calibri"/>
+                <w:sz w:val="18"/>
+                <w:szCs w:val="18"/>
+              </w:rPr>
+              <w:t xml:space="preserve">46</w:t>
+            </w:r>
+          </w:p>
+        </w:tc>
+        <w:tc>
+          <w:tcPr>
+            <w:tcW w:type="dxa" w:w="2701"/>
+            <w:tcMar>
+              <w:top w:type="dxa" w:w="60"/>
+              <w:left w:type="dxa" w:w="100"/>
+              <w:bottom w:type="dxa" w:w="60"/>
+              <w:right w:type="dxa" w:w="100"/>
+            </w:tcMar>
+          </w:tcPr>
+          <w:p>
+            <w:pPr>
+              <w:spacing w:after="0" w:before="0" w:line="252"/>
+            </w:pPr>
+            <w:r>
+              <w:rPr>
+                <w:rFonts w:ascii="Calibri" w:cs="Calibri" w:eastAsia="Calibri" w:hAnsi="Calibri"/>
+                <w:sz w:val="18"/>
+                <w:szCs w:val="18"/>
+              </w:rPr>
+              <w:t xml:space="preserve">Informe del agente: ningún comando arranca porque bubblewrap no puede crear </w:t>
+            </w:r>
+            <w:r>
+              <w:rPr>
+                <w:rFonts w:ascii="Calibri" w:cs="Calibri" w:eastAsia="Calibri" w:hAnsi="Calibri"/>
+                <w:i/>
+                <w:iCs/>
+                <w:sz w:val="18"/>
+                <w:szCs w:val="18"/>
+              </w:rPr>
+              <w:t xml:space="preserve">user namespaces</w:t>
+            </w:r>
+          </w:p>
+        </w:tc>
+        <w:tc>
+          <w:tcPr>
+            <w:tcW w:type="dxa" w:w="3736"/>
+            <w:tcMar>
+              <w:top w:type="dxa" w:w="60"/>
+              <w:left w:type="dxa" w:w="100"/>
+              <w:bottom w:type="dxa" w:w="60"/>
+              <w:right w:type="dxa" w:w="100"/>
+            </w:tcMar>
+          </w:tcPr>
+          <w:p>
+            <w:pPr>
+              <w:spacing w:after="0" w:before="0" w:line="252"/>
+            </w:pPr>
+            <w:r>
+              <w:rPr>
+                <w:rFonts w:ascii="Calibri" w:cs="Calibri" w:eastAsia="Calibri" w:hAnsi="Calibri"/>
+                <w:sz w:val="18"/>
+                <w:szCs w:val="18"/>
+              </w:rPr>
+              <w:t xml:space="preserve">Identifica el perfil seccomp de Docker como causa y abre app#8 con </w:t>
+            </w:r>
+            <w:r>
+              <w:rPr>
+                <w:rFonts w:ascii="Consolas" w:cs="Consolas" w:eastAsia="Consolas" w:hAnsi="Consolas"/>
+                <w:color w:val="2E3A36"/>
+                <w:sz w:val="16"/>
+                <w:szCs w:val="16"/>
+              </w:rPr>
+              <w:t xml:space="preserve">seccomp=unconfined</w:t>
+            </w:r>
+            <w:r>
+              <w:rPr>
+                <w:rFonts w:ascii="Calibri" w:cs="Calibri" w:eastAsia="Calibri" w:hAnsi="Calibri"/>
+                <w:sz w:val="18"/>
+                <w:szCs w:val="18"/>
+              </w:rPr>
+              <w:t xml:space="preserve"> y una comprobación. Descarta desactivar el sandbox</w:t>
+            </w:r>
+          </w:p>
+        </w:tc>
+        <w:tc>
+          <w:tcPr>
+            <w:tcW w:type="dxa" w:w="1933"/>
+            <w:tcMar>
+              <w:top w:type="dxa" w:w="60"/>
+              <w:left w:type="dxa" w:w="100"/>
+              <w:bottom w:type="dxa" w:w="60"/>
+              <w:right w:type="dxa" w:w="100"/>
+            </w:tcMar>
+          </w:tcPr>
+          <w:p>
+            <w:pPr>
+              <w:spacing w:after="0" w:before="0" w:line="252"/>
+            </w:pPr>
+            <w:r>
+              <w:rPr>
+                <w:rFonts w:ascii="Calibri" w:cs="Calibri" w:eastAsia="Calibri" w:hAnsi="Calibri"/>
+                <w:sz w:val="18"/>
+                <w:szCs w:val="18"/>
+              </w:rPr>
+              <w:t xml:space="preserve">Sandbox operativo</w:t>
+            </w:r>
+          </w:p>
+        </w:tc>
+      </w:tr>
+      <w:tr>
+        <w:trPr>
+          <w:cantSplit/>
+        </w:trPr>
+        <w:tc>
+          <w:tcPr>
+            <w:tcW w:type="dxa" w:w="700"/>
+            <w:tcMar>
+              <w:top w:type="dxa" w:w="60"/>
+              <w:left w:type="dxa" w:w="100"/>
+              <w:bottom w:type="dxa" w:w="60"/>
+              <w:right w:type="dxa" w:w="100"/>
+            </w:tcMar>
+          </w:tcPr>
+          <w:p>
+            <w:pPr>
+              <w:spacing w:after="0" w:before="0" w:line="252"/>
+            </w:pPr>
+            <w:r>
+              <w:rPr>
+                <w:rFonts w:ascii="Calibri" w:cs="Calibri" w:eastAsia="Calibri" w:hAnsi="Calibri"/>
+                <w:sz w:val="18"/>
+                <w:szCs w:val="18"/>
+              </w:rPr>
+              <w:t xml:space="preserve">47</w:t>
+            </w:r>
+          </w:p>
+        </w:tc>
+        <w:tc>
+          <w:tcPr>
+            <w:tcW w:type="dxa" w:w="2701"/>
+            <w:tcMar>
+              <w:top w:type="dxa" w:w="60"/>
+              <w:left w:type="dxa" w:w="100"/>
+              <w:bottom w:type="dxa" w:w="60"/>
+              <w:right w:type="dxa" w:w="100"/>
+            </w:tcMar>
+          </w:tcPr>
+          <w:p>
+            <w:pPr>
+              <w:spacing w:after="0" w:before="0" w:line="252"/>
+            </w:pPr>
+            <w:r>
+              <w:rPr>
+                <w:rFonts w:ascii="Calibri" w:cs="Calibri" w:eastAsia="Calibri" w:hAnsi="Calibri"/>
+                <w:sz w:val="18"/>
+                <w:szCs w:val="18"/>
+              </w:rPr>
+              <w:t xml:space="preserve">«Ya se ha ejecutado y ha creado una PR»</w:t>
+            </w:r>
+          </w:p>
+        </w:tc>
+        <w:tc>
+          <w:tcPr>
+            <w:tcW w:type="dxa" w:w="3736"/>
+            <w:tcMar>
+              <w:top w:type="dxa" w:w="60"/>
+              <w:left w:type="dxa" w:w="100"/>
+              <w:bottom w:type="dxa" w:w="60"/>
+              <w:right w:type="dxa" w:w="100"/>
+            </w:tcMar>
+          </w:tcPr>
+          <w:p>
+            <w:pPr>
+              <w:spacing w:after="0" w:before="0" w:line="252"/>
+            </w:pPr>
+            <w:r>
+              <w:rPr>
+                <w:rFonts w:ascii="Calibri" w:cs="Calibri" w:eastAsia="Calibri" w:hAnsi="Calibri"/>
+                <w:sz w:val="18"/>
+                <w:szCs w:val="18"/>
+              </w:rPr>
+              <w:t xml:space="preserve">Revisa el PR #9 frente al issue y la constitución; propone que el esqueleto lo cree la tarea 5</w:t>
+            </w:r>
+          </w:p>
+        </w:tc>
+        <w:tc>
+          <w:tcPr>
+            <w:tcW w:type="dxa" w:w="1933"/>
+            <w:tcMar>
+              <w:top w:type="dxa" w:w="60"/>
+              <w:left w:type="dxa" w:w="100"/>
+              <w:bottom w:type="dxa" w:w="60"/>
+              <w:right w:type="dxa" w:w="100"/>
+            </w:tcMar>
+          </w:tcPr>
+          <w:p>
+            <w:pPr>
+              <w:spacing w:after="0" w:before="0" w:line="252"/>
+            </w:pPr>
+            <w:r>
+              <w:rPr>
+                <w:rFonts w:ascii="Calibri" w:cs="Calibri" w:eastAsia="Calibri" w:hAnsi="Calibri"/>
+                <w:sz w:val="18"/>
+                <w:szCs w:val="18"/>
+              </w:rPr>
+              <w:t xml:space="preserve">Spec aprobada por revisión normal</w:t>
+            </w:r>
+          </w:p>
+        </w:tc>
+      </w:tr>
+      <w:tr>
+        <w:trPr>
+          <w:cantSplit/>
+        </w:trPr>
+        <w:tc>
+          <w:tcPr>
+            <w:tcW w:type="dxa" w:w="700"/>
+            <w:tcMar>
+              <w:top w:type="dxa" w:w="60"/>
+              <w:left w:type="dxa" w:w="100"/>
+              <w:bottom w:type="dxa" w:w="60"/>
+              <w:right w:type="dxa" w:w="100"/>
+            </w:tcMar>
+          </w:tcPr>
+          <w:p>
+            <w:pPr>
+              <w:spacing w:after="0" w:before="0" w:line="252"/>
+            </w:pPr>
+            <w:r>
+              <w:rPr>
+                <w:rFonts w:ascii="Calibri" w:cs="Calibri" w:eastAsia="Calibri" w:hAnsi="Calibri"/>
+                <w:sz w:val="18"/>
+                <w:szCs w:val="18"/>
+              </w:rPr>
+              <w:t xml:space="preserve">48</w:t>
+            </w:r>
+          </w:p>
+        </w:tc>
+        <w:tc>
+          <w:tcPr>
+            <w:tcW w:type="dxa" w:w="2701"/>
+            <w:tcMar>
+              <w:top w:type="dxa" w:w="60"/>
+              <w:left w:type="dxa" w:w="100"/>
+              <w:bottom w:type="dxa" w:w="60"/>
+              <w:right w:type="dxa" w:w="100"/>
+            </w:tcMar>
+          </w:tcPr>
+          <w:p>
+            <w:pPr>
+              <w:spacing w:after="0" w:before="0" w:line="252"/>
+            </w:pPr>
+            <w:r>
+              <w:rPr>
+                <w:rFonts w:ascii="Calibri" w:cs="Calibri" w:eastAsia="Calibri" w:hAnsi="Calibri"/>
+                <w:sz w:val="18"/>
+                <w:szCs w:val="18"/>
+              </w:rPr>
+              <w:t xml:space="preserve">«Merged»</w:t>
+            </w:r>
+          </w:p>
+        </w:tc>
+        <w:tc>
+          <w:tcPr>
+            <w:tcW w:type="dxa" w:w="3736"/>
+            <w:tcMar>
+              <w:top w:type="dxa" w:w="60"/>
+              <w:left w:type="dxa" w:w="100"/>
+              <w:bottom w:type="dxa" w:w="60"/>
+              <w:right w:type="dxa" w:w="100"/>
+            </w:tcMar>
+          </w:tcPr>
+          <w:p>
+            <w:pPr>
+              <w:spacing w:after="0" w:before="0" w:line="252"/>
+            </w:pPr>
+            <w:r>
+              <w:rPr>
+                <w:rFonts w:ascii="Calibri" w:cs="Calibri" w:eastAsia="Calibri" w:hAnsi="Calibri"/>
+                <w:sz w:val="18"/>
+                <w:szCs w:val="18"/>
+              </w:rPr>
+              <w:t xml:space="preserve">Cierra la tarea 4: bitácora, panel y memoria</w:t>
+            </w:r>
+          </w:p>
+        </w:tc>
+        <w:tc>
+          <w:tcPr>
+            <w:tcW w:type="dxa" w:w="1933"/>
+            <w:tcMar>
+              <w:top w:type="dxa" w:w="60"/>
+              <w:left w:type="dxa" w:w="100"/>
+              <w:bottom w:type="dxa" w:w="60"/>
+              <w:right w:type="dxa" w:w="100"/>
+            </w:tcMar>
+          </w:tcPr>
+          <w:p>
+            <w:pPr>
+              <w:spacing w:after="0" w:before="0" w:line="252"/>
+            </w:pPr>
+            <w:r>
+              <w:rPr>
+                <w:rFonts w:ascii="Calibri" w:cs="Calibri" w:eastAsia="Calibri" w:hAnsi="Calibri"/>
+                <w:sz w:val="18"/>
+                <w:szCs w:val="18"/>
+              </w:rPr>
+              <w:t xml:space="preserve">Tarea 4 cerrada</w:t>
+            </w:r>
+          </w:p>
+        </w:tc>
+      </w:tr>
+    </w:tbl>
+    <w:p>
+      <w:pPr>
+        <w:spacing w:after="120"/>
+      </w:pPr>
+    </w:p>
+    <w:p>
+      <w:pPr>
         <w:pStyle w:val="Heading2"/>
         <w:keepNext/>
       </w:pPr>
@@ -18726,9 +20350,9 @@
         </w:tblBorders>
       </w:tblPr>
       <w:tblGrid>
-        <w:gridCol w:w="4746"/>
-        <w:gridCol w:w="2407"/>
-        <w:gridCol w:w="1917"/>
+        <w:gridCol w:w="4403"/>
+        <w:gridCol w:w="2384"/>
+        <w:gridCol w:w="2283"/>
       </w:tblGrid>
       <w:tr>
         <w:trPr>
@@ -18736,7 +20360,7 @@
         </w:trPr>
         <w:tc>
           <w:tcPr>
-            <w:tcW w:type="dxa" w:w="4746"/>
+            <w:tcW w:type="dxa" w:w="4403"/>
             <w:shd w:fill="E3EEEA" w:color="auto" w:val="clear"/>
             <w:tcMar>
               <w:top w:type="dxa" w:w="60"/>
@@ -18763,7 +20387,7 @@
         </w:tc>
         <w:tc>
           <w:tcPr>
-            <w:tcW w:type="dxa" w:w="2407"/>
+            <w:tcW w:type="dxa" w:w="2384"/>
             <w:shd w:fill="E3EEEA" w:color="auto" w:val="clear"/>
             <w:tcMar>
               <w:top w:type="dxa" w:w="60"/>
@@ -18790,7 +20414,7 @@
         </w:tc>
         <w:tc>
           <w:tcPr>
-            <w:tcW w:type="dxa" w:w="1917"/>
+            <w:tcW w:type="dxa" w:w="2283"/>
             <w:shd w:fill="E3EEEA" w:color="auto" w:val="clear"/>
             <w:tcMar>
               <w:top w:type="dxa" w:w="60"/>
@@ -18822,7 +20446,7 @@
         </w:trPr>
         <w:tc>
           <w:tcPr>
-            <w:tcW w:type="dxa" w:w="4746"/>
+            <w:tcW w:type="dxa" w:w="4403"/>
             <w:tcMar>
               <w:top w:type="dxa" w:w="60"/>
               <w:left w:type="dxa" w:w="100"/>
@@ -18846,7 +20470,7 @@
         </w:tc>
         <w:tc>
           <w:tcPr>
-            <w:tcW w:type="dxa" w:w="2407"/>
+            <w:tcW w:type="dxa" w:w="2384"/>
             <w:tcMar>
               <w:top w:type="dxa" w:w="60"/>
               <w:left w:type="dxa" w:w="100"/>
@@ -18870,7 +20494,7 @@
         </w:tc>
         <w:tc>
           <w:tcPr>
-            <w:tcW w:type="dxa" w:w="1917"/>
+            <w:tcW w:type="dxa" w:w="2283"/>
             <w:tcMar>
               <w:top w:type="dxa" w:w="60"/>
               <w:left w:type="dxa" w:w="100"/>
@@ -18899,7 +20523,7 @@
         </w:trPr>
         <w:tc>
           <w:tcPr>
-            <w:tcW w:type="dxa" w:w="4746"/>
+            <w:tcW w:type="dxa" w:w="4403"/>
             <w:tcMar>
               <w:top w:type="dxa" w:w="60"/>
               <w:left w:type="dxa" w:w="100"/>
@@ -18923,7 +20547,7 @@
         </w:tc>
         <w:tc>
           <w:tcPr>
-            <w:tcW w:type="dxa" w:w="2407"/>
+            <w:tcW w:type="dxa" w:w="2384"/>
             <w:tcMar>
               <w:top w:type="dxa" w:w="60"/>
               <w:left w:type="dxa" w:w="100"/>
@@ -18947,7 +20571,7 @@
         </w:tc>
         <w:tc>
           <w:tcPr>
-            <w:tcW w:type="dxa" w:w="1917"/>
+            <w:tcW w:type="dxa" w:w="2283"/>
             <w:tcMar>
               <w:top w:type="dxa" w:w="60"/>
               <w:left w:type="dxa" w:w="100"/>
@@ -18976,7 +20600,7 @@
         </w:trPr>
         <w:tc>
           <w:tcPr>
-            <w:tcW w:type="dxa" w:w="4746"/>
+            <w:tcW w:type="dxa" w:w="4403"/>
             <w:tcMar>
               <w:top w:type="dxa" w:w="60"/>
               <w:left w:type="dxa" w:w="100"/>
@@ -19009,7 +20633,7 @@
         </w:tc>
         <w:tc>
           <w:tcPr>
-            <w:tcW w:type="dxa" w:w="2407"/>
+            <w:tcW w:type="dxa" w:w="2384"/>
             <w:tcMar>
               <w:top w:type="dxa" w:w="60"/>
               <w:left w:type="dxa" w:w="100"/>
@@ -19033,7 +20657,7 @@
         </w:tc>
         <w:tc>
           <w:tcPr>
-            <w:tcW w:type="dxa" w:w="1917"/>
+            <w:tcW w:type="dxa" w:w="2283"/>
             <w:tcMar>
               <w:top w:type="dxa" w:w="60"/>
               <w:left w:type="dxa" w:w="100"/>
@@ -19062,7 +20686,7 @@
         </w:trPr>
         <w:tc>
           <w:tcPr>
-            <w:tcW w:type="dxa" w:w="4746"/>
+            <w:tcW w:type="dxa" w:w="4403"/>
             <w:tcMar>
               <w:top w:type="dxa" w:w="60"/>
               <w:left w:type="dxa" w:w="100"/>
@@ -19095,7 +20719,7 @@
         </w:tc>
         <w:tc>
           <w:tcPr>
-            <w:tcW w:type="dxa" w:w="2407"/>
+            <w:tcW w:type="dxa" w:w="2384"/>
             <w:tcMar>
               <w:top w:type="dxa" w:w="60"/>
               <w:left w:type="dxa" w:w="100"/>
@@ -19119,7 +20743,7 @@
         </w:tc>
         <w:tc>
           <w:tcPr>
-            <w:tcW w:type="dxa" w:w="1917"/>
+            <w:tcW w:type="dxa" w:w="2283"/>
             <w:tcMar>
               <w:top w:type="dxa" w:w="60"/>
               <w:left w:type="dxa" w:w="100"/>
@@ -19148,7 +20772,7 @@
         </w:trPr>
         <w:tc>
           <w:tcPr>
-            <w:tcW w:type="dxa" w:w="4746"/>
+            <w:tcW w:type="dxa" w:w="4403"/>
             <w:tcMar>
               <w:top w:type="dxa" w:w="60"/>
               <w:left w:type="dxa" w:w="100"/>
@@ -19181,7 +20805,7 @@
         </w:tc>
         <w:tc>
           <w:tcPr>
-            <w:tcW w:type="dxa" w:w="2407"/>
+            <w:tcW w:type="dxa" w:w="2384"/>
             <w:tcMar>
               <w:top w:type="dxa" w:w="60"/>
               <w:left w:type="dxa" w:w="100"/>
@@ -19205,7 +20829,7 @@
         </w:tc>
         <w:tc>
           <w:tcPr>
-            <w:tcW w:type="dxa" w:w="1917"/>
+            <w:tcW w:type="dxa" w:w="2283"/>
             <w:tcMar>
               <w:top w:type="dxa" w:w="60"/>
               <w:left w:type="dxa" w:w="100"/>
@@ -19224,6 +20848,100 @@
                 <w:szCs w:val="18"/>
               </w:rPr>
               <w:t xml:space="preserve">Bloqueado</w:t>
+            </w:r>
+          </w:p>
+        </w:tc>
+      </w:tr>
+      <w:tr>
+        <w:trPr>
+          <w:cantSplit/>
+        </w:trPr>
+        <w:tc>
+          <w:tcPr>
+            <w:tcW w:type="dxa" w:w="4403"/>
+            <w:tcMar>
+              <w:top w:type="dxa" w:w="60"/>
+              <w:left w:type="dxa" w:w="100"/>
+              <w:bottom w:type="dxa" w:w="60"/>
+              <w:right w:type="dxa" w:w="100"/>
+            </w:tcMar>
+          </w:tcPr>
+          <w:p>
+            <w:pPr>
+              <w:spacing w:after="0" w:before="0" w:line="252"/>
+            </w:pPr>
+            <w:r>
+              <w:rPr>
+                <w:rFonts w:ascii="Calibri" w:cs="Calibri" w:eastAsia="Calibri" w:hAnsi="Calibri"/>
+                <w:sz w:val="18"/>
+                <w:szCs w:val="18"/>
+              </w:rPr>
+              <w:t xml:space="preserve">Sandbox no disponible en el contenedor (tarea 4)</w:t>
+            </w:r>
+          </w:p>
+        </w:tc>
+        <w:tc>
+          <w:tcPr>
+            <w:tcW w:type="dxa" w:w="2384"/>
+            <w:tcMar>
+              <w:top w:type="dxa" w:w="60"/>
+              <w:left w:type="dxa" w:w="100"/>
+              <w:bottom w:type="dxa" w:w="60"/>
+              <w:right w:type="dxa" w:w="100"/>
+            </w:tcMar>
+          </w:tcPr>
+          <w:p>
+            <w:pPr>
+              <w:spacing w:after="0" w:before="0" w:line="252"/>
+            </w:pPr>
+            <w:r>
+              <w:rPr>
+                <w:rFonts w:ascii="Calibri" w:cs="Calibri" w:eastAsia="Calibri" w:hAnsi="Calibri"/>
+                <w:sz w:val="18"/>
+                <w:szCs w:val="18"/>
+              </w:rPr>
+              <w:t xml:space="preserve">5 · Sandbox (</w:t>
+            </w:r>
+            <w:r>
+              <w:rPr>
+                <w:rFonts w:ascii="Consolas" w:cs="Consolas" w:eastAsia="Consolas" w:hAnsi="Consolas"/>
+                <w:color w:val="2E3A36"/>
+                <w:sz w:val="16"/>
+                <w:szCs w:val="16"/>
+              </w:rPr>
+              <w:t xml:space="preserve">failIfUnavailable</w:t>
+            </w:r>
+            <w:r>
+              <w:rPr>
+                <w:rFonts w:ascii="Calibri" w:cs="Calibri" w:eastAsia="Calibri" w:hAnsi="Calibri"/>
+                <w:sz w:val="18"/>
+                <w:szCs w:val="18"/>
+              </w:rPr>
+              <w:t xml:space="preserve">)</w:t>
+            </w:r>
+          </w:p>
+        </w:tc>
+        <w:tc>
+          <w:tcPr>
+            <w:tcW w:type="dxa" w:w="2283"/>
+            <w:tcMar>
+              <w:top w:type="dxa" w:w="60"/>
+              <w:left w:type="dxa" w:w="100"/>
+              <w:bottom w:type="dxa" w:w="60"/>
+              <w:right w:type="dxa" w:w="100"/>
+            </w:tcMar>
+          </w:tcPr>
+          <w:p>
+            <w:pPr>
+              <w:spacing w:after="0" w:before="0" w:line="252"/>
+            </w:pPr>
+            <w:r>
+              <w:rPr>
+                <w:rFonts w:ascii="Calibri" w:cs="Calibri" w:eastAsia="Calibri" w:hAnsi="Calibri"/>
+                <w:sz w:val="18"/>
+                <w:szCs w:val="18"/>
+              </w:rPr>
+              <w:t xml:space="preserve">Ningún comando se ejecuta; el agente no busca rodeos</w:t>
             </w:r>
           </w:p>
         </w:tc>
@@ -19847,10 +21565,10 @@
         </w:tblBorders>
       </w:tblPr>
       <w:tblGrid>
-        <w:gridCol w:w="1903"/>
-        <w:gridCol w:w="1814"/>
-        <w:gridCol w:w="1932"/>
-        <w:gridCol w:w="3421"/>
+        <w:gridCol w:w="1885"/>
+        <w:gridCol w:w="1850"/>
+        <w:gridCol w:w="1963"/>
+        <w:gridCol w:w="3372"/>
       </w:tblGrid>
       <w:tr>
         <w:trPr>
@@ -19858,7 +21576,7 @@
         </w:trPr>
         <w:tc>
           <w:tcPr>
-            <w:tcW w:type="dxa" w:w="1903"/>
+            <w:tcW w:type="dxa" w:w="1885"/>
             <w:shd w:fill="E3EEEA" w:color="auto" w:val="clear"/>
             <w:tcMar>
               <w:top w:type="dxa" w:w="60"/>
@@ -19885,7 +21603,7 @@
         </w:tc>
         <w:tc>
           <w:tcPr>
-            <w:tcW w:type="dxa" w:w="1814"/>
+            <w:tcW w:type="dxa" w:w="1850"/>
             <w:shd w:fill="E3EEEA" w:color="auto" w:val="clear"/>
             <w:tcMar>
               <w:top w:type="dxa" w:w="60"/>
@@ -19912,7 +21630,7 @@
         </w:tc>
         <w:tc>
           <w:tcPr>
-            <w:tcW w:type="dxa" w:w="1932"/>
+            <w:tcW w:type="dxa" w:w="1963"/>
             <w:shd w:fill="E3EEEA" w:color="auto" w:val="clear"/>
             <w:tcMar>
               <w:top w:type="dxa" w:w="60"/>
@@ -19939,7 +21657,7 @@
         </w:tc>
         <w:tc>
           <w:tcPr>
-            <w:tcW w:type="dxa" w:w="3421"/>
+            <w:tcW w:type="dxa" w:w="3372"/>
             <w:shd w:fill="E3EEEA" w:color="auto" w:val="clear"/>
             <w:tcMar>
               <w:top w:type="dxa" w:w="60"/>
@@ -19971,7 +21689,7 @@
         </w:trPr>
         <w:tc>
           <w:tcPr>
-            <w:tcW w:type="dxa" w:w="1903"/>
+            <w:tcW w:type="dxa" w:w="1885"/>
             <w:tcMar>
               <w:top w:type="dxa" w:w="60"/>
               <w:left w:type="dxa" w:w="100"/>
@@ -20012,7 +21730,7 @@
         </w:tc>
         <w:tc>
           <w:tcPr>
-            <w:tcW w:type="dxa" w:w="1814"/>
+            <w:tcW w:type="dxa" w:w="1850"/>
             <w:tcMar>
               <w:top w:type="dxa" w:w="60"/>
               <w:left w:type="dxa" w:w="100"/>
@@ -20045,7 +21763,7 @@
         </w:tc>
         <w:tc>
           <w:tcPr>
-            <w:tcW w:type="dxa" w:w="1932"/>
+            <w:tcW w:type="dxa" w:w="1963"/>
             <w:tcMar>
               <w:top w:type="dxa" w:w="60"/>
               <w:left w:type="dxa" w:w="100"/>
@@ -20078,7 +21796,7 @@
         </w:tc>
         <w:tc>
           <w:tcPr>
-            <w:tcW w:type="dxa" w:w="3421"/>
+            <w:tcW w:type="dxa" w:w="3372"/>
             <w:tcMar>
               <w:top w:type="dxa" w:w="60"/>
               <w:left w:type="dxa" w:w="100"/>
@@ -20107,7 +21825,7 @@
         </w:trPr>
         <w:tc>
           <w:tcPr>
-            <w:tcW w:type="dxa" w:w="1903"/>
+            <w:tcW w:type="dxa" w:w="1885"/>
             <w:tcMar>
               <w:top w:type="dxa" w:w="60"/>
               <w:left w:type="dxa" w:w="100"/>
@@ -20131,7 +21849,7 @@
         </w:tc>
         <w:tc>
           <w:tcPr>
-            <w:tcW w:type="dxa" w:w="1814"/>
+            <w:tcW w:type="dxa" w:w="1850"/>
             <w:tcMar>
               <w:top w:type="dxa" w:w="60"/>
               <w:left w:type="dxa" w:w="100"/>
@@ -20155,7 +21873,7 @@
         </w:tc>
         <w:tc>
           <w:tcPr>
-            <w:tcW w:type="dxa" w:w="1932"/>
+            <w:tcW w:type="dxa" w:w="1963"/>
             <w:tcMar>
               <w:top w:type="dxa" w:w="60"/>
               <w:left w:type="dxa" w:w="100"/>
@@ -20179,7 +21897,7 @@
         </w:tc>
         <w:tc>
           <w:tcPr>
-            <w:tcW w:type="dxa" w:w="3421"/>
+            <w:tcW w:type="dxa" w:w="3372"/>
             <w:tcMar>
               <w:top w:type="dxa" w:w="60"/>
               <w:left w:type="dxa" w:w="100"/>
@@ -20208,7 +21926,7 @@
         </w:trPr>
         <w:tc>
           <w:tcPr>
-            <w:tcW w:type="dxa" w:w="1903"/>
+            <w:tcW w:type="dxa" w:w="1885"/>
             <w:tcMar>
               <w:top w:type="dxa" w:w="60"/>
               <w:left w:type="dxa" w:w="100"/>
@@ -20232,7 +21950,7 @@
         </w:tc>
         <w:tc>
           <w:tcPr>
-            <w:tcW w:type="dxa" w:w="1814"/>
+            <w:tcW w:type="dxa" w:w="1850"/>
             <w:tcMar>
               <w:top w:type="dxa" w:w="60"/>
               <w:left w:type="dxa" w:w="100"/>
@@ -20256,7 +21974,7 @@
         </w:tc>
         <w:tc>
           <w:tcPr>
-            <w:tcW w:type="dxa" w:w="1932"/>
+            <w:tcW w:type="dxa" w:w="1963"/>
             <w:tcMar>
               <w:top w:type="dxa" w:w="60"/>
               <w:left w:type="dxa" w:w="100"/>
@@ -20280,7 +21998,7 @@
         </w:tc>
         <w:tc>
           <w:tcPr>
-            <w:tcW w:type="dxa" w:w="3421"/>
+            <w:tcW w:type="dxa" w:w="3372"/>
             <w:tcMar>
               <w:top w:type="dxa" w:w="60"/>
               <w:left w:type="dxa" w:w="100"/>
@@ -20309,7 +22027,7 @@
         </w:trPr>
         <w:tc>
           <w:tcPr>
-            <w:tcW w:type="dxa" w:w="1903"/>
+            <w:tcW w:type="dxa" w:w="1885"/>
             <w:tcMar>
               <w:top w:type="dxa" w:w="60"/>
               <w:left w:type="dxa" w:w="100"/>
@@ -20333,7 +22051,7 @@
         </w:tc>
         <w:tc>
           <w:tcPr>
-            <w:tcW w:type="dxa" w:w="1814"/>
+            <w:tcW w:type="dxa" w:w="1850"/>
             <w:tcMar>
               <w:top w:type="dxa" w:w="60"/>
               <w:left w:type="dxa" w:w="100"/>
@@ -20357,7 +22075,7 @@
         </w:tc>
         <w:tc>
           <w:tcPr>
-            <w:tcW w:type="dxa" w:w="1932"/>
+            <w:tcW w:type="dxa" w:w="1963"/>
             <w:tcMar>
               <w:top w:type="dxa" w:w="60"/>
               <w:left w:type="dxa" w:w="100"/>
@@ -20381,7 +22099,7 @@
         </w:tc>
         <w:tc>
           <w:tcPr>
-            <w:tcW w:type="dxa" w:w="3421"/>
+            <w:tcW w:type="dxa" w:w="3372"/>
             <w:tcMar>
               <w:top w:type="dxa" w:w="60"/>
               <w:left w:type="dxa" w:w="100"/>
@@ -20410,7 +22128,7 @@
         </w:trPr>
         <w:tc>
           <w:tcPr>
-            <w:tcW w:type="dxa" w:w="1903"/>
+            <w:tcW w:type="dxa" w:w="1885"/>
             <w:tcMar>
               <w:top w:type="dxa" w:w="60"/>
               <w:left w:type="dxa" w:w="100"/>
@@ -20434,7 +22152,7 @@
         </w:tc>
         <w:tc>
           <w:tcPr>
-            <w:tcW w:type="dxa" w:w="1814"/>
+            <w:tcW w:type="dxa" w:w="1850"/>
             <w:tcMar>
               <w:top w:type="dxa" w:w="60"/>
               <w:left w:type="dxa" w:w="100"/>
@@ -20467,7 +22185,7 @@
         </w:tc>
         <w:tc>
           <w:tcPr>
-            <w:tcW w:type="dxa" w:w="1932"/>
+            <w:tcW w:type="dxa" w:w="1963"/>
             <w:tcMar>
               <w:top w:type="dxa" w:w="60"/>
               <w:left w:type="dxa" w:w="100"/>
@@ -20491,7 +22209,7 @@
         </w:tc>
         <w:tc>
           <w:tcPr>
-            <w:tcW w:type="dxa" w:w="3421"/>
+            <w:tcW w:type="dxa" w:w="3372"/>
             <w:tcMar>
               <w:top w:type="dxa" w:w="60"/>
               <w:left w:type="dxa" w:w="100"/>
@@ -20520,7 +22238,7 @@
         </w:trPr>
         <w:tc>
           <w:tcPr>
-            <w:tcW w:type="dxa" w:w="1903"/>
+            <w:tcW w:type="dxa" w:w="1885"/>
             <w:tcMar>
               <w:top w:type="dxa" w:w="60"/>
               <w:left w:type="dxa" w:w="100"/>
@@ -20544,7 +22262,7 @@
         </w:tc>
         <w:tc>
           <w:tcPr>
-            <w:tcW w:type="dxa" w:w="1814"/>
+            <w:tcW w:type="dxa" w:w="1850"/>
             <w:tcMar>
               <w:top w:type="dxa" w:w="60"/>
               <w:left w:type="dxa" w:w="100"/>
@@ -20568,7 +22286,7 @@
         </w:tc>
         <w:tc>
           <w:tcPr>
-            <w:tcW w:type="dxa" w:w="1932"/>
+            <w:tcW w:type="dxa" w:w="1963"/>
             <w:tcMar>
               <w:top w:type="dxa" w:w="60"/>
               <w:left w:type="dxa" w:w="100"/>
@@ -20592,7 +22310,7 @@
         </w:tc>
         <w:tc>
           <w:tcPr>
-            <w:tcW w:type="dxa" w:w="3421"/>
+            <w:tcW w:type="dxa" w:w="3372"/>
             <w:tcMar>
               <w:top w:type="dxa" w:w="60"/>
               <w:left w:type="dxa" w:w="100"/>
@@ -20611,6 +22329,262 @@
                 <w:szCs w:val="18"/>
               </w:rPr>
               <w:t xml:space="preserve">Los metadatos de la respuesta (coste 0) bastan para el diagnóstico</w:t>
+            </w:r>
+          </w:p>
+        </w:tc>
+      </w:tr>
+      <w:tr>
+        <w:trPr>
+          <w:cantSplit/>
+        </w:trPr>
+        <w:tc>
+          <w:tcPr>
+            <w:tcW w:type="dxa" w:w="1885"/>
+            <w:tcMar>
+              <w:top w:type="dxa" w:w="60"/>
+              <w:left w:type="dxa" w:w="100"/>
+              <w:bottom w:type="dxa" w:w="60"/>
+              <w:right w:type="dxa" w:w="100"/>
+            </w:tcMar>
+          </w:tcPr>
+          <w:p>
+            <w:pPr>
+              <w:spacing w:after="0" w:before="0" w:line="252"/>
+            </w:pPr>
+            <w:r>
+              <w:rPr>
+                <w:rFonts w:ascii="Calibri" w:cs="Calibri" w:eastAsia="Calibri" w:hAnsi="Calibri"/>
+                <w:sz w:val="18"/>
+                <w:szCs w:val="18"/>
+              </w:rPr>
+              <w:t xml:space="preserve">Rutas </w:t>
+            </w:r>
+            <w:r>
+              <w:rPr>
+                <w:rFonts w:ascii="Consolas" w:cs="Consolas" w:eastAsia="Consolas" w:hAnsi="Consolas"/>
+                <w:color w:val="2E3A36"/>
+                <w:sz w:val="16"/>
+                <w:szCs w:val="16"/>
+              </w:rPr>
+              <w:t xml:space="preserve">/v1</w:t>
+            </w:r>
+            <w:r>
+              <w:rPr>
+                <w:rFonts w:ascii="Calibri" w:cs="Calibri" w:eastAsia="Calibri" w:hAnsi="Calibri"/>
+                <w:sz w:val="18"/>
+                <w:szCs w:val="18"/>
+              </w:rPr>
+              <w:t xml:space="preserve"> en la respuesta al issue</w:t>
+            </w:r>
+          </w:p>
+        </w:tc>
+        <w:tc>
+          <w:tcPr>
+            <w:tcW w:type="dxa" w:w="1850"/>
+            <w:tcMar>
+              <w:top w:type="dxa" w:w="60"/>
+              <w:left w:type="dxa" w:w="100"/>
+              <w:bottom w:type="dxa" w:w="60"/>
+              <w:right w:type="dxa" w:w="100"/>
+            </w:tcMar>
+          </w:tcPr>
+          <w:p>
+            <w:pPr>
+              <w:spacing w:after="0" w:before="0" w:line="252"/>
+            </w:pPr>
+            <w:r>
+              <w:rPr>
+                <w:rFonts w:ascii="Calibri" w:cs="Calibri" w:eastAsia="Calibri" w:hAnsi="Calibri"/>
+                <w:sz w:val="18"/>
+                <w:szCs w:val="18"/>
+              </w:rPr>
+              <w:t xml:space="preserve">Error del asistente al redactarla</w:t>
+            </w:r>
+          </w:p>
+        </w:tc>
+        <w:tc>
+          <w:tcPr>
+            <w:tcW w:type="dxa" w:w="1963"/>
+            <w:tcMar>
+              <w:top w:type="dxa" w:w="60"/>
+              <w:left w:type="dxa" w:w="100"/>
+              <w:bottom w:type="dxa" w:w="60"/>
+              <w:right w:type="dxa" w:w="100"/>
+            </w:tcMar>
+          </w:tcPr>
+          <w:p>
+            <w:pPr>
+              <w:spacing w:after="0" w:before="0" w:line="252"/>
+            </w:pPr>
+            <w:r>
+              <w:rPr>
+                <w:rFonts w:ascii="Calibri" w:cs="Calibri" w:eastAsia="Calibri" w:hAnsi="Calibri"/>
+                <w:sz w:val="18"/>
+                <w:szCs w:val="18"/>
+              </w:rPr>
+              <w:t xml:space="preserve">Corregir el comentario a </w:t>
+            </w:r>
+            <w:r>
+              <w:rPr>
+                <w:rFonts w:ascii="Consolas" w:cs="Consolas" w:eastAsia="Consolas" w:hAnsi="Consolas"/>
+                <w:color w:val="2E3A36"/>
+                <w:sz w:val="16"/>
+                <w:szCs w:val="16"/>
+              </w:rPr>
+              <w:t xml:space="preserve">/api/v1</w:t>
+            </w:r>
+          </w:p>
+        </w:tc>
+        <w:tc>
+          <w:tcPr>
+            <w:tcW w:type="dxa" w:w="3372"/>
+            <w:tcMar>
+              <w:top w:type="dxa" w:w="60"/>
+              <w:left w:type="dxa" w:w="100"/>
+              <w:bottom w:type="dxa" w:w="60"/>
+              <w:right w:type="dxa" w:w="100"/>
+            </w:tcMar>
+          </w:tcPr>
+          <w:p>
+            <w:pPr>
+              <w:spacing w:after="0" w:before="0" w:line="252"/>
+            </w:pPr>
+            <w:r>
+              <w:rPr>
+                <w:rFonts w:ascii="Calibri" w:cs="Calibri" w:eastAsia="Calibri" w:hAnsi="Calibri"/>
+                <w:sz w:val="18"/>
+                <w:szCs w:val="18"/>
+              </w:rPr>
+              <w:t xml:space="preserve">Las respuestas a una petición deben contrastarse con </w:t>
+            </w:r>
+            <w:r>
+              <w:rPr>
+                <w:rFonts w:ascii="Consolas" w:cs="Consolas" w:eastAsia="Consolas" w:hAnsi="Consolas"/>
+                <w:color w:val="2E3A36"/>
+                <w:sz w:val="16"/>
+                <w:szCs w:val="16"/>
+              </w:rPr>
+              <w:t xml:space="preserve">AGENTS.md</w:t>
+            </w:r>
+          </w:p>
+        </w:tc>
+      </w:tr>
+      <w:tr>
+        <w:trPr>
+          <w:cantSplit/>
+        </w:trPr>
+        <w:tc>
+          <w:tcPr>
+            <w:tcW w:type="dxa" w:w="1885"/>
+            <w:tcMar>
+              <w:top w:type="dxa" w:w="60"/>
+              <w:left w:type="dxa" w:w="100"/>
+              <w:bottom w:type="dxa" w:w="60"/>
+              <w:right w:type="dxa" w:w="100"/>
+            </w:tcMar>
+          </w:tcPr>
+          <w:p>
+            <w:pPr>
+              <w:spacing w:after="0" w:before="0" w:line="252"/>
+            </w:pPr>
+            <w:r>
+              <w:rPr>
+                <w:rFonts w:ascii="Calibri" w:cs="Calibri" w:eastAsia="Calibri" w:hAnsi="Calibri"/>
+                <w:sz w:val="18"/>
+                <w:szCs w:val="18"/>
+              </w:rPr>
+              <w:t xml:space="preserve">Sandbox sin </w:t>
+            </w:r>
+            <w:r>
+              <w:rPr>
+                <w:rFonts w:ascii="Calibri" w:cs="Calibri" w:eastAsia="Calibri" w:hAnsi="Calibri"/>
+                <w:i/>
+                <w:iCs/>
+                <w:sz w:val="18"/>
+                <w:szCs w:val="18"/>
+              </w:rPr>
+              <w:t xml:space="preserve">user namespaces</w:t>
+            </w:r>
+          </w:p>
+        </w:tc>
+        <w:tc>
+          <w:tcPr>
+            <w:tcW w:type="dxa" w:w="1850"/>
+            <w:tcMar>
+              <w:top w:type="dxa" w:w="60"/>
+              <w:left w:type="dxa" w:w="100"/>
+              <w:bottom w:type="dxa" w:w="60"/>
+              <w:right w:type="dxa" w:w="100"/>
+            </w:tcMar>
+          </w:tcPr>
+          <w:p>
+            <w:pPr>
+              <w:spacing w:after="0" w:before="0" w:line="252"/>
+            </w:pPr>
+            <w:r>
+              <w:rPr>
+                <w:rFonts w:ascii="Calibri" w:cs="Calibri" w:eastAsia="Calibri" w:hAnsi="Calibri"/>
+                <w:sz w:val="18"/>
+                <w:szCs w:val="18"/>
+              </w:rPr>
+              <w:t xml:space="preserve">Perfil seccomp por defecto de Docker</w:t>
+            </w:r>
+          </w:p>
+        </w:tc>
+        <w:tc>
+          <w:tcPr>
+            <w:tcW w:type="dxa" w:w="1963"/>
+            <w:tcMar>
+              <w:top w:type="dxa" w:w="60"/>
+              <w:left w:type="dxa" w:w="100"/>
+              <w:bottom w:type="dxa" w:w="60"/>
+              <w:right w:type="dxa" w:w="100"/>
+            </w:tcMar>
+          </w:tcPr>
+          <w:p>
+            <w:pPr>
+              <w:spacing w:after="0" w:before="0" w:line="252"/>
+            </w:pPr>
+            <w:r>
+              <w:rPr>
+                <w:rFonts w:ascii="Consolas" w:cs="Consolas" w:eastAsia="Consolas" w:hAnsi="Consolas"/>
+                <w:color w:val="2E3A36"/>
+                <w:sz w:val="16"/>
+                <w:szCs w:val="16"/>
+              </w:rPr>
+              <w:t xml:space="preserve">seccomp=unconfined</w:t>
+            </w:r>
+            <w:r>
+              <w:rPr>
+                <w:rFonts w:ascii="Calibri" w:cs="Calibri" w:eastAsia="Calibri" w:hAnsi="Calibri"/>
+                <w:sz w:val="18"/>
+                <w:szCs w:val="18"/>
+              </w:rPr>
+              <w:t xml:space="preserve"> en el devcontainer</w:t>
+            </w:r>
+          </w:p>
+        </w:tc>
+        <w:tc>
+          <w:tcPr>
+            <w:tcW w:type="dxa" w:w="3372"/>
+            <w:tcMar>
+              <w:top w:type="dxa" w:w="60"/>
+              <w:left w:type="dxa" w:w="100"/>
+              <w:bottom w:type="dxa" w:w="60"/>
+              <w:right w:type="dxa" w:w="100"/>
+            </w:tcMar>
+          </w:tcPr>
+          <w:p>
+            <w:pPr>
+              <w:spacing w:after="0" w:before="0" w:line="252"/>
+            </w:pPr>
+            <w:r>
+              <w:rPr>
+                <w:rFonts w:ascii="Calibri" w:cs="Calibri" w:eastAsia="Calibri" w:hAnsi="Calibri"/>
+                <w:sz w:val="18"/>
+                <w:szCs w:val="18"/>
+              </w:rPr>
+              <w:t xml:space="preserve">Una capa sin probar en ejecución real puede estar rota; el fallo seguro lo hizo visible</w:t>
             </w:r>
           </w:p>
         </w:tc>
@@ -20646,8 +22620,8 @@
         </w:tblBorders>
       </w:tblPr>
       <w:tblGrid>
-        <w:gridCol w:w="4973"/>
-        <w:gridCol w:w="4097"/>
+        <w:gridCol w:w="4762"/>
+        <w:gridCol w:w="4308"/>
       </w:tblGrid>
       <w:tr>
         <w:trPr>
@@ -20655,7 +22629,7 @@
         </w:trPr>
         <w:tc>
           <w:tcPr>
-            <w:tcW w:type="dxa" w:w="4973"/>
+            <w:tcW w:type="dxa" w:w="4762"/>
             <w:shd w:fill="E3EEEA" w:color="auto" w:val="clear"/>
             <w:tcMar>
               <w:top w:type="dxa" w:w="60"/>
@@ -20682,7 +22656,7 @@
         </w:tc>
         <w:tc>
           <w:tcPr>
-            <w:tcW w:type="dxa" w:w="4097"/>
+            <w:tcW w:type="dxa" w:w="4308"/>
             <w:shd w:fill="E3EEEA" w:color="auto" w:val="clear"/>
             <w:tcMar>
               <w:top w:type="dxa" w:w="60"/>
@@ -20714,7 +22688,7 @@
         </w:trPr>
         <w:tc>
           <w:tcPr>
-            <w:tcW w:type="dxa" w:w="4973"/>
+            <w:tcW w:type="dxa" w:w="4762"/>
             <w:tcMar>
               <w:top w:type="dxa" w:w="60"/>
               <w:left w:type="dxa" w:w="100"/>
@@ -20738,25 +22712,25 @@
         </w:tc>
         <w:tc>
           <w:tcPr>
-            <w:tcW w:type="dxa" w:w="4097"/>
-            <w:tcMar>
-              <w:top w:type="dxa" w:w="60"/>
-              <w:left w:type="dxa" w:w="100"/>
-              <w:bottom w:type="dxa" w:w="60"/>
-              <w:right w:type="dxa" w:w="100"/>
-            </w:tcMar>
-          </w:tcPr>
-          <w:p>
-            <w:pPr>
-              <w:spacing w:after="0" w:before="0" w:line="252"/>
-            </w:pPr>
-            <w:r>
-              <w:rPr>
-                <w:rFonts w:ascii="Calibri" w:cs="Calibri" w:eastAsia="Calibri" w:hAnsi="Calibri"/>
-                <w:sz w:val="18"/>
-                <w:szCs w:val="18"/>
-              </w:rPr>
-              <w:t xml:space="preserve">4 de 17 (1, 2, 3 y A)</w:t>
+            <w:tcW w:type="dxa" w:w="4308"/>
+            <w:tcMar>
+              <w:top w:type="dxa" w:w="60"/>
+              <w:left w:type="dxa" w:w="100"/>
+              <w:bottom w:type="dxa" w:w="60"/>
+              <w:right w:type="dxa" w:w="100"/>
+            </w:tcMar>
+          </w:tcPr>
+          <w:p>
+            <w:pPr>
+              <w:spacing w:after="0" w:before="0" w:line="252"/>
+            </w:pPr>
+            <w:r>
+              <w:rPr>
+                <w:rFonts w:ascii="Calibri" w:cs="Calibri" w:eastAsia="Calibri" w:hAnsi="Calibri"/>
+                <w:sz w:val="18"/>
+                <w:szCs w:val="18"/>
+              </w:rPr>
+              <w:t xml:space="preserve">5 de 17 (1, 2, 3, A y 4)</w:t>
             </w:r>
           </w:p>
         </w:tc>
@@ -20767,7 +22741,7 @@
         </w:trPr>
         <w:tc>
           <w:tcPr>
-            <w:tcW w:type="dxa" w:w="4973"/>
+            <w:tcW w:type="dxa" w:w="4762"/>
             <w:tcMar>
               <w:top w:type="dxa" w:w="60"/>
               <w:left w:type="dxa" w:w="100"/>
@@ -20791,25 +22765,25 @@
         </w:tc>
         <w:tc>
           <w:tcPr>
-            <w:tcW w:type="dxa" w:w="4097"/>
-            <w:tcMar>
-              <w:top w:type="dxa" w:w="60"/>
-              <w:left w:type="dxa" w:w="100"/>
-              <w:bottom w:type="dxa" w:w="60"/>
-              <w:right w:type="dxa" w:w="100"/>
-            </w:tcMar>
-          </w:tcPr>
-          <w:p>
-            <w:pPr>
-              <w:spacing w:after="0" w:before="0" w:line="252"/>
-            </w:pPr>
-            <w:r>
-              <w:rPr>
-                <w:rFonts w:ascii="Calibri" w:cs="Calibri" w:eastAsia="Calibri" w:hAnsi="Calibri"/>
-                <w:sz w:val="18"/>
-                <w:szCs w:val="18"/>
-              </w:rPr>
-              <w:t xml:space="preserve">8 (4 en core y 4 en app), más la documentación</w:t>
+            <w:tcW w:type="dxa" w:w="4308"/>
+            <w:tcMar>
+              <w:top w:type="dxa" w:w="60"/>
+              <w:left w:type="dxa" w:w="100"/>
+              <w:bottom w:type="dxa" w:w="60"/>
+              <w:right w:type="dxa" w:w="100"/>
+            </w:tcMar>
+          </w:tcPr>
+          <w:p>
+            <w:pPr>
+              <w:spacing w:after="0" w:before="0" w:line="252"/>
+            </w:pPr>
+            <w:r>
+              <w:rPr>
+                <w:rFonts w:ascii="Calibri" w:cs="Calibri" w:eastAsia="Calibri" w:hAnsi="Calibri"/>
+                <w:sz w:val="18"/>
+                <w:szCs w:val="18"/>
+              </w:rPr>
+              <w:t xml:space="preserve">11 (4 en core y 7 en app, uno de ellos del agente), más la documentación</w:t>
             </w:r>
           </w:p>
         </w:tc>
@@ -20820,7 +22794,7 @@
         </w:trPr>
         <w:tc>
           <w:tcPr>
-            <w:tcW w:type="dxa" w:w="4973"/>
+            <w:tcW w:type="dxa" w:w="4762"/>
             <w:tcMar>
               <w:top w:type="dxa" w:w="60"/>
               <w:left w:type="dxa" w:w="100"/>
@@ -20844,7 +22818,7 @@
         </w:tc>
         <w:tc>
           <w:tcPr>
-            <w:tcW w:type="dxa" w:w="4097"/>
+            <w:tcW w:type="dxa" w:w="4308"/>
             <w:tcMar>
               <w:top w:type="dxa" w:w="60"/>
               <w:left w:type="dxa" w:w="100"/>
@@ -20873,7 +22847,7 @@
         </w:trPr>
         <w:tc>
           <w:tcPr>
-            <w:tcW w:type="dxa" w:w="4973"/>
+            <w:tcW w:type="dxa" w:w="4762"/>
             <w:tcMar>
               <w:top w:type="dxa" w:w="60"/>
               <w:left w:type="dxa" w:w="100"/>
@@ -20897,25 +22871,25 @@
         </w:tc>
         <w:tc>
           <w:tcPr>
-            <w:tcW w:type="dxa" w:w="4097"/>
-            <w:tcMar>
-              <w:top w:type="dxa" w:w="60"/>
-              <w:left w:type="dxa" w:w="100"/>
-              <w:bottom w:type="dxa" w:w="60"/>
-              <w:right w:type="dxa" w:w="100"/>
-            </w:tcMar>
-          </w:tcPr>
-          <w:p>
-            <w:pPr>
-              <w:spacing w:after="0" w:before="0" w:line="252"/>
-            </w:pPr>
-            <w:r>
-              <w:rPr>
-                <w:rFonts w:ascii="Calibri" w:cs="Calibri" w:eastAsia="Calibri" w:hAnsi="Calibri"/>
-                <w:sz w:val="18"/>
-                <w:szCs w:val="18"/>
-              </w:rPr>
-              <w:t xml:space="preserve">43</w:t>
+            <w:tcW w:type="dxa" w:w="4308"/>
+            <w:tcMar>
+              <w:top w:type="dxa" w:w="60"/>
+              <w:left w:type="dxa" w:w="100"/>
+              <w:bottom w:type="dxa" w:w="60"/>
+              <w:right w:type="dxa" w:w="100"/>
+            </w:tcMar>
+          </w:tcPr>
+          <w:p>
+            <w:pPr>
+              <w:spacing w:after="0" w:before="0" w:line="252"/>
+            </w:pPr>
+            <w:r>
+              <w:rPr>
+                <w:rFonts w:ascii="Calibri" w:cs="Calibri" w:eastAsia="Calibri" w:hAnsi="Calibri"/>
+                <w:sz w:val="18"/>
+                <w:szCs w:val="18"/>
+              </w:rPr>
+              <w:t xml:space="preserve">48</w:t>
             </w:r>
           </w:p>
         </w:tc>
@@ -20926,7 +22900,7 @@
         </w:trPr>
         <w:tc>
           <w:tcPr>
-            <w:tcW w:type="dxa" w:w="4973"/>
+            <w:tcW w:type="dxa" w:w="4762"/>
             <w:tcMar>
               <w:top w:type="dxa" w:w="60"/>
               <w:left w:type="dxa" w:w="100"/>
@@ -20950,25 +22924,25 @@
         </w:tc>
         <w:tc>
           <w:tcPr>
-            <w:tcW w:type="dxa" w:w="4097"/>
-            <w:tcMar>
-              <w:top w:type="dxa" w:w="60"/>
-              <w:left w:type="dxa" w:w="100"/>
-              <w:bottom w:type="dxa" w:w="60"/>
-              <w:right w:type="dxa" w:w="100"/>
-            </w:tcMar>
-          </w:tcPr>
-          <w:p>
-            <w:pPr>
-              <w:spacing w:after="0" w:before="0" w:line="252"/>
-            </w:pPr>
-            <w:r>
-              <w:rPr>
-                <w:rFonts w:ascii="Calibri" w:cs="Calibri" w:eastAsia="Calibri" w:hAnsi="Calibri"/>
-                <w:sz w:val="18"/>
-                <w:szCs w:val="18"/>
-              </w:rPr>
-              <w:t xml:space="preserve">10</w:t>
+            <w:tcW w:type="dxa" w:w="4308"/>
+            <w:tcMar>
+              <w:top w:type="dxa" w:w="60"/>
+              <w:left w:type="dxa" w:w="100"/>
+              <w:bottom w:type="dxa" w:w="60"/>
+              <w:right w:type="dxa" w:w="100"/>
+            </w:tcMar>
+          </w:tcPr>
+          <w:p>
+            <w:pPr>
+              <w:spacing w:after="0" w:before="0" w:line="252"/>
+            </w:pPr>
+            <w:r>
+              <w:rPr>
+                <w:rFonts w:ascii="Calibri" w:cs="Calibri" w:eastAsia="Calibri" w:hAnsi="Calibri"/>
+                <w:sz w:val="18"/>
+                <w:szCs w:val="18"/>
+              </w:rPr>
+              <w:t xml:space="preserve">11</w:t>
             </w:r>
           </w:p>
         </w:tc>
@@ -20979,7 +22953,7 @@
         </w:trPr>
         <w:tc>
           <w:tcPr>
-            <w:tcW w:type="dxa" w:w="4973"/>
+            <w:tcW w:type="dxa" w:w="4762"/>
             <w:tcMar>
               <w:top w:type="dxa" w:w="60"/>
               <w:left w:type="dxa" w:w="100"/>
@@ -21003,7 +22977,7 @@
         </w:tc>
         <w:tc>
           <w:tcPr>
-            <w:tcW w:type="dxa" w:w="4097"/>
+            <w:tcW w:type="dxa" w:w="4308"/>
             <w:tcMar>
               <w:top w:type="dxa" w:w="60"/>
               <w:left w:type="dxa" w:w="100"/>
@@ -21047,7 +23021,7 @@
           <w:sz w:val="21"/>
           <w:szCs w:val="21"/>
         </w:rPr>
-        <w:t xml:space="preserve">Este capítulo se ampliará con las iteraciones y pruebas de las tareas 4 a 12 y B a E.</w:t>
+        <w:t xml:space="preserve">Este capítulo se ampliará con las iteraciones y pruebas de las tareas 5 a 12 y B a E.</w:t>
       </w:r>
     </w:p>
     <w:p>
@@ -22025,6 +23999,236 @@
     </w:p>
     <w:p>
       <w:pPr>
+        <w:pStyle w:val="Heading3"/>
+        <w:keepNext/>
+      </w:pPr>
+      <w:r>
+        <w:rPr>
+          <w:rFonts w:ascii="Calibri" w:cs="Calibri" w:eastAsia="Calibri" w:hAnsi="Calibri"/>
+        </w:rPr>
+        <w:t xml:space="preserve">Tarea 4. Spec Kit y especificación</w:t>
+      </w:r>
+    </w:p>
+    <w:p>
+      <w:pPr>
+        <w:pStyle w:val="ListParagraph"/>
+        <w:numPr>
+          <w:ilvl w:val="0"/>
+          <w:numId w:val="9"/>
+        </w:numPr>
+        <w:spacing w:after="60"/>
+      </w:pPr>
+      <w:r>
+        <w:rPr>
+          <w:rFonts w:ascii="Calibri" w:cs="Calibri" w:eastAsia="Calibri" w:hAnsi="Calibri"/>
+        </w:rPr>
+        <w:t xml:space="preserve">Responder en el issue las preguntas abiertas del triage y añadir la etiqueta </w:t>
+      </w:r>
+      <w:r>
+        <w:rPr>
+          <w:rFonts w:ascii="Consolas" w:cs="Consolas" w:eastAsia="Consolas" w:hAnsi="Consolas"/>
+          <w:color w:val="2E3A36"/>
+          <w:sz w:val="20"/>
+          <w:szCs w:val="20"/>
+        </w:rPr>
+        <w:t xml:space="preserve">aprobado</w:t>
+      </w:r>
+      <w:r>
+        <w:rPr>
+          <w:rFonts w:ascii="Calibri" w:cs="Calibri" w:eastAsia="Calibri" w:hAnsi="Calibri"/>
+        </w:rPr>
+        <w:t xml:space="preserve">.</w:t>
+      </w:r>
+    </w:p>
+    <w:p>
+      <w:pPr>
+        <w:pStyle w:val="ListParagraph"/>
+        <w:numPr>
+          <w:ilvl w:val="0"/>
+          <w:numId w:val="9"/>
+        </w:numPr>
+        <w:spacing w:after="60"/>
+      </w:pPr>
+      <w:r>
+        <w:rPr>
+          <w:rFonts w:ascii="Calibri" w:cs="Calibri" w:eastAsia="Calibri" w:hAnsi="Calibri"/>
+        </w:rPr>
+        <w:t xml:space="preserve">Añadir Spec Kit a app (lo hace una persona, en una rama propia) y revisar que el diff no toque la constitución, </w:t>
+      </w:r>
+      <w:r>
+        <w:rPr>
+          <w:rFonts w:ascii="Consolas" w:cs="Consolas" w:eastAsia="Consolas" w:hAnsi="Consolas"/>
+          <w:color w:val="2E3A36"/>
+          <w:sz w:val="20"/>
+          <w:szCs w:val="20"/>
+        </w:rPr>
+        <w:t xml:space="preserve">CLAUDE.md</w:t>
+      </w:r>
+      <w:r>
+        <w:rPr>
+          <w:rFonts w:ascii="Calibri" w:cs="Calibri" w:eastAsia="Calibri" w:hAnsi="Calibri"/>
+        </w:rPr>
+        <w:t xml:space="preserve"> ni </w:t>
+      </w:r>
+      <w:r>
+        <w:rPr>
+          <w:rFonts w:ascii="Consolas" w:cs="Consolas" w:eastAsia="Consolas" w:hAnsi="Consolas"/>
+          <w:color w:val="2E3A36"/>
+          <w:sz w:val="20"/>
+          <w:szCs w:val="20"/>
+        </w:rPr>
+        <w:t xml:space="preserve">settings.json</w:t>
+      </w:r>
+      <w:r>
+        <w:rPr>
+          <w:rFonts w:ascii="Calibri" w:cs="Calibri" w:eastAsia="Calibri" w:hAnsi="Calibri"/>
+        </w:rPr>
+        <w:t xml:space="preserve">:</w:t>
+      </w:r>
+    </w:p>
+    <w:p>
+      <w:pPr>
+        <w:shd w:fill="F2F4F3" w:color="auto" w:val="clear"/>
+        <w:spacing w:after="0" w:before="120" w:line="240"/>
+        <w:ind w:left="200" w:right="200"/>
+      </w:pPr>
+      <w:r>
+        <w:rPr>
+          <w:rFonts w:ascii="Consolas" w:cs="Consolas" w:eastAsia="Consolas" w:hAnsi="Consolas"/>
+          <w:color w:val="1F2A27"/>
+          <w:sz w:val="17"/>
+          <w:szCs w:val="17"/>
+        </w:rPr>
+        <w:t xml:space="preserve">uvx --from git+https://github.com/github/spec-kit.git@v1.1.0 \</w:t>
+      </w:r>
+    </w:p>
+    <w:p>
+      <w:pPr>
+        <w:shd w:fill="F2F4F3" w:color="auto" w:val="clear"/>
+        <w:spacing w:after="160" w:before="0" w:line="240"/>
+        <w:ind w:left="200" w:right="200"/>
+      </w:pPr>
+      <w:r>
+        <w:rPr>
+          <w:rFonts w:ascii="Consolas" w:cs="Consolas" w:eastAsia="Consolas" w:hAnsi="Consolas"/>
+          <w:color w:val="1F2A27"/>
+          <w:sz w:val="17"/>
+          <w:szCs w:val="17"/>
+        </w:rPr>
+        <w:t xml:space="preserve">  specify init --here --force --integration claude --script sh</w:t>
+      </w:r>
+    </w:p>
+    <w:p>
+      <w:pPr>
+        <w:pStyle w:val="ListParagraph"/>
+        <w:numPr>
+          <w:ilvl w:val="0"/>
+          <w:numId w:val="10"/>
+        </w:numPr>
+        <w:spacing w:after="60"/>
+      </w:pPr>
+      <w:r>
+        <w:rPr>
+          <w:rFonts w:ascii="Calibri" w:cs="Calibri" w:eastAsia="Calibri" w:hAnsi="Calibri"/>
+        </w:rPr>
+        <w:t xml:space="preserve">Arrancar el devcontainer con </w:t>
+      </w:r>
+      <w:r>
+        <w:rPr>
+          <w:rFonts w:ascii="Consolas" w:cs="Consolas" w:eastAsia="Consolas" w:hAnsi="Consolas"/>
+          <w:color w:val="2E3A36"/>
+          <w:sz w:val="20"/>
+          <w:szCs w:val="20"/>
+        </w:rPr>
+        <w:t xml:space="preserve">"runArgs": ["--security-opt", "seccomp=unconfined"]</w:t>
+      </w:r>
+      <w:r>
+        <w:rPr>
+          <w:rFonts w:ascii="Calibri" w:cs="Calibri" w:eastAsia="Calibri" w:hAnsi="Calibri"/>
+        </w:rPr>
+        <w:t xml:space="preserve"> y comprobar el sandbox:</w:t>
+      </w:r>
+    </w:p>
+    <w:p>
+      <w:pPr>
+        <w:shd w:fill="F2F4F3" w:color="auto" w:val="clear"/>
+        <w:spacing w:after="160" w:before="120" w:line="240"/>
+        <w:ind w:left="200" w:right="200"/>
+      </w:pPr>
+      <w:r>
+        <w:rPr>
+          <w:rFonts w:ascii="Consolas" w:cs="Consolas" w:eastAsia="Consolas" w:hAnsi="Consolas"/>
+          <w:color w:val="1F2A27"/>
+          <w:sz w:val="17"/>
+          <w:szCs w:val="17"/>
+        </w:rPr>
+        <w:t xml:space="preserve">bwrap --ro-bind / / --dev /dev --unshare-user --unshare-net true &amp;&amp; echo "sandbox OK"</w:t>
+      </w:r>
+    </w:p>
+    <w:p>
+      <w:pPr>
+        <w:pStyle w:val="ListParagraph"/>
+        <w:numPr>
+          <w:ilvl w:val="0"/>
+          <w:numId w:val="11"/>
+        </w:numPr>
+        <w:spacing w:after="60"/>
+      </w:pPr>
+      <w:r>
+        <w:rPr>
+          <w:rFonts w:ascii="Calibri" w:cs="Calibri" w:eastAsia="Calibri" w:hAnsi="Calibri"/>
+        </w:rPr>
+        <w:t xml:space="preserve">Arrancar el agente y pedirle que lea el issue, cree </w:t>
+      </w:r>
+      <w:r>
+        <w:rPr>
+          <w:rFonts w:ascii="Consolas" w:cs="Consolas" w:eastAsia="Consolas" w:hAnsi="Consolas"/>
+          <w:color w:val="2E3A36"/>
+          <w:sz w:val="20"/>
+          <w:szCs w:val="20"/>
+        </w:rPr>
+        <w:t xml:space="preserve">spec/&lt;issue&gt;-&lt;slug&gt;</w:t>
+      </w:r>
+      <w:r>
+        <w:rPr>
+          <w:rFonts w:ascii="Calibri" w:cs="Calibri" w:eastAsia="Calibri" w:hAnsi="Calibri"/>
+        </w:rPr>
+        <w:t xml:space="preserve">, ejecute </w:t>
+      </w:r>
+      <w:r>
+        <w:rPr>
+          <w:rFonts w:ascii="Consolas" w:cs="Consolas" w:eastAsia="Consolas" w:hAnsi="Consolas"/>
+          <w:color w:val="2E3A36"/>
+          <w:sz w:val="20"/>
+          <w:szCs w:val="20"/>
+        </w:rPr>
+        <w:t xml:space="preserve">/speckit-specify</w:t>
+      </w:r>
+      <w:r>
+        <w:rPr>
+          <w:rFonts w:ascii="Calibri" w:cs="Calibri" w:eastAsia="Calibri" w:hAnsi="Calibri"/>
+        </w:rPr>
+        <w:t xml:space="preserve"> y abra el PR solo con la spec.</w:t>
+      </w:r>
+    </w:p>
+    <w:p>
+      <w:pPr>
+        <w:pStyle w:val="ListParagraph"/>
+        <w:numPr>
+          <w:ilvl w:val="0"/>
+          <w:numId w:val="11"/>
+        </w:numPr>
+        <w:spacing w:after="60"/>
+      </w:pPr>
+      <w:r>
+        <w:rPr>
+          <w:rFonts w:ascii="Calibri" w:cs="Calibri" w:eastAsia="Calibri" w:hAnsi="Calibri"/>
+        </w:rPr>
+        <w:t xml:space="preserve">Revisar la spec frente al issue y aprobar el PR con la cuenta del responsable.</w:t>
+      </w:r>
+    </w:p>
+    <w:p>
+      <w:pPr>
         <w:pBdr>
           <w:left w:val="single" w:color="0D5C4F" w:sz="18" w:space="10"/>
         </w:pBdr>
@@ -22038,7 +24242,7 @@
           <w:sz w:val="21"/>
           <w:szCs w:val="21"/>
         </w:rPr>
-        <w:t xml:space="preserve">Los pasos de las tareas 4 a 12 y B a E se añadirán al completarlas.</w:t>
+        <w:t xml:space="preserve">Los pasos de las tareas 5 a 12 y B a E se añadirán al completarlas.</w:t>
       </w:r>
     </w:p>
     <w:p>
@@ -22350,8 +24554,8 @@
         </w:tblBorders>
       </w:tblPr>
       <w:tblGrid>
-        <w:gridCol w:w="3837"/>
-        <w:gridCol w:w="5233"/>
+        <w:gridCol w:w="3880"/>
+        <w:gridCol w:w="5190"/>
       </w:tblGrid>
       <w:tr>
         <w:trPr>
@@ -22359,7 +24563,7 @@
         </w:trPr>
         <w:tc>
           <w:tcPr>
-            <w:tcW w:type="dxa" w:w="3837"/>
+            <w:tcW w:type="dxa" w:w="3880"/>
             <w:shd w:fill="E3EEEA" w:color="auto" w:val="clear"/>
             <w:tcMar>
               <w:top w:type="dxa" w:w="60"/>
@@ -22386,7 +24590,7 @@
         </w:tc>
         <w:tc>
           <w:tcPr>
-            <w:tcW w:type="dxa" w:w="5233"/>
+            <w:tcW w:type="dxa" w:w="5190"/>
             <w:shd w:fill="E3EEEA" w:color="auto" w:val="clear"/>
             <w:tcMar>
               <w:top w:type="dxa" w:w="60"/>
@@ -22418,7 +24622,7 @@
         </w:trPr>
         <w:tc>
           <w:tcPr>
-            <w:tcW w:type="dxa" w:w="3837"/>
+            <w:tcW w:type="dxa" w:w="3880"/>
             <w:tcMar>
               <w:top w:type="dxa" w:w="60"/>
               <w:left w:type="dxa" w:w="100"/>
@@ -22444,7 +24648,7 @@
         </w:tc>
         <w:tc>
           <w:tcPr>
-            <w:tcW w:type="dxa" w:w="5233"/>
+            <w:tcW w:type="dxa" w:w="5190"/>
             <w:tcMar>
               <w:top w:type="dxa" w:w="60"/>
               <w:left w:type="dxa" w:w="100"/>
@@ -22491,7 +24695,7 @@
         </w:trPr>
         <w:tc>
           <w:tcPr>
-            <w:tcW w:type="dxa" w:w="3837"/>
+            <w:tcW w:type="dxa" w:w="3880"/>
             <w:tcMar>
               <w:top w:type="dxa" w:w="60"/>
               <w:left w:type="dxa" w:w="100"/>
@@ -22516,7 +24720,7 @@
         </w:tc>
         <w:tc>
           <w:tcPr>
-            <w:tcW w:type="dxa" w:w="5233"/>
+            <w:tcW w:type="dxa" w:w="5190"/>
             <w:tcMar>
               <w:top w:type="dxa" w:w="60"/>
               <w:left w:type="dxa" w:w="100"/>
@@ -22555,7 +24759,7 @@
         </w:trPr>
         <w:tc>
           <w:tcPr>
-            <w:tcW w:type="dxa" w:w="3837"/>
+            <w:tcW w:type="dxa" w:w="3880"/>
             <w:tcMar>
               <w:top w:type="dxa" w:w="60"/>
               <w:left w:type="dxa" w:w="100"/>
@@ -22588,7 +24792,7 @@
         </w:tc>
         <w:tc>
           <w:tcPr>
-            <w:tcW w:type="dxa" w:w="5233"/>
+            <w:tcW w:type="dxa" w:w="5190"/>
             <w:tcMar>
               <w:top w:type="dxa" w:w="60"/>
               <w:left w:type="dxa" w:w="100"/>
@@ -22617,7 +24821,7 @@
         </w:trPr>
         <w:tc>
           <w:tcPr>
-            <w:tcW w:type="dxa" w:w="3837"/>
+            <w:tcW w:type="dxa" w:w="3880"/>
             <w:tcMar>
               <w:top w:type="dxa" w:w="60"/>
               <w:left w:type="dxa" w:w="100"/>
@@ -22659,7 +24863,7 @@
         </w:tc>
         <w:tc>
           <w:tcPr>
-            <w:tcW w:type="dxa" w:w="5233"/>
+            <w:tcW w:type="dxa" w:w="5190"/>
             <w:tcMar>
               <w:top w:type="dxa" w:w="60"/>
               <w:left w:type="dxa" w:w="100"/>
@@ -22705,7 +24909,7 @@
         </w:trPr>
         <w:tc>
           <w:tcPr>
-            <w:tcW w:type="dxa" w:w="3837"/>
+            <w:tcW w:type="dxa" w:w="3880"/>
             <w:tcMar>
               <w:top w:type="dxa" w:w="60"/>
               <w:left w:type="dxa" w:w="100"/>
@@ -22746,7 +24950,7 @@
         </w:tc>
         <w:tc>
           <w:tcPr>
-            <w:tcW w:type="dxa" w:w="5233"/>
+            <w:tcW w:type="dxa" w:w="5190"/>
             <w:tcMar>
               <w:top w:type="dxa" w:w="60"/>
               <w:left w:type="dxa" w:w="100"/>
@@ -22775,7 +24979,7 @@
         </w:trPr>
         <w:tc>
           <w:tcPr>
-            <w:tcW w:type="dxa" w:w="3837"/>
+            <w:tcW w:type="dxa" w:w="3880"/>
             <w:tcMar>
               <w:top w:type="dxa" w:w="60"/>
               <w:left w:type="dxa" w:w="100"/>
@@ -22799,7 +25003,7 @@
         </w:tc>
         <w:tc>
           <w:tcPr>
-            <w:tcW w:type="dxa" w:w="5233"/>
+            <w:tcW w:type="dxa" w:w="5190"/>
             <w:tcMar>
               <w:top w:type="dxa" w:w="60"/>
               <w:left w:type="dxa" w:w="100"/>
@@ -22836,6 +25040,94 @@
                 <w:szCs w:val="18"/>
               </w:rPr>
               <w:t xml:space="preserve"> de la ejecución</w:t>
+            </w:r>
+          </w:p>
+        </w:tc>
+      </w:tr>
+      <w:tr>
+        <w:trPr>
+          <w:cantSplit/>
+        </w:trPr>
+        <w:tc>
+          <w:tcPr>
+            <w:tcW w:type="dxa" w:w="3880"/>
+            <w:tcMar>
+              <w:top w:type="dxa" w:w="60"/>
+              <w:left w:type="dxa" w:w="100"/>
+              <w:bottom w:type="dxa" w:w="60"/>
+              <w:right w:type="dxa" w:w="100"/>
+            </w:tcMar>
+          </w:tcPr>
+          <w:p>
+            <w:pPr>
+              <w:spacing w:after="0" w:before="0" w:line="252"/>
+            </w:pPr>
+            <w:r>
+              <w:rPr>
+                <w:rFonts w:ascii="Consolas" w:cs="Consolas" w:eastAsia="Consolas" w:hAnsi="Consolas"/>
+                <w:color w:val="2E3A36"/>
+                <w:sz w:val="16"/>
+                <w:szCs w:val="16"/>
+              </w:rPr>
+              <w:t xml:space="preserve">bwrap: No permissions to create a new namespace</w:t>
+            </w:r>
+          </w:p>
+        </w:tc>
+        <w:tc>
+          <w:tcPr>
+            <w:tcW w:type="dxa" w:w="5190"/>
+            <w:tcMar>
+              <w:top w:type="dxa" w:w="60"/>
+              <w:left w:type="dxa" w:w="100"/>
+              <w:bottom w:type="dxa" w:w="60"/>
+              <w:right w:type="dxa" w:w="100"/>
+            </w:tcMar>
+          </w:tcPr>
+          <w:p>
+            <w:pPr>
+              <w:spacing w:after="0" w:before="0" w:line="252"/>
+            </w:pPr>
+            <w:r>
+              <w:rPr>
+                <w:rFonts w:ascii="Calibri" w:cs="Calibri" w:eastAsia="Calibri" w:hAnsi="Calibri"/>
+                <w:sz w:val="18"/>
+                <w:szCs w:val="18"/>
+              </w:rPr>
+              <w:t xml:space="preserve">Añadir </w:t>
+            </w:r>
+            <w:r>
+              <w:rPr>
+                <w:rFonts w:ascii="Consolas" w:cs="Consolas" w:eastAsia="Consolas" w:hAnsi="Consolas"/>
+                <w:color w:val="2E3A36"/>
+                <w:sz w:val="16"/>
+                <w:szCs w:val="16"/>
+              </w:rPr>
+              <w:t xml:space="preserve">--security-opt seccomp=unconfined</w:t>
+            </w:r>
+            <w:r>
+              <w:rPr>
+                <w:rFonts w:ascii="Calibri" w:cs="Calibri" w:eastAsia="Calibri" w:hAnsi="Calibri"/>
+                <w:sz w:val="18"/>
+                <w:szCs w:val="18"/>
+              </w:rPr>
+              <w:t xml:space="preserve"> a </w:t>
+            </w:r>
+            <w:r>
+              <w:rPr>
+                <w:rFonts w:ascii="Consolas" w:cs="Consolas" w:eastAsia="Consolas" w:hAnsi="Consolas"/>
+                <w:color w:val="2E3A36"/>
+                <w:sz w:val="16"/>
+                <w:szCs w:val="16"/>
+              </w:rPr>
+              <w:t xml:space="preserve">runArgs</w:t>
+            </w:r>
+            <w:r>
+              <w:rPr>
+                <w:rFonts w:ascii="Calibri" w:cs="Calibri" w:eastAsia="Calibri" w:hAnsi="Calibri"/>
+                <w:sz w:val="18"/>
+                <w:szCs w:val="18"/>
+              </w:rPr>
+              <w:t xml:space="preserve"> y reconstruir el contenedor</w:t>
             </w:r>
           </w:p>
         </w:tc>
@@ -22875,7 +25167,7 @@
         <w:pStyle w:val="ListParagraph"/>
         <w:numPr>
           <w:ilvl w:val="0"/>
-          <w:numId w:val="9"/>
+          <w:numId w:val="12"/>
         </w:numPr>
         <w:spacing w:after="60"/>
       </w:pPr>
@@ -22891,7 +25183,7 @@
         <w:pStyle w:val="ListParagraph"/>
         <w:numPr>
           <w:ilvl w:val="0"/>
-          <w:numId w:val="9"/>
+          <w:numId w:val="12"/>
         </w:numPr>
         <w:spacing w:after="60"/>
       </w:pPr>
@@ -22907,7 +25199,7 @@
         <w:pStyle w:val="ListParagraph"/>
         <w:numPr>
           <w:ilvl w:val="0"/>
-          <w:numId w:val="9"/>
+          <w:numId w:val="12"/>
         </w:numPr>
         <w:spacing w:after="60"/>
       </w:pPr>
@@ -22923,7 +25215,7 @@
         <w:pStyle w:val="ListParagraph"/>
         <w:numPr>
           <w:ilvl w:val="0"/>
-          <w:numId w:val="9"/>
+          <w:numId w:val="12"/>
         </w:numPr>
         <w:spacing w:after="60"/>
       </w:pPr>
@@ -22953,7 +25245,7 @@
         <w:pStyle w:val="ListParagraph"/>
         <w:numPr>
           <w:ilvl w:val="0"/>
-          <w:numId w:val="9"/>
+          <w:numId w:val="12"/>
         </w:numPr>
         <w:spacing w:after="60"/>
       </w:pPr>
@@ -23039,7 +25331,7 @@
         </w:rPr>
         <w:t xml:space="preserve"> arXiv:2604.26275, 2026. </w:t>
       </w:r>
-      <w:hyperlink w:history="1" r:id="rIdgjuoopruapjpwyjukt6uu">
+      <w:hyperlink w:history="1" r:id="rIdi_fczc9e_jawjsj8qfasv">
         <w:r>
           <w:rPr>
             <w:rStyle w:val="Hyperlink"/>
@@ -23084,7 +25376,7 @@
         </w:rPr>
         <w:t xml:space="preserve">, 2026. </w:t>
       </w:r>
-      <w:hyperlink w:history="1" r:id="rId6wop0x33-o_xwr3qvglts">
+      <w:hyperlink w:history="1" r:id="rIdphuguzfyz8j0abqhpm5yy">
         <w:r>
           <w:rPr>
             <w:rStyle w:val="Hyperlink"/>
@@ -23129,7 +25421,7 @@
         </w:rPr>
         <w:t xml:space="preserve"> </w:t>
       </w:r>
-      <w:hyperlink w:history="1" r:id="rIdgkxges4guvvpqiqr1m20x">
+      <w:hyperlink w:history="1" r:id="rIdidhe0g8tw7lume1scbj-n">
         <w:r>
           <w:rPr>
             <w:rStyle w:val="Hyperlink"/>
@@ -23174,7 +25466,7 @@
         </w:rPr>
         <w:t xml:space="preserve">, junio de 2026. </w:t>
       </w:r>
-      <w:hyperlink w:history="1" r:id="rIdpzzqjcovd5z8pxqltvsp3">
+      <w:hyperlink w:history="1" r:id="rIdyzpbcxmmhmcq15x7grsnw">
         <w:r>
           <w:rPr>
             <w:rStyle w:val="Hyperlink"/>
@@ -23219,7 +25511,7 @@
         </w:rPr>
         <w:t xml:space="preserve"> </w:t>
       </w:r>
-      <w:hyperlink w:history="1" r:id="rIdaouglbilxkzrh26pxsij5">
+      <w:hyperlink w:history="1" r:id="rIdzbagxi1ldrhdccjmuzysi">
         <w:r>
           <w:rPr>
             <w:rStyle w:val="Hyperlink"/>
@@ -23264,7 +25556,7 @@
         </w:rPr>
         <w:t xml:space="preserve"> </w:t>
       </w:r>
-      <w:hyperlink w:history="1" r:id="rId8vru_xvkd2mr3pma-klml">
+      <w:hyperlink w:history="1" r:id="rIddldyepbyj0nmzwh_7ejwe">
         <w:r>
           <w:rPr>
             <w:rStyle w:val="Hyperlink"/>
@@ -23309,7 +25601,7 @@
         </w:rPr>
         <w:t xml:space="preserve">, diciembre de 2025. </w:t>
       </w:r>
-      <w:hyperlink w:history="1" r:id="rIdug5fvv8pk3ihora3ibr0k">
+      <w:hyperlink w:history="1" r:id="rIdvwy4binksab_5x-ben7zu">
         <w:r>
           <w:rPr>
             <w:rStyle w:val="Hyperlink"/>
@@ -23354,7 +25646,7 @@
         </w:rPr>
         <w:t xml:space="preserve"> </w:t>
       </w:r>
-      <w:hyperlink w:history="1" r:id="rIdnfzo_ccmw1_bxmtllrnbl">
+      <w:hyperlink w:history="1" r:id="rIddh3if1sgrrdwu4nljhm8o">
         <w:r>
           <w:rPr>
             <w:rStyle w:val="Hyperlink"/>
@@ -23399,7 +25691,7 @@
         </w:rPr>
         <w:t xml:space="preserve"> </w:t>
       </w:r>
-      <w:hyperlink w:history="1" r:id="rIdzgilqw0f_wne_lzkdmvhe">
+      <w:hyperlink w:history="1" r:id="rIdqwxhilhvpouq5maji1ku3">
         <w:r>
           <w:rPr>
             <w:rStyle w:val="Hyperlink"/>
@@ -23444,7 +25736,7 @@
         </w:rPr>
         <w:t xml:space="preserve"> </w:t>
       </w:r>
-      <w:hyperlink w:history="1" r:id="rIdpoagv1d_r9puporsefvqr">
+      <w:hyperlink w:history="1" r:id="rIdzliqwqmeb1w5ygmnjdm1l">
         <w:r>
           <w:rPr>
             <w:rStyle w:val="Hyperlink"/>
@@ -23489,7 +25781,7 @@
         </w:rPr>
         <w:t xml:space="preserve"> </w:t>
       </w:r>
-      <w:hyperlink w:history="1" r:id="rIdgkzsbr9dfby--mokwkcf4">
+      <w:hyperlink w:history="1" r:id="rIdydsn-nh3lod-ryzrcnkmc">
         <w:r>
           <w:rPr>
             <w:rStyle w:val="Hyperlink"/>
@@ -23534,7 +25826,7 @@
         </w:rPr>
         <w:t xml:space="preserve"> </w:t>
       </w:r>
-      <w:hyperlink w:history="1" r:id="rIdwgevtqt7lmivqieifq272">
+      <w:hyperlink w:history="1" r:id="rIdslbo2dbhonnldrqngxd5z">
         <w:r>
           <w:rPr>
             <w:rStyle w:val="Hyperlink"/>
@@ -23579,7 +25871,7 @@
         </w:rPr>
         <w:t xml:space="preserve"> </w:t>
       </w:r>
-      <w:hyperlink w:history="1" r:id="rIdfxssce1-j3uqbvmqb8cws">
+      <w:hyperlink w:history="1" r:id="rId_jdsgycrnjgbd8hckpns1">
         <w:r>
           <w:rPr>
             <w:rStyle w:val="Hyperlink"/>
@@ -23624,7 +25916,7 @@
         </w:rPr>
         <w:t xml:space="preserve"> </w:t>
       </w:r>
-      <w:hyperlink w:history="1" r:id="rIdueti5ch-k6ulj0qaeniah">
+      <w:hyperlink w:history="1" r:id="rIdxbs5uzfufpfkc8xmsruda">
         <w:r>
           <w:rPr>
             <w:rStyle w:val="Hyperlink"/>
@@ -23669,7 +25961,7 @@
         </w:rPr>
         <w:t xml:space="preserve"> </w:t>
       </w:r>
-      <w:hyperlink w:history="1" r:id="rIdwcormdq3hwkt97pkrsxgs">
+      <w:hyperlink w:history="1" r:id="rIdvf8ei52kpz8esvtkc6oka">
         <w:r>
           <w:rPr>
             <w:rStyle w:val="Hyperlink"/>
@@ -23714,7 +26006,7 @@
         </w:rPr>
         <w:t xml:space="preserve"> </w:t>
       </w:r>
-      <w:hyperlink w:history="1" r:id="rIdfe4q9ba5wbhnww0erc9gx">
+      <w:hyperlink w:history="1" r:id="rIdhw6z-xtt5sarfwsghyqun">
         <w:r>
           <w:rPr>
             <w:rStyle w:val="Hyperlink"/>
@@ -23759,7 +26051,7 @@
         </w:rPr>
         <w:t xml:space="preserve">, agosto de 2026. </w:t>
       </w:r>
-      <w:hyperlink w:history="1" r:id="rIdkaxfqhkbwzk_phlbkhmyp">
+      <w:hyperlink w:history="1" r:id="rId58sx3ikjfkkor6m8wpk7i">
         <w:r>
           <w:rPr>
             <w:rStyle w:val="Hyperlink"/>
@@ -23804,7 +26096,7 @@
         </w:rPr>
         <w:t xml:space="preserve"> </w:t>
       </w:r>
-      <w:hyperlink w:history="1" r:id="rIdmva-qtujuv2wcsoedrnok">
+      <w:hyperlink w:history="1" r:id="rIdzlpmnidteuky6jthd_nih">
         <w:r>
           <w:rPr>
             <w:rStyle w:val="Hyperlink"/>
@@ -23867,7 +26159,7 @@
         </w:rPr>
         <w:t xml:space="preserve"> </w:t>
       </w:r>
-      <w:hyperlink w:history="1" r:id="rIdtikcoyi5st4xn6kvisnzw">
+      <w:hyperlink w:history="1" r:id="rId0dgehlznrixlviybpsijk">
         <w:r>
           <w:rPr>
             <w:rStyle w:val="Hyperlink"/>
@@ -23912,7 +26204,7 @@
         </w:rPr>
         <w:t xml:space="preserve"> </w:t>
       </w:r>
-      <w:hyperlink w:history="1" r:id="rId06wltwpgjb7jzvdhkwd1o">
+      <w:hyperlink w:history="1" r:id="rIdh-ietgwqivq5q8ovnzhv6">
         <w:r>
           <w:rPr>
             <w:rStyle w:val="Hyperlink"/>
@@ -23957,7 +26249,7 @@
         </w:rPr>
         <w:t xml:space="preserve"> </w:t>
       </w:r>
-      <w:hyperlink w:history="1" r:id="rId4phl5h2jtyzcg0ayersra">
+      <w:hyperlink w:history="1" r:id="rIdvksztlytpx7lnqfhrqebq">
         <w:r>
           <w:rPr>
             <w:rStyle w:val="Hyperlink"/>
@@ -25556,6 +27848,42 @@
     </w:lvl>
   </w:abstractNum>
   <w:abstractNum w:abstractNumId="9" w15:restartNumberingAfterBreak="0">
+    <w:multiLevelType w:val="hybridMultilevel"/>
+    <w:lvl w:ilvl="0" w15:tentative="1">
+      <w:start w:val="1"/>
+      <w:numFmt w:val="decimal"/>
+      <w:lvlText w:val="%1."/>
+      <w:lvlJc w:val="left"/>
+      <w:pPr>
+        <w:ind w:left="540" w:hanging="320"/>
+      </w:pPr>
+    </w:lvl>
+  </w:abstractNum>
+  <w:abstractNum w:abstractNumId="10" w15:restartNumberingAfterBreak="0">
+    <w:multiLevelType w:val="hybridMultilevel"/>
+    <w:lvl w:ilvl="0" w15:tentative="1">
+      <w:start w:val="3"/>
+      <w:numFmt w:val="decimal"/>
+      <w:lvlText w:val="%1."/>
+      <w:lvlJc w:val="left"/>
+      <w:pPr>
+        <w:ind w:left="540" w:hanging="320"/>
+      </w:pPr>
+    </w:lvl>
+  </w:abstractNum>
+  <w:abstractNum w:abstractNumId="11" w15:restartNumberingAfterBreak="0">
+    <w:multiLevelType w:val="hybridMultilevel"/>
+    <w:lvl w:ilvl="0" w15:tentative="1">
+      <w:start w:val="4"/>
+      <w:numFmt w:val="decimal"/>
+      <w:lvlText w:val="%1."/>
+      <w:lvlJc w:val="left"/>
+      <w:pPr>
+        <w:ind w:left="540" w:hanging="320"/>
+      </w:pPr>
+    </w:lvl>
+  </w:abstractNum>
+  <w:abstractNum w:abstractNumId="12" w15:restartNumberingAfterBreak="0">
     <w:multiLevelType w:val="hybridMultilevel"/>
     <w:lvl w:ilvl="0" w15:tentative="1">
       <w:start w:val="1"/>
@@ -25617,6 +27945,24 @@
   </w:num>
   <w:num w:numId="9">
     <w:abstractNumId w:val="9"/>
+    <w:lvlOverride w:ilvl="0">
+      <w:startOverride w:val="1"/>
+    </w:lvlOverride>
+  </w:num>
+  <w:num w:numId="10">
+    <w:abstractNumId w:val="10"/>
+    <w:lvlOverride w:ilvl="0">
+      <w:startOverride w:val="3"/>
+    </w:lvlOverride>
+  </w:num>
+  <w:num w:numId="11">
+    <w:abstractNumId w:val="11"/>
+    <w:lvlOverride w:ilvl="0">
+      <w:startOverride w:val="4"/>
+    </w:lvlOverride>
+  </w:num>
+  <w:num w:numId="12">
+    <w:abstractNumId w:val="12"/>
     <w:lvlOverride w:ilvl="0">
       <w:startOverride w:val="1"/>
     </w:lvlOverride>

</xml_diff>

<commit_message>
docs: añadir la extensión F (agente autónomo en Actions)
La etiqueta aprobado lanza al agente en Actions para escribir la spec y el
merge de la spec lanza plan, tareas e implementación. Va entre las tareas 8
y 9. El plan pasa a 18 tareas.

- Bitácora y panel: tarea F con prerrequisitos, subtareas y controles.
- Memoria: plan de 18 tareas, decisión sobre dónde se ejecuta el agente e
  iteraciones 49 a 52.

Co-Authored-By: Claude Opus 5.5 <noreply@anthropic.com>
Claude-Session: https://claude.ai/code/session_01DJozxnTfKm9YzN69MVZq7X
</commit_message>
<xml_diff>
--- a/docs/tfm/TFM-ALM-agentico.docx
+++ b/docs/tfm/TFM-ALM-agentico.docx
@@ -1303,7 +1303,7 @@
                 <w:sz w:val="18"/>
                 <w:szCs w:val="18"/>
               </w:rPr>
-              <w:t xml:space="preserve">17 tareas: 12 principales y 5 extensiones ALM (A a E), detalladas en el capítulo 4</w:t>
+              <w:t xml:space="preserve">18 tareas: 12 principales y 6 extensiones (A a F), detalladas en el capítulo 4</w:t>
             </w:r>
           </w:p>
         </w:tc>
@@ -5709,10 +5709,10 @@
         </w:tblBorders>
       </w:tblPr>
       <w:tblGrid>
-        <w:gridCol w:w="1635"/>
-        <w:gridCol w:w="1520"/>
+        <w:gridCol w:w="1625"/>
+        <w:gridCol w:w="1712"/>
         <w:gridCol w:w="2050"/>
-        <w:gridCol w:w="3865"/>
+        <w:gridCol w:w="3683"/>
       </w:tblGrid>
       <w:tr>
         <w:trPr>
@@ -5720,7 +5720,7 @@
         </w:trPr>
         <w:tc>
           <w:tcPr>
-            <w:tcW w:type="dxa" w:w="1635"/>
+            <w:tcW w:type="dxa" w:w="1625"/>
             <w:shd w:fill="E3EEEA" w:color="auto" w:val="clear"/>
             <w:tcMar>
               <w:top w:type="dxa" w:w="60"/>
@@ -5747,7 +5747,7 @@
         </w:tc>
         <w:tc>
           <w:tcPr>
-            <w:tcW w:type="dxa" w:w="1520"/>
+            <w:tcW w:type="dxa" w:w="1712"/>
             <w:shd w:fill="E3EEEA" w:color="auto" w:val="clear"/>
             <w:tcMar>
               <w:top w:type="dxa" w:w="60"/>
@@ -5801,7 +5801,7 @@
         </w:tc>
         <w:tc>
           <w:tcPr>
-            <w:tcW w:type="dxa" w:w="3865"/>
+            <w:tcW w:type="dxa" w:w="3683"/>
             <w:shd w:fill="E3EEEA" w:color="auto" w:val="clear"/>
             <w:tcMar>
               <w:top w:type="dxa" w:w="60"/>
@@ -5833,7 +5833,7 @@
         </w:trPr>
         <w:tc>
           <w:tcPr>
-            <w:tcW w:type="dxa" w:w="1635"/>
+            <w:tcW w:type="dxa" w:w="1625"/>
             <w:tcMar>
               <w:top w:type="dxa" w:w="60"/>
               <w:left w:type="dxa" w:w="100"/>
@@ -5857,7 +5857,7 @@
         </w:tc>
         <w:tc>
           <w:tcPr>
-            <w:tcW w:type="dxa" w:w="1520"/>
+            <w:tcW w:type="dxa" w:w="1712"/>
             <w:tcMar>
               <w:top w:type="dxa" w:w="60"/>
               <w:left w:type="dxa" w:w="100"/>
@@ -5905,7 +5905,7 @@
         </w:tc>
         <w:tc>
           <w:tcPr>
-            <w:tcW w:type="dxa" w:w="3865"/>
+            <w:tcW w:type="dxa" w:w="3683"/>
             <w:tcMar>
               <w:top w:type="dxa" w:w="60"/>
               <w:left w:type="dxa" w:w="100"/>
@@ -5934,7 +5934,7 @@
         </w:trPr>
         <w:tc>
           <w:tcPr>
-            <w:tcW w:type="dxa" w:w="1635"/>
+            <w:tcW w:type="dxa" w:w="1625"/>
             <w:tcMar>
               <w:top w:type="dxa" w:w="60"/>
               <w:left w:type="dxa" w:w="100"/>
@@ -5958,7 +5958,7 @@
         </w:tc>
         <w:tc>
           <w:tcPr>
-            <w:tcW w:type="dxa" w:w="1520"/>
+            <w:tcW w:type="dxa" w:w="1712"/>
             <w:tcMar>
               <w:top w:type="dxa" w:w="60"/>
               <w:left w:type="dxa" w:w="100"/>
@@ -6006,7 +6006,7 @@
         </w:tc>
         <w:tc>
           <w:tcPr>
-            <w:tcW w:type="dxa" w:w="3865"/>
+            <w:tcW w:type="dxa" w:w="3683"/>
             <w:tcMar>
               <w:top w:type="dxa" w:w="60"/>
               <w:left w:type="dxa" w:w="100"/>
@@ -6035,7 +6035,7 @@
         </w:trPr>
         <w:tc>
           <w:tcPr>
-            <w:tcW w:type="dxa" w:w="1635"/>
+            <w:tcW w:type="dxa" w:w="1625"/>
             <w:tcMar>
               <w:top w:type="dxa" w:w="60"/>
               <w:left w:type="dxa" w:w="100"/>
@@ -6059,7 +6059,7 @@
         </w:tc>
         <w:tc>
           <w:tcPr>
-            <w:tcW w:type="dxa" w:w="1520"/>
+            <w:tcW w:type="dxa" w:w="1712"/>
             <w:tcMar>
               <w:top w:type="dxa" w:w="60"/>
               <w:left w:type="dxa" w:w="100"/>
@@ -6107,7 +6107,7 @@
         </w:tc>
         <w:tc>
           <w:tcPr>
-            <w:tcW w:type="dxa" w:w="3865"/>
+            <w:tcW w:type="dxa" w:w="3683"/>
             <w:tcMar>
               <w:top w:type="dxa" w:w="60"/>
               <w:left w:type="dxa" w:w="100"/>
@@ -6172,7 +6172,7 @@
         </w:trPr>
         <w:tc>
           <w:tcPr>
-            <w:tcW w:type="dxa" w:w="1635"/>
+            <w:tcW w:type="dxa" w:w="1625"/>
             <w:tcMar>
               <w:top w:type="dxa" w:w="60"/>
               <w:left w:type="dxa" w:w="100"/>
@@ -6196,7 +6196,7 @@
         </w:tc>
         <w:tc>
           <w:tcPr>
-            <w:tcW w:type="dxa" w:w="1520"/>
+            <w:tcW w:type="dxa" w:w="1712"/>
             <w:tcMar>
               <w:top w:type="dxa" w:w="60"/>
               <w:left w:type="dxa" w:w="100"/>
@@ -6244,7 +6244,7 @@
         </w:tc>
         <w:tc>
           <w:tcPr>
-            <w:tcW w:type="dxa" w:w="3865"/>
+            <w:tcW w:type="dxa" w:w="3683"/>
             <w:tcMar>
               <w:top w:type="dxa" w:w="60"/>
               <w:left w:type="dxa" w:w="100"/>
@@ -6273,7 +6273,7 @@
         </w:trPr>
         <w:tc>
           <w:tcPr>
-            <w:tcW w:type="dxa" w:w="1635"/>
+            <w:tcW w:type="dxa" w:w="1625"/>
             <w:tcMar>
               <w:top w:type="dxa" w:w="60"/>
               <w:left w:type="dxa" w:w="100"/>
@@ -6297,7 +6297,7 @@
         </w:tc>
         <w:tc>
           <w:tcPr>
-            <w:tcW w:type="dxa" w:w="1520"/>
+            <w:tcW w:type="dxa" w:w="1712"/>
             <w:tcMar>
               <w:top w:type="dxa" w:w="60"/>
               <w:left w:type="dxa" w:w="100"/>
@@ -6345,7 +6345,7 @@
         </w:tc>
         <w:tc>
           <w:tcPr>
-            <w:tcW w:type="dxa" w:w="3865"/>
+            <w:tcW w:type="dxa" w:w="3683"/>
             <w:tcMar>
               <w:top w:type="dxa" w:w="60"/>
               <w:left w:type="dxa" w:w="100"/>
@@ -6392,7 +6392,7 @@
         </w:trPr>
         <w:tc>
           <w:tcPr>
-            <w:tcW w:type="dxa" w:w="1635"/>
+            <w:tcW w:type="dxa" w:w="1625"/>
             <w:tcMar>
               <w:top w:type="dxa" w:w="60"/>
               <w:left w:type="dxa" w:w="100"/>
@@ -6416,7 +6416,7 @@
         </w:tc>
         <w:tc>
           <w:tcPr>
-            <w:tcW w:type="dxa" w:w="1520"/>
+            <w:tcW w:type="dxa" w:w="1712"/>
             <w:tcMar>
               <w:top w:type="dxa" w:w="60"/>
               <w:left w:type="dxa" w:w="100"/>
@@ -6464,7 +6464,7 @@
         </w:tc>
         <w:tc>
           <w:tcPr>
-            <w:tcW w:type="dxa" w:w="3865"/>
+            <w:tcW w:type="dxa" w:w="3683"/>
             <w:tcMar>
               <w:top w:type="dxa" w:w="60"/>
               <w:left w:type="dxa" w:w="100"/>
@@ -6493,7 +6493,7 @@
         </w:trPr>
         <w:tc>
           <w:tcPr>
-            <w:tcW w:type="dxa" w:w="1635"/>
+            <w:tcW w:type="dxa" w:w="1625"/>
             <w:tcMar>
               <w:top w:type="dxa" w:w="60"/>
               <w:left w:type="dxa" w:w="100"/>
@@ -6517,7 +6517,7 @@
         </w:tc>
         <w:tc>
           <w:tcPr>
-            <w:tcW w:type="dxa" w:w="1520"/>
+            <w:tcW w:type="dxa" w:w="1712"/>
             <w:tcMar>
               <w:top w:type="dxa" w:w="60"/>
               <w:left w:type="dxa" w:w="100"/>
@@ -6585,7 +6585,7 @@
         </w:tc>
         <w:tc>
           <w:tcPr>
-            <w:tcW w:type="dxa" w:w="3865"/>
+            <w:tcW w:type="dxa" w:w="3683"/>
             <w:tcMar>
               <w:top w:type="dxa" w:w="60"/>
               <w:left w:type="dxa" w:w="100"/>
@@ -6614,7 +6614,7 @@
         </w:trPr>
         <w:tc>
           <w:tcPr>
-            <w:tcW w:type="dxa" w:w="1635"/>
+            <w:tcW w:type="dxa" w:w="1625"/>
             <w:tcMar>
               <w:top w:type="dxa" w:w="60"/>
               <w:left w:type="dxa" w:w="100"/>
@@ -6638,7 +6638,7 @@
         </w:tc>
         <w:tc>
           <w:tcPr>
-            <w:tcW w:type="dxa" w:w="1520"/>
+            <w:tcW w:type="dxa" w:w="1712"/>
             <w:tcMar>
               <w:top w:type="dxa" w:w="60"/>
               <w:left w:type="dxa" w:w="100"/>
@@ -6686,7 +6686,7 @@
         </w:tc>
         <w:tc>
           <w:tcPr>
-            <w:tcW w:type="dxa" w:w="3865"/>
+            <w:tcW w:type="dxa" w:w="3683"/>
             <w:tcMar>
               <w:top w:type="dxa" w:w="60"/>
               <w:left w:type="dxa" w:w="100"/>
@@ -6715,7 +6715,7 @@
         </w:trPr>
         <w:tc>
           <w:tcPr>
-            <w:tcW w:type="dxa" w:w="1635"/>
+            <w:tcW w:type="dxa" w:w="1625"/>
             <w:tcMar>
               <w:top w:type="dxa" w:w="60"/>
               <w:left w:type="dxa" w:w="100"/>
@@ -6739,7 +6739,7 @@
         </w:tc>
         <w:tc>
           <w:tcPr>
-            <w:tcW w:type="dxa" w:w="1520"/>
+            <w:tcW w:type="dxa" w:w="1712"/>
             <w:tcMar>
               <w:top w:type="dxa" w:w="60"/>
               <w:left w:type="dxa" w:w="100"/>
@@ -6787,7 +6787,7 @@
         </w:tc>
         <w:tc>
           <w:tcPr>
-            <w:tcW w:type="dxa" w:w="3865"/>
+            <w:tcW w:type="dxa" w:w="3683"/>
             <w:tcMar>
               <w:top w:type="dxa" w:w="60"/>
               <w:left w:type="dxa" w:w="100"/>
@@ -6806,6 +6806,124 @@
                 <w:szCs w:val="18"/>
               </w:rPr>
               <w:t xml:space="preserve">Funciona igual en repos públicos y deja rastro en git</w:t>
+            </w:r>
+          </w:p>
+        </w:tc>
+      </w:tr>
+      <w:tr>
+        <w:trPr>
+          <w:cantSplit/>
+        </w:trPr>
+        <w:tc>
+          <w:tcPr>
+            <w:tcW w:type="dxa" w:w="1625"/>
+            <w:tcMar>
+              <w:top w:type="dxa" w:w="60"/>
+              <w:left w:type="dxa" w:w="100"/>
+              <w:bottom w:type="dxa" w:w="60"/>
+              <w:right w:type="dxa" w:w="100"/>
+            </w:tcMar>
+          </w:tcPr>
+          <w:p>
+            <w:pPr>
+              <w:spacing w:after="0" w:before="0" w:line="252"/>
+            </w:pPr>
+            <w:r>
+              <w:rPr>
+                <w:rFonts w:ascii="Calibri" w:cs="Calibri" w:eastAsia="Calibri" w:hAnsi="Calibri"/>
+                <w:sz w:val="18"/>
+                <w:szCs w:val="18"/>
+              </w:rPr>
+              <w:t xml:space="preserve">Ejecución del agente de código</w:t>
+            </w:r>
+          </w:p>
+        </w:tc>
+        <w:tc>
+          <w:tcPr>
+            <w:tcW w:type="dxa" w:w="1712"/>
+            <w:tcMar>
+              <w:top w:type="dxa" w:w="60"/>
+              <w:left w:type="dxa" w:w="100"/>
+              <w:bottom w:type="dxa" w:w="60"/>
+              <w:right w:type="dxa" w:w="100"/>
+            </w:tcMar>
+          </w:tcPr>
+          <w:p>
+            <w:pPr>
+              <w:spacing w:after="0" w:before="0" w:line="252"/>
+            </w:pPr>
+            <w:r>
+              <w:rPr>
+                <w:rFonts w:ascii="Calibri" w:cs="Calibri" w:eastAsia="Calibri" w:hAnsi="Calibri"/>
+                <w:sz w:val="18"/>
+                <w:szCs w:val="18"/>
+              </w:rPr>
+              <w:t xml:space="preserve">Devcontainer interactivo y, con la extensión F, GitHub Actions disparado por la etiqueta </w:t>
+            </w:r>
+            <w:r>
+              <w:rPr>
+                <w:rFonts w:ascii="Consolas" w:cs="Consolas" w:eastAsia="Consolas" w:hAnsi="Consolas"/>
+                <w:color w:val="2E3A36"/>
+                <w:sz w:val="16"/>
+                <w:szCs w:val="16"/>
+              </w:rPr>
+              <w:t xml:space="preserve">aprobado</w:t>
+            </w:r>
+            <w:r>
+              <w:rPr>
+                <w:rFonts w:ascii="Calibri" w:cs="Calibri" w:eastAsia="Calibri" w:hAnsi="Calibri"/>
+                <w:sz w:val="18"/>
+                <w:szCs w:val="18"/>
+              </w:rPr>
+              <w:t xml:space="preserve"> y el merge de la spec</w:t>
+            </w:r>
+          </w:p>
+        </w:tc>
+        <w:tc>
+          <w:tcPr>
+            <w:tcW w:type="dxa" w:w="2050"/>
+            <w:tcMar>
+              <w:top w:type="dxa" w:w="60"/>
+              <w:left w:type="dxa" w:w="100"/>
+              <w:bottom w:type="dxa" w:w="60"/>
+              <w:right w:type="dxa" w:w="100"/>
+            </w:tcMar>
+          </w:tcPr>
+          <w:p>
+            <w:pPr>
+              <w:spacing w:after="0" w:before="0" w:line="252"/>
+            </w:pPr>
+            <w:r>
+              <w:rPr>
+                <w:rFonts w:ascii="Calibri" w:cs="Calibri" w:eastAsia="Calibri" w:hAnsi="Calibri"/>
+                <w:sz w:val="18"/>
+                <w:szCs w:val="18"/>
+              </w:rPr>
+              <w:t xml:space="preserve">Solo devcontainer; solo Actions</w:t>
+            </w:r>
+          </w:p>
+        </w:tc>
+        <w:tc>
+          <w:tcPr>
+            <w:tcW w:type="dxa" w:w="3683"/>
+            <w:tcMar>
+              <w:top w:type="dxa" w:w="60"/>
+              <w:left w:type="dxa" w:w="100"/>
+              <w:bottom w:type="dxa" w:w="60"/>
+              <w:right w:type="dxa" w:w="100"/>
+            </w:tcMar>
+          </w:tcPr>
+          <w:p>
+            <w:pPr>
+              <w:spacing w:after="0" w:before="0" w:line="252"/>
+            </w:pPr>
+            <w:r>
+              <w:rPr>
+                <w:rFonts w:ascii="Calibri" w:cs="Calibri" w:eastAsia="Calibri" w:hAnsi="Calibri"/>
+                <w:sz w:val="18"/>
+                <w:szCs w:val="18"/>
+              </w:rPr>
+              <w:t xml:space="preserve">El devcontainer permite trabajar en pareja con el agente y enseñar el harness; Actions quita los prompts manuales sin añadir ni quitar aprobaciones humanas</w:t>
             </w:r>
           </w:p>
         </w:tc>
@@ -8242,7 +8360,7 @@
         <w:rPr>
           <w:rFonts w:ascii="Calibri" w:cs="Calibri" w:eastAsia="Calibri" w:hAnsi="Calibri"/>
         </w:rPr>
-        <w:t xml:space="preserve">, mantenimiento, retirada y trazabilidad:</w:t>
+        <w:t xml:space="preserve">, mantenimiento, retirada y trazabilidad. Más tarde se añadió la F, que lanza al agente de código desde GitHub Actions para que el desarrollador no tenga que escribirle un prompt en cada feature:</w:t>
       </w:r>
     </w:p>
     <w:tbl>
@@ -8258,10 +8376,10 @@
         </w:tblBorders>
       </w:tblPr>
       <w:tblGrid>
-        <w:gridCol w:w="1001"/>
-        <w:gridCol w:w="4367"/>
-        <w:gridCol w:w="1978"/>
-        <w:gridCol w:w="1724"/>
+        <w:gridCol w:w="999"/>
+        <w:gridCol w:w="4355"/>
+        <w:gridCol w:w="1966"/>
+        <w:gridCol w:w="1750"/>
       </w:tblGrid>
       <w:tr>
         <w:trPr>
@@ -8269,7 +8387,7 @@
         </w:trPr>
         <w:tc>
           <w:tcPr>
-            <w:tcW w:type="dxa" w:w="1001"/>
+            <w:tcW w:type="dxa" w:w="999"/>
             <w:shd w:fill="E3EEEA" w:color="auto" w:val="clear"/>
             <w:tcMar>
               <w:top w:type="dxa" w:w="60"/>
@@ -8296,7 +8414,7 @@
         </w:tc>
         <w:tc>
           <w:tcPr>
-            <w:tcW w:type="dxa" w:w="4367"/>
+            <w:tcW w:type="dxa" w:w="4355"/>
             <w:shd w:fill="E3EEEA" w:color="auto" w:val="clear"/>
             <w:tcMar>
               <w:top w:type="dxa" w:w="60"/>
@@ -8323,7 +8441,7 @@
         </w:tc>
         <w:tc>
           <w:tcPr>
-            <w:tcW w:type="dxa" w:w="1978"/>
+            <w:tcW w:type="dxa" w:w="1966"/>
             <w:shd w:fill="E3EEEA" w:color="auto" w:val="clear"/>
             <w:tcMar>
               <w:top w:type="dxa" w:w="60"/>
@@ -8350,7 +8468,7 @@
         </w:tc>
         <w:tc>
           <w:tcPr>
-            <w:tcW w:type="dxa" w:w="1724"/>
+            <w:tcW w:type="dxa" w:w="1750"/>
             <w:shd w:fill="E3EEEA" w:color="auto" w:val="clear"/>
             <w:tcMar>
               <w:top w:type="dxa" w:w="60"/>
@@ -8382,7 +8500,7 @@
         </w:trPr>
         <w:tc>
           <w:tcPr>
-            <w:tcW w:type="dxa" w:w="1001"/>
+            <w:tcW w:type="dxa" w:w="999"/>
             <w:tcMar>
               <w:top w:type="dxa" w:w="60"/>
               <w:left w:type="dxa" w:w="100"/>
@@ -8406,7 +8524,7 @@
         </w:tc>
         <w:tc>
           <w:tcPr>
-            <w:tcW w:type="dxa" w:w="4367"/>
+            <w:tcW w:type="dxa" w:w="4355"/>
             <w:tcMar>
               <w:top w:type="dxa" w:w="60"/>
               <w:left w:type="dxa" w:w="100"/>
@@ -8430,7 +8548,7 @@
         </w:tc>
         <w:tc>
           <w:tcPr>
-            <w:tcW w:type="dxa" w:w="1978"/>
+            <w:tcW w:type="dxa" w:w="1966"/>
             <w:tcMar>
               <w:top w:type="dxa" w:w="60"/>
               <w:left w:type="dxa" w:w="100"/>
@@ -8454,7 +8572,7 @@
         </w:tc>
         <w:tc>
           <w:tcPr>
-            <w:tcW w:type="dxa" w:w="1724"/>
+            <w:tcW w:type="dxa" w:w="1750"/>
             <w:tcMar>
               <w:top w:type="dxa" w:w="60"/>
               <w:left w:type="dxa" w:w="100"/>
@@ -8483,7 +8601,7 @@
         </w:trPr>
         <w:tc>
           <w:tcPr>
-            <w:tcW w:type="dxa" w:w="1001"/>
+            <w:tcW w:type="dxa" w:w="999"/>
             <w:tcMar>
               <w:top w:type="dxa" w:w="60"/>
               <w:left w:type="dxa" w:w="100"/>
@@ -8507,7 +8625,7 @@
         </w:tc>
         <w:tc>
           <w:tcPr>
-            <w:tcW w:type="dxa" w:w="4367"/>
+            <w:tcW w:type="dxa" w:w="4355"/>
             <w:tcMar>
               <w:top w:type="dxa" w:w="60"/>
               <w:left w:type="dxa" w:w="100"/>
@@ -8531,7 +8649,7 @@
         </w:tc>
         <w:tc>
           <w:tcPr>
-            <w:tcW w:type="dxa" w:w="1978"/>
+            <w:tcW w:type="dxa" w:w="1966"/>
             <w:tcMar>
               <w:top w:type="dxa" w:w="60"/>
               <w:left w:type="dxa" w:w="100"/>
@@ -8555,7 +8673,7 @@
         </w:tc>
         <w:tc>
           <w:tcPr>
-            <w:tcW w:type="dxa" w:w="1724"/>
+            <w:tcW w:type="dxa" w:w="1750"/>
             <w:tcMar>
               <w:top w:type="dxa" w:w="60"/>
               <w:left w:type="dxa" w:w="100"/>
@@ -8584,7 +8702,7 @@
         </w:trPr>
         <w:tc>
           <w:tcPr>
-            <w:tcW w:type="dxa" w:w="1001"/>
+            <w:tcW w:type="dxa" w:w="999"/>
             <w:tcMar>
               <w:top w:type="dxa" w:w="60"/>
               <w:left w:type="dxa" w:w="100"/>
@@ -8608,7 +8726,7 @@
         </w:tc>
         <w:tc>
           <w:tcPr>
-            <w:tcW w:type="dxa" w:w="4367"/>
+            <w:tcW w:type="dxa" w:w="4355"/>
             <w:tcMar>
               <w:top w:type="dxa" w:w="60"/>
               <w:left w:type="dxa" w:w="100"/>
@@ -8632,7 +8750,7 @@
         </w:tc>
         <w:tc>
           <w:tcPr>
-            <w:tcW w:type="dxa" w:w="1978"/>
+            <w:tcW w:type="dxa" w:w="1966"/>
             <w:tcMar>
               <w:top w:type="dxa" w:w="60"/>
               <w:left w:type="dxa" w:w="100"/>
@@ -8656,7 +8774,7 @@
         </w:tc>
         <w:tc>
           <w:tcPr>
-            <w:tcW w:type="dxa" w:w="1724"/>
+            <w:tcW w:type="dxa" w:w="1750"/>
             <w:tcMar>
               <w:top w:type="dxa" w:w="60"/>
               <w:left w:type="dxa" w:w="100"/>
@@ -8685,7 +8803,7 @@
         </w:trPr>
         <w:tc>
           <w:tcPr>
-            <w:tcW w:type="dxa" w:w="1001"/>
+            <w:tcW w:type="dxa" w:w="999"/>
             <w:tcMar>
               <w:top w:type="dxa" w:w="60"/>
               <w:left w:type="dxa" w:w="100"/>
@@ -8709,7 +8827,7 @@
         </w:tc>
         <w:tc>
           <w:tcPr>
-            <w:tcW w:type="dxa" w:w="4367"/>
+            <w:tcW w:type="dxa" w:w="4355"/>
             <w:tcMar>
               <w:top w:type="dxa" w:w="60"/>
               <w:left w:type="dxa" w:w="100"/>
@@ -8733,7 +8851,7 @@
         </w:tc>
         <w:tc>
           <w:tcPr>
-            <w:tcW w:type="dxa" w:w="1978"/>
+            <w:tcW w:type="dxa" w:w="1966"/>
             <w:tcMar>
               <w:top w:type="dxa" w:w="60"/>
               <w:left w:type="dxa" w:w="100"/>
@@ -8757,7 +8875,7 @@
         </w:tc>
         <w:tc>
           <w:tcPr>
-            <w:tcW w:type="dxa" w:w="1724"/>
+            <w:tcW w:type="dxa" w:w="1750"/>
             <w:tcMar>
               <w:top w:type="dxa" w:w="60"/>
               <w:left w:type="dxa" w:w="100"/>
@@ -8786,7 +8904,7 @@
         </w:trPr>
         <w:tc>
           <w:tcPr>
-            <w:tcW w:type="dxa" w:w="1001"/>
+            <w:tcW w:type="dxa" w:w="999"/>
             <w:tcMar>
               <w:top w:type="dxa" w:w="60"/>
               <w:left w:type="dxa" w:w="100"/>
@@ -8810,7 +8928,7 @@
         </w:tc>
         <w:tc>
           <w:tcPr>
-            <w:tcW w:type="dxa" w:w="4367"/>
+            <w:tcW w:type="dxa" w:w="4355"/>
             <w:tcMar>
               <w:top w:type="dxa" w:w="60"/>
               <w:left w:type="dxa" w:w="100"/>
@@ -8834,7 +8952,7 @@
         </w:tc>
         <w:tc>
           <w:tcPr>
-            <w:tcW w:type="dxa" w:w="1978"/>
+            <w:tcW w:type="dxa" w:w="1966"/>
             <w:tcMar>
               <w:top w:type="dxa" w:w="60"/>
               <w:left w:type="dxa" w:w="100"/>
@@ -8858,7 +8976,7 @@
         </w:tc>
         <w:tc>
           <w:tcPr>
-            <w:tcW w:type="dxa" w:w="1724"/>
+            <w:tcW w:type="dxa" w:w="1750"/>
             <w:tcMar>
               <w:top w:type="dxa" w:w="60"/>
               <w:left w:type="dxa" w:w="100"/>
@@ -8887,7 +9005,7 @@
         </w:trPr>
         <w:tc>
           <w:tcPr>
-            <w:tcW w:type="dxa" w:w="1001"/>
+            <w:tcW w:type="dxa" w:w="999"/>
             <w:tcMar>
               <w:top w:type="dxa" w:w="60"/>
               <w:left w:type="dxa" w:w="100"/>
@@ -8911,7 +9029,7 @@
         </w:tc>
         <w:tc>
           <w:tcPr>
-            <w:tcW w:type="dxa" w:w="4367"/>
+            <w:tcW w:type="dxa" w:w="4355"/>
             <w:tcMar>
               <w:top w:type="dxa" w:w="60"/>
               <w:left w:type="dxa" w:w="100"/>
@@ -8935,7 +9053,7 @@
         </w:tc>
         <w:tc>
           <w:tcPr>
-            <w:tcW w:type="dxa" w:w="1978"/>
+            <w:tcW w:type="dxa" w:w="1966"/>
             <w:tcMar>
               <w:top w:type="dxa" w:w="60"/>
               <w:left w:type="dxa" w:w="100"/>
@@ -8959,7 +9077,7 @@
         </w:tc>
         <w:tc>
           <w:tcPr>
-            <w:tcW w:type="dxa" w:w="1724"/>
+            <w:tcW w:type="dxa" w:w="1750"/>
             <w:tcMar>
               <w:top w:type="dxa" w:w="60"/>
               <w:left w:type="dxa" w:w="100"/>
@@ -8988,7 +9106,7 @@
         </w:trPr>
         <w:tc>
           <w:tcPr>
-            <w:tcW w:type="dxa" w:w="1001"/>
+            <w:tcW w:type="dxa" w:w="999"/>
             <w:tcMar>
               <w:top w:type="dxa" w:w="60"/>
               <w:left w:type="dxa" w:w="100"/>
@@ -9012,7 +9130,7 @@
         </w:tc>
         <w:tc>
           <w:tcPr>
-            <w:tcW w:type="dxa" w:w="4367"/>
+            <w:tcW w:type="dxa" w:w="4355"/>
             <w:tcMar>
               <w:top w:type="dxa" w:w="60"/>
               <w:left w:type="dxa" w:w="100"/>
@@ -9036,7 +9154,7 @@
         </w:tc>
         <w:tc>
           <w:tcPr>
-            <w:tcW w:type="dxa" w:w="1978"/>
+            <w:tcW w:type="dxa" w:w="1966"/>
             <w:tcMar>
               <w:top w:type="dxa" w:w="60"/>
               <w:left w:type="dxa" w:w="100"/>
@@ -9060,7 +9178,7 @@
         </w:tc>
         <w:tc>
           <w:tcPr>
-            <w:tcW w:type="dxa" w:w="1724"/>
+            <w:tcW w:type="dxa" w:w="1750"/>
             <w:tcMar>
               <w:top w:type="dxa" w:w="60"/>
               <w:left w:type="dxa" w:w="100"/>
@@ -9089,7 +9207,7 @@
         </w:trPr>
         <w:tc>
           <w:tcPr>
-            <w:tcW w:type="dxa" w:w="1001"/>
+            <w:tcW w:type="dxa" w:w="999"/>
             <w:tcMar>
               <w:top w:type="dxa" w:w="60"/>
               <w:left w:type="dxa" w:w="100"/>
@@ -9113,7 +9231,7 @@
         </w:tc>
         <w:tc>
           <w:tcPr>
-            <w:tcW w:type="dxa" w:w="4367"/>
+            <w:tcW w:type="dxa" w:w="4355"/>
             <w:tcMar>
               <w:top w:type="dxa" w:w="60"/>
               <w:left w:type="dxa" w:w="100"/>
@@ -9137,7 +9255,7 @@
         </w:tc>
         <w:tc>
           <w:tcPr>
-            <w:tcW w:type="dxa" w:w="1978"/>
+            <w:tcW w:type="dxa" w:w="1966"/>
             <w:tcMar>
               <w:top w:type="dxa" w:w="60"/>
               <w:left w:type="dxa" w:w="100"/>
@@ -9161,7 +9279,7 @@
         </w:tc>
         <w:tc>
           <w:tcPr>
-            <w:tcW w:type="dxa" w:w="1724"/>
+            <w:tcW w:type="dxa" w:w="1750"/>
             <w:tcMar>
               <w:top w:type="dxa" w:w="60"/>
               <w:left w:type="dxa" w:w="100"/>
@@ -9190,7 +9308,7 @@
         </w:trPr>
         <w:tc>
           <w:tcPr>
-            <w:tcW w:type="dxa" w:w="1001"/>
+            <w:tcW w:type="dxa" w:w="999"/>
             <w:tcMar>
               <w:top w:type="dxa" w:w="60"/>
               <w:left w:type="dxa" w:w="100"/>
@@ -9214,7 +9332,7 @@
         </w:tc>
         <w:tc>
           <w:tcPr>
-            <w:tcW w:type="dxa" w:w="4367"/>
+            <w:tcW w:type="dxa" w:w="4355"/>
             <w:tcMar>
               <w:top w:type="dxa" w:w="60"/>
               <w:left w:type="dxa" w:w="100"/>
@@ -9247,7 +9365,7 @@
         </w:tc>
         <w:tc>
           <w:tcPr>
-            <w:tcW w:type="dxa" w:w="1978"/>
+            <w:tcW w:type="dxa" w:w="1966"/>
             <w:tcMar>
               <w:top w:type="dxa" w:w="60"/>
               <w:left w:type="dxa" w:w="100"/>
@@ -9271,7 +9389,7 @@
         </w:tc>
         <w:tc>
           <w:tcPr>
-            <w:tcW w:type="dxa" w:w="1724"/>
+            <w:tcW w:type="dxa" w:w="1750"/>
             <w:tcMar>
               <w:top w:type="dxa" w:w="60"/>
               <w:left w:type="dxa" w:w="100"/>
@@ -9300,97 +9418,97 @@
         </w:trPr>
         <w:tc>
           <w:tcPr>
-            <w:tcW w:type="dxa" w:w="1001"/>
-            <w:tcMar>
-              <w:top w:type="dxa" w:w="60"/>
-              <w:left w:type="dxa" w:w="100"/>
-              <w:bottom w:type="dxa" w:w="60"/>
-              <w:right w:type="dxa" w:w="100"/>
-            </w:tcMar>
-          </w:tcPr>
-          <w:p>
-            <w:pPr>
-              <w:spacing w:after="0" w:before="0" w:line="252"/>
-            </w:pPr>
-            <w:r>
-              <w:rPr>
-                <w:rFonts w:ascii="Calibri" w:cs="Calibri" w:eastAsia="Calibri" w:hAnsi="Calibri"/>
-                <w:sz w:val="18"/>
-                <w:szCs w:val="18"/>
-              </w:rPr>
-              <w:t xml:space="preserve">9</w:t>
-            </w:r>
-          </w:p>
-        </w:tc>
-        <w:tc>
-          <w:tcPr>
-            <w:tcW w:type="dxa" w:w="4367"/>
-            <w:tcMar>
-              <w:top w:type="dxa" w:w="60"/>
-              <w:left w:type="dxa" w:w="100"/>
-              <w:bottom w:type="dxa" w:w="60"/>
-              <w:right w:type="dxa" w:w="100"/>
-            </w:tcMar>
-          </w:tcPr>
-          <w:p>
-            <w:pPr>
-              <w:spacing w:after="0" w:before="0" w:line="252"/>
-            </w:pPr>
-            <w:r>
-              <w:rPr>
-                <w:rFonts w:ascii="Calibri" w:cs="Calibri" w:eastAsia="Calibri" w:hAnsi="Calibri"/>
-                <w:sz w:val="18"/>
-                <w:szCs w:val="18"/>
-              </w:rPr>
-              <w:t xml:space="preserve">Supply chain: SBOM, firma y procedencia</w:t>
-            </w:r>
-          </w:p>
-        </w:tc>
-        <w:tc>
-          <w:tcPr>
-            <w:tcW w:type="dxa" w:w="1978"/>
-            <w:tcMar>
-              <w:top w:type="dxa" w:w="60"/>
-              <w:left w:type="dxa" w:w="100"/>
-              <w:bottom w:type="dxa" w:w="60"/>
-              <w:right w:type="dxa" w:w="100"/>
-            </w:tcMar>
-          </w:tcPr>
-          <w:p>
-            <w:pPr>
-              <w:spacing w:after="0" w:before="0" w:line="252"/>
-            </w:pPr>
-            <w:r>
-              <w:rPr>
-                <w:rFonts w:ascii="Calibri" w:cs="Calibri" w:eastAsia="Calibri" w:hAnsi="Calibri"/>
-                <w:sz w:val="18"/>
-                <w:szCs w:val="18"/>
-              </w:rPr>
-              <w:t xml:space="preserve">Principal</w:t>
-            </w:r>
-          </w:p>
-        </w:tc>
-        <w:tc>
-          <w:tcPr>
-            <w:tcW w:type="dxa" w:w="1724"/>
-            <w:tcMar>
-              <w:top w:type="dxa" w:w="60"/>
-              <w:left w:type="dxa" w:w="100"/>
-              <w:bottom w:type="dxa" w:w="60"/>
-              <w:right w:type="dxa" w:w="100"/>
-            </w:tcMar>
-          </w:tcPr>
-          <w:p>
-            <w:pPr>
-              <w:spacing w:after="0" w:before="0" w:line="252"/>
-            </w:pPr>
-            <w:r>
-              <w:rPr>
-                <w:rFonts w:ascii="Calibri" w:cs="Calibri" w:eastAsia="Calibri" w:hAnsi="Calibri"/>
-                <w:sz w:val="18"/>
-                <w:szCs w:val="18"/>
-              </w:rPr>
-              <w:t xml:space="preserve">Entrega</w:t>
+            <w:tcW w:type="dxa" w:w="999"/>
+            <w:tcMar>
+              <w:top w:type="dxa" w:w="60"/>
+              <w:left w:type="dxa" w:w="100"/>
+              <w:bottom w:type="dxa" w:w="60"/>
+              <w:right w:type="dxa" w:w="100"/>
+            </w:tcMar>
+          </w:tcPr>
+          <w:p>
+            <w:pPr>
+              <w:spacing w:after="0" w:before="0" w:line="252"/>
+            </w:pPr>
+            <w:r>
+              <w:rPr>
+                <w:rFonts w:ascii="Calibri" w:cs="Calibri" w:eastAsia="Calibri" w:hAnsi="Calibri"/>
+                <w:sz w:val="18"/>
+                <w:szCs w:val="18"/>
+              </w:rPr>
+              <w:t xml:space="preserve">↳ F</w:t>
+            </w:r>
+          </w:p>
+        </w:tc>
+        <w:tc>
+          <w:tcPr>
+            <w:tcW w:type="dxa" w:w="4355"/>
+            <w:tcMar>
+              <w:top w:type="dxa" w:w="60"/>
+              <w:left w:type="dxa" w:w="100"/>
+              <w:bottom w:type="dxa" w:w="60"/>
+              <w:right w:type="dxa" w:w="100"/>
+            </w:tcMar>
+          </w:tcPr>
+          <w:p>
+            <w:pPr>
+              <w:spacing w:after="0" w:before="0" w:line="252"/>
+            </w:pPr>
+            <w:r>
+              <w:rPr>
+                <w:rFonts w:ascii="Calibri" w:cs="Calibri" w:eastAsia="Calibri" w:hAnsi="Calibri"/>
+                <w:sz w:val="18"/>
+                <w:szCs w:val="18"/>
+              </w:rPr>
+              <w:t xml:space="preserve">Agente autónomo en Actions</w:t>
+            </w:r>
+          </w:p>
+        </w:tc>
+        <w:tc>
+          <w:tcPr>
+            <w:tcW w:type="dxa" w:w="1966"/>
+            <w:tcMar>
+              <w:top w:type="dxa" w:w="60"/>
+              <w:left w:type="dxa" w:w="100"/>
+              <w:bottom w:type="dxa" w:w="60"/>
+              <w:right w:type="dxa" w:w="100"/>
+            </w:tcMar>
+          </w:tcPr>
+          <w:p>
+            <w:pPr>
+              <w:spacing w:after="0" w:before="0" w:line="252"/>
+            </w:pPr>
+            <w:r>
+              <w:rPr>
+                <w:rFonts w:ascii="Calibri" w:cs="Calibri" w:eastAsia="Calibri" w:hAnsi="Calibri"/>
+                <w:sz w:val="18"/>
+                <w:szCs w:val="18"/>
+              </w:rPr>
+              <w:t xml:space="preserve">Extensión</w:t>
+            </w:r>
+          </w:p>
+        </w:tc>
+        <w:tc>
+          <w:tcPr>
+            <w:tcW w:type="dxa" w:w="1750"/>
+            <w:tcMar>
+              <w:top w:type="dxa" w:w="60"/>
+              <w:left w:type="dxa" w:w="100"/>
+              <w:bottom w:type="dxa" w:w="60"/>
+              <w:right w:type="dxa" w:w="100"/>
+            </w:tcMar>
+          </w:tcPr>
+          <w:p>
+            <w:pPr>
+              <w:spacing w:after="0" w:before="0" w:line="252"/>
+            </w:pPr>
+            <w:r>
+              <w:rPr>
+                <w:rFonts w:ascii="Calibri" w:cs="Calibri" w:eastAsia="Calibri" w:hAnsi="Calibri"/>
+                <w:sz w:val="18"/>
+                <w:szCs w:val="18"/>
+              </w:rPr>
+              <w:t xml:space="preserve">Construcción</w:t>
             </w:r>
           </w:p>
         </w:tc>
@@ -9401,55 +9519,55 @@
         </w:trPr>
         <w:tc>
           <w:tcPr>
-            <w:tcW w:type="dxa" w:w="1001"/>
-            <w:tcMar>
-              <w:top w:type="dxa" w:w="60"/>
-              <w:left w:type="dxa" w:w="100"/>
-              <w:bottom w:type="dxa" w:w="60"/>
-              <w:right w:type="dxa" w:w="100"/>
-            </w:tcMar>
-          </w:tcPr>
-          <w:p>
-            <w:pPr>
-              <w:spacing w:after="0" w:before="0" w:line="252"/>
-            </w:pPr>
-            <w:r>
-              <w:rPr>
-                <w:rFonts w:ascii="Calibri" w:cs="Calibri" w:eastAsia="Calibri" w:hAnsi="Calibri"/>
-                <w:sz w:val="18"/>
-                <w:szCs w:val="18"/>
-              </w:rPr>
-              <w:t xml:space="preserve">10</w:t>
-            </w:r>
-          </w:p>
-        </w:tc>
-        <w:tc>
-          <w:tcPr>
-            <w:tcW w:type="dxa" w:w="4367"/>
-            <w:tcMar>
-              <w:top w:type="dxa" w:w="60"/>
-              <w:left w:type="dxa" w:w="100"/>
-              <w:bottom w:type="dxa" w:w="60"/>
-              <w:right w:type="dxa" w:w="100"/>
-            </w:tcMar>
-          </w:tcPr>
-          <w:p>
-            <w:pPr>
-              <w:spacing w:after="0" w:before="0" w:line="252"/>
-            </w:pPr>
-            <w:r>
-              <w:rPr>
-                <w:rFonts w:ascii="Calibri" w:cs="Calibri" w:eastAsia="Calibri" w:hAnsi="Calibri"/>
-                <w:sz w:val="18"/>
-                <w:szCs w:val="18"/>
-              </w:rPr>
-              <w:t xml:space="preserve">Deploy GitOps con gate humano</w:t>
-            </w:r>
-          </w:p>
-        </w:tc>
-        <w:tc>
-          <w:tcPr>
-            <w:tcW w:type="dxa" w:w="1978"/>
+            <w:tcW w:type="dxa" w:w="999"/>
+            <w:tcMar>
+              <w:top w:type="dxa" w:w="60"/>
+              <w:left w:type="dxa" w:w="100"/>
+              <w:bottom w:type="dxa" w:w="60"/>
+              <w:right w:type="dxa" w:w="100"/>
+            </w:tcMar>
+          </w:tcPr>
+          <w:p>
+            <w:pPr>
+              <w:spacing w:after="0" w:before="0" w:line="252"/>
+            </w:pPr>
+            <w:r>
+              <w:rPr>
+                <w:rFonts w:ascii="Calibri" w:cs="Calibri" w:eastAsia="Calibri" w:hAnsi="Calibri"/>
+                <w:sz w:val="18"/>
+                <w:szCs w:val="18"/>
+              </w:rPr>
+              <w:t xml:space="preserve">9</w:t>
+            </w:r>
+          </w:p>
+        </w:tc>
+        <w:tc>
+          <w:tcPr>
+            <w:tcW w:type="dxa" w:w="4355"/>
+            <w:tcMar>
+              <w:top w:type="dxa" w:w="60"/>
+              <w:left w:type="dxa" w:w="100"/>
+              <w:bottom w:type="dxa" w:w="60"/>
+              <w:right w:type="dxa" w:w="100"/>
+            </w:tcMar>
+          </w:tcPr>
+          <w:p>
+            <w:pPr>
+              <w:spacing w:after="0" w:before="0" w:line="252"/>
+            </w:pPr>
+            <w:r>
+              <w:rPr>
+                <w:rFonts w:ascii="Calibri" w:cs="Calibri" w:eastAsia="Calibri" w:hAnsi="Calibri"/>
+                <w:sz w:val="18"/>
+                <w:szCs w:val="18"/>
+              </w:rPr>
+              <w:t xml:space="preserve">Supply chain: SBOM, firma y procedencia</w:t>
+            </w:r>
+          </w:p>
+        </w:tc>
+        <w:tc>
+          <w:tcPr>
+            <w:tcW w:type="dxa" w:w="1966"/>
             <w:tcMar>
               <w:top w:type="dxa" w:w="60"/>
               <w:left w:type="dxa" w:w="100"/>
@@ -9473,7 +9591,7 @@
         </w:tc>
         <w:tc>
           <w:tcPr>
-            <w:tcW w:type="dxa" w:w="1724"/>
+            <w:tcW w:type="dxa" w:w="1750"/>
             <w:tcMar>
               <w:top w:type="dxa" w:w="60"/>
               <w:left w:type="dxa" w:w="100"/>
@@ -9502,79 +9620,79 @@
         </w:trPr>
         <w:tc>
           <w:tcPr>
-            <w:tcW w:type="dxa" w:w="1001"/>
-            <w:tcMar>
-              <w:top w:type="dxa" w:w="60"/>
-              <w:left w:type="dxa" w:w="100"/>
-              <w:bottom w:type="dxa" w:w="60"/>
-              <w:right w:type="dxa" w:w="100"/>
-            </w:tcMar>
-          </w:tcPr>
-          <w:p>
-            <w:pPr>
-              <w:spacing w:after="0" w:before="0" w:line="252"/>
-            </w:pPr>
-            <w:r>
-              <w:rPr>
-                <w:rFonts w:ascii="Calibri" w:cs="Calibri" w:eastAsia="Calibri" w:hAnsi="Calibri"/>
-                <w:sz w:val="18"/>
-                <w:szCs w:val="18"/>
-              </w:rPr>
-              <w:t xml:space="preserve">↳ B</w:t>
-            </w:r>
-          </w:p>
-        </w:tc>
-        <w:tc>
-          <w:tcPr>
-            <w:tcW w:type="dxa" w:w="4367"/>
-            <w:tcMar>
-              <w:top w:type="dxa" w:w="60"/>
-              <w:left w:type="dxa" w:w="100"/>
-              <w:bottom w:type="dxa" w:w="60"/>
-              <w:right w:type="dxa" w:w="100"/>
-            </w:tcMar>
-          </w:tcPr>
-          <w:p>
-            <w:pPr>
-              <w:spacing w:after="0" w:before="0" w:line="252"/>
-            </w:pPr>
-            <w:r>
-              <w:rPr>
-                <w:rFonts w:ascii="Calibri" w:cs="Calibri" w:eastAsia="Calibri" w:hAnsi="Calibri"/>
-                <w:sz w:val="18"/>
-                <w:szCs w:val="18"/>
-              </w:rPr>
-              <w:t xml:space="preserve">Gestión de releases</w:t>
-            </w:r>
-          </w:p>
-        </w:tc>
-        <w:tc>
-          <w:tcPr>
-            <w:tcW w:type="dxa" w:w="1978"/>
-            <w:tcMar>
-              <w:top w:type="dxa" w:w="60"/>
-              <w:left w:type="dxa" w:w="100"/>
-              <w:bottom w:type="dxa" w:w="60"/>
-              <w:right w:type="dxa" w:w="100"/>
-            </w:tcMar>
-          </w:tcPr>
-          <w:p>
-            <w:pPr>
-              <w:spacing w:after="0" w:before="0" w:line="252"/>
-            </w:pPr>
-            <w:r>
-              <w:rPr>
-                <w:rFonts w:ascii="Calibri" w:cs="Calibri" w:eastAsia="Calibri" w:hAnsi="Calibri"/>
-                <w:sz w:val="18"/>
-                <w:szCs w:val="18"/>
-              </w:rPr>
-              <w:t xml:space="preserve">Extensión ALM</w:t>
-            </w:r>
-          </w:p>
-        </w:tc>
-        <w:tc>
-          <w:tcPr>
-            <w:tcW w:type="dxa" w:w="1724"/>
+            <w:tcW w:type="dxa" w:w="999"/>
+            <w:tcMar>
+              <w:top w:type="dxa" w:w="60"/>
+              <w:left w:type="dxa" w:w="100"/>
+              <w:bottom w:type="dxa" w:w="60"/>
+              <w:right w:type="dxa" w:w="100"/>
+            </w:tcMar>
+          </w:tcPr>
+          <w:p>
+            <w:pPr>
+              <w:spacing w:after="0" w:before="0" w:line="252"/>
+            </w:pPr>
+            <w:r>
+              <w:rPr>
+                <w:rFonts w:ascii="Calibri" w:cs="Calibri" w:eastAsia="Calibri" w:hAnsi="Calibri"/>
+                <w:sz w:val="18"/>
+                <w:szCs w:val="18"/>
+              </w:rPr>
+              <w:t xml:space="preserve">10</w:t>
+            </w:r>
+          </w:p>
+        </w:tc>
+        <w:tc>
+          <w:tcPr>
+            <w:tcW w:type="dxa" w:w="4355"/>
+            <w:tcMar>
+              <w:top w:type="dxa" w:w="60"/>
+              <w:left w:type="dxa" w:w="100"/>
+              <w:bottom w:type="dxa" w:w="60"/>
+              <w:right w:type="dxa" w:w="100"/>
+            </w:tcMar>
+          </w:tcPr>
+          <w:p>
+            <w:pPr>
+              <w:spacing w:after="0" w:before="0" w:line="252"/>
+            </w:pPr>
+            <w:r>
+              <w:rPr>
+                <w:rFonts w:ascii="Calibri" w:cs="Calibri" w:eastAsia="Calibri" w:hAnsi="Calibri"/>
+                <w:sz w:val="18"/>
+                <w:szCs w:val="18"/>
+              </w:rPr>
+              <w:t xml:space="preserve">Deploy GitOps con gate humano</w:t>
+            </w:r>
+          </w:p>
+        </w:tc>
+        <w:tc>
+          <w:tcPr>
+            <w:tcW w:type="dxa" w:w="1966"/>
+            <w:tcMar>
+              <w:top w:type="dxa" w:w="60"/>
+              <w:left w:type="dxa" w:w="100"/>
+              <w:bottom w:type="dxa" w:w="60"/>
+              <w:right w:type="dxa" w:w="100"/>
+            </w:tcMar>
+          </w:tcPr>
+          <w:p>
+            <w:pPr>
+              <w:spacing w:after="0" w:before="0" w:line="252"/>
+            </w:pPr>
+            <w:r>
+              <w:rPr>
+                <w:rFonts w:ascii="Calibri" w:cs="Calibri" w:eastAsia="Calibri" w:hAnsi="Calibri"/>
+                <w:sz w:val="18"/>
+                <w:szCs w:val="18"/>
+              </w:rPr>
+              <w:t xml:space="preserve">Principal</w:t>
+            </w:r>
+          </w:p>
+        </w:tc>
+        <w:tc>
+          <w:tcPr>
+            <w:tcW w:type="dxa" w:w="1750"/>
             <w:tcMar>
               <w:top w:type="dxa" w:w="60"/>
               <w:left w:type="dxa" w:w="100"/>
@@ -9603,97 +9721,97 @@
         </w:trPr>
         <w:tc>
           <w:tcPr>
-            <w:tcW w:type="dxa" w:w="1001"/>
-            <w:tcMar>
-              <w:top w:type="dxa" w:w="60"/>
-              <w:left w:type="dxa" w:w="100"/>
-              <w:bottom w:type="dxa" w:w="60"/>
-              <w:right w:type="dxa" w:w="100"/>
-            </w:tcMar>
-          </w:tcPr>
-          <w:p>
-            <w:pPr>
-              <w:spacing w:after="0" w:before="0" w:line="252"/>
-            </w:pPr>
-            <w:r>
-              <w:rPr>
-                <w:rFonts w:ascii="Calibri" w:cs="Calibri" w:eastAsia="Calibri" w:hAnsi="Calibri"/>
-                <w:sz w:val="18"/>
-                <w:szCs w:val="18"/>
-              </w:rPr>
-              <w:t xml:space="preserve">11</w:t>
-            </w:r>
-          </w:p>
-        </w:tc>
-        <w:tc>
-          <w:tcPr>
-            <w:tcW w:type="dxa" w:w="4367"/>
-            <w:tcMar>
-              <w:top w:type="dxa" w:w="60"/>
-              <w:left w:type="dxa" w:w="100"/>
-              <w:bottom w:type="dxa" w:w="60"/>
-              <w:right w:type="dxa" w:w="100"/>
-            </w:tcMar>
-          </w:tcPr>
-          <w:p>
-            <w:pPr>
-              <w:spacing w:after="0" w:before="0" w:line="252"/>
-            </w:pPr>
-            <w:r>
-              <w:rPr>
-                <w:rFonts w:ascii="Calibri" w:cs="Calibri" w:eastAsia="Calibri" w:hAnsi="Calibri"/>
-                <w:sz w:val="18"/>
-                <w:szCs w:val="18"/>
-              </w:rPr>
-              <w:t xml:space="preserve">Cerrar el loop de operación</w:t>
-            </w:r>
-          </w:p>
-        </w:tc>
-        <w:tc>
-          <w:tcPr>
-            <w:tcW w:type="dxa" w:w="1978"/>
-            <w:tcMar>
-              <w:top w:type="dxa" w:w="60"/>
-              <w:left w:type="dxa" w:w="100"/>
-              <w:bottom w:type="dxa" w:w="60"/>
-              <w:right w:type="dxa" w:w="100"/>
-            </w:tcMar>
-          </w:tcPr>
-          <w:p>
-            <w:pPr>
-              <w:spacing w:after="0" w:before="0" w:line="252"/>
-            </w:pPr>
-            <w:r>
-              <w:rPr>
-                <w:rFonts w:ascii="Calibri" w:cs="Calibri" w:eastAsia="Calibri" w:hAnsi="Calibri"/>
-                <w:sz w:val="18"/>
-                <w:szCs w:val="18"/>
-              </w:rPr>
-              <w:t xml:space="preserve">Principal</w:t>
-            </w:r>
-          </w:p>
-        </w:tc>
-        <w:tc>
-          <w:tcPr>
-            <w:tcW w:type="dxa" w:w="1724"/>
-            <w:tcMar>
-              <w:top w:type="dxa" w:w="60"/>
-              <w:left w:type="dxa" w:w="100"/>
-              <w:bottom w:type="dxa" w:w="60"/>
-              <w:right w:type="dxa" w:w="100"/>
-            </w:tcMar>
-          </w:tcPr>
-          <w:p>
-            <w:pPr>
-              <w:spacing w:after="0" w:before="0" w:line="252"/>
-            </w:pPr>
-            <w:r>
-              <w:rPr>
-                <w:rFonts w:ascii="Calibri" w:cs="Calibri" w:eastAsia="Calibri" w:hAnsi="Calibri"/>
-                <w:sz w:val="18"/>
-                <w:szCs w:val="18"/>
-              </w:rPr>
-              <w:t xml:space="preserve">Operación</w:t>
+            <w:tcW w:type="dxa" w:w="999"/>
+            <w:tcMar>
+              <w:top w:type="dxa" w:w="60"/>
+              <w:left w:type="dxa" w:w="100"/>
+              <w:bottom w:type="dxa" w:w="60"/>
+              <w:right w:type="dxa" w:w="100"/>
+            </w:tcMar>
+          </w:tcPr>
+          <w:p>
+            <w:pPr>
+              <w:spacing w:after="0" w:before="0" w:line="252"/>
+            </w:pPr>
+            <w:r>
+              <w:rPr>
+                <w:rFonts w:ascii="Calibri" w:cs="Calibri" w:eastAsia="Calibri" w:hAnsi="Calibri"/>
+                <w:sz w:val="18"/>
+                <w:szCs w:val="18"/>
+              </w:rPr>
+              <w:t xml:space="preserve">↳ B</w:t>
+            </w:r>
+          </w:p>
+        </w:tc>
+        <w:tc>
+          <w:tcPr>
+            <w:tcW w:type="dxa" w:w="4355"/>
+            <w:tcMar>
+              <w:top w:type="dxa" w:w="60"/>
+              <w:left w:type="dxa" w:w="100"/>
+              <w:bottom w:type="dxa" w:w="60"/>
+              <w:right w:type="dxa" w:w="100"/>
+            </w:tcMar>
+          </w:tcPr>
+          <w:p>
+            <w:pPr>
+              <w:spacing w:after="0" w:before="0" w:line="252"/>
+            </w:pPr>
+            <w:r>
+              <w:rPr>
+                <w:rFonts w:ascii="Calibri" w:cs="Calibri" w:eastAsia="Calibri" w:hAnsi="Calibri"/>
+                <w:sz w:val="18"/>
+                <w:szCs w:val="18"/>
+              </w:rPr>
+              <w:t xml:space="preserve">Gestión de releases</w:t>
+            </w:r>
+          </w:p>
+        </w:tc>
+        <w:tc>
+          <w:tcPr>
+            <w:tcW w:type="dxa" w:w="1966"/>
+            <w:tcMar>
+              <w:top w:type="dxa" w:w="60"/>
+              <w:left w:type="dxa" w:w="100"/>
+              <w:bottom w:type="dxa" w:w="60"/>
+              <w:right w:type="dxa" w:w="100"/>
+            </w:tcMar>
+          </w:tcPr>
+          <w:p>
+            <w:pPr>
+              <w:spacing w:after="0" w:before="0" w:line="252"/>
+            </w:pPr>
+            <w:r>
+              <w:rPr>
+                <w:rFonts w:ascii="Calibri" w:cs="Calibri" w:eastAsia="Calibri" w:hAnsi="Calibri"/>
+                <w:sz w:val="18"/>
+                <w:szCs w:val="18"/>
+              </w:rPr>
+              <w:t xml:space="preserve">Extensión ALM</w:t>
+            </w:r>
+          </w:p>
+        </w:tc>
+        <w:tc>
+          <w:tcPr>
+            <w:tcW w:type="dxa" w:w="1750"/>
+            <w:tcMar>
+              <w:top w:type="dxa" w:w="60"/>
+              <w:left w:type="dxa" w:w="100"/>
+              <w:bottom w:type="dxa" w:w="60"/>
+              <w:right w:type="dxa" w:w="100"/>
+            </w:tcMar>
+          </w:tcPr>
+          <w:p>
+            <w:pPr>
+              <w:spacing w:after="0" w:before="0" w:line="252"/>
+            </w:pPr>
+            <w:r>
+              <w:rPr>
+                <w:rFonts w:ascii="Calibri" w:cs="Calibri" w:eastAsia="Calibri" w:hAnsi="Calibri"/>
+                <w:sz w:val="18"/>
+                <w:szCs w:val="18"/>
+              </w:rPr>
+              <w:t xml:space="preserve">Entrega</w:t>
             </w:r>
           </w:p>
         </w:tc>
@@ -9704,79 +9822,79 @@
         </w:trPr>
         <w:tc>
           <w:tcPr>
-            <w:tcW w:type="dxa" w:w="1001"/>
-            <w:tcMar>
-              <w:top w:type="dxa" w:w="60"/>
-              <w:left w:type="dxa" w:w="100"/>
-              <w:bottom w:type="dxa" w:w="60"/>
-              <w:right w:type="dxa" w:w="100"/>
-            </w:tcMar>
-          </w:tcPr>
-          <w:p>
-            <w:pPr>
-              <w:spacing w:after="0" w:before="0" w:line="252"/>
-            </w:pPr>
-            <w:r>
-              <w:rPr>
-                <w:rFonts w:ascii="Calibri" w:cs="Calibri" w:eastAsia="Calibri" w:hAnsi="Calibri"/>
-                <w:sz w:val="18"/>
-                <w:szCs w:val="18"/>
-              </w:rPr>
-              <w:t xml:space="preserve">↳ C</w:t>
-            </w:r>
-          </w:p>
-        </w:tc>
-        <w:tc>
-          <w:tcPr>
-            <w:tcW w:type="dxa" w:w="4367"/>
-            <w:tcMar>
-              <w:top w:type="dxa" w:w="60"/>
-              <w:left w:type="dxa" w:w="100"/>
-              <w:bottom w:type="dxa" w:w="60"/>
-              <w:right w:type="dxa" w:w="100"/>
-            </w:tcMar>
-          </w:tcPr>
-          <w:p>
-            <w:pPr>
-              <w:spacing w:after="0" w:before="0" w:line="252"/>
-            </w:pPr>
-            <w:r>
-              <w:rPr>
-                <w:rFonts w:ascii="Calibri" w:cs="Calibri" w:eastAsia="Calibri" w:hAnsi="Calibri"/>
-                <w:sz w:val="18"/>
-                <w:szCs w:val="18"/>
-              </w:rPr>
-              <w:t xml:space="preserve">Mantenimiento continuo</w:t>
-            </w:r>
-          </w:p>
-        </w:tc>
-        <w:tc>
-          <w:tcPr>
-            <w:tcW w:type="dxa" w:w="1978"/>
-            <w:tcMar>
-              <w:top w:type="dxa" w:w="60"/>
-              <w:left w:type="dxa" w:w="100"/>
-              <w:bottom w:type="dxa" w:w="60"/>
-              <w:right w:type="dxa" w:w="100"/>
-            </w:tcMar>
-          </w:tcPr>
-          <w:p>
-            <w:pPr>
-              <w:spacing w:after="0" w:before="0" w:line="252"/>
-            </w:pPr>
-            <w:r>
-              <w:rPr>
-                <w:rFonts w:ascii="Calibri" w:cs="Calibri" w:eastAsia="Calibri" w:hAnsi="Calibri"/>
-                <w:sz w:val="18"/>
-                <w:szCs w:val="18"/>
-              </w:rPr>
-              <w:t xml:space="preserve">Extensión ALM</w:t>
-            </w:r>
-          </w:p>
-        </w:tc>
-        <w:tc>
-          <w:tcPr>
-            <w:tcW w:type="dxa" w:w="1724"/>
+            <w:tcW w:type="dxa" w:w="999"/>
+            <w:tcMar>
+              <w:top w:type="dxa" w:w="60"/>
+              <w:left w:type="dxa" w:w="100"/>
+              <w:bottom w:type="dxa" w:w="60"/>
+              <w:right w:type="dxa" w:w="100"/>
+            </w:tcMar>
+          </w:tcPr>
+          <w:p>
+            <w:pPr>
+              <w:spacing w:after="0" w:before="0" w:line="252"/>
+            </w:pPr>
+            <w:r>
+              <w:rPr>
+                <w:rFonts w:ascii="Calibri" w:cs="Calibri" w:eastAsia="Calibri" w:hAnsi="Calibri"/>
+                <w:sz w:val="18"/>
+                <w:szCs w:val="18"/>
+              </w:rPr>
+              <w:t xml:space="preserve">11</w:t>
+            </w:r>
+          </w:p>
+        </w:tc>
+        <w:tc>
+          <w:tcPr>
+            <w:tcW w:type="dxa" w:w="4355"/>
+            <w:tcMar>
+              <w:top w:type="dxa" w:w="60"/>
+              <w:left w:type="dxa" w:w="100"/>
+              <w:bottom w:type="dxa" w:w="60"/>
+              <w:right w:type="dxa" w:w="100"/>
+            </w:tcMar>
+          </w:tcPr>
+          <w:p>
+            <w:pPr>
+              <w:spacing w:after="0" w:before="0" w:line="252"/>
+            </w:pPr>
+            <w:r>
+              <w:rPr>
+                <w:rFonts w:ascii="Calibri" w:cs="Calibri" w:eastAsia="Calibri" w:hAnsi="Calibri"/>
+                <w:sz w:val="18"/>
+                <w:szCs w:val="18"/>
+              </w:rPr>
+              <w:t xml:space="preserve">Cerrar el loop de operación</w:t>
+            </w:r>
+          </w:p>
+        </w:tc>
+        <w:tc>
+          <w:tcPr>
+            <w:tcW w:type="dxa" w:w="1966"/>
+            <w:tcMar>
+              <w:top w:type="dxa" w:w="60"/>
+              <w:left w:type="dxa" w:w="100"/>
+              <w:bottom w:type="dxa" w:w="60"/>
+              <w:right w:type="dxa" w:w="100"/>
+            </w:tcMar>
+          </w:tcPr>
+          <w:p>
+            <w:pPr>
+              <w:spacing w:after="0" w:before="0" w:line="252"/>
+            </w:pPr>
+            <w:r>
+              <w:rPr>
+                <w:rFonts w:ascii="Calibri" w:cs="Calibri" w:eastAsia="Calibri" w:hAnsi="Calibri"/>
+                <w:sz w:val="18"/>
+                <w:szCs w:val="18"/>
+              </w:rPr>
+              <w:t xml:space="preserve">Principal</w:t>
+            </w:r>
+          </w:p>
+        </w:tc>
+        <w:tc>
+          <w:tcPr>
+            <w:tcW w:type="dxa" w:w="1750"/>
             <w:tcMar>
               <w:top w:type="dxa" w:w="60"/>
               <w:left w:type="dxa" w:w="100"/>
@@ -9805,55 +9923,55 @@
         </w:trPr>
         <w:tc>
           <w:tcPr>
-            <w:tcW w:type="dxa" w:w="1001"/>
-            <w:tcMar>
-              <w:top w:type="dxa" w:w="60"/>
-              <w:left w:type="dxa" w:w="100"/>
-              <w:bottom w:type="dxa" w:w="60"/>
-              <w:right w:type="dxa" w:w="100"/>
-            </w:tcMar>
-          </w:tcPr>
-          <w:p>
-            <w:pPr>
-              <w:spacing w:after="0" w:before="0" w:line="252"/>
-            </w:pPr>
-            <w:r>
-              <w:rPr>
-                <w:rFonts w:ascii="Calibri" w:cs="Calibri" w:eastAsia="Calibri" w:hAnsi="Calibri"/>
-                <w:sz w:val="18"/>
-                <w:szCs w:val="18"/>
-              </w:rPr>
-              <w:t xml:space="preserve">↳ D</w:t>
-            </w:r>
-          </w:p>
-        </w:tc>
-        <w:tc>
-          <w:tcPr>
-            <w:tcW w:type="dxa" w:w="4367"/>
-            <w:tcMar>
-              <w:top w:type="dxa" w:w="60"/>
-              <w:left w:type="dxa" w:w="100"/>
-              <w:bottom w:type="dxa" w:w="60"/>
-              <w:right w:type="dxa" w:w="100"/>
-            </w:tcMar>
-          </w:tcPr>
-          <w:p>
-            <w:pPr>
-              <w:spacing w:after="0" w:before="0" w:line="252"/>
-            </w:pPr>
-            <w:r>
-              <w:rPr>
-                <w:rFonts w:ascii="Calibri" w:cs="Calibri" w:eastAsia="Calibri" w:hAnsi="Calibri"/>
-                <w:sz w:val="18"/>
-                <w:szCs w:val="18"/>
-              </w:rPr>
-              <w:t xml:space="preserve">Retirada de un endpoint v1</w:t>
-            </w:r>
-          </w:p>
-        </w:tc>
-        <w:tc>
-          <w:tcPr>
-            <w:tcW w:type="dxa" w:w="1978"/>
+            <w:tcW w:type="dxa" w:w="999"/>
+            <w:tcMar>
+              <w:top w:type="dxa" w:w="60"/>
+              <w:left w:type="dxa" w:w="100"/>
+              <w:bottom w:type="dxa" w:w="60"/>
+              <w:right w:type="dxa" w:w="100"/>
+            </w:tcMar>
+          </w:tcPr>
+          <w:p>
+            <w:pPr>
+              <w:spacing w:after="0" w:before="0" w:line="252"/>
+            </w:pPr>
+            <w:r>
+              <w:rPr>
+                <w:rFonts w:ascii="Calibri" w:cs="Calibri" w:eastAsia="Calibri" w:hAnsi="Calibri"/>
+                <w:sz w:val="18"/>
+                <w:szCs w:val="18"/>
+              </w:rPr>
+              <w:t xml:space="preserve">↳ C</w:t>
+            </w:r>
+          </w:p>
+        </w:tc>
+        <w:tc>
+          <w:tcPr>
+            <w:tcW w:type="dxa" w:w="4355"/>
+            <w:tcMar>
+              <w:top w:type="dxa" w:w="60"/>
+              <w:left w:type="dxa" w:w="100"/>
+              <w:bottom w:type="dxa" w:w="60"/>
+              <w:right w:type="dxa" w:w="100"/>
+            </w:tcMar>
+          </w:tcPr>
+          <w:p>
+            <w:pPr>
+              <w:spacing w:after="0" w:before="0" w:line="252"/>
+            </w:pPr>
+            <w:r>
+              <w:rPr>
+                <w:rFonts w:ascii="Calibri" w:cs="Calibri" w:eastAsia="Calibri" w:hAnsi="Calibri"/>
+                <w:sz w:val="18"/>
+                <w:szCs w:val="18"/>
+              </w:rPr>
+              <w:t xml:space="preserve">Mantenimiento continuo</w:t>
+            </w:r>
+          </w:p>
+        </w:tc>
+        <w:tc>
+          <w:tcPr>
+            <w:tcW w:type="dxa" w:w="1966"/>
             <w:tcMar>
               <w:top w:type="dxa" w:w="60"/>
               <w:left w:type="dxa" w:w="100"/>
@@ -9877,25 +9995,25 @@
         </w:tc>
         <w:tc>
           <w:tcPr>
-            <w:tcW w:type="dxa" w:w="1724"/>
-            <w:tcMar>
-              <w:top w:type="dxa" w:w="60"/>
-              <w:left w:type="dxa" w:w="100"/>
-              <w:bottom w:type="dxa" w:w="60"/>
-              <w:right w:type="dxa" w:w="100"/>
-            </w:tcMar>
-          </w:tcPr>
-          <w:p>
-            <w:pPr>
-              <w:spacing w:after="0" w:before="0" w:line="252"/>
-            </w:pPr>
-            <w:r>
-              <w:rPr>
-                <w:rFonts w:ascii="Calibri" w:cs="Calibri" w:eastAsia="Calibri" w:hAnsi="Calibri"/>
-                <w:sz w:val="18"/>
-                <w:szCs w:val="18"/>
-              </w:rPr>
-              <w:t xml:space="preserve">Retirada</w:t>
+            <w:tcW w:type="dxa" w:w="1750"/>
+            <w:tcMar>
+              <w:top w:type="dxa" w:w="60"/>
+              <w:left w:type="dxa" w:w="100"/>
+              <w:bottom w:type="dxa" w:w="60"/>
+              <w:right w:type="dxa" w:w="100"/>
+            </w:tcMar>
+          </w:tcPr>
+          <w:p>
+            <w:pPr>
+              <w:spacing w:after="0" w:before="0" w:line="252"/>
+            </w:pPr>
+            <w:r>
+              <w:rPr>
+                <w:rFonts w:ascii="Calibri" w:cs="Calibri" w:eastAsia="Calibri" w:hAnsi="Calibri"/>
+                <w:sz w:val="18"/>
+                <w:szCs w:val="18"/>
+              </w:rPr>
+              <w:t xml:space="preserve">Operación</w:t>
             </w:r>
           </w:p>
         </w:tc>
@@ -9906,55 +10024,55 @@
         </w:trPr>
         <w:tc>
           <w:tcPr>
-            <w:tcW w:type="dxa" w:w="1001"/>
-            <w:tcMar>
-              <w:top w:type="dxa" w:w="60"/>
-              <w:left w:type="dxa" w:w="100"/>
-              <w:bottom w:type="dxa" w:w="60"/>
-              <w:right w:type="dxa" w:w="100"/>
-            </w:tcMar>
-          </w:tcPr>
-          <w:p>
-            <w:pPr>
-              <w:spacing w:after="0" w:before="0" w:line="252"/>
-            </w:pPr>
-            <w:r>
-              <w:rPr>
-                <w:rFonts w:ascii="Calibri" w:cs="Calibri" w:eastAsia="Calibri" w:hAnsi="Calibri"/>
-                <w:sz w:val="18"/>
-                <w:szCs w:val="18"/>
-              </w:rPr>
-              <w:t xml:space="preserve">↳ E</w:t>
-            </w:r>
-          </w:p>
-        </w:tc>
-        <w:tc>
-          <w:tcPr>
-            <w:tcW w:type="dxa" w:w="4367"/>
-            <w:tcMar>
-              <w:top w:type="dxa" w:w="60"/>
-              <w:left w:type="dxa" w:w="100"/>
-              <w:bottom w:type="dxa" w:w="60"/>
-              <w:right w:type="dxa" w:w="100"/>
-            </w:tcMar>
-          </w:tcPr>
-          <w:p>
-            <w:pPr>
-              <w:spacing w:after="0" w:before="0" w:line="252"/>
-            </w:pPr>
-            <w:r>
-              <w:rPr>
-                <w:rFonts w:ascii="Calibri" w:cs="Calibri" w:eastAsia="Calibri" w:hAnsi="Calibri"/>
-                <w:sz w:val="18"/>
-                <w:szCs w:val="18"/>
-              </w:rPr>
-              <w:t xml:space="preserve">Informe de trazabilidad</w:t>
-            </w:r>
-          </w:p>
-        </w:tc>
-        <w:tc>
-          <w:tcPr>
-            <w:tcW w:type="dxa" w:w="1978"/>
+            <w:tcW w:type="dxa" w:w="999"/>
+            <w:tcMar>
+              <w:top w:type="dxa" w:w="60"/>
+              <w:left w:type="dxa" w:w="100"/>
+              <w:bottom w:type="dxa" w:w="60"/>
+              <w:right w:type="dxa" w:w="100"/>
+            </w:tcMar>
+          </w:tcPr>
+          <w:p>
+            <w:pPr>
+              <w:spacing w:after="0" w:before="0" w:line="252"/>
+            </w:pPr>
+            <w:r>
+              <w:rPr>
+                <w:rFonts w:ascii="Calibri" w:cs="Calibri" w:eastAsia="Calibri" w:hAnsi="Calibri"/>
+                <w:sz w:val="18"/>
+                <w:szCs w:val="18"/>
+              </w:rPr>
+              <w:t xml:space="preserve">↳ D</w:t>
+            </w:r>
+          </w:p>
+        </w:tc>
+        <w:tc>
+          <w:tcPr>
+            <w:tcW w:type="dxa" w:w="4355"/>
+            <w:tcMar>
+              <w:top w:type="dxa" w:w="60"/>
+              <w:left w:type="dxa" w:w="100"/>
+              <w:bottom w:type="dxa" w:w="60"/>
+              <w:right w:type="dxa" w:w="100"/>
+            </w:tcMar>
+          </w:tcPr>
+          <w:p>
+            <w:pPr>
+              <w:spacing w:after="0" w:before="0" w:line="252"/>
+            </w:pPr>
+            <w:r>
+              <w:rPr>
+                <w:rFonts w:ascii="Calibri" w:cs="Calibri" w:eastAsia="Calibri" w:hAnsi="Calibri"/>
+                <w:sz w:val="18"/>
+                <w:szCs w:val="18"/>
+              </w:rPr>
+              <w:t xml:space="preserve">Retirada de un endpoint v1</w:t>
+            </w:r>
+          </w:p>
+        </w:tc>
+        <w:tc>
+          <w:tcPr>
+            <w:tcW w:type="dxa" w:w="1966"/>
             <w:tcMar>
               <w:top w:type="dxa" w:w="60"/>
               <w:left w:type="dxa" w:w="100"/>
@@ -9978,25 +10096,25 @@
         </w:tc>
         <w:tc>
           <w:tcPr>
-            <w:tcW w:type="dxa" w:w="1724"/>
-            <w:tcMar>
-              <w:top w:type="dxa" w:w="60"/>
-              <w:left w:type="dxa" w:w="100"/>
-              <w:bottom w:type="dxa" w:w="60"/>
-              <w:right w:type="dxa" w:w="100"/>
-            </w:tcMar>
-          </w:tcPr>
-          <w:p>
-            <w:pPr>
-              <w:spacing w:after="0" w:before="0" w:line="252"/>
-            </w:pPr>
-            <w:r>
-              <w:rPr>
-                <w:rFonts w:ascii="Calibri" w:cs="Calibri" w:eastAsia="Calibri" w:hAnsi="Calibri"/>
-                <w:sz w:val="18"/>
-                <w:szCs w:val="18"/>
-              </w:rPr>
-              <w:t xml:space="preserve">Gobierno</w:t>
+            <w:tcW w:type="dxa" w:w="1750"/>
+            <w:tcMar>
+              <w:top w:type="dxa" w:w="60"/>
+              <w:left w:type="dxa" w:w="100"/>
+              <w:bottom w:type="dxa" w:w="60"/>
+              <w:right w:type="dxa" w:w="100"/>
+            </w:tcMar>
+          </w:tcPr>
+          <w:p>
+            <w:pPr>
+              <w:spacing w:after="0" w:before="0" w:line="252"/>
+            </w:pPr>
+            <w:r>
+              <w:rPr>
+                <w:rFonts w:ascii="Calibri" w:cs="Calibri" w:eastAsia="Calibri" w:hAnsi="Calibri"/>
+                <w:sz w:val="18"/>
+                <w:szCs w:val="18"/>
+              </w:rPr>
+              <w:t xml:space="preserve">Retirada</w:t>
             </w:r>
           </w:p>
         </w:tc>
@@ -10007,7 +10125,108 @@
         </w:trPr>
         <w:tc>
           <w:tcPr>
-            <w:tcW w:type="dxa" w:w="1001"/>
+            <w:tcW w:type="dxa" w:w="999"/>
+            <w:tcMar>
+              <w:top w:type="dxa" w:w="60"/>
+              <w:left w:type="dxa" w:w="100"/>
+              <w:bottom w:type="dxa" w:w="60"/>
+              <w:right w:type="dxa" w:w="100"/>
+            </w:tcMar>
+          </w:tcPr>
+          <w:p>
+            <w:pPr>
+              <w:spacing w:after="0" w:before="0" w:line="252"/>
+            </w:pPr>
+            <w:r>
+              <w:rPr>
+                <w:rFonts w:ascii="Calibri" w:cs="Calibri" w:eastAsia="Calibri" w:hAnsi="Calibri"/>
+                <w:sz w:val="18"/>
+                <w:szCs w:val="18"/>
+              </w:rPr>
+              <w:t xml:space="preserve">↳ E</w:t>
+            </w:r>
+          </w:p>
+        </w:tc>
+        <w:tc>
+          <w:tcPr>
+            <w:tcW w:type="dxa" w:w="4355"/>
+            <w:tcMar>
+              <w:top w:type="dxa" w:w="60"/>
+              <w:left w:type="dxa" w:w="100"/>
+              <w:bottom w:type="dxa" w:w="60"/>
+              <w:right w:type="dxa" w:w="100"/>
+            </w:tcMar>
+          </w:tcPr>
+          <w:p>
+            <w:pPr>
+              <w:spacing w:after="0" w:before="0" w:line="252"/>
+            </w:pPr>
+            <w:r>
+              <w:rPr>
+                <w:rFonts w:ascii="Calibri" w:cs="Calibri" w:eastAsia="Calibri" w:hAnsi="Calibri"/>
+                <w:sz w:val="18"/>
+                <w:szCs w:val="18"/>
+              </w:rPr>
+              <w:t xml:space="preserve">Informe de trazabilidad</w:t>
+            </w:r>
+          </w:p>
+        </w:tc>
+        <w:tc>
+          <w:tcPr>
+            <w:tcW w:type="dxa" w:w="1966"/>
+            <w:tcMar>
+              <w:top w:type="dxa" w:w="60"/>
+              <w:left w:type="dxa" w:w="100"/>
+              <w:bottom w:type="dxa" w:w="60"/>
+              <w:right w:type="dxa" w:w="100"/>
+            </w:tcMar>
+          </w:tcPr>
+          <w:p>
+            <w:pPr>
+              <w:spacing w:after="0" w:before="0" w:line="252"/>
+            </w:pPr>
+            <w:r>
+              <w:rPr>
+                <w:rFonts w:ascii="Calibri" w:cs="Calibri" w:eastAsia="Calibri" w:hAnsi="Calibri"/>
+                <w:sz w:val="18"/>
+                <w:szCs w:val="18"/>
+              </w:rPr>
+              <w:t xml:space="preserve">Extensión ALM</w:t>
+            </w:r>
+          </w:p>
+        </w:tc>
+        <w:tc>
+          <w:tcPr>
+            <w:tcW w:type="dxa" w:w="1750"/>
+            <w:tcMar>
+              <w:top w:type="dxa" w:w="60"/>
+              <w:left w:type="dxa" w:w="100"/>
+              <w:bottom w:type="dxa" w:w="60"/>
+              <w:right w:type="dxa" w:w="100"/>
+            </w:tcMar>
+          </w:tcPr>
+          <w:p>
+            <w:pPr>
+              <w:spacing w:after="0" w:before="0" w:line="252"/>
+            </w:pPr>
+            <w:r>
+              <w:rPr>
+                <w:rFonts w:ascii="Calibri" w:cs="Calibri" w:eastAsia="Calibri" w:hAnsi="Calibri"/>
+                <w:sz w:val="18"/>
+                <w:szCs w:val="18"/>
+              </w:rPr>
+              <w:t xml:space="preserve">Gobierno</w:t>
+            </w:r>
+          </w:p>
+        </w:tc>
+      </w:tr>
+      <w:tr>
+        <w:trPr>
+          <w:cantSplit/>
+        </w:trPr>
+        <w:tc>
+          <w:tcPr>
+            <w:tcW w:type="dxa" w:w="999"/>
             <w:tcMar>
               <w:top w:type="dxa" w:w="60"/>
               <w:left w:type="dxa" w:w="100"/>
@@ -10031,7 +10250,7 @@
         </w:tc>
         <w:tc>
           <w:tcPr>
-            <w:tcW w:type="dxa" w:w="4367"/>
+            <w:tcW w:type="dxa" w:w="4355"/>
             <w:tcMar>
               <w:top w:type="dxa" w:w="60"/>
               <w:left w:type="dxa" w:w="100"/>
@@ -10055,7 +10274,7 @@
         </w:tc>
         <w:tc>
           <w:tcPr>
-            <w:tcW w:type="dxa" w:w="1978"/>
+            <w:tcW w:type="dxa" w:w="1966"/>
             <w:tcMar>
               <w:top w:type="dxa" w:w="60"/>
               <w:left w:type="dxa" w:w="100"/>
@@ -10079,7 +10298,7 @@
         </w:tc>
         <w:tc>
           <w:tcPr>
-            <w:tcW w:type="dxa" w:w="1724"/>
+            <w:tcW w:type="dxa" w:w="1750"/>
             <w:tcMar>
               <w:top w:type="dxa" w:w="60"/>
               <w:left w:type="dxa" w:w="100"/>
@@ -19997,6 +20216,559 @@
     </w:p>
     <w:p>
       <w:pPr>
+        <w:pStyle w:val="Heading3"/>
+        <w:keepNext/>
+      </w:pPr>
+      <w:r>
+        <w:rPr>
+          <w:rFonts w:ascii="Calibri" w:cs="Calibri" w:eastAsia="Calibri" w:hAnsi="Calibri"/>
+        </w:rPr>
+        <w:t xml:space="preserve">Fase 8 · Automatización del flujo (6 de octubre)</w:t>
+      </w:r>
+    </w:p>
+    <w:tbl>
+      <w:tblPr>
+        <w:tblW w:type="dxa" w:w="9070"/>
+        <w:tblBorders>
+          <w:top w:val="single" w:color="C9D3CF" w:sz="4"/>
+          <w:left w:val="single" w:color="C9D3CF" w:sz="4"/>
+          <w:bottom w:val="single" w:color="C9D3CF" w:sz="4"/>
+          <w:right w:val="single" w:color="C9D3CF" w:sz="4"/>
+          <w:insideH w:val="single" w:color="C9D3CF" w:sz="4"/>
+          <w:insideV w:val="single" w:color="C9D3CF" w:sz="4"/>
+        </w:tblBorders>
+      </w:tblPr>
+      <w:tblGrid>
+        <w:gridCol w:w="700"/>
+        <w:gridCol w:w="2645"/>
+        <w:gridCol w:w="3793"/>
+        <w:gridCol w:w="1932"/>
+      </w:tblGrid>
+      <w:tr>
+        <w:trPr>
+          <w:tblHeader/>
+        </w:trPr>
+        <w:tc>
+          <w:tcPr>
+            <w:tcW w:type="dxa" w:w="700"/>
+            <w:shd w:fill="E3EEEA" w:color="auto" w:val="clear"/>
+            <w:tcMar>
+              <w:top w:type="dxa" w:w="60"/>
+              <w:left w:type="dxa" w:w="100"/>
+              <w:bottom w:type="dxa" w:w="60"/>
+              <w:right w:type="dxa" w:w="100"/>
+            </w:tcMar>
+          </w:tcPr>
+          <w:p>
+            <w:pPr>
+              <w:spacing w:after="0" w:before="0" w:line="252"/>
+            </w:pPr>
+            <w:r>
+              <w:rPr>
+                <w:rFonts w:ascii="Calibri" w:cs="Calibri" w:eastAsia="Calibri" w:hAnsi="Calibri"/>
+                <w:b/>
+                <w:bCs/>
+                <w:sz w:val="18"/>
+                <w:szCs w:val="18"/>
+              </w:rPr>
+              <w:t xml:space="preserve">#</w:t>
+            </w:r>
+          </w:p>
+        </w:tc>
+        <w:tc>
+          <w:tcPr>
+            <w:tcW w:type="dxa" w:w="2645"/>
+            <w:shd w:fill="E3EEEA" w:color="auto" w:val="clear"/>
+            <w:tcMar>
+              <w:top w:type="dxa" w:w="60"/>
+              <w:left w:type="dxa" w:w="100"/>
+              <w:bottom w:type="dxa" w:w="60"/>
+              <w:right w:type="dxa" w:w="100"/>
+            </w:tcMar>
+          </w:tcPr>
+          <w:p>
+            <w:pPr>
+              <w:spacing w:after="0" w:before="0" w:line="252"/>
+            </w:pPr>
+            <w:r>
+              <w:rPr>
+                <w:rFonts w:ascii="Calibri" w:cs="Calibri" w:eastAsia="Calibri" w:hAnsi="Calibri"/>
+                <w:b/>
+                <w:bCs/>
+                <w:sz w:val="18"/>
+                <w:szCs w:val="18"/>
+              </w:rPr>
+              <w:t xml:space="preserve">Petición del autor</w:t>
+            </w:r>
+          </w:p>
+        </w:tc>
+        <w:tc>
+          <w:tcPr>
+            <w:tcW w:type="dxa" w:w="3793"/>
+            <w:shd w:fill="E3EEEA" w:color="auto" w:val="clear"/>
+            <w:tcMar>
+              <w:top w:type="dxa" w:w="60"/>
+              <w:left w:type="dxa" w:w="100"/>
+              <w:bottom w:type="dxa" w:w="60"/>
+              <w:right w:type="dxa" w:w="100"/>
+            </w:tcMar>
+          </w:tcPr>
+          <w:p>
+            <w:pPr>
+              <w:spacing w:after="0" w:before="0" w:line="252"/>
+            </w:pPr>
+            <w:r>
+              <w:rPr>
+                <w:rFonts w:ascii="Calibri" w:cs="Calibri" w:eastAsia="Calibri" w:hAnsi="Calibri"/>
+                <w:b/>
+                <w:bCs/>
+                <w:sz w:val="18"/>
+                <w:szCs w:val="18"/>
+              </w:rPr>
+              <w:t xml:space="preserve">Respuesta y acción del modelo</w:t>
+            </w:r>
+          </w:p>
+        </w:tc>
+        <w:tc>
+          <w:tcPr>
+            <w:tcW w:type="dxa" w:w="1932"/>
+            <w:shd w:fill="E3EEEA" w:color="auto" w:val="clear"/>
+            <w:tcMar>
+              <w:top w:type="dxa" w:w="60"/>
+              <w:left w:type="dxa" w:w="100"/>
+              <w:bottom w:type="dxa" w:w="60"/>
+              <w:right w:type="dxa" w:w="100"/>
+            </w:tcMar>
+          </w:tcPr>
+          <w:p>
+            <w:pPr>
+              <w:spacing w:after="0" w:before="0" w:line="252"/>
+            </w:pPr>
+            <w:r>
+              <w:rPr>
+                <w:rFonts w:ascii="Calibri" w:cs="Calibri" w:eastAsia="Calibri" w:hAnsi="Calibri"/>
+                <w:b/>
+                <w:bCs/>
+                <w:sz w:val="18"/>
+                <w:szCs w:val="18"/>
+              </w:rPr>
+              <w:t xml:space="preserve">Resultado</w:t>
+            </w:r>
+          </w:p>
+        </w:tc>
+      </w:tr>
+      <w:tr>
+        <w:trPr>
+          <w:cantSplit/>
+        </w:trPr>
+        <w:tc>
+          <w:tcPr>
+            <w:tcW w:type="dxa" w:w="700"/>
+            <w:tcMar>
+              <w:top w:type="dxa" w:w="60"/>
+              <w:left w:type="dxa" w:w="100"/>
+              <w:bottom w:type="dxa" w:w="60"/>
+              <w:right w:type="dxa" w:w="100"/>
+            </w:tcMar>
+          </w:tcPr>
+          <w:p>
+            <w:pPr>
+              <w:spacing w:after="0" w:before="0" w:line="252"/>
+            </w:pPr>
+            <w:r>
+              <w:rPr>
+                <w:rFonts w:ascii="Calibri" w:cs="Calibri" w:eastAsia="Calibri" w:hAnsi="Calibri"/>
+                <w:sz w:val="18"/>
+                <w:szCs w:val="18"/>
+              </w:rPr>
+              <w:t xml:space="preserve">49</w:t>
+            </w:r>
+          </w:p>
+        </w:tc>
+        <w:tc>
+          <w:tcPr>
+            <w:tcW w:type="dxa" w:w="2645"/>
+            <w:tcMar>
+              <w:top w:type="dxa" w:w="60"/>
+              <w:left w:type="dxa" w:w="100"/>
+              <w:bottom w:type="dxa" w:w="60"/>
+              <w:right w:type="dxa" w:w="100"/>
+            </w:tcMar>
+          </w:tcPr>
+          <w:p>
+            <w:pPr>
+              <w:spacing w:after="0" w:before="0" w:line="252"/>
+            </w:pPr>
+            <w:r>
+              <w:rPr>
+                <w:rFonts w:ascii="Calibri" w:cs="Calibri" w:eastAsia="Calibri" w:hAnsi="Calibri"/>
+                <w:sz w:val="18"/>
+                <w:szCs w:val="18"/>
+              </w:rPr>
+              <w:t xml:space="preserve">«Guarda este punto. ¿El flujo que estamos montando siempre va a requerir que el desarrollador meta un prompt en el devcontainer?»</w:t>
+            </w:r>
+          </w:p>
+        </w:tc>
+        <w:tc>
+          <w:tcPr>
+            <w:tcW w:type="dxa" w:w="3793"/>
+            <w:tcMar>
+              <w:top w:type="dxa" w:w="60"/>
+              <w:left w:type="dxa" w:w="100"/>
+              <w:bottom w:type="dxa" w:w="60"/>
+              <w:right w:type="dxa" w:w="100"/>
+            </w:tcMar>
+          </w:tcPr>
+          <w:p>
+            <w:pPr>
+              <w:spacing w:after="0" w:before="0" w:line="252"/>
+            </w:pPr>
+            <w:r>
+              <w:rPr>
+                <w:rFonts w:ascii="Calibri" w:cs="Calibri" w:eastAsia="Calibri" w:hAnsi="Calibri"/>
+                <w:sz w:val="18"/>
+                <w:szCs w:val="18"/>
+              </w:rPr>
+              <w:t xml:space="preserve">Guarda el punto exacto de la tarea 5. Explica que no: el agente puede ejecutarse en Actions disparado por eventos, con los riesgos que cambian (contenido no confiable sin supervisión, aislamiento del runner, coste)</w:t>
+            </w:r>
+          </w:p>
+        </w:tc>
+        <w:tc>
+          <w:tcPr>
+            <w:tcW w:type="dxa" w:w="1932"/>
+            <w:tcMar>
+              <w:top w:type="dxa" w:w="60"/>
+              <w:left w:type="dxa" w:w="100"/>
+              <w:bottom w:type="dxa" w:w="60"/>
+              <w:right w:type="dxa" w:w="100"/>
+            </w:tcMar>
+          </w:tcPr>
+          <w:p>
+            <w:pPr>
+              <w:spacing w:after="0" w:before="0" w:line="252"/>
+            </w:pPr>
+            <w:r>
+              <w:rPr>
+                <w:rFonts w:ascii="Calibri" w:cs="Calibri" w:eastAsia="Calibri" w:hAnsi="Calibri"/>
+                <w:sz w:val="18"/>
+                <w:szCs w:val="18"/>
+              </w:rPr>
+              <w:t xml:space="preserve">Propuesta de agente autónomo</w:t>
+            </w:r>
+          </w:p>
+        </w:tc>
+      </w:tr>
+      <w:tr>
+        <w:trPr>
+          <w:cantSplit/>
+        </w:trPr>
+        <w:tc>
+          <w:tcPr>
+            <w:tcW w:type="dxa" w:w="700"/>
+            <w:tcMar>
+              <w:top w:type="dxa" w:w="60"/>
+              <w:left w:type="dxa" w:w="100"/>
+              <w:bottom w:type="dxa" w:w="60"/>
+              <w:right w:type="dxa" w:w="100"/>
+            </w:tcMar>
+          </w:tcPr>
+          <w:p>
+            <w:pPr>
+              <w:spacing w:after="0" w:before="0" w:line="252"/>
+            </w:pPr>
+            <w:r>
+              <w:rPr>
+                <w:rFonts w:ascii="Calibri" w:cs="Calibri" w:eastAsia="Calibri" w:hAnsi="Calibri"/>
+                <w:sz w:val="18"/>
+                <w:szCs w:val="18"/>
+              </w:rPr>
+              <w:t xml:space="preserve">50</w:t>
+            </w:r>
+          </w:p>
+        </w:tc>
+        <w:tc>
+          <w:tcPr>
+            <w:tcW w:type="dxa" w:w="2645"/>
+            <w:tcMar>
+              <w:top w:type="dxa" w:w="60"/>
+              <w:left w:type="dxa" w:w="100"/>
+              <w:bottom w:type="dxa" w:w="60"/>
+              <w:right w:type="dxa" w:w="100"/>
+            </w:tcMar>
+          </w:tcPr>
+          <w:p>
+            <w:pPr>
+              <w:spacing w:after="0" w:before="0" w:line="252"/>
+            </w:pPr>
+            <w:r>
+              <w:rPr>
+                <w:rFonts w:ascii="Calibri" w:cs="Calibri" w:eastAsia="Calibri" w:hAnsi="Calibri"/>
+                <w:sz w:val="18"/>
+                <w:szCs w:val="18"/>
+              </w:rPr>
+              <w:t xml:space="preserve">«¿Cuáles son las tareas 5 a 8?»</w:t>
+            </w:r>
+          </w:p>
+        </w:tc>
+        <w:tc>
+          <w:tcPr>
+            <w:tcW w:type="dxa" w:w="3793"/>
+            <w:tcMar>
+              <w:top w:type="dxa" w:w="60"/>
+              <w:left w:type="dxa" w:w="100"/>
+              <w:bottom w:type="dxa" w:w="60"/>
+              <w:right w:type="dxa" w:w="100"/>
+            </w:tcMar>
+          </w:tcPr>
+          <w:p>
+            <w:pPr>
+              <w:spacing w:after="0" w:before="0" w:line="252"/>
+            </w:pPr>
+            <w:r>
+              <w:rPr>
+                <w:rFonts w:ascii="Calibri" w:cs="Calibri" w:eastAsia="Calibri" w:hAnsi="Calibri"/>
+                <w:sz w:val="18"/>
+                <w:szCs w:val="18"/>
+              </w:rPr>
+              <w:t xml:space="preserve">Las resume y corrige una afirmación previa: solo la 5 usa el devcontainer; la 6 y la 7 son CI y la 8 ya ejecuta al agente en Actions</w:t>
+            </w:r>
+          </w:p>
+        </w:tc>
+        <w:tc>
+          <w:tcPr>
+            <w:tcW w:type="dxa" w:w="1932"/>
+            <w:tcMar>
+              <w:top w:type="dxa" w:w="60"/>
+              <w:left w:type="dxa" w:w="100"/>
+              <w:bottom w:type="dxa" w:w="60"/>
+              <w:right w:type="dxa" w:w="100"/>
+            </w:tcMar>
+          </w:tcPr>
+          <w:p>
+            <w:pPr>
+              <w:spacing w:after="0" w:before="0" w:line="252"/>
+            </w:pPr>
+            <w:r>
+              <w:rPr>
+                <w:rFonts w:ascii="Calibri" w:cs="Calibri" w:eastAsia="Calibri" w:hAnsi="Calibri"/>
+                <w:sz w:val="18"/>
+                <w:szCs w:val="18"/>
+              </w:rPr>
+              <w:t xml:space="preserve">Encaje de la propuesta tras la tarea 8</w:t>
+            </w:r>
+          </w:p>
+        </w:tc>
+      </w:tr>
+      <w:tr>
+        <w:trPr>
+          <w:cantSplit/>
+        </w:trPr>
+        <w:tc>
+          <w:tcPr>
+            <w:tcW w:type="dxa" w:w="700"/>
+            <w:tcMar>
+              <w:top w:type="dxa" w:w="60"/>
+              <w:left w:type="dxa" w:w="100"/>
+              <w:bottom w:type="dxa" w:w="60"/>
+              <w:right w:type="dxa" w:w="100"/>
+            </w:tcMar>
+          </w:tcPr>
+          <w:p>
+            <w:pPr>
+              <w:spacing w:after="0" w:before="0" w:line="252"/>
+            </w:pPr>
+            <w:r>
+              <w:rPr>
+                <w:rFonts w:ascii="Calibri" w:cs="Calibri" w:eastAsia="Calibri" w:hAnsi="Calibri"/>
+                <w:sz w:val="18"/>
+                <w:szCs w:val="18"/>
+              </w:rPr>
+              <w:t xml:space="preserve">51</w:t>
+            </w:r>
+          </w:p>
+        </w:tc>
+        <w:tc>
+          <w:tcPr>
+            <w:tcW w:type="dxa" w:w="2645"/>
+            <w:tcMar>
+              <w:top w:type="dxa" w:w="60"/>
+              <w:left w:type="dxa" w:w="100"/>
+              <w:bottom w:type="dxa" w:w="60"/>
+              <w:right w:type="dxa" w:w="100"/>
+            </w:tcMar>
+          </w:tcPr>
+          <w:p>
+            <w:pPr>
+              <w:spacing w:after="0" w:before="0" w:line="252"/>
+            </w:pPr>
+            <w:r>
+              <w:rPr>
+                <w:rFonts w:ascii="Calibri" w:cs="Calibri" w:eastAsia="Calibri" w:hAnsi="Calibri"/>
+                <w:sz w:val="18"/>
+                <w:szCs w:val="18"/>
+              </w:rPr>
+              <w:t xml:space="preserve">«Sin esa extensión, ¿cuál sería el flujo?»</w:t>
+            </w:r>
+          </w:p>
+        </w:tc>
+        <w:tc>
+          <w:tcPr>
+            <w:tcW w:type="dxa" w:w="3793"/>
+            <w:tcMar>
+              <w:top w:type="dxa" w:w="60"/>
+              <w:left w:type="dxa" w:w="100"/>
+              <w:bottom w:type="dxa" w:w="60"/>
+              <w:right w:type="dxa" w:w="100"/>
+            </w:tcMar>
+          </w:tcPr>
+          <w:p>
+            <w:pPr>
+              <w:spacing w:after="0" w:before="0" w:line="252"/>
+            </w:pPr>
+            <w:r>
+              <w:rPr>
+                <w:rFonts w:ascii="Calibri" w:cs="Calibri" w:eastAsia="Calibri" w:hAnsi="Calibri"/>
+                <w:sz w:val="18"/>
+                <w:szCs w:val="18"/>
+              </w:rPr>
+              <w:t xml:space="preserve">Describe el ciclo completo en 13 pasos: dos prompts manuales (spec e implementación) y el resto automático o por aprobación</w:t>
+            </w:r>
+          </w:p>
+        </w:tc>
+        <w:tc>
+          <w:tcPr>
+            <w:tcW w:type="dxa" w:w="1932"/>
+            <w:tcMar>
+              <w:top w:type="dxa" w:w="60"/>
+              <w:left w:type="dxa" w:w="100"/>
+              <w:bottom w:type="dxa" w:w="60"/>
+              <w:right w:type="dxa" w:w="100"/>
+            </w:tcMar>
+          </w:tcPr>
+          <w:p>
+            <w:pPr>
+              <w:spacing w:after="0" w:before="0" w:line="252"/>
+            </w:pPr>
+            <w:r>
+              <w:rPr>
+                <w:rFonts w:ascii="Calibri" w:cs="Calibri" w:eastAsia="Calibri" w:hAnsi="Calibri"/>
+                <w:sz w:val="18"/>
+                <w:szCs w:val="18"/>
+              </w:rPr>
+              <w:t xml:space="preserve">Comparación de los dos modos</w:t>
+            </w:r>
+          </w:p>
+        </w:tc>
+      </w:tr>
+      <w:tr>
+        <w:trPr>
+          <w:cantSplit/>
+        </w:trPr>
+        <w:tc>
+          <w:tcPr>
+            <w:tcW w:type="dxa" w:w="700"/>
+            <w:tcMar>
+              <w:top w:type="dxa" w:w="60"/>
+              <w:left w:type="dxa" w:w="100"/>
+              <w:bottom w:type="dxa" w:w="60"/>
+              <w:right w:type="dxa" w:w="100"/>
+            </w:tcMar>
+          </w:tcPr>
+          <w:p>
+            <w:pPr>
+              <w:spacing w:after="0" w:before="0" w:line="252"/>
+            </w:pPr>
+            <w:r>
+              <w:rPr>
+                <w:rFonts w:ascii="Calibri" w:cs="Calibri" w:eastAsia="Calibri" w:hAnsi="Calibri"/>
+                <w:sz w:val="18"/>
+                <w:szCs w:val="18"/>
+              </w:rPr>
+              <w:t xml:space="preserve">52</w:t>
+            </w:r>
+          </w:p>
+        </w:tc>
+        <w:tc>
+          <w:tcPr>
+            <w:tcW w:type="dxa" w:w="2645"/>
+            <w:tcMar>
+              <w:top w:type="dxa" w:w="60"/>
+              <w:left w:type="dxa" w:w="100"/>
+              <w:bottom w:type="dxa" w:w="60"/>
+              <w:right w:type="dxa" w:w="100"/>
+            </w:tcMar>
+          </w:tcPr>
+          <w:p>
+            <w:pPr>
+              <w:spacing w:after="0" w:before="0" w:line="252"/>
+            </w:pPr>
+            <w:r>
+              <w:rPr>
+                <w:rFonts w:ascii="Calibri" w:cs="Calibri" w:eastAsia="Calibri" w:hAnsi="Calibri"/>
+                <w:sz w:val="18"/>
+                <w:szCs w:val="18"/>
+              </w:rPr>
+              <w:t xml:space="preserve">«Añade la extensión»</w:t>
+            </w:r>
+          </w:p>
+        </w:tc>
+        <w:tc>
+          <w:tcPr>
+            <w:tcW w:type="dxa" w:w="3793"/>
+            <w:tcMar>
+              <w:top w:type="dxa" w:w="60"/>
+              <w:left w:type="dxa" w:w="100"/>
+              <w:bottom w:type="dxa" w:w="60"/>
+              <w:right w:type="dxa" w:w="100"/>
+            </w:tcMar>
+          </w:tcPr>
+          <w:p>
+            <w:pPr>
+              <w:spacing w:after="0" w:before="0" w:line="252"/>
+            </w:pPr>
+            <w:r>
+              <w:rPr>
+                <w:rFonts w:ascii="Calibri" w:cs="Calibri" w:eastAsia="Calibri" w:hAnsi="Calibri"/>
+                <w:sz w:val="18"/>
+                <w:szCs w:val="18"/>
+              </w:rPr>
+              <w:t xml:space="preserve">Añade la extensión F entre las tareas 8 y 9 con sus subtareas y controles, y actualiza bitácora, panel y memoria</w:t>
+            </w:r>
+          </w:p>
+        </w:tc>
+        <w:tc>
+          <w:tcPr>
+            <w:tcW w:type="dxa" w:w="1932"/>
+            <w:tcMar>
+              <w:top w:type="dxa" w:w="60"/>
+              <w:left w:type="dxa" w:w="100"/>
+              <w:bottom w:type="dxa" w:w="60"/>
+              <w:right w:type="dxa" w:w="100"/>
+            </w:tcMar>
+          </w:tcPr>
+          <w:p>
+            <w:pPr>
+              <w:spacing w:after="0" w:before="0" w:line="252"/>
+            </w:pPr>
+            <w:r>
+              <w:rPr>
+                <w:rFonts w:ascii="Calibri" w:cs="Calibri" w:eastAsia="Calibri" w:hAnsi="Calibri"/>
+                <w:sz w:val="18"/>
+                <w:szCs w:val="18"/>
+              </w:rPr>
+              <w:t xml:space="preserve">Plan de 18 tareas</w:t>
+            </w:r>
+          </w:p>
+        </w:tc>
+      </w:tr>
+    </w:tbl>
+    <w:p>
+      <w:pPr>
+        <w:spacing w:after="120"/>
+      </w:pPr>
+    </w:p>
+    <w:p>
+      <w:pPr>
         <w:pStyle w:val="Heading2"/>
         <w:keepNext/>
       </w:pPr>
@@ -22730,7 +23502,7 @@
                 <w:sz w:val="18"/>
                 <w:szCs w:val="18"/>
               </w:rPr>
-              <w:t xml:space="preserve">5 de 17 (1, 2, 3, A y 4)</w:t>
+              <w:t xml:space="preserve">5 de 18 (1, 2, 3, A y 4)</w:t>
             </w:r>
           </w:p>
         </w:tc>
@@ -22889,7 +23661,7 @@
                 <w:sz w:val="18"/>
                 <w:szCs w:val="18"/>
               </w:rPr>
-              <w:t xml:space="preserve">48</w:t>
+              <w:t xml:space="preserve">52</w:t>
             </w:r>
           </w:p>
         </w:tc>
@@ -25331,7 +26103,7 @@
         </w:rPr>
         <w:t xml:space="preserve"> arXiv:2604.26275, 2026. </w:t>
       </w:r>
-      <w:hyperlink w:history="1" r:id="rIdi_fczc9e_jawjsj8qfasv">
+      <w:hyperlink w:history="1" r:id="rIdoj6h1rnz2c6oriwvnv60u">
         <w:r>
           <w:rPr>
             <w:rStyle w:val="Hyperlink"/>
@@ -25376,7 +26148,7 @@
         </w:rPr>
         <w:t xml:space="preserve">, 2026. </w:t>
       </w:r>
-      <w:hyperlink w:history="1" r:id="rIdphuguzfyz8j0abqhpm5yy">
+      <w:hyperlink w:history="1" r:id="rIdsjtmwgd-6nfn8g_wqwhvs">
         <w:r>
           <w:rPr>
             <w:rStyle w:val="Hyperlink"/>
@@ -25421,7 +26193,7 @@
         </w:rPr>
         <w:t xml:space="preserve"> </w:t>
       </w:r>
-      <w:hyperlink w:history="1" r:id="rIdidhe0g8tw7lume1scbj-n">
+      <w:hyperlink w:history="1" r:id="rId-v5wvcjbvevdkynaaiiyk">
         <w:r>
           <w:rPr>
             <w:rStyle w:val="Hyperlink"/>
@@ -25466,7 +26238,7 @@
         </w:rPr>
         <w:t xml:space="preserve">, junio de 2026. </w:t>
       </w:r>
-      <w:hyperlink w:history="1" r:id="rIdyzpbcxmmhmcq15x7grsnw">
+      <w:hyperlink w:history="1" r:id="rId_ngo8seymq-bgqug2tip2">
         <w:r>
           <w:rPr>
             <w:rStyle w:val="Hyperlink"/>
@@ -25511,7 +26283,7 @@
         </w:rPr>
         <w:t xml:space="preserve"> </w:t>
       </w:r>
-      <w:hyperlink w:history="1" r:id="rIdzbagxi1ldrhdccjmuzysi">
+      <w:hyperlink w:history="1" r:id="rIdptugf6cwszbicgmmeatqy">
         <w:r>
           <w:rPr>
             <w:rStyle w:val="Hyperlink"/>
@@ -25556,7 +26328,7 @@
         </w:rPr>
         <w:t xml:space="preserve"> </w:t>
       </w:r>
-      <w:hyperlink w:history="1" r:id="rIddldyepbyj0nmzwh_7ejwe">
+      <w:hyperlink w:history="1" r:id="rIdl-tjygynutbyluaryup9c">
         <w:r>
           <w:rPr>
             <w:rStyle w:val="Hyperlink"/>
@@ -25601,7 +26373,7 @@
         </w:rPr>
         <w:t xml:space="preserve">, diciembre de 2025. </w:t>
       </w:r>
-      <w:hyperlink w:history="1" r:id="rIdvwy4binksab_5x-ben7zu">
+      <w:hyperlink w:history="1" r:id="rIdn0yqsyxjr0xnqx8taibga">
         <w:r>
           <w:rPr>
             <w:rStyle w:val="Hyperlink"/>
@@ -25646,7 +26418,7 @@
         </w:rPr>
         <w:t xml:space="preserve"> </w:t>
       </w:r>
-      <w:hyperlink w:history="1" r:id="rIddh3if1sgrrdwu4nljhm8o">
+      <w:hyperlink w:history="1" r:id="rIdm6rpcaepoj3yfocmecq0_">
         <w:r>
           <w:rPr>
             <w:rStyle w:val="Hyperlink"/>
@@ -25691,7 +26463,7 @@
         </w:rPr>
         <w:t xml:space="preserve"> </w:t>
       </w:r>
-      <w:hyperlink w:history="1" r:id="rIdqwxhilhvpouq5maji1ku3">
+      <w:hyperlink w:history="1" r:id="rId63iga9pcluhznfn5uxz5j">
         <w:r>
           <w:rPr>
             <w:rStyle w:val="Hyperlink"/>
@@ -25736,7 +26508,7 @@
         </w:rPr>
         <w:t xml:space="preserve"> </w:t>
       </w:r>
-      <w:hyperlink w:history="1" r:id="rIdzliqwqmeb1w5ygmnjdm1l">
+      <w:hyperlink w:history="1" r:id="rIdpwn_puid1yuwnr3b3xip7">
         <w:r>
           <w:rPr>
             <w:rStyle w:val="Hyperlink"/>
@@ -25781,7 +26553,7 @@
         </w:rPr>
         <w:t xml:space="preserve"> </w:t>
       </w:r>
-      <w:hyperlink w:history="1" r:id="rIdydsn-nh3lod-ryzrcnkmc">
+      <w:hyperlink w:history="1" r:id="rIdvp07krlbgreva2nzklpky">
         <w:r>
           <w:rPr>
             <w:rStyle w:val="Hyperlink"/>
@@ -25826,7 +26598,7 @@
         </w:rPr>
         <w:t xml:space="preserve"> </w:t>
       </w:r>
-      <w:hyperlink w:history="1" r:id="rIdslbo2dbhonnldrqngxd5z">
+      <w:hyperlink w:history="1" r:id="rId1kt6czgmla8kqocije0x8">
         <w:r>
           <w:rPr>
             <w:rStyle w:val="Hyperlink"/>
@@ -25871,7 +26643,7 @@
         </w:rPr>
         <w:t xml:space="preserve"> </w:t>
       </w:r>
-      <w:hyperlink w:history="1" r:id="rId_jdsgycrnjgbd8hckpns1">
+      <w:hyperlink w:history="1" r:id="rIds_cjwhfibo8aqaagmmg8k">
         <w:r>
           <w:rPr>
             <w:rStyle w:val="Hyperlink"/>
@@ -25916,7 +26688,7 @@
         </w:rPr>
         <w:t xml:space="preserve"> </w:t>
       </w:r>
-      <w:hyperlink w:history="1" r:id="rIdxbs5uzfufpfkc8xmsruda">
+      <w:hyperlink w:history="1" r:id="rIdgnzggfzpy4myhacdwzhpu">
         <w:r>
           <w:rPr>
             <w:rStyle w:val="Hyperlink"/>
@@ -25961,7 +26733,7 @@
         </w:rPr>
         <w:t xml:space="preserve"> </w:t>
       </w:r>
-      <w:hyperlink w:history="1" r:id="rIdvf8ei52kpz8esvtkc6oka">
+      <w:hyperlink w:history="1" r:id="rIdwkg9f3rijfdko_b8idllt">
         <w:r>
           <w:rPr>
             <w:rStyle w:val="Hyperlink"/>
@@ -26006,7 +26778,7 @@
         </w:rPr>
         <w:t xml:space="preserve"> </w:t>
       </w:r>
-      <w:hyperlink w:history="1" r:id="rIdhw6z-xtt5sarfwsghyqun">
+      <w:hyperlink w:history="1" r:id="rIdmepxylwvq4kaorfyum5yk">
         <w:r>
           <w:rPr>
             <w:rStyle w:val="Hyperlink"/>
@@ -26051,7 +26823,7 @@
         </w:rPr>
         <w:t xml:space="preserve">, agosto de 2026. </w:t>
       </w:r>
-      <w:hyperlink w:history="1" r:id="rId58sx3ikjfkkor6m8wpk7i">
+      <w:hyperlink w:history="1" r:id="rIdjeeveeaxns0txiwhfcygq">
         <w:r>
           <w:rPr>
             <w:rStyle w:val="Hyperlink"/>
@@ -26096,7 +26868,7 @@
         </w:rPr>
         <w:t xml:space="preserve"> </w:t>
       </w:r>
-      <w:hyperlink w:history="1" r:id="rIdzlpmnidteuky6jthd_nih">
+      <w:hyperlink w:history="1" r:id="rIdsac5i65cyjmtjazmurdy8">
         <w:r>
           <w:rPr>
             <w:rStyle w:val="Hyperlink"/>
@@ -26159,7 +26931,7 @@
         </w:rPr>
         <w:t xml:space="preserve"> </w:t>
       </w:r>
-      <w:hyperlink w:history="1" r:id="rId0dgehlznrixlviybpsijk">
+      <w:hyperlink w:history="1" r:id="rId5lp9zsojrqz6l6auyemzx">
         <w:r>
           <w:rPr>
             <w:rStyle w:val="Hyperlink"/>
@@ -26204,7 +26976,7 @@
         </w:rPr>
         <w:t xml:space="preserve"> </w:t>
       </w:r>
-      <w:hyperlink w:history="1" r:id="rIdh-ietgwqivq5q8ovnzhv6">
+      <w:hyperlink w:history="1" r:id="rIdxvnohst2rfnxmudyr16ev">
         <w:r>
           <w:rPr>
             <w:rStyle w:val="Hyperlink"/>
@@ -26249,7 +27021,7 @@
         </w:rPr>
         <w:t xml:space="preserve"> </w:t>
       </w:r>
-      <w:hyperlink w:history="1" r:id="rIdvksztlytpx7lnqfhrqebq">
+      <w:hyperlink w:history="1" r:id="rIdibz4637aejozagpv-pxej">
         <w:r>
           <w:rPr>
             <w:rStyle w:val="Hyperlink"/>

</xml_diff>

<commit_message>
docs(tfm): figura del alcance AI-DLC/SDLC frente al ALM agéntico
- Figura 2 (archify): tareas repartidas entre SDLC (AI-DLC), ampliación ALM
  y gobierno transversal. Se renumeran las figuras siguientes.
- Tabla de términos: fila AI-driven SDLC / AI-DLC.
- Iteraciones 53 y 54.

Co-Authored-By: Claude Opus 5.5 <noreply@anthropic.com>
Claude-Session: https://claude.ai/code/session_01DJozxnTfKm9YzN69MVZq7X
</commit_message>
<xml_diff>
--- a/docs/tfm/TFM-ALM-agentico.docx
+++ b/docs/tfm/TFM-ALM-agentico.docx
@@ -3852,9 +3852,9 @@
         </w:tblBorders>
       </w:tblPr>
       <w:tblGrid>
-        <w:gridCol w:w="1683"/>
-        <w:gridCol w:w="4194"/>
-        <w:gridCol w:w="3193"/>
+        <w:gridCol w:w="1681"/>
+        <w:gridCol w:w="4150"/>
+        <w:gridCol w:w="3239"/>
       </w:tblGrid>
       <w:tr>
         <w:trPr>
@@ -3862,7 +3862,7 @@
         </w:trPr>
         <w:tc>
           <w:tcPr>
-            <w:tcW w:type="dxa" w:w="1683"/>
+            <w:tcW w:type="dxa" w:w="1681"/>
             <w:shd w:fill="E3EEEA" w:color="auto" w:val="clear"/>
             <w:tcMar>
               <w:top w:type="dxa" w:w="60"/>
@@ -3889,7 +3889,7 @@
         </w:tc>
         <w:tc>
           <w:tcPr>
-            <w:tcW w:type="dxa" w:w="4194"/>
+            <w:tcW w:type="dxa" w:w="4150"/>
             <w:shd w:fill="E3EEEA" w:color="auto" w:val="clear"/>
             <w:tcMar>
               <w:top w:type="dxa" w:w="60"/>
@@ -3916,7 +3916,7 @@
         </w:tc>
         <w:tc>
           <w:tcPr>
-            <w:tcW w:type="dxa" w:w="3193"/>
+            <w:tcW w:type="dxa" w:w="3239"/>
             <w:shd w:fill="E3EEEA" w:color="auto" w:val="clear"/>
             <w:tcMar>
               <w:top w:type="dxa" w:w="60"/>
@@ -3948,73 +3948,73 @@
         </w:trPr>
         <w:tc>
           <w:tcPr>
-            <w:tcW w:type="dxa" w:w="1683"/>
-            <w:tcMar>
-              <w:top w:type="dxa" w:w="60"/>
-              <w:left w:type="dxa" w:w="100"/>
-              <w:bottom w:type="dxa" w:w="60"/>
-              <w:right w:type="dxa" w:w="100"/>
-            </w:tcMar>
-          </w:tcPr>
-          <w:p>
-            <w:pPr>
-              <w:spacing w:after="0" w:before="0" w:line="252"/>
-            </w:pPr>
-            <w:r>
-              <w:rPr>
-                <w:rFonts w:ascii="Calibri" w:cs="Calibri" w:eastAsia="Calibri" w:hAnsi="Calibri"/>
-                <w:sz w:val="18"/>
-                <w:szCs w:val="18"/>
-              </w:rPr>
-              <w:t xml:space="preserve">SDLC agéntico</w:t>
-            </w:r>
-          </w:p>
-        </w:tc>
-        <w:tc>
-          <w:tcPr>
-            <w:tcW w:type="dxa" w:w="4194"/>
-            <w:tcMar>
-              <w:top w:type="dxa" w:w="60"/>
-              <w:left w:type="dxa" w:w="100"/>
-              <w:bottom w:type="dxa" w:w="60"/>
-              <w:right w:type="dxa" w:w="100"/>
-            </w:tcMar>
-          </w:tcPr>
-          <w:p>
-            <w:pPr>
-              <w:spacing w:after="0" w:before="0" w:line="252"/>
-            </w:pPr>
-            <w:r>
-              <w:rPr>
-                <w:rFonts w:ascii="Calibri" w:cs="Calibri" w:eastAsia="Calibri" w:hAnsi="Calibri"/>
-                <w:sz w:val="18"/>
-                <w:szCs w:val="18"/>
-              </w:rPr>
-              <w:t xml:space="preserve">Los agentes hacen el trabajo de cada fase del desarrollo [6]</w:t>
-            </w:r>
-          </w:p>
-        </w:tc>
-        <w:tc>
-          <w:tcPr>
-            <w:tcW w:type="dxa" w:w="3193"/>
-            <w:tcMar>
-              <w:top w:type="dxa" w:w="60"/>
-              <w:left w:type="dxa" w:w="100"/>
-              <w:bottom w:type="dxa" w:w="60"/>
-              <w:right w:type="dxa" w:w="100"/>
-            </w:tcMar>
-          </w:tcPr>
-          <w:p>
-            <w:pPr>
-              <w:spacing w:after="0" w:before="0" w:line="252"/>
-            </w:pPr>
-            <w:r>
-              <w:rPr>
-                <w:rFonts w:ascii="Calibri" w:cs="Calibri" w:eastAsia="Calibri" w:hAnsi="Calibri"/>
-                <w:sz w:val="18"/>
-                <w:szCs w:val="18"/>
-              </w:rPr>
-              <w:t xml:space="preserve">Núcleo de la POC</w:t>
+            <w:tcW w:type="dxa" w:w="1681"/>
+            <w:tcMar>
+              <w:top w:type="dxa" w:w="60"/>
+              <w:left w:type="dxa" w:w="100"/>
+              <w:bottom w:type="dxa" w:w="60"/>
+              <w:right w:type="dxa" w:w="100"/>
+            </w:tcMar>
+          </w:tcPr>
+          <w:p>
+            <w:pPr>
+              <w:spacing w:after="0" w:before="0" w:line="252"/>
+            </w:pPr>
+            <w:r>
+              <w:rPr>
+                <w:rFonts w:ascii="Calibri" w:cs="Calibri" w:eastAsia="Calibri" w:hAnsi="Calibri"/>
+                <w:sz w:val="18"/>
+                <w:szCs w:val="18"/>
+              </w:rPr>
+              <w:t xml:space="preserve">AI-driven SDLC / AI-DLC</w:t>
+            </w:r>
+          </w:p>
+        </w:tc>
+        <w:tc>
+          <w:tcPr>
+            <w:tcW w:type="dxa" w:w="4150"/>
+            <w:tcMar>
+              <w:top w:type="dxa" w:w="60"/>
+              <w:left w:type="dxa" w:w="100"/>
+              <w:bottom w:type="dxa" w:w="60"/>
+              <w:right w:type="dxa" w:w="100"/>
+            </w:tcMar>
+          </w:tcPr>
+          <w:p>
+            <w:pPr>
+              <w:spacing w:after="0" w:before="0" w:line="252"/>
+            </w:pPr>
+            <w:r>
+              <w:rPr>
+                <w:rFonts w:ascii="Calibri" w:cs="Calibri" w:eastAsia="Calibri" w:hAnsi="Calibri"/>
+                <w:sz w:val="18"/>
+                <w:szCs w:val="18"/>
+              </w:rPr>
+              <w:t xml:space="preserve">Ciclo de desarrollo dirigido por IA con validación humana en cada etapa; AI-DLC es la metodología concreta de AWS [8][9]</w:t>
+            </w:r>
+          </w:p>
+        </w:tc>
+        <w:tc>
+          <w:tcPr>
+            <w:tcW w:type="dxa" w:w="3239"/>
+            <w:tcMar>
+              <w:top w:type="dxa" w:w="60"/>
+              <w:left w:type="dxa" w:w="100"/>
+              <w:bottom w:type="dxa" w:w="60"/>
+              <w:right w:type="dxa" w:w="100"/>
+            </w:tcMar>
+          </w:tcPr>
+          <w:p>
+            <w:pPr>
+              <w:spacing w:after="0" w:before="0" w:line="252"/>
+            </w:pPr>
+            <w:r>
+              <w:rPr>
+                <w:rFonts w:ascii="Calibri" w:cs="Calibri" w:eastAsia="Calibri" w:hAnsi="Calibri"/>
+                <w:sz w:val="18"/>
+                <w:szCs w:val="18"/>
+              </w:rPr>
+              <w:t xml:space="preserve">La POC aplica sus principios en las fases del SDLC</w:t>
             </w:r>
           </w:p>
         </w:tc>
@@ -4025,73 +4025,73 @@
         </w:trPr>
         <w:tc>
           <w:tcPr>
-            <w:tcW w:type="dxa" w:w="1683"/>
-            <w:tcMar>
-              <w:top w:type="dxa" w:w="60"/>
-              <w:left w:type="dxa" w:w="100"/>
-              <w:bottom w:type="dxa" w:w="60"/>
-              <w:right w:type="dxa" w:w="100"/>
-            </w:tcMar>
-          </w:tcPr>
-          <w:p>
-            <w:pPr>
-              <w:spacing w:after="0" w:before="0" w:line="252"/>
-            </w:pPr>
-            <w:r>
-              <w:rPr>
-                <w:rFonts w:ascii="Calibri" w:cs="Calibri" w:eastAsia="Calibri" w:hAnsi="Calibri"/>
-                <w:sz w:val="18"/>
-                <w:szCs w:val="18"/>
-              </w:rPr>
-              <w:t xml:space="preserve">ALM agéntico</w:t>
-            </w:r>
-          </w:p>
-        </w:tc>
-        <w:tc>
-          <w:tcPr>
-            <w:tcW w:type="dxa" w:w="4194"/>
-            <w:tcMar>
-              <w:top w:type="dxa" w:w="60"/>
-              <w:left w:type="dxa" w:w="100"/>
-              <w:bottom w:type="dxa" w:w="60"/>
-              <w:right w:type="dxa" w:w="100"/>
-            </w:tcMar>
-          </w:tcPr>
-          <w:p>
-            <w:pPr>
-              <w:spacing w:after="0" w:before="0" w:line="252"/>
-            </w:pPr>
-            <w:r>
-              <w:rPr>
-                <w:rFonts w:ascii="Calibri" w:cs="Calibri" w:eastAsia="Calibri" w:hAnsi="Calibri"/>
-                <w:sz w:val="18"/>
-                <w:szCs w:val="18"/>
-              </w:rPr>
-              <w:t xml:space="preserve">El mismo enfoque extendido a todo el ciclo de vida, incluidas demanda, operación y retirada</w:t>
-            </w:r>
-          </w:p>
-        </w:tc>
-        <w:tc>
-          <w:tcPr>
-            <w:tcW w:type="dxa" w:w="3193"/>
-            <w:tcMar>
-              <w:top w:type="dxa" w:w="60"/>
-              <w:left w:type="dxa" w:w="100"/>
-              <w:bottom w:type="dxa" w:w="60"/>
-              <w:right w:type="dxa" w:w="100"/>
-            </w:tcMar>
-          </w:tcPr>
-          <w:p>
-            <w:pPr>
-              <w:spacing w:after="0" w:before="0" w:line="252"/>
-            </w:pPr>
-            <w:r>
-              <w:rPr>
-                <w:rFonts w:ascii="Calibri" w:cs="Calibri" w:eastAsia="Calibri" w:hAnsi="Calibri"/>
-                <w:sz w:val="18"/>
-                <w:szCs w:val="18"/>
-              </w:rPr>
-              <w:t xml:space="preserve">Alcance completo de la POC (tareas A a E)</w:t>
+            <w:tcW w:type="dxa" w:w="1681"/>
+            <w:tcMar>
+              <w:top w:type="dxa" w:w="60"/>
+              <w:left w:type="dxa" w:w="100"/>
+              <w:bottom w:type="dxa" w:w="60"/>
+              <w:right w:type="dxa" w:w="100"/>
+            </w:tcMar>
+          </w:tcPr>
+          <w:p>
+            <w:pPr>
+              <w:spacing w:after="0" w:before="0" w:line="252"/>
+            </w:pPr>
+            <w:r>
+              <w:rPr>
+                <w:rFonts w:ascii="Calibri" w:cs="Calibri" w:eastAsia="Calibri" w:hAnsi="Calibri"/>
+                <w:sz w:val="18"/>
+                <w:szCs w:val="18"/>
+              </w:rPr>
+              <w:t xml:space="preserve">SDLC agéntico</w:t>
+            </w:r>
+          </w:p>
+        </w:tc>
+        <w:tc>
+          <w:tcPr>
+            <w:tcW w:type="dxa" w:w="4150"/>
+            <w:tcMar>
+              <w:top w:type="dxa" w:w="60"/>
+              <w:left w:type="dxa" w:w="100"/>
+              <w:bottom w:type="dxa" w:w="60"/>
+              <w:right w:type="dxa" w:w="100"/>
+            </w:tcMar>
+          </w:tcPr>
+          <w:p>
+            <w:pPr>
+              <w:spacing w:after="0" w:before="0" w:line="252"/>
+            </w:pPr>
+            <w:r>
+              <w:rPr>
+                <w:rFonts w:ascii="Calibri" w:cs="Calibri" w:eastAsia="Calibri" w:hAnsi="Calibri"/>
+                <w:sz w:val="18"/>
+                <w:szCs w:val="18"/>
+              </w:rPr>
+              <w:t xml:space="preserve">Los agentes hacen el trabajo de cada fase del desarrollo [6]</w:t>
+            </w:r>
+          </w:p>
+        </w:tc>
+        <w:tc>
+          <w:tcPr>
+            <w:tcW w:type="dxa" w:w="3239"/>
+            <w:tcMar>
+              <w:top w:type="dxa" w:w="60"/>
+              <w:left w:type="dxa" w:w="100"/>
+              <w:bottom w:type="dxa" w:w="60"/>
+              <w:right w:type="dxa" w:w="100"/>
+            </w:tcMar>
+          </w:tcPr>
+          <w:p>
+            <w:pPr>
+              <w:spacing w:after="0" w:before="0" w:line="252"/>
+            </w:pPr>
+            <w:r>
+              <w:rPr>
+                <w:rFonts w:ascii="Calibri" w:cs="Calibri" w:eastAsia="Calibri" w:hAnsi="Calibri"/>
+                <w:sz w:val="18"/>
+                <w:szCs w:val="18"/>
+              </w:rPr>
+              <w:t xml:space="preserve">Núcleo de la POC</w:t>
             </w:r>
           </w:p>
         </w:tc>
@@ -4102,7 +4102,84 @@
         </w:trPr>
         <w:tc>
           <w:tcPr>
-            <w:tcW w:type="dxa" w:w="1683"/>
+            <w:tcW w:type="dxa" w:w="1681"/>
+            <w:tcMar>
+              <w:top w:type="dxa" w:w="60"/>
+              <w:left w:type="dxa" w:w="100"/>
+              <w:bottom w:type="dxa" w:w="60"/>
+              <w:right w:type="dxa" w:w="100"/>
+            </w:tcMar>
+          </w:tcPr>
+          <w:p>
+            <w:pPr>
+              <w:spacing w:after="0" w:before="0" w:line="252"/>
+            </w:pPr>
+            <w:r>
+              <w:rPr>
+                <w:rFonts w:ascii="Calibri" w:cs="Calibri" w:eastAsia="Calibri" w:hAnsi="Calibri"/>
+                <w:sz w:val="18"/>
+                <w:szCs w:val="18"/>
+              </w:rPr>
+              <w:t xml:space="preserve">ALM agéntico</w:t>
+            </w:r>
+          </w:p>
+        </w:tc>
+        <w:tc>
+          <w:tcPr>
+            <w:tcW w:type="dxa" w:w="4150"/>
+            <w:tcMar>
+              <w:top w:type="dxa" w:w="60"/>
+              <w:left w:type="dxa" w:w="100"/>
+              <w:bottom w:type="dxa" w:w="60"/>
+              <w:right w:type="dxa" w:w="100"/>
+            </w:tcMar>
+          </w:tcPr>
+          <w:p>
+            <w:pPr>
+              <w:spacing w:after="0" w:before="0" w:line="252"/>
+            </w:pPr>
+            <w:r>
+              <w:rPr>
+                <w:rFonts w:ascii="Calibri" w:cs="Calibri" w:eastAsia="Calibri" w:hAnsi="Calibri"/>
+                <w:sz w:val="18"/>
+                <w:szCs w:val="18"/>
+              </w:rPr>
+              <w:t xml:space="preserve">El mismo enfoque extendido a todo el ciclo de vida, incluidas demanda, operación y retirada</w:t>
+            </w:r>
+          </w:p>
+        </w:tc>
+        <w:tc>
+          <w:tcPr>
+            <w:tcW w:type="dxa" w:w="3239"/>
+            <w:tcMar>
+              <w:top w:type="dxa" w:w="60"/>
+              <w:left w:type="dxa" w:w="100"/>
+              <w:bottom w:type="dxa" w:w="60"/>
+              <w:right w:type="dxa" w:w="100"/>
+            </w:tcMar>
+          </w:tcPr>
+          <w:p>
+            <w:pPr>
+              <w:spacing w:after="0" w:before="0" w:line="252"/>
+            </w:pPr>
+            <w:r>
+              <w:rPr>
+                <w:rFonts w:ascii="Calibri" w:cs="Calibri" w:eastAsia="Calibri" w:hAnsi="Calibri"/>
+                <w:sz w:val="18"/>
+                <w:szCs w:val="18"/>
+              </w:rPr>
+              <w:t xml:space="preserve">Alcance completo de la POC (tareas A a E)</w:t>
+            </w:r>
+          </w:p>
+        </w:tc>
+      </w:tr>
+      <w:tr>
+        <w:trPr>
+          <w:cantSplit/>
+        </w:trPr>
+        <w:tc>
+          <w:tcPr>
+            <w:tcW w:type="dxa" w:w="1681"/>
             <w:tcMar>
               <w:top w:type="dxa" w:w="60"/>
               <w:left w:type="dxa" w:w="100"/>
@@ -4144,7 +4221,7 @@
         </w:tc>
         <w:tc>
           <w:tcPr>
-            <w:tcW w:type="dxa" w:w="4194"/>
+            <w:tcW w:type="dxa" w:w="4150"/>
             <w:tcMar>
               <w:top w:type="dxa" w:w="60"/>
               <w:left w:type="dxa" w:w="100"/>
@@ -4186,7 +4263,7 @@
         </w:tc>
         <w:tc>
           <w:tcPr>
-            <w:tcW w:type="dxa" w:w="3193"/>
+            <w:tcW w:type="dxa" w:w="3239"/>
             <w:tcMar>
               <w:top w:type="dxa" w:w="60"/>
               <w:left w:type="dxa" w:w="100"/>
@@ -4226,6 +4303,97 @@
           <w:rFonts w:ascii="Calibri" w:cs="Calibri" w:eastAsia="Calibri" w:hAnsi="Calibri"/>
         </w:rPr>
         <w:t xml:space="preserve">Dicho de forma breve, en el SDLC agéntico los agentes construyen software y en el ADLC el software que se construye son agentes.</w:t>
+      </w:r>
+    </w:p>
+    <w:p>
+      <w:pPr>
+        <w:keepNext w:val="false"/>
+        <w:spacing w:after="140" w:line="288"/>
+        <w:jc w:val="both"/>
+      </w:pPr>
+      <w:r>
+        <w:rPr>
+          <w:rFonts w:ascii="Calibri" w:cs="Calibri" w:eastAsia="Calibri" w:hAnsi="Calibri"/>
+        </w:rPr>
+        <w:t xml:space="preserve">La POC lleva estos principios a una implementación real y los amplía en dos direcciones. Cubre las fases del ALM que AI-DLC no trata (demanda, </w:t>
+      </w:r>
+      <w:r>
+        <w:rPr>
+          <w:rFonts w:ascii="Calibri" w:cs="Calibri" w:eastAsia="Calibri" w:hAnsi="Calibri"/>
+          <w:i/>
+          <w:iCs/>
+        </w:rPr>
+        <w:t xml:space="preserve">releases</w:t>
+      </w:r>
+      <w:r>
+        <w:rPr>
+          <w:rFonts w:ascii="Calibri" w:cs="Calibri" w:eastAsia="Calibri" w:hAnsi="Calibri"/>
+        </w:rPr>
+        <w:t xml:space="preserve">, mantenimiento y retirada) y añade una capa de gobierno que la metodología describe poco: identidades propias para los agentes, un harness que los contiene y trazabilidad por versión. La figura 2 sitúa cada tarea del plan en una de las tres zonas.</w:t>
+      </w:r>
+    </w:p>
+    <w:p>
+      <w:pPr>
+        <w:keepNext/>
+        <w:spacing w:after="60" w:before="200" w:line="240" w:lineRule="auto"/>
+        <w:jc w:val="center"/>
+      </w:pPr>
+      <w:r>
+        <w:drawing>
+          <wp:inline distT="0" distB="0" distL="0" distR="0">
+            <wp:extent cx="5762625" cy="5857875"/>
+            <wp:effectExtent t="0" r="0" b="0" l="0"/>
+            <wp:docPr id="1" name="alcance.png" descr="Figura 2. Qué parte de la POC corresponde al SDLC que cubre AI-DLC y qué parte la amplía hasta el ALM agéntico." title="Figura 2. Qué parte de la POC corresponde al SDLC que cubre AI-DLC y qué parte la amplía hasta el ALM agéntico."/>
+            <wp:cNvGraphicFramePr>
+              <a:graphicFrameLocks xmlns:a="http://schemas.openxmlformats.org/drawingml/2006/main" noChangeAspect="1"/>
+            </wp:cNvGraphicFramePr>
+            <a:graphic xmlns:a="http://schemas.openxmlformats.org/drawingml/2006/main">
+              <a:graphicData uri="http://schemas.openxmlformats.org/drawingml/2006/picture">
+                <pic:pic xmlns:pic="http://schemas.openxmlformats.org/drawingml/2006/picture">
+                  <pic:nvPicPr>
+                    <pic:cNvPr id="0" name="" descr=""/>
+                    <pic:cNvPicPr>
+                      <a:picLocks noChangeAspect="1" noChangeArrowheads="1"/>
+                    </pic:cNvPicPr>
+                  </pic:nvPicPr>
+                  <pic:blipFill>
+                    <a:blip r:embed="rId10" cstate="none"/>
+                    <a:srcRect/>
+                    <a:stretch>
+                      <a:fillRect/>
+                    </a:stretch>
+                  </pic:blipFill>
+                  <pic:spPr bwMode="auto">
+                    <a:xfrm>
+                      <a:off x="0" y="0"/>
+                      <a:ext cx="5762625" cy="5857875"/>
+                    </a:xfrm>
+                    <a:prstGeom prst="rect">
+                      <a:avLst/>
+                    </a:prstGeom>
+                  </pic:spPr>
+                </pic:pic>
+              </a:graphicData>
+            </a:graphic>
+          </wp:inline>
+        </w:drawing>
+      </w:r>
+    </w:p>
+    <w:p>
+      <w:pPr>
+        <w:spacing w:after="240"/>
+        <w:jc w:val="center"/>
+      </w:pPr>
+      <w:r>
+        <w:rPr>
+          <w:rFonts w:ascii="Calibri" w:cs="Calibri" w:eastAsia="Calibri" w:hAnsi="Calibri"/>
+          <w:i/>
+          <w:iCs/>
+          <w:color w:val="5B6964"/>
+          <w:sz w:val="18"/>
+          <w:szCs w:val="18"/>
+        </w:rPr>
+        <w:t xml:space="preserve">Figura 2. Qué parte de la POC corresponde al SDLC que cubre AI-DLC y qué parte la amplía hasta el ALM agéntico.</w:t>
       </w:r>
     </w:p>
     <w:p>
@@ -7330,7 +7498,7 @@
         <w:rPr>
           <w:rFonts w:ascii="Calibri" w:cs="Calibri" w:eastAsia="Calibri" w:hAnsi="Calibri"/>
         </w:rPr>
-        <w:t xml:space="preserve">La figura 2 sigue un cambio desde que el agente abre el PR hasta que Argo CD lo despliega en </w:t>
+        <w:t xml:space="preserve">La figura 3 sigue un cambio desde que el agente abre el PR hasta que Argo CD lo despliega en </w:t>
       </w:r>
       <w:r>
         <w:rPr>
@@ -7358,7 +7526,7 @@
           <wp:inline distT="0" distB="0" distL="0" distR="0">
             <wp:extent cx="5762625" cy="6667500"/>
             <wp:effectExtent t="0" r="0" b="0" l="0"/>
-            <wp:docPr id="1" name="flujo-cambio.png" descr="Figura 2. Flujo de un cambio por los tres repositorios, desde el PR del agente hasta la sincronización de Argo CD." title="Figura 2. Flujo de un cambio por los tres repositorios, desde el PR del agente hasta la sincronización de Argo CD."/>
+            <wp:docPr id="1" name="flujo-cambio.png" descr="Figura 3. Flujo de un cambio por los tres repositorios, desde el PR del agente hasta la sincronización de Argo CD." title="Figura 3. Flujo de un cambio por los tres repositorios, desde el PR del agente hasta la sincronización de Argo CD."/>
             <wp:cNvGraphicFramePr>
               <a:graphicFrameLocks xmlns:a="http://schemas.openxmlformats.org/drawingml/2006/main" noChangeAspect="1"/>
             </wp:cNvGraphicFramePr>
@@ -7372,7 +7540,7 @@
                     </pic:cNvPicPr>
                   </pic:nvPicPr>
                   <pic:blipFill>
-                    <a:blip r:embed="rId10" cstate="none"/>
+                    <a:blip r:embed="rId11" cstate="none"/>
                     <a:srcRect/>
                     <a:stretch>
                       <a:fillRect/>
@@ -7408,7 +7576,7 @@
           <w:sz w:val="18"/>
           <w:szCs w:val="18"/>
         </w:rPr>
-        <w:t xml:space="preserve">Figura 2. Flujo de un cambio por los tres repositorios, desde el PR del agente hasta la sincronización de Argo CD.</w:t>
+        <w:t xml:space="preserve">Figura 3. Flujo de un cambio por los tres repositorios, desde el PR del agente hasta la sincronización de Argo CD.</w:t>
       </w:r>
     </w:p>
     <w:p>
@@ -10455,7 +10623,7 @@
         <w:rPr>
           <w:rFonts w:ascii="Calibri" w:cs="Calibri" w:eastAsia="Calibri" w:hAnsi="Calibri"/>
         </w:rPr>
-        <w:t xml:space="preserve"> es el conjunto de controles que rodean al agente de código. Tiene siete capas, desde las que solo orientan al agente hasta las que impone la plataforma. La figura 3 sigue el camino de una acción: el contexto orienta al agente, los permisos y el hook pueden bloquearla en local, y GitHub aplica la identidad y la protección de la rama cuando la acción llega al repositorio.</w:t>
+        <w:t xml:space="preserve"> es el conjunto de controles que rodean al agente de código. Tiene siete capas, desde las que solo orientan al agente hasta las que impone la plataforma. La figura 4 sigue el camino de una acción: el contexto orienta al agente, los permisos y el hook pueden bloquearla en local, y GitHub aplica la identidad y la protección de la rama cuando la acción llega al repositorio.</w:t>
       </w:r>
     </w:p>
     <w:p>
@@ -10469,7 +10637,7 @@
           <wp:inline distT="0" distB="0" distL="0" distR="0">
             <wp:extent cx="5762625" cy="6210300"/>
             <wp:effectExtent t="0" r="0" b="0" l="0"/>
-            <wp:docPr id="1" name="harness.png" descr="Figura 3. Capas del harness en el camino de una acción del agente. Las capas 3 a 5 actúan en Claude Code y las capas 6 y 7 en GitHub." title="Figura 3. Capas del harness en el camino de una acción del agente. Las capas 3 a 5 actúan en Claude Code y las capas 6 y 7 en GitHub."/>
+            <wp:docPr id="1" name="harness.png" descr="Figura 4. Capas del harness en el camino de una acción del agente. Las capas 3 a 5 actúan en Claude Code y las capas 6 y 7 en GitHub." title="Figura 4. Capas del harness en el camino de una acción del agente. Las capas 3 a 5 actúan en Claude Code y las capas 6 y 7 en GitHub."/>
             <wp:cNvGraphicFramePr>
               <a:graphicFrameLocks xmlns:a="http://schemas.openxmlformats.org/drawingml/2006/main" noChangeAspect="1"/>
             </wp:cNvGraphicFramePr>
@@ -10483,7 +10651,7 @@
                     </pic:cNvPicPr>
                   </pic:nvPicPr>
                   <pic:blipFill>
-                    <a:blip r:embed="rId11" cstate="none"/>
+                    <a:blip r:embed="rId12" cstate="none"/>
                     <a:srcRect/>
                     <a:stretch>
                       <a:fillRect/>
@@ -10519,7 +10687,7 @@
           <w:sz w:val="18"/>
           <w:szCs w:val="18"/>
         </w:rPr>
-        <w:t xml:space="preserve">Figura 3. Capas del harness en el camino de una acción del agente. Las capas 3 a 5 actúan en Claude Code y las capas 6 y 7 en GitHub.</w:t>
+        <w:t xml:space="preserve">Figura 4. Capas del harness en el camino de una acción del agente. Las capas 3 a 5 actúan en Claude Code y las capas 6 y 7 en GitHub.</w:t>
       </w:r>
     </w:p>
     <w:tbl>
@@ -11812,7 +11980,7 @@
           <wp:inline distT="0" distB="0" distL="0" distR="0">
             <wp:extent cx="5762625" cy="5238750"/>
             <wp:effectExtent t="0" r="0" b="0" l="0"/>
-            <wp:docPr id="1" name="triage.png" descr="Figura 4. Flujo del triage: el modelo propone sin herramientas y un script determinista valida y aplica." title="Figura 4. Flujo del triage: el modelo propone sin herramientas y un script determinista valida y aplica."/>
+            <wp:docPr id="1" name="triage.png" descr="Figura 5. Flujo del triage: el modelo propone sin herramientas y un script determinista valida y aplica." title="Figura 5. Flujo del triage: el modelo propone sin herramientas y un script determinista valida y aplica."/>
             <wp:cNvGraphicFramePr>
               <a:graphicFrameLocks xmlns:a="http://schemas.openxmlformats.org/drawingml/2006/main" noChangeAspect="1"/>
             </wp:cNvGraphicFramePr>
@@ -11826,7 +11994,7 @@
                     </pic:cNvPicPr>
                   </pic:nvPicPr>
                   <pic:blipFill>
-                    <a:blip r:embed="rId12" cstate="none"/>
+                    <a:blip r:embed="rId13" cstate="none"/>
                     <a:srcRect/>
                     <a:stretch>
                       <a:fillRect/>
@@ -11862,7 +12030,7 @@
           <w:sz w:val="18"/>
           <w:szCs w:val="18"/>
         </w:rPr>
-        <w:t xml:space="preserve">Figura 4. Flujo del triage: el modelo propone sin herramientas y un script determinista valida y aplica.</w:t>
+        <w:t xml:space="preserve">Figura 5. Flujo del triage: el modelo propone sin herramientas y un script determinista valida y aplica.</w:t>
       </w:r>
     </w:p>
     <w:tbl>
@@ -20240,9 +20408,9 @@
       </w:tblPr>
       <w:tblGrid>
         <w:gridCol w:w="700"/>
-        <w:gridCol w:w="2645"/>
-        <w:gridCol w:w="3793"/>
-        <w:gridCol w:w="1932"/>
+        <w:gridCol w:w="2926"/>
+        <w:gridCol w:w="3573"/>
+        <w:gridCol w:w="1871"/>
       </w:tblGrid>
       <w:tr>
         <w:trPr>
@@ -20277,7 +20445,7 @@
         </w:tc>
         <w:tc>
           <w:tcPr>
-            <w:tcW w:type="dxa" w:w="2645"/>
+            <w:tcW w:type="dxa" w:w="2926"/>
             <w:shd w:fill="E3EEEA" w:color="auto" w:val="clear"/>
             <w:tcMar>
               <w:top w:type="dxa" w:w="60"/>
@@ -20304,7 +20472,7 @@
         </w:tc>
         <w:tc>
           <w:tcPr>
-            <w:tcW w:type="dxa" w:w="3793"/>
+            <w:tcW w:type="dxa" w:w="3573"/>
             <w:shd w:fill="E3EEEA" w:color="auto" w:val="clear"/>
             <w:tcMar>
               <w:top w:type="dxa" w:w="60"/>
@@ -20331,7 +20499,7 @@
         </w:tc>
         <w:tc>
           <w:tcPr>
-            <w:tcW w:type="dxa" w:w="1932"/>
+            <w:tcW w:type="dxa" w:w="1871"/>
             <w:shd w:fill="E3EEEA" w:color="auto" w:val="clear"/>
             <w:tcMar>
               <w:top w:type="dxa" w:w="60"/>
@@ -20387,7 +20555,7 @@
         </w:tc>
         <w:tc>
           <w:tcPr>
-            <w:tcW w:type="dxa" w:w="2645"/>
+            <w:tcW w:type="dxa" w:w="2926"/>
             <w:tcMar>
               <w:top w:type="dxa" w:w="60"/>
               <w:left w:type="dxa" w:w="100"/>
@@ -20411,7 +20579,7 @@
         </w:tc>
         <w:tc>
           <w:tcPr>
-            <w:tcW w:type="dxa" w:w="3793"/>
+            <w:tcW w:type="dxa" w:w="3573"/>
             <w:tcMar>
               <w:top w:type="dxa" w:w="60"/>
               <w:left w:type="dxa" w:w="100"/>
@@ -20435,7 +20603,7 @@
         </w:tc>
         <w:tc>
           <w:tcPr>
-            <w:tcW w:type="dxa" w:w="1932"/>
+            <w:tcW w:type="dxa" w:w="1871"/>
             <w:tcMar>
               <w:top w:type="dxa" w:w="60"/>
               <w:left w:type="dxa" w:w="100"/>
@@ -20488,7 +20656,7 @@
         </w:tc>
         <w:tc>
           <w:tcPr>
-            <w:tcW w:type="dxa" w:w="2645"/>
+            <w:tcW w:type="dxa" w:w="2926"/>
             <w:tcMar>
               <w:top w:type="dxa" w:w="60"/>
               <w:left w:type="dxa" w:w="100"/>
@@ -20512,7 +20680,7 @@
         </w:tc>
         <w:tc>
           <w:tcPr>
-            <w:tcW w:type="dxa" w:w="3793"/>
+            <w:tcW w:type="dxa" w:w="3573"/>
             <w:tcMar>
               <w:top w:type="dxa" w:w="60"/>
               <w:left w:type="dxa" w:w="100"/>
@@ -20536,7 +20704,7 @@
         </w:tc>
         <w:tc>
           <w:tcPr>
-            <w:tcW w:type="dxa" w:w="1932"/>
+            <w:tcW w:type="dxa" w:w="1871"/>
             <w:tcMar>
               <w:top w:type="dxa" w:w="60"/>
               <w:left w:type="dxa" w:w="100"/>
@@ -20589,7 +20757,7 @@
         </w:tc>
         <w:tc>
           <w:tcPr>
-            <w:tcW w:type="dxa" w:w="2645"/>
+            <w:tcW w:type="dxa" w:w="2926"/>
             <w:tcMar>
               <w:top w:type="dxa" w:w="60"/>
               <w:left w:type="dxa" w:w="100"/>
@@ -20613,7 +20781,7 @@
         </w:tc>
         <w:tc>
           <w:tcPr>
-            <w:tcW w:type="dxa" w:w="3793"/>
+            <w:tcW w:type="dxa" w:w="3573"/>
             <w:tcMar>
               <w:top w:type="dxa" w:w="60"/>
               <w:left w:type="dxa" w:w="100"/>
@@ -20637,7 +20805,7 @@
         </w:tc>
         <w:tc>
           <w:tcPr>
-            <w:tcW w:type="dxa" w:w="1932"/>
+            <w:tcW w:type="dxa" w:w="1871"/>
             <w:tcMar>
               <w:top w:type="dxa" w:w="60"/>
               <w:left w:type="dxa" w:w="100"/>
@@ -20690,7 +20858,7 @@
         </w:tc>
         <w:tc>
           <w:tcPr>
-            <w:tcW w:type="dxa" w:w="2645"/>
+            <w:tcW w:type="dxa" w:w="2926"/>
             <w:tcMar>
               <w:top w:type="dxa" w:w="60"/>
               <w:left w:type="dxa" w:w="100"/>
@@ -20714,7 +20882,7 @@
         </w:tc>
         <w:tc>
           <w:tcPr>
-            <w:tcW w:type="dxa" w:w="3793"/>
+            <w:tcW w:type="dxa" w:w="3573"/>
             <w:tcMar>
               <w:top w:type="dxa" w:w="60"/>
               <w:left w:type="dxa" w:w="100"/>
@@ -20738,7 +20906,7 @@
         </w:tc>
         <w:tc>
           <w:tcPr>
-            <w:tcW w:type="dxa" w:w="1932"/>
+            <w:tcW w:type="dxa" w:w="1871"/>
             <w:tcMar>
               <w:top w:type="dxa" w:w="60"/>
               <w:left w:type="dxa" w:w="100"/>
@@ -20757,6 +20925,208 @@
                 <w:szCs w:val="18"/>
               </w:rPr>
               <w:t xml:space="preserve">Plan de 18 tareas</w:t>
+            </w:r>
+          </w:p>
+        </w:tc>
+      </w:tr>
+      <w:tr>
+        <w:trPr>
+          <w:cantSplit/>
+        </w:trPr>
+        <w:tc>
+          <w:tcPr>
+            <w:tcW w:type="dxa" w:w="700"/>
+            <w:tcMar>
+              <w:top w:type="dxa" w:w="60"/>
+              <w:left w:type="dxa" w:w="100"/>
+              <w:bottom w:type="dxa" w:w="60"/>
+              <w:right w:type="dxa" w:w="100"/>
+            </w:tcMar>
+          </w:tcPr>
+          <w:p>
+            <w:pPr>
+              <w:spacing w:after="0" w:before="0" w:line="252"/>
+            </w:pPr>
+            <w:r>
+              <w:rPr>
+                <w:rFonts w:ascii="Calibri" w:cs="Calibri" w:eastAsia="Calibri" w:hAnsi="Calibri"/>
+                <w:sz w:val="18"/>
+                <w:szCs w:val="18"/>
+              </w:rPr>
+              <w:t xml:space="preserve">53</w:t>
+            </w:r>
+          </w:p>
+        </w:tc>
+        <w:tc>
+          <w:tcPr>
+            <w:tcW w:type="dxa" w:w="2926"/>
+            <w:tcMar>
+              <w:top w:type="dxa" w:w="60"/>
+              <w:left w:type="dxa" w:w="100"/>
+              <w:bottom w:type="dxa" w:w="60"/>
+              <w:right w:type="dxa" w:w="100"/>
+            </w:tcMar>
+          </w:tcPr>
+          <w:p>
+            <w:pPr>
+              <w:spacing w:after="0" w:before="0" w:line="252"/>
+            </w:pPr>
+            <w:r>
+              <w:rPr>
+                <w:rFonts w:ascii="Calibri" w:cs="Calibri" w:eastAsia="Calibri" w:hAnsi="Calibri"/>
+                <w:sz w:val="18"/>
+                <w:szCs w:val="18"/>
+              </w:rPr>
+              <w:t xml:space="preserve">«¿AI-driven SDLC es otra manera de llamar a lo que estamos haciendo, el ALM agéntico?»</w:t>
+            </w:r>
+          </w:p>
+        </w:tc>
+        <w:tc>
+          <w:tcPr>
+            <w:tcW w:type="dxa" w:w="3573"/>
+            <w:tcMar>
+              <w:top w:type="dxa" w:w="60"/>
+              <w:left w:type="dxa" w:w="100"/>
+              <w:bottom w:type="dxa" w:w="60"/>
+              <w:right w:type="dxa" w:w="100"/>
+            </w:tcMar>
+          </w:tcPr>
+          <w:p>
+            <w:pPr>
+              <w:spacing w:after="0" w:before="0" w:line="252"/>
+            </w:pPr>
+            <w:r>
+              <w:rPr>
+                <w:rFonts w:ascii="Calibri" w:cs="Calibri" w:eastAsia="Calibri" w:hAnsi="Calibri"/>
+                <w:sz w:val="18"/>
+                <w:szCs w:val="18"/>
+              </w:rPr>
+              <w:t xml:space="preserve">Distingue el uso genérico del término y la metodología AI-DLC de AWS, y compara ambos con el SDLC y el ALM agénticos: la POC comparte la validación humana por etapa y amplía el alcance y el gobierno</w:t>
+            </w:r>
+          </w:p>
+        </w:tc>
+        <w:tc>
+          <w:tcPr>
+            <w:tcW w:type="dxa" w:w="1871"/>
+            <w:tcMar>
+              <w:top w:type="dxa" w:w="60"/>
+              <w:left w:type="dxa" w:w="100"/>
+              <w:bottom w:type="dxa" w:w="60"/>
+              <w:right w:type="dxa" w:w="100"/>
+            </w:tcMar>
+          </w:tcPr>
+          <w:p>
+            <w:pPr>
+              <w:spacing w:after="0" w:before="0" w:line="252"/>
+            </w:pPr>
+            <w:r>
+              <w:rPr>
+                <w:rFonts w:ascii="Calibri" w:cs="Calibri" w:eastAsia="Calibri" w:hAnsi="Calibri"/>
+                <w:sz w:val="18"/>
+                <w:szCs w:val="18"/>
+              </w:rPr>
+              <w:t xml:space="preserve">Posicionamiento del trabajo</w:t>
+            </w:r>
+          </w:p>
+        </w:tc>
+      </w:tr>
+      <w:tr>
+        <w:trPr>
+          <w:cantSplit/>
+        </w:trPr>
+        <w:tc>
+          <w:tcPr>
+            <w:tcW w:type="dxa" w:w="700"/>
+            <w:tcMar>
+              <w:top w:type="dxa" w:w="60"/>
+              <w:left w:type="dxa" w:w="100"/>
+              <w:bottom w:type="dxa" w:w="60"/>
+              <w:right w:type="dxa" w:w="100"/>
+            </w:tcMar>
+          </w:tcPr>
+          <w:p>
+            <w:pPr>
+              <w:spacing w:after="0" w:before="0" w:line="252"/>
+            </w:pPr>
+            <w:r>
+              <w:rPr>
+                <w:rFonts w:ascii="Calibri" w:cs="Calibri" w:eastAsia="Calibri" w:hAnsi="Calibri"/>
+                <w:sz w:val="18"/>
+                <w:szCs w:val="18"/>
+              </w:rPr>
+              <w:t xml:space="preserve">54</w:t>
+            </w:r>
+          </w:p>
+        </w:tc>
+        <w:tc>
+          <w:tcPr>
+            <w:tcW w:type="dxa" w:w="2926"/>
+            <w:tcMar>
+              <w:top w:type="dxa" w:w="60"/>
+              <w:left w:type="dxa" w:w="100"/>
+              <w:bottom w:type="dxa" w:w="60"/>
+              <w:right w:type="dxa" w:w="100"/>
+            </w:tcMar>
+          </w:tcPr>
+          <w:p>
+            <w:pPr>
+              <w:spacing w:after="0" w:before="0" w:line="252"/>
+            </w:pPr>
+            <w:r>
+              <w:rPr>
+                <w:rFonts w:ascii="Calibri" w:cs="Calibri" w:eastAsia="Calibri" w:hAnsi="Calibri"/>
+                <w:sz w:val="18"/>
+                <w:szCs w:val="18"/>
+              </w:rPr>
+              <w:t xml:space="preserve">«Es decir, que vamos más allá, de la teoría a la práctica real, no solo en el SDLC de la app sino en la configuración de todo el ALM. Haz un gráfico donde se vea qué partes son del AI-DLC/SDLC y cuáles del ALM que hemos montado.»</w:t>
+            </w:r>
+          </w:p>
+        </w:tc>
+        <w:tc>
+          <w:tcPr>
+            <w:tcW w:type="dxa" w:w="3573"/>
+            <w:tcMar>
+              <w:top w:type="dxa" w:w="60"/>
+              <w:left w:type="dxa" w:w="100"/>
+              <w:bottom w:type="dxa" w:w="60"/>
+              <w:right w:type="dxa" w:w="100"/>
+            </w:tcMar>
+          </w:tcPr>
+          <w:p>
+            <w:pPr>
+              <w:spacing w:after="0" w:before="0" w:line="252"/>
+            </w:pPr>
+            <w:r>
+              <w:rPr>
+                <w:rFonts w:ascii="Calibri" w:cs="Calibri" w:eastAsia="Calibri" w:hAnsi="Calibri"/>
+                <w:sz w:val="18"/>
+                <w:szCs w:val="18"/>
+              </w:rPr>
+              <w:t xml:space="preserve">Crea la figura 2 con archify, que reparte las tareas en SDLC (AI-DLC), ampliación ALM y gobierno transversal, y añade AI-DLC a la tabla de términos</w:t>
+            </w:r>
+          </w:p>
+        </w:tc>
+        <w:tc>
+          <w:tcPr>
+            <w:tcW w:type="dxa" w:w="1871"/>
+            <w:tcMar>
+              <w:top w:type="dxa" w:w="60"/>
+              <w:left w:type="dxa" w:w="100"/>
+              <w:bottom w:type="dxa" w:w="60"/>
+              <w:right w:type="dxa" w:w="100"/>
+            </w:tcMar>
+          </w:tcPr>
+          <w:p>
+            <w:pPr>
+              <w:spacing w:after="0" w:before="0" w:line="252"/>
+            </w:pPr>
+            <w:r>
+              <w:rPr>
+                <w:rFonts w:ascii="Calibri" w:cs="Calibri" w:eastAsia="Calibri" w:hAnsi="Calibri"/>
+                <w:sz w:val="18"/>
+                <w:szCs w:val="18"/>
+              </w:rPr>
+              <w:t xml:space="preserve">Figura 2 en el estado del arte</w:t>
             </w:r>
           </w:p>
         </w:tc>
@@ -23661,7 +24031,7 @@
                 <w:sz w:val="18"/>
                 <w:szCs w:val="18"/>
               </w:rPr>
-              <w:t xml:space="preserve">52</w:t>
+              <w:t xml:space="preserve">54</w:t>
             </w:r>
           </w:p>
         </w:tc>
@@ -26103,7 +26473,7 @@
         </w:rPr>
         <w:t xml:space="preserve"> arXiv:2604.26275, 2026. </w:t>
       </w:r>
-      <w:hyperlink w:history="1" r:id="rIdoj6h1rnz2c6oriwvnv60u">
+      <w:hyperlink w:history="1" r:id="rIdifducm5nxuhxkfvp6wowo">
         <w:r>
           <w:rPr>
             <w:rStyle w:val="Hyperlink"/>
@@ -26148,7 +26518,7 @@
         </w:rPr>
         <w:t xml:space="preserve">, 2026. </w:t>
       </w:r>
-      <w:hyperlink w:history="1" r:id="rIdsjtmwgd-6nfn8g_wqwhvs">
+      <w:hyperlink w:history="1" r:id="rIdmxpybvl2ts6dd6nub0ohi">
         <w:r>
           <w:rPr>
             <w:rStyle w:val="Hyperlink"/>
@@ -26193,7 +26563,7 @@
         </w:rPr>
         <w:t xml:space="preserve"> </w:t>
       </w:r>
-      <w:hyperlink w:history="1" r:id="rId-v5wvcjbvevdkynaaiiyk">
+      <w:hyperlink w:history="1" r:id="rId8nrh8s_hb1klv6z1mv39k">
         <w:r>
           <w:rPr>
             <w:rStyle w:val="Hyperlink"/>
@@ -26238,7 +26608,7 @@
         </w:rPr>
         <w:t xml:space="preserve">, junio de 2026. </w:t>
       </w:r>
-      <w:hyperlink w:history="1" r:id="rId_ngo8seymq-bgqug2tip2">
+      <w:hyperlink w:history="1" r:id="rIdqu719mykhp2v5ddf4223b">
         <w:r>
           <w:rPr>
             <w:rStyle w:val="Hyperlink"/>
@@ -26283,7 +26653,7 @@
         </w:rPr>
         <w:t xml:space="preserve"> </w:t>
       </w:r>
-      <w:hyperlink w:history="1" r:id="rIdptugf6cwszbicgmmeatqy">
+      <w:hyperlink w:history="1" r:id="rIdakdh6lvkuswzdwmslywrn">
         <w:r>
           <w:rPr>
             <w:rStyle w:val="Hyperlink"/>
@@ -26328,7 +26698,7 @@
         </w:rPr>
         <w:t xml:space="preserve"> </w:t>
       </w:r>
-      <w:hyperlink w:history="1" r:id="rIdl-tjygynutbyluaryup9c">
+      <w:hyperlink w:history="1" r:id="rIdeg4pw1hffgkrkcupvwhz7">
         <w:r>
           <w:rPr>
             <w:rStyle w:val="Hyperlink"/>
@@ -26373,7 +26743,7 @@
         </w:rPr>
         <w:t xml:space="preserve">, diciembre de 2025. </w:t>
       </w:r>
-      <w:hyperlink w:history="1" r:id="rIdn0yqsyxjr0xnqx8taibga">
+      <w:hyperlink w:history="1" r:id="rIds3upz8xrqxkiwstdqbw7e">
         <w:r>
           <w:rPr>
             <w:rStyle w:val="Hyperlink"/>
@@ -26418,7 +26788,7 @@
         </w:rPr>
         <w:t xml:space="preserve"> </w:t>
       </w:r>
-      <w:hyperlink w:history="1" r:id="rIdm6rpcaepoj3yfocmecq0_">
+      <w:hyperlink w:history="1" r:id="rId7oam1c7n_8rt9vlcz4wgu">
         <w:r>
           <w:rPr>
             <w:rStyle w:val="Hyperlink"/>
@@ -26463,7 +26833,7 @@
         </w:rPr>
         <w:t xml:space="preserve"> </w:t>
       </w:r>
-      <w:hyperlink w:history="1" r:id="rId63iga9pcluhznfn5uxz5j">
+      <w:hyperlink w:history="1" r:id="rIdqccdayy7azgiuakuwunfz">
         <w:r>
           <w:rPr>
             <w:rStyle w:val="Hyperlink"/>
@@ -26508,7 +26878,7 @@
         </w:rPr>
         <w:t xml:space="preserve"> </w:t>
       </w:r>
-      <w:hyperlink w:history="1" r:id="rIdpwn_puid1yuwnr3b3xip7">
+      <w:hyperlink w:history="1" r:id="rIdijbchste5z4eankq0fb8a">
         <w:r>
           <w:rPr>
             <w:rStyle w:val="Hyperlink"/>
@@ -26553,7 +26923,7 @@
         </w:rPr>
         <w:t xml:space="preserve"> </w:t>
       </w:r>
-      <w:hyperlink w:history="1" r:id="rIdvp07krlbgreva2nzklpky">
+      <w:hyperlink w:history="1" r:id="rIdeaodxl3sxexnfsyrflqos">
         <w:r>
           <w:rPr>
             <w:rStyle w:val="Hyperlink"/>
@@ -26598,7 +26968,7 @@
         </w:rPr>
         <w:t xml:space="preserve"> </w:t>
       </w:r>
-      <w:hyperlink w:history="1" r:id="rId1kt6czgmla8kqocije0x8">
+      <w:hyperlink w:history="1" r:id="rIdjttaxrnvjvqqq78pvkmjc">
         <w:r>
           <w:rPr>
             <w:rStyle w:val="Hyperlink"/>
@@ -26643,7 +27013,7 @@
         </w:rPr>
         <w:t xml:space="preserve"> </w:t>
       </w:r>
-      <w:hyperlink w:history="1" r:id="rIds_cjwhfibo8aqaagmmg8k">
+      <w:hyperlink w:history="1" r:id="rIdgmhskmncaviep3lbfkmj_">
         <w:r>
           <w:rPr>
             <w:rStyle w:val="Hyperlink"/>
@@ -26688,7 +27058,7 @@
         </w:rPr>
         <w:t xml:space="preserve"> </w:t>
       </w:r>
-      <w:hyperlink w:history="1" r:id="rIdgnzggfzpy4myhacdwzhpu">
+      <w:hyperlink w:history="1" r:id="rIdo5g52yk9bmm_j2p4so7tm">
         <w:r>
           <w:rPr>
             <w:rStyle w:val="Hyperlink"/>
@@ -26733,7 +27103,7 @@
         </w:rPr>
         <w:t xml:space="preserve"> </w:t>
       </w:r>
-      <w:hyperlink w:history="1" r:id="rIdwkg9f3rijfdko_b8idllt">
+      <w:hyperlink w:history="1" r:id="rIdcohciouafnvqcn-d04uj8">
         <w:r>
           <w:rPr>
             <w:rStyle w:val="Hyperlink"/>
@@ -26778,7 +27148,7 @@
         </w:rPr>
         <w:t xml:space="preserve"> </w:t>
       </w:r>
-      <w:hyperlink w:history="1" r:id="rIdmepxylwvq4kaorfyum5yk">
+      <w:hyperlink w:history="1" r:id="rIdwovk995tirro4y5ewihsg">
         <w:r>
           <w:rPr>
             <w:rStyle w:val="Hyperlink"/>
@@ -26823,7 +27193,7 @@
         </w:rPr>
         <w:t xml:space="preserve">, agosto de 2026. </w:t>
       </w:r>
-      <w:hyperlink w:history="1" r:id="rIdjeeveeaxns0txiwhfcygq">
+      <w:hyperlink w:history="1" r:id="rIdygp0cuuds5uztt-ga5en8">
         <w:r>
           <w:rPr>
             <w:rStyle w:val="Hyperlink"/>
@@ -26868,7 +27238,7 @@
         </w:rPr>
         <w:t xml:space="preserve"> </w:t>
       </w:r>
-      <w:hyperlink w:history="1" r:id="rIdsac5i65cyjmtjazmurdy8">
+      <w:hyperlink w:history="1" r:id="rIdtgkbjsmnojs5adgto9ddw">
         <w:r>
           <w:rPr>
             <w:rStyle w:val="Hyperlink"/>
@@ -26931,7 +27301,7 @@
         </w:rPr>
         <w:t xml:space="preserve"> </w:t>
       </w:r>
-      <w:hyperlink w:history="1" r:id="rId5lp9zsojrqz6l6auyemzx">
+      <w:hyperlink w:history="1" r:id="rIdpi8_oqashns7emmyvsz0o">
         <w:r>
           <w:rPr>
             <w:rStyle w:val="Hyperlink"/>
@@ -26976,7 +27346,7 @@
         </w:rPr>
         <w:t xml:space="preserve"> </w:t>
       </w:r>
-      <w:hyperlink w:history="1" r:id="rIdxvnohst2rfnxmudyr16ev">
+      <w:hyperlink w:history="1" r:id="rIdqg-ye1bmt0s5ddxrpnydp">
         <w:r>
           <w:rPr>
             <w:rStyle w:val="Hyperlink"/>
@@ -27021,7 +27391,7 @@
         </w:rPr>
         <w:t xml:space="preserve"> </w:t>
       </w:r>
-      <w:hyperlink w:history="1" r:id="rIdibz4637aejozagpv-pxej">
+      <w:hyperlink w:history="1" r:id="rIdskvpurf2c1sb6nmwwlhwh">
         <w:r>
           <w:rPr>
             <w:rStyle w:val="Hyperlink"/>

</xml_diff>

<commit_message>
docs: cierre de la tarea 5 (implementación por el agente)
- Bitácora y panel: tarea 5 hecha (app#10, issue #5 cerrado); tarea 6 siguiente.
- Memoria: sección de la tarea 5 (commits, decisiones del agente, límites y
  revisión), pruebas de la aplicación (55), fase 9 del registro (iteraciones
  55 a 60), métricas, pasos reproducibles y solución de problemas.

Co-Authored-By: Claude Opus 5.5 <noreply@anthropic.com>
Claude-Session: https://claude.ai/code/session_01DJozxnTfKm9YzN69MVZq7X
</commit_message>
<xml_diff>
--- a/docs/tfm/TFM-ALM-agentico.docx
+++ b/docs/tfm/TFM-ALM-agentico.docx
@@ -13395,6 +13395,1369 @@
         <w:rPr>
           <w:rFonts w:ascii="Calibri" w:cs="Calibri" w:eastAsia="Calibri" w:hAnsi="Calibri"/>
         </w:rPr>
+        <w:t xml:space="preserve">Tarea 5: implementación por el agente</w:t>
+      </w:r>
+    </w:p>
+    <w:p>
+      <w:pPr>
+        <w:keepNext/>
+        <w:spacing w:after="140" w:line="288"/>
+        <w:jc w:val="both"/>
+      </w:pPr>
+      <w:r>
+        <w:rPr>
+          <w:rFonts w:ascii="Calibri" w:cs="Calibri" w:eastAsia="Calibri" w:hAnsi="Calibri"/>
+        </w:rPr>
+        <w:t xml:space="preserve">Con la spec fusionada, el responsable pidió al agente el segundo paso del flujo: plan, tareas e implementación en la rama </w:t>
+      </w:r>
+      <w:r>
+        <w:rPr>
+          <w:rFonts w:ascii="Consolas" w:cs="Consolas" w:eastAsia="Consolas" w:hAnsi="Consolas"/>
+          <w:color w:val="2E3A36"/>
+          <w:sz w:val="20"/>
+          <w:szCs w:val="20"/>
+        </w:rPr>
+        <w:t xml:space="preserve">feat/5-catalogo-productos</w:t>
+      </w:r>
+      <w:r>
+        <w:rPr>
+          <w:rFonts w:ascii="Calibri" w:cs="Calibri" w:eastAsia="Calibri" w:hAnsi="Calibri"/>
+        </w:rPr>
+        <w:t xml:space="preserve">, incluido el esqueleto de la aplicación que aún no existía. El agente encadenó </w:t>
+      </w:r>
+      <w:r>
+        <w:rPr>
+          <w:rFonts w:ascii="Consolas" w:cs="Consolas" w:eastAsia="Consolas" w:hAnsi="Consolas"/>
+          <w:color w:val="2E3A36"/>
+          <w:sz w:val="20"/>
+          <w:szCs w:val="20"/>
+        </w:rPr>
+        <w:t xml:space="preserve">/speckit-plan</w:t>
+      </w:r>
+      <w:r>
+        <w:rPr>
+          <w:rFonts w:ascii="Calibri" w:cs="Calibri" w:eastAsia="Calibri" w:hAnsi="Calibri"/>
+        </w:rPr>
+        <w:t xml:space="preserve">, </w:t>
+      </w:r>
+      <w:r>
+        <w:rPr>
+          <w:rFonts w:ascii="Consolas" w:cs="Consolas" w:eastAsia="Consolas" w:hAnsi="Consolas"/>
+          <w:color w:val="2E3A36"/>
+          <w:sz w:val="20"/>
+          <w:szCs w:val="20"/>
+        </w:rPr>
+        <w:t xml:space="preserve">/speckit-tasks</w:t>
+      </w:r>
+      <w:r>
+        <w:rPr>
+          <w:rFonts w:ascii="Calibri" w:cs="Calibri" w:eastAsia="Calibri" w:hAnsi="Calibri"/>
+        </w:rPr>
+        <w:t xml:space="preserve"> y </w:t>
+      </w:r>
+      <w:r>
+        <w:rPr>
+          <w:rFonts w:ascii="Consolas" w:cs="Consolas" w:eastAsia="Consolas" w:hAnsi="Consolas"/>
+          <w:color w:val="2E3A36"/>
+          <w:sz w:val="20"/>
+          <w:szCs w:val="20"/>
+        </w:rPr>
+        <w:t xml:space="preserve">/speckit-implement</w:t>
+      </w:r>
+      <w:r>
+        <w:rPr>
+          <w:rFonts w:ascii="Calibri" w:cs="Calibri" w:eastAsia="Calibri" w:hAnsi="Calibri"/>
+        </w:rPr>
+        <w:t xml:space="preserve"> y abrió el PR #10 con seis commits:</w:t>
+      </w:r>
+    </w:p>
+    <w:tbl>
+      <w:tblPr>
+        <w:tblW w:type="dxa" w:w="9070"/>
+        <w:tblBorders>
+          <w:top w:val="single" w:color="C9D3CF" w:sz="4"/>
+          <w:left w:val="single" w:color="C9D3CF" w:sz="4"/>
+          <w:bottom w:val="single" w:color="C9D3CF" w:sz="4"/>
+          <w:right w:val="single" w:color="C9D3CF" w:sz="4"/>
+          <w:insideH w:val="single" w:color="C9D3CF" w:sz="4"/>
+          <w:insideV w:val="single" w:color="C9D3CF" w:sz="4"/>
+        </w:tblBorders>
+      </w:tblPr>
+      <w:tblGrid>
+        <w:gridCol w:w="2101"/>
+        <w:gridCol w:w="6969"/>
+      </w:tblGrid>
+      <w:tr>
+        <w:trPr>
+          <w:tblHeader/>
+        </w:trPr>
+        <w:tc>
+          <w:tcPr>
+            <w:tcW w:type="dxa" w:w="2101"/>
+            <w:shd w:fill="E3EEEA" w:color="auto" w:val="clear"/>
+            <w:tcMar>
+              <w:top w:type="dxa" w:w="60"/>
+              <w:left w:type="dxa" w:w="100"/>
+              <w:bottom w:type="dxa" w:w="60"/>
+              <w:right w:type="dxa" w:w="100"/>
+            </w:tcMar>
+          </w:tcPr>
+          <w:p>
+            <w:pPr>
+              <w:spacing w:after="0" w:before="0" w:line="252"/>
+            </w:pPr>
+            <w:r>
+              <w:rPr>
+                <w:rFonts w:ascii="Calibri" w:cs="Calibri" w:eastAsia="Calibri" w:hAnsi="Calibri"/>
+                <w:b/>
+                <w:bCs/>
+                <w:sz w:val="18"/>
+                <w:szCs w:val="18"/>
+              </w:rPr>
+              <w:t xml:space="preserve">Commit</w:t>
+            </w:r>
+          </w:p>
+        </w:tc>
+        <w:tc>
+          <w:tcPr>
+            <w:tcW w:type="dxa" w:w="6969"/>
+            <w:shd w:fill="E3EEEA" w:color="auto" w:val="clear"/>
+            <w:tcMar>
+              <w:top w:type="dxa" w:w="60"/>
+              <w:left w:type="dxa" w:w="100"/>
+              <w:bottom w:type="dxa" w:w="60"/>
+              <w:right w:type="dxa" w:w="100"/>
+            </w:tcMar>
+          </w:tcPr>
+          <w:p>
+            <w:pPr>
+              <w:spacing w:after="0" w:before="0" w:line="252"/>
+            </w:pPr>
+            <w:r>
+              <w:rPr>
+                <w:rFonts w:ascii="Calibri" w:cs="Calibri" w:eastAsia="Calibri" w:hAnsi="Calibri"/>
+                <w:b/>
+                <w:bCs/>
+                <w:sz w:val="18"/>
+                <w:szCs w:val="18"/>
+              </w:rPr>
+              <w:t xml:space="preserve">Contenido</w:t>
+            </w:r>
+          </w:p>
+        </w:tc>
+      </w:tr>
+      <w:tr>
+        <w:trPr>
+          <w:cantSplit/>
+        </w:trPr>
+        <w:tc>
+          <w:tcPr>
+            <w:tcW w:type="dxa" w:w="2101"/>
+            <w:tcMar>
+              <w:top w:type="dxa" w:w="60"/>
+              <w:left w:type="dxa" w:w="100"/>
+              <w:bottom w:type="dxa" w:w="60"/>
+              <w:right w:type="dxa" w:w="100"/>
+            </w:tcMar>
+          </w:tcPr>
+          <w:p>
+            <w:pPr>
+              <w:spacing w:after="0" w:before="0" w:line="252"/>
+            </w:pPr>
+            <w:r>
+              <w:rPr>
+                <w:rFonts w:ascii="Calibri" w:cs="Calibri" w:eastAsia="Calibri" w:hAnsi="Calibri"/>
+                <w:sz w:val="18"/>
+                <w:szCs w:val="18"/>
+              </w:rPr>
+              <w:t xml:space="preserve">Plan y tareas</w:t>
+            </w:r>
+          </w:p>
+        </w:tc>
+        <w:tc>
+          <w:tcPr>
+            <w:tcW w:type="dxa" w:w="6969"/>
+            <w:tcMar>
+              <w:top w:type="dxa" w:w="60"/>
+              <w:left w:type="dxa" w:w="100"/>
+              <w:bottom w:type="dxa" w:w="60"/>
+              <w:right w:type="dxa" w:w="100"/>
+            </w:tcMar>
+          </w:tcPr>
+          <w:p>
+            <w:pPr>
+              <w:spacing w:after="0" w:before="0" w:line="252"/>
+            </w:pPr>
+            <w:r>
+              <w:rPr>
+                <w:rFonts w:ascii="Consolas" w:cs="Consolas" w:eastAsia="Consolas" w:hAnsi="Consolas"/>
+                <w:color w:val="2E3A36"/>
+                <w:sz w:val="16"/>
+                <w:szCs w:val="16"/>
+              </w:rPr>
+              <w:t xml:space="preserve">plan.md</w:t>
+            </w:r>
+            <w:r>
+              <w:rPr>
+                <w:rFonts w:ascii="Calibri" w:cs="Calibri" w:eastAsia="Calibri" w:hAnsi="Calibri"/>
+                <w:sz w:val="18"/>
+                <w:szCs w:val="18"/>
+              </w:rPr>
+              <w:t xml:space="preserve">, </w:t>
+            </w:r>
+            <w:r>
+              <w:rPr>
+                <w:rFonts w:ascii="Consolas" w:cs="Consolas" w:eastAsia="Consolas" w:hAnsi="Consolas"/>
+                <w:color w:val="2E3A36"/>
+                <w:sz w:val="16"/>
+                <w:szCs w:val="16"/>
+              </w:rPr>
+              <w:t xml:space="preserve">research.md</w:t>
+            </w:r>
+            <w:r>
+              <w:rPr>
+                <w:rFonts w:ascii="Calibri" w:cs="Calibri" w:eastAsia="Calibri" w:hAnsi="Calibri"/>
+                <w:sz w:val="18"/>
+                <w:szCs w:val="18"/>
+              </w:rPr>
+              <w:t xml:space="preserve">, </w:t>
+            </w:r>
+            <w:r>
+              <w:rPr>
+                <w:rFonts w:ascii="Consolas" w:cs="Consolas" w:eastAsia="Consolas" w:hAnsi="Consolas"/>
+                <w:color w:val="2E3A36"/>
+                <w:sz w:val="16"/>
+                <w:szCs w:val="16"/>
+              </w:rPr>
+              <w:t xml:space="preserve">data-model.md</w:t>
+            </w:r>
+            <w:r>
+              <w:rPr>
+                <w:rFonts w:ascii="Calibri" w:cs="Calibri" w:eastAsia="Calibri" w:hAnsi="Calibri"/>
+                <w:sz w:val="18"/>
+                <w:szCs w:val="18"/>
+              </w:rPr>
+              <w:t xml:space="preserve">, </w:t>
+            </w:r>
+            <w:r>
+              <w:rPr>
+                <w:rFonts w:ascii="Consolas" w:cs="Consolas" w:eastAsia="Consolas" w:hAnsi="Consolas"/>
+                <w:color w:val="2E3A36"/>
+                <w:sz w:val="16"/>
+                <w:szCs w:val="16"/>
+              </w:rPr>
+              <w:t xml:space="preserve">contracts/openapi.yaml</w:t>
+            </w:r>
+            <w:r>
+              <w:rPr>
+                <w:rFonts w:ascii="Calibri" w:cs="Calibri" w:eastAsia="Calibri" w:hAnsi="Calibri"/>
+                <w:sz w:val="18"/>
+                <w:szCs w:val="18"/>
+              </w:rPr>
+              <w:t xml:space="preserve">, </w:t>
+            </w:r>
+            <w:r>
+              <w:rPr>
+                <w:rFonts w:ascii="Consolas" w:cs="Consolas" w:eastAsia="Consolas" w:hAnsi="Consolas"/>
+                <w:color w:val="2E3A36"/>
+                <w:sz w:val="16"/>
+                <w:szCs w:val="16"/>
+              </w:rPr>
+              <w:t xml:space="preserve">quickstart.md</w:t>
+            </w:r>
+            <w:r>
+              <w:rPr>
+                <w:rFonts w:ascii="Calibri" w:cs="Calibri" w:eastAsia="Calibri" w:hAnsi="Calibri"/>
+                <w:sz w:val="18"/>
+                <w:szCs w:val="18"/>
+              </w:rPr>
+              <w:t xml:space="preserve"> y </w:t>
+            </w:r>
+            <w:r>
+              <w:rPr>
+                <w:rFonts w:ascii="Consolas" w:cs="Consolas" w:eastAsia="Consolas" w:hAnsi="Consolas"/>
+                <w:color w:val="2E3A36"/>
+                <w:sz w:val="16"/>
+                <w:szCs w:val="16"/>
+              </w:rPr>
+              <w:t xml:space="preserve">tasks.md</w:t>
+            </w:r>
+          </w:p>
+        </w:tc>
+      </w:tr>
+      <w:tr>
+        <w:trPr>
+          <w:cantSplit/>
+        </w:trPr>
+        <w:tc>
+          <w:tcPr>
+            <w:tcW w:type="dxa" w:w="2101"/>
+            <w:tcMar>
+              <w:top w:type="dxa" w:w="60"/>
+              <w:left w:type="dxa" w:w="100"/>
+              <w:bottom w:type="dxa" w:w="60"/>
+              <w:right w:type="dxa" w:w="100"/>
+            </w:tcMar>
+          </w:tcPr>
+          <w:p>
+            <w:pPr>
+              <w:spacing w:after="0" w:before="0" w:line="252"/>
+            </w:pPr>
+            <w:r>
+              <w:rPr>
+                <w:rFonts w:ascii="Calibri" w:cs="Calibri" w:eastAsia="Calibri" w:hAnsi="Calibri"/>
+                <w:sz w:val="18"/>
+                <w:szCs w:val="18"/>
+              </w:rPr>
+              <w:t xml:space="preserve">Esqueleto</w:t>
+            </w:r>
+          </w:p>
+        </w:tc>
+        <w:tc>
+          <w:tcPr>
+            <w:tcW w:type="dxa" w:w="6969"/>
+            <w:tcMar>
+              <w:top w:type="dxa" w:w="60"/>
+              <w:left w:type="dxa" w:w="100"/>
+              <w:bottom w:type="dxa" w:w="60"/>
+              <w:right w:type="dxa" w:w="100"/>
+            </w:tcMar>
+          </w:tcPr>
+          <w:p>
+            <w:pPr>
+              <w:spacing w:after="0" w:before="0" w:line="252"/>
+            </w:pPr>
+            <w:r>
+              <w:rPr>
+                <w:rFonts w:ascii="Consolas" w:cs="Consolas" w:eastAsia="Consolas" w:hAnsi="Consolas"/>
+                <w:color w:val="2E3A36"/>
+                <w:sz w:val="16"/>
+                <w:szCs w:val="16"/>
+              </w:rPr>
+              <w:t xml:space="preserve">pyproject.toml</w:t>
+            </w:r>
+            <w:r>
+              <w:rPr>
+                <w:rFonts w:ascii="Calibri" w:cs="Calibri" w:eastAsia="Calibri" w:hAnsi="Calibri"/>
+                <w:sz w:val="18"/>
+                <w:szCs w:val="18"/>
+              </w:rPr>
+              <w:t xml:space="preserve"> con </w:t>
+            </w:r>
+            <w:r>
+              <w:rPr>
+                <w:rFonts w:ascii="Consolas" w:cs="Consolas" w:eastAsia="Consolas" w:hAnsi="Consolas"/>
+                <w:color w:val="2E3A36"/>
+                <w:sz w:val="16"/>
+                <w:szCs w:val="16"/>
+              </w:rPr>
+              <w:t xml:space="preserve">uv</w:t>
+            </w:r>
+            <w:r>
+              <w:rPr>
+                <w:rFonts w:ascii="Calibri" w:cs="Calibri" w:eastAsia="Calibri" w:hAnsi="Calibri"/>
+                <w:sz w:val="18"/>
+                <w:szCs w:val="18"/>
+              </w:rPr>
+              <w:t xml:space="preserve">, </w:t>
+            </w:r>
+            <w:r>
+              <w:rPr>
+                <w:rFonts w:ascii="Consolas" w:cs="Consolas" w:eastAsia="Consolas" w:hAnsi="Consolas"/>
+                <w:color w:val="2E3A36"/>
+                <w:sz w:val="16"/>
+                <w:szCs w:val="16"/>
+              </w:rPr>
+              <w:t xml:space="preserve">src/app/main.py</w:t>
+            </w:r>
+            <w:r>
+              <w:rPr>
+                <w:rFonts w:ascii="Calibri" w:cs="Calibri" w:eastAsia="Calibri" w:hAnsi="Calibri"/>
+                <w:sz w:val="18"/>
+                <w:szCs w:val="18"/>
+              </w:rPr>
+              <w:t xml:space="preserve"> con </w:t>
+            </w:r>
+            <w:r>
+              <w:rPr>
+                <w:rFonts w:ascii="Consolas" w:cs="Consolas" w:eastAsia="Consolas" w:hAnsi="Consolas"/>
+                <w:color w:val="2E3A36"/>
+                <w:sz w:val="16"/>
+                <w:szCs w:val="16"/>
+              </w:rPr>
+              <w:t xml:space="preserve">GET /health</w:t>
+            </w:r>
+            <w:r>
+              <w:rPr>
+                <w:rFonts w:ascii="Calibri" w:cs="Calibri" w:eastAsia="Calibri" w:hAnsi="Calibri"/>
+                <w:sz w:val="18"/>
+                <w:szCs w:val="18"/>
+              </w:rPr>
+              <w:t xml:space="preserve"> y su test</w:t>
+            </w:r>
+          </w:p>
+        </w:tc>
+      </w:tr>
+      <w:tr>
+        <w:trPr>
+          <w:cantSplit/>
+        </w:trPr>
+        <w:tc>
+          <w:tcPr>
+            <w:tcW w:type="dxa" w:w="2101"/>
+            <w:tcMar>
+              <w:top w:type="dxa" w:w="60"/>
+              <w:left w:type="dxa" w:w="100"/>
+              <w:bottom w:type="dxa" w:w="60"/>
+              <w:right w:type="dxa" w:w="100"/>
+            </w:tcMar>
+          </w:tcPr>
+          <w:p>
+            <w:pPr>
+              <w:spacing w:after="0" w:before="0" w:line="252"/>
+            </w:pPr>
+            <w:r>
+              <w:rPr>
+                <w:rFonts w:ascii="Calibri" w:cs="Calibri" w:eastAsia="Calibri" w:hAnsi="Calibri"/>
+                <w:sz w:val="18"/>
+                <w:szCs w:val="18"/>
+              </w:rPr>
+              <w:t xml:space="preserve">Validación del catálogo</w:t>
+            </w:r>
+          </w:p>
+        </w:tc>
+        <w:tc>
+          <w:tcPr>
+            <w:tcW w:type="dxa" w:w="6969"/>
+            <w:tcMar>
+              <w:top w:type="dxa" w:w="60"/>
+              <w:left w:type="dxa" w:w="100"/>
+              <w:bottom w:type="dxa" w:w="60"/>
+              <w:right w:type="dxa" w:w="100"/>
+            </w:tcMar>
+          </w:tcPr>
+          <w:p>
+            <w:pPr>
+              <w:spacing w:after="0" w:before="0" w:line="252"/>
+            </w:pPr>
+            <w:r>
+              <w:rPr>
+                <w:rFonts w:ascii="Calibri" w:cs="Calibri" w:eastAsia="Calibri" w:hAnsi="Calibri"/>
+                <w:sz w:val="18"/>
+                <w:szCs w:val="18"/>
+              </w:rPr>
+              <w:t xml:space="preserve">Modelo Pydantic que rechaza ids repetidos, precios sin 2 decimales y catálogos fuera de 5 a 10 productos; la aplicación no arranca con un catálogo mal formado</w:t>
+            </w:r>
+          </w:p>
+        </w:tc>
+      </w:tr>
+      <w:tr>
+        <w:trPr>
+          <w:cantSplit/>
+        </w:trPr>
+        <w:tc>
+          <w:tcPr>
+            <w:tcW w:type="dxa" w:w="2101"/>
+            <w:tcMar>
+              <w:top w:type="dxa" w:w="60"/>
+              <w:left w:type="dxa" w:w="100"/>
+              <w:bottom w:type="dxa" w:w="60"/>
+              <w:right w:type="dxa" w:w="100"/>
+            </w:tcMar>
+          </w:tcPr>
+          <w:p>
+            <w:pPr>
+              <w:spacing w:after="0" w:before="0" w:line="252"/>
+            </w:pPr>
+            <w:r>
+              <w:rPr>
+                <w:rFonts w:ascii="Calibri" w:cs="Calibri" w:eastAsia="Calibri" w:hAnsi="Calibri"/>
+                <w:sz w:val="18"/>
+                <w:szCs w:val="18"/>
+              </w:rPr>
+              <w:t xml:space="preserve">API</w:t>
+            </w:r>
+          </w:p>
+        </w:tc>
+        <w:tc>
+          <w:tcPr>
+            <w:tcW w:type="dxa" w:w="6969"/>
+            <w:tcMar>
+              <w:top w:type="dxa" w:w="60"/>
+              <w:left w:type="dxa" w:w="100"/>
+              <w:bottom w:type="dxa" w:w="60"/>
+              <w:right w:type="dxa" w:w="100"/>
+            </w:tcMar>
+          </w:tcPr>
+          <w:p>
+            <w:pPr>
+              <w:spacing w:after="0" w:before="0" w:line="252"/>
+            </w:pPr>
+            <w:r>
+              <w:rPr>
+                <w:rFonts w:ascii="Consolas" w:cs="Consolas" w:eastAsia="Consolas" w:hAnsi="Consolas"/>
+                <w:color w:val="2E3A36"/>
+                <w:sz w:val="16"/>
+                <w:szCs w:val="16"/>
+              </w:rPr>
+              <w:t xml:space="preserve">GET /api/v1/productos</w:t>
+            </w:r>
+            <w:r>
+              <w:rPr>
+                <w:rFonts w:ascii="Calibri" w:cs="Calibri" w:eastAsia="Calibri" w:hAnsi="Calibri"/>
+                <w:sz w:val="18"/>
+                <w:szCs w:val="18"/>
+              </w:rPr>
+              <w:t xml:space="preserve"> y </w:t>
+            </w:r>
+            <w:r>
+              <w:rPr>
+                <w:rFonts w:ascii="Consolas" w:cs="Consolas" w:eastAsia="Consolas" w:hAnsi="Consolas"/>
+                <w:color w:val="2E3A36"/>
+                <w:sz w:val="16"/>
+                <w:szCs w:val="16"/>
+              </w:rPr>
+              <w:t xml:space="preserve">GET /api/v1/productos/{id}</w:t>
+            </w:r>
+          </w:p>
+        </w:tc>
+      </w:tr>
+      <w:tr>
+        <w:trPr>
+          <w:cantSplit/>
+        </w:trPr>
+        <w:tc>
+          <w:tcPr>
+            <w:tcW w:type="dxa" w:w="2101"/>
+            <w:tcMar>
+              <w:top w:type="dxa" w:w="60"/>
+              <w:left w:type="dxa" w:w="100"/>
+              <w:bottom w:type="dxa" w:w="60"/>
+              <w:right w:type="dxa" w:w="100"/>
+            </w:tcMar>
+          </w:tcPr>
+          <w:p>
+            <w:pPr>
+              <w:spacing w:after="0" w:before="0" w:line="252"/>
+            </w:pPr>
+            <w:r>
+              <w:rPr>
+                <w:rFonts w:ascii="Calibri" w:cs="Calibri" w:eastAsia="Calibri" w:hAnsi="Calibri"/>
+                <w:sz w:val="18"/>
+                <w:szCs w:val="18"/>
+              </w:rPr>
+              <w:t xml:space="preserve">Observabilidad</w:t>
+            </w:r>
+          </w:p>
+        </w:tc>
+        <w:tc>
+          <w:tcPr>
+            <w:tcW w:type="dxa" w:w="6969"/>
+            <w:tcMar>
+              <w:top w:type="dxa" w:w="60"/>
+              <w:left w:type="dxa" w:w="100"/>
+              <w:bottom w:type="dxa" w:w="60"/>
+              <w:right w:type="dxa" w:w="100"/>
+            </w:tcMar>
+          </w:tcPr>
+          <w:p>
+            <w:pPr>
+              <w:spacing w:after="0" w:before="0" w:line="252"/>
+            </w:pPr>
+            <w:r>
+              <w:rPr>
+                <w:rFonts w:ascii="Calibri" w:cs="Calibri" w:eastAsia="Calibri" w:hAnsi="Calibri"/>
+                <w:sz w:val="18"/>
+                <w:szCs w:val="18"/>
+              </w:rPr>
+              <w:t xml:space="preserve">Logs JSON y métricas Prometheus por plantilla de ruta, sin URLs ni datos del cliente</w:t>
+            </w:r>
+          </w:p>
+        </w:tc>
+      </w:tr>
+      <w:tr>
+        <w:trPr>
+          <w:cantSplit/>
+        </w:trPr>
+        <w:tc>
+          <w:tcPr>
+            <w:tcW w:type="dxa" w:w="2101"/>
+            <w:tcMar>
+              <w:top w:type="dxa" w:w="60"/>
+              <w:left w:type="dxa" w:w="100"/>
+              <w:bottom w:type="dxa" w:w="60"/>
+              <w:right w:type="dxa" w:w="100"/>
+            </w:tcMar>
+          </w:tcPr>
+          <w:p>
+            <w:pPr>
+              <w:spacing w:after="0" w:before="0" w:line="252"/>
+            </w:pPr>
+            <w:r>
+              <w:rPr>
+                <w:rFonts w:ascii="Calibri" w:cs="Calibri" w:eastAsia="Calibri" w:hAnsi="Calibri"/>
+                <w:sz w:val="18"/>
+                <w:szCs w:val="18"/>
+              </w:rPr>
+              <w:t xml:space="preserve">Cierre de tareas</w:t>
+            </w:r>
+          </w:p>
+        </w:tc>
+        <w:tc>
+          <w:tcPr>
+            <w:tcW w:type="dxa" w:w="6969"/>
+            <w:tcMar>
+              <w:top w:type="dxa" w:w="60"/>
+              <w:left w:type="dxa" w:w="100"/>
+              <w:bottom w:type="dxa" w:w="60"/>
+              <w:right w:type="dxa" w:w="100"/>
+            </w:tcMar>
+          </w:tcPr>
+          <w:p>
+            <w:pPr>
+              <w:spacing w:after="0" w:before="0" w:line="252"/>
+            </w:pPr>
+            <w:r>
+              <w:rPr>
+                <w:rFonts w:ascii="Consolas" w:cs="Consolas" w:eastAsia="Consolas" w:hAnsi="Consolas"/>
+                <w:color w:val="2E3A36"/>
+                <w:sz w:val="16"/>
+                <w:szCs w:val="16"/>
+              </w:rPr>
+              <w:t xml:space="preserve">tasks.md</w:t>
+            </w:r>
+            <w:r>
+              <w:rPr>
+                <w:rFonts w:ascii="Calibri" w:cs="Calibri" w:eastAsia="Calibri" w:hAnsi="Calibri"/>
+                <w:sz w:val="18"/>
+                <w:szCs w:val="18"/>
+              </w:rPr>
+              <w:t xml:space="preserve"> con las tareas marcadas</w:t>
+            </w:r>
+          </w:p>
+        </w:tc>
+      </w:tr>
+    </w:tbl>
+    <w:p>
+      <w:pPr>
+        <w:spacing w:after="120"/>
+      </w:pPr>
+    </w:p>
+    <w:p>
+      <w:pPr>
+        <w:keepNext w:val="false"/>
+        <w:spacing w:after="140" w:line="288"/>
+        <w:jc w:val="both"/>
+      </w:pPr>
+      <w:r>
+        <w:rPr>
+          <w:rFonts w:ascii="Calibri" w:cs="Calibri" w:eastAsia="Calibri" w:hAnsi="Calibri"/>
+        </w:rPr>
+        <w:t xml:space="preserve">El PR enlaza cada criterio de aceptación de la spec con los tests que lo cubren (55 en total) y justifica cada dependencia con su alternativa y su licencia. Tests, ruff y mypy en modo estricto pasaban en local.</w:t>
+      </w:r>
+    </w:p>
+    <w:p>
+      <w:pPr>
+        <w:pStyle w:val="Heading3"/>
+        <w:keepNext/>
+      </w:pPr>
+      <w:r>
+        <w:rPr>
+          <w:rFonts w:ascii="Calibri" w:cs="Calibri" w:eastAsia="Calibri" w:hAnsi="Calibri"/>
+        </w:rPr>
+        <w:t xml:space="preserve">Decisiones del agente</w:t>
+      </w:r>
+    </w:p>
+    <w:p>
+      <w:pPr>
+        <w:keepNext/>
+        <w:spacing w:after="140" w:line="288"/>
+        <w:jc w:val="both"/>
+      </w:pPr>
+      <w:r>
+        <w:rPr>
+          <w:rFonts w:ascii="Calibri" w:cs="Calibri" w:eastAsia="Calibri" w:hAnsi="Calibri"/>
+        </w:rPr>
+        <w:t xml:space="preserve">La spec dejaba algunas decisiones al plan. El agente las tomó, las razonó en </w:t>
+      </w:r>
+      <w:r>
+        <w:rPr>
+          <w:rFonts w:ascii="Consolas" w:cs="Consolas" w:eastAsia="Consolas" w:hAnsi="Consolas"/>
+          <w:color w:val="2E3A36"/>
+          <w:sz w:val="20"/>
+          <w:szCs w:val="20"/>
+        </w:rPr>
+        <w:t xml:space="preserve">research.md</w:t>
+      </w:r>
+      <w:r>
+        <w:rPr>
+          <w:rFonts w:ascii="Calibri" w:cs="Calibri" w:eastAsia="Calibri" w:hAnsi="Calibri"/>
+        </w:rPr>
+        <w:t xml:space="preserve"> y las listó en el PR para que el responsable las revisara antes de fusionar:</w:t>
+      </w:r>
+    </w:p>
+    <w:tbl>
+      <w:tblPr>
+        <w:tblW w:type="dxa" w:w="9070"/>
+        <w:tblBorders>
+          <w:top w:val="single" w:color="C9D3CF" w:sz="4"/>
+          <w:left w:val="single" w:color="C9D3CF" w:sz="4"/>
+          <w:bottom w:val="single" w:color="C9D3CF" w:sz="4"/>
+          <w:right w:val="single" w:color="C9D3CF" w:sz="4"/>
+          <w:insideH w:val="single" w:color="C9D3CF" w:sz="4"/>
+          <w:insideV w:val="single" w:color="C9D3CF" w:sz="4"/>
+        </w:tblBorders>
+      </w:tblPr>
+      <w:tblGrid>
+        <w:gridCol w:w="2938"/>
+        <w:gridCol w:w="4382"/>
+        <w:gridCol w:w="1750"/>
+      </w:tblGrid>
+      <w:tr>
+        <w:trPr>
+          <w:tblHeader/>
+        </w:trPr>
+        <w:tc>
+          <w:tcPr>
+            <w:tcW w:type="dxa" w:w="2938"/>
+            <w:shd w:fill="E3EEEA" w:color="auto" w:val="clear"/>
+            <w:tcMar>
+              <w:top w:type="dxa" w:w="60"/>
+              <w:left w:type="dxa" w:w="100"/>
+              <w:bottom w:type="dxa" w:w="60"/>
+              <w:right w:type="dxa" w:w="100"/>
+            </w:tcMar>
+          </w:tcPr>
+          <w:p>
+            <w:pPr>
+              <w:spacing w:after="0" w:before="0" w:line="252"/>
+            </w:pPr>
+            <w:r>
+              <w:rPr>
+                <w:rFonts w:ascii="Calibri" w:cs="Calibri" w:eastAsia="Calibri" w:hAnsi="Calibri"/>
+                <w:b/>
+                <w:bCs/>
+                <w:sz w:val="18"/>
+                <w:szCs w:val="18"/>
+              </w:rPr>
+              <w:t xml:space="preserve">Decisión</w:t>
+            </w:r>
+          </w:p>
+        </w:tc>
+        <w:tc>
+          <w:tcPr>
+            <w:tcW w:type="dxa" w:w="4382"/>
+            <w:shd w:fill="E3EEEA" w:color="auto" w:val="clear"/>
+            <w:tcMar>
+              <w:top w:type="dxa" w:w="60"/>
+              <w:left w:type="dxa" w:w="100"/>
+              <w:bottom w:type="dxa" w:w="60"/>
+              <w:right w:type="dxa" w:w="100"/>
+            </w:tcMar>
+          </w:tcPr>
+          <w:p>
+            <w:pPr>
+              <w:spacing w:after="0" w:before="0" w:line="252"/>
+            </w:pPr>
+            <w:r>
+              <w:rPr>
+                <w:rFonts w:ascii="Calibri" w:cs="Calibri" w:eastAsia="Calibri" w:hAnsi="Calibri"/>
+                <w:b/>
+                <w:bCs/>
+                <w:sz w:val="18"/>
+                <w:szCs w:val="18"/>
+              </w:rPr>
+              <w:t xml:space="preserve">Motivo</w:t>
+            </w:r>
+          </w:p>
+        </w:tc>
+        <w:tc>
+          <w:tcPr>
+            <w:tcW w:type="dxa" w:w="1750"/>
+            <w:shd w:fill="E3EEEA" w:color="auto" w:val="clear"/>
+            <w:tcMar>
+              <w:top w:type="dxa" w:w="60"/>
+              <w:left w:type="dxa" w:w="100"/>
+              <w:bottom w:type="dxa" w:w="60"/>
+              <w:right w:type="dxa" w:w="100"/>
+            </w:tcMar>
+          </w:tcPr>
+          <w:p>
+            <w:pPr>
+              <w:spacing w:after="0" w:before="0" w:line="252"/>
+            </w:pPr>
+            <w:r>
+              <w:rPr>
+                <w:rFonts w:ascii="Calibri" w:cs="Calibri" w:eastAsia="Calibri" w:hAnsi="Calibri"/>
+                <w:b/>
+                <w:bCs/>
+                <w:sz w:val="18"/>
+                <w:szCs w:val="18"/>
+              </w:rPr>
+              <w:t xml:space="preserve">Resolución</w:t>
+            </w:r>
+          </w:p>
+        </w:tc>
+      </w:tr>
+      <w:tr>
+        <w:trPr>
+          <w:cantSplit/>
+        </w:trPr>
+        <w:tc>
+          <w:tcPr>
+            <w:tcW w:type="dxa" w:w="2938"/>
+            <w:tcMar>
+              <w:top w:type="dxa" w:w="60"/>
+              <w:left w:type="dxa" w:w="100"/>
+              <w:bottom w:type="dxa" w:w="60"/>
+              <w:right w:type="dxa" w:w="100"/>
+            </w:tcMar>
+          </w:tcPr>
+          <w:p>
+            <w:pPr>
+              <w:spacing w:after="0" w:before="0" w:line="252"/>
+            </w:pPr>
+            <w:r>
+              <w:rPr>
+                <w:rFonts w:ascii="Calibri" w:cs="Calibri" w:eastAsia="Calibri" w:hAnsi="Calibri"/>
+                <w:sz w:val="18"/>
+                <w:szCs w:val="18"/>
+              </w:rPr>
+              <w:t xml:space="preserve">Precio serializado como texto (</w:t>
+            </w:r>
+            <w:r>
+              <w:rPr>
+                <w:rFonts w:ascii="Consolas" w:cs="Consolas" w:eastAsia="Consolas" w:hAnsi="Consolas"/>
+                <w:color w:val="2E3A36"/>
+                <w:sz w:val="16"/>
+                <w:szCs w:val="16"/>
+              </w:rPr>
+              <w:t xml:space="preserve">"4.95"</w:t>
+            </w:r>
+            <w:r>
+              <w:rPr>
+                <w:rFonts w:ascii="Calibri" w:cs="Calibri" w:eastAsia="Calibri" w:hAnsi="Calibri"/>
+                <w:sz w:val="18"/>
+                <w:szCs w:val="18"/>
+              </w:rPr>
+              <w:t xml:space="preserve">)</w:t>
+            </w:r>
+          </w:p>
+        </w:tc>
+        <w:tc>
+          <w:tcPr>
+            <w:tcW w:type="dxa" w:w="4382"/>
+            <w:tcMar>
+              <w:top w:type="dxa" w:w="60"/>
+              <w:left w:type="dxa" w:w="100"/>
+              <w:bottom w:type="dxa" w:w="60"/>
+              <w:right w:type="dxa" w:w="100"/>
+            </w:tcMar>
+          </w:tcPr>
+          <w:p>
+            <w:pPr>
+              <w:spacing w:after="0" w:before="0" w:line="252"/>
+            </w:pPr>
+            <w:r>
+              <w:rPr>
+                <w:rFonts w:ascii="Calibri" w:cs="Calibri" w:eastAsia="Calibri" w:hAnsi="Calibri"/>
+                <w:sz w:val="18"/>
+                <w:szCs w:val="18"/>
+              </w:rPr>
+              <w:t xml:space="preserve">Un número JSON no conserva los 2 decimales (</w:t>
+            </w:r>
+            <w:r>
+              <w:rPr>
+                <w:rFonts w:ascii="Consolas" w:cs="Consolas" w:eastAsia="Consolas" w:hAnsi="Consolas"/>
+                <w:color w:val="2E3A36"/>
+                <w:sz w:val="16"/>
+                <w:szCs w:val="16"/>
+              </w:rPr>
+              <w:t xml:space="preserve">4.50</w:t>
+            </w:r>
+            <w:r>
+              <w:rPr>
+                <w:rFonts w:ascii="Calibri" w:cs="Calibri" w:eastAsia="Calibri" w:hAnsi="Calibri"/>
+                <w:sz w:val="18"/>
+                <w:szCs w:val="18"/>
+              </w:rPr>
+              <w:t xml:space="preserve"> sale como </w:t>
+            </w:r>
+            <w:r>
+              <w:rPr>
+                <w:rFonts w:ascii="Consolas" w:cs="Consolas" w:eastAsia="Consolas" w:hAnsi="Consolas"/>
+                <w:color w:val="2E3A36"/>
+                <w:sz w:val="16"/>
+                <w:szCs w:val="16"/>
+              </w:rPr>
+              <w:t xml:space="preserve">4.5</w:t>
+            </w:r>
+            <w:r>
+              <w:rPr>
+                <w:rFonts w:ascii="Calibri" w:cs="Calibri" w:eastAsia="Calibri" w:hAnsi="Calibri"/>
+                <w:sz w:val="18"/>
+                <w:szCs w:val="18"/>
+              </w:rPr>
+              <w:t xml:space="preserve">)</w:t>
+            </w:r>
+          </w:p>
+        </w:tc>
+        <w:tc>
+          <w:tcPr>
+            <w:tcW w:type="dxa" w:w="1750"/>
+            <w:tcMar>
+              <w:top w:type="dxa" w:w="60"/>
+              <w:left w:type="dxa" w:w="100"/>
+              <w:bottom w:type="dxa" w:w="60"/>
+              <w:right w:type="dxa" w:w="100"/>
+            </w:tcMar>
+          </w:tcPr>
+          <w:p>
+            <w:pPr>
+              <w:spacing w:after="0" w:before="0" w:line="252"/>
+            </w:pPr>
+            <w:r>
+              <w:rPr>
+                <w:rFonts w:ascii="Calibri" w:cs="Calibri" w:eastAsia="Calibri" w:hAnsi="Calibri"/>
+                <w:sz w:val="18"/>
+                <w:szCs w:val="18"/>
+              </w:rPr>
+              <w:t xml:space="preserve">Aceptada</w:t>
+            </w:r>
+          </w:p>
+        </w:tc>
+      </w:tr>
+      <w:tr>
+        <w:trPr>
+          <w:cantSplit/>
+        </w:trPr>
+        <w:tc>
+          <w:tcPr>
+            <w:tcW w:type="dxa" w:w="2938"/>
+            <w:tcMar>
+              <w:top w:type="dxa" w:w="60"/>
+              <w:left w:type="dxa" w:w="100"/>
+              <w:bottom w:type="dxa" w:w="60"/>
+              <w:right w:type="dxa" w:w="100"/>
+            </w:tcMar>
+          </w:tcPr>
+          <w:p>
+            <w:pPr>
+              <w:spacing w:after="0" w:before="0" w:line="252"/>
+            </w:pPr>
+            <w:r>
+              <w:rPr>
+                <w:rFonts w:ascii="Calibri" w:cs="Calibri" w:eastAsia="Calibri" w:hAnsi="Calibri"/>
+                <w:sz w:val="18"/>
+                <w:szCs w:val="18"/>
+              </w:rPr>
+              <w:t xml:space="preserve">Identificador como </w:t>
+            </w:r>
+            <w:r>
+              <w:rPr>
+                <w:rFonts w:ascii="Calibri" w:cs="Calibri" w:eastAsia="Calibri" w:hAnsi="Calibri"/>
+                <w:i/>
+                <w:iCs/>
+                <w:sz w:val="18"/>
+                <w:szCs w:val="18"/>
+              </w:rPr>
+              <w:t xml:space="preserve">slug</w:t>
+            </w:r>
+            <w:r>
+              <w:rPr>
+                <w:rFonts w:ascii="Calibri" w:cs="Calibri" w:eastAsia="Calibri" w:hAnsi="Calibri"/>
+                <w:sz w:val="18"/>
+                <w:szCs w:val="18"/>
+              </w:rPr>
+              <w:t xml:space="preserve"> de texto</w:t>
+            </w:r>
+          </w:p>
+        </w:tc>
+        <w:tc>
+          <w:tcPr>
+            <w:tcW w:type="dxa" w:w="4382"/>
+            <w:tcMar>
+              <w:top w:type="dxa" w:w="60"/>
+              <w:left w:type="dxa" w:w="100"/>
+              <w:bottom w:type="dxa" w:w="60"/>
+              <w:right w:type="dxa" w:w="100"/>
+            </w:tcMar>
+          </w:tcPr>
+          <w:p>
+            <w:pPr>
+              <w:spacing w:after="0" w:before="0" w:line="252"/>
+            </w:pPr>
+            <w:r>
+              <w:rPr>
+                <w:rFonts w:ascii="Calibri" w:cs="Calibri" w:eastAsia="Calibri" w:hAnsi="Calibri"/>
+                <w:sz w:val="18"/>
+                <w:szCs w:val="18"/>
+              </w:rPr>
+              <w:t xml:space="preserve">La spec lo trataba como valor opaco; cualquier valor desconocido da 404 y nunca 422</w:t>
+            </w:r>
+          </w:p>
+        </w:tc>
+        <w:tc>
+          <w:tcPr>
+            <w:tcW w:type="dxa" w:w="1750"/>
+            <w:tcMar>
+              <w:top w:type="dxa" w:w="60"/>
+              <w:left w:type="dxa" w:w="100"/>
+              <w:bottom w:type="dxa" w:w="60"/>
+              <w:right w:type="dxa" w:w="100"/>
+            </w:tcMar>
+          </w:tcPr>
+          <w:p>
+            <w:pPr>
+              <w:spacing w:after="0" w:before="0" w:line="252"/>
+            </w:pPr>
+            <w:r>
+              <w:rPr>
+                <w:rFonts w:ascii="Calibri" w:cs="Calibri" w:eastAsia="Calibri" w:hAnsi="Calibri"/>
+                <w:sz w:val="18"/>
+                <w:szCs w:val="18"/>
+              </w:rPr>
+              <w:t xml:space="preserve">Aceptada</w:t>
+            </w:r>
+          </w:p>
+        </w:tc>
+      </w:tr>
+      <w:tr>
+        <w:trPr>
+          <w:cantSplit/>
+        </w:trPr>
+        <w:tc>
+          <w:tcPr>
+            <w:tcW w:type="dxa" w:w="2938"/>
+            <w:tcMar>
+              <w:top w:type="dxa" w:w="60"/>
+              <w:left w:type="dxa" w:w="100"/>
+              <w:bottom w:type="dxa" w:w="60"/>
+              <w:right w:type="dxa" w:w="100"/>
+            </w:tcMar>
+          </w:tcPr>
+          <w:p>
+            <w:pPr>
+              <w:spacing w:after="0" w:before="0" w:line="252"/>
+            </w:pPr>
+            <w:r>
+              <w:rPr>
+                <w:rFonts w:ascii="Consolas" w:cs="Consolas" w:eastAsia="Consolas" w:hAnsi="Consolas"/>
+                <w:color w:val="2E3A36"/>
+                <w:sz w:val="16"/>
+                <w:szCs w:val="16"/>
+              </w:rPr>
+              <w:t xml:space="preserve">GET /metrics</w:t>
+            </w:r>
+            <w:r>
+              <w:rPr>
+                <w:rFonts w:ascii="Calibri" w:cs="Calibri" w:eastAsia="Calibri" w:hAnsi="Calibri"/>
+                <w:sz w:val="18"/>
+                <w:szCs w:val="18"/>
+              </w:rPr>
+              <w:t xml:space="preserve"> público</w:t>
+            </w:r>
+          </w:p>
+        </w:tc>
+        <w:tc>
+          <w:tcPr>
+            <w:tcW w:type="dxa" w:w="4382"/>
+            <w:tcMar>
+              <w:top w:type="dxa" w:w="60"/>
+              <w:left w:type="dxa" w:w="100"/>
+              <w:bottom w:type="dxa" w:w="60"/>
+              <w:right w:type="dxa" w:w="100"/>
+            </w:tcMar>
+          </w:tcPr>
+          <w:p>
+            <w:pPr>
+              <w:spacing w:after="0" w:before="0" w:line="252"/>
+            </w:pPr>
+            <w:r>
+              <w:rPr>
+                <w:rFonts w:ascii="Calibri" w:cs="Calibri" w:eastAsia="Calibri" w:hAnsi="Calibri"/>
+                <w:sz w:val="18"/>
+                <w:szCs w:val="18"/>
+              </w:rPr>
+              <w:t xml:space="preserve">El anexo de la constitución exige métricas por endpoint</w:t>
+            </w:r>
+          </w:p>
+        </w:tc>
+        <w:tc>
+          <w:tcPr>
+            <w:tcW w:type="dxa" w:w="1750"/>
+            <w:tcMar>
+              <w:top w:type="dxa" w:w="60"/>
+              <w:left w:type="dxa" w:w="100"/>
+              <w:bottom w:type="dxa" w:w="60"/>
+              <w:right w:type="dxa" w:w="100"/>
+            </w:tcMar>
+          </w:tcPr>
+          <w:p>
+            <w:pPr>
+              <w:spacing w:after="0" w:before="0" w:line="252"/>
+            </w:pPr>
+            <w:r>
+              <w:rPr>
+                <w:rFonts w:ascii="Calibri" w:cs="Calibri" w:eastAsia="Calibri" w:hAnsi="Calibri"/>
+                <w:sz w:val="18"/>
+                <w:szCs w:val="18"/>
+              </w:rPr>
+              <w:t xml:space="preserve">Aceptada; se restringirá al cluster en la tarea 10</w:t>
+            </w:r>
+          </w:p>
+        </w:tc>
+      </w:tr>
+      <w:tr>
+        <w:trPr>
+          <w:cantSplit/>
+        </w:trPr>
+        <w:tc>
+          <w:tcPr>
+            <w:tcW w:type="dxa" w:w="2938"/>
+            <w:tcMar>
+              <w:top w:type="dxa" w:w="60"/>
+              <w:left w:type="dxa" w:w="100"/>
+              <w:bottom w:type="dxa" w:w="60"/>
+              <w:right w:type="dxa" w:w="100"/>
+            </w:tcMar>
+          </w:tcPr>
+          <w:p>
+            <w:pPr>
+              <w:spacing w:after="0" w:before="0" w:line="252"/>
+            </w:pPr>
+            <w:r>
+              <w:rPr>
+                <w:rFonts w:ascii="Calibri" w:cs="Calibri" w:eastAsia="Calibri" w:hAnsi="Calibri"/>
+                <w:sz w:val="18"/>
+                <w:szCs w:val="18"/>
+              </w:rPr>
+              <w:t xml:space="preserve">Rutas con barras reciben el 404 genérico de FastAPI</w:t>
+            </w:r>
+          </w:p>
+        </w:tc>
+        <w:tc>
+          <w:tcPr>
+            <w:tcW w:type="dxa" w:w="4382"/>
+            <w:tcMar>
+              <w:top w:type="dxa" w:w="60"/>
+              <w:left w:type="dxa" w:w="100"/>
+              <w:bottom w:type="dxa" w:w="60"/>
+              <w:right w:type="dxa" w:w="100"/>
+            </w:tcMar>
+          </w:tcPr>
+          <w:p>
+            <w:pPr>
+              <w:spacing w:after="0" w:before="0" w:line="252"/>
+            </w:pPr>
+            <w:r>
+              <w:rPr>
+                <w:rFonts w:ascii="Calibri" w:cs="Calibri" w:eastAsia="Calibri" w:hAnsi="Calibri"/>
+                <w:sz w:val="18"/>
+                <w:szCs w:val="18"/>
+              </w:rPr>
+              <w:t xml:space="preserve">Ya no son un identificador; la respuesta sigue sin revelar nada</w:t>
+            </w:r>
+          </w:p>
+        </w:tc>
+        <w:tc>
+          <w:tcPr>
+            <w:tcW w:type="dxa" w:w="1750"/>
+            <w:tcMar>
+              <w:top w:type="dxa" w:w="60"/>
+              <w:left w:type="dxa" w:w="100"/>
+              <w:bottom w:type="dxa" w:w="60"/>
+              <w:right w:type="dxa" w:w="100"/>
+            </w:tcMar>
+          </w:tcPr>
+          <w:p>
+            <w:pPr>
+              <w:spacing w:after="0" w:before="0" w:line="252"/>
+            </w:pPr>
+            <w:r>
+              <w:rPr>
+                <w:rFonts w:ascii="Calibri" w:cs="Calibri" w:eastAsia="Calibri" w:hAnsi="Calibri"/>
+                <w:sz w:val="18"/>
+                <w:szCs w:val="18"/>
+              </w:rPr>
+              <w:t xml:space="preserve">Aceptada</w:t>
+            </w:r>
+          </w:p>
+        </w:tc>
+      </w:tr>
+    </w:tbl>
+    <w:p>
+      <w:pPr>
+        <w:spacing w:after="120"/>
+      </w:pPr>
+    </w:p>
+    <w:p>
+      <w:pPr>
+        <w:pStyle w:val="Heading3"/>
+        <w:keepNext/>
+      </w:pPr>
+      <w:r>
+        <w:rPr>
+          <w:rFonts w:ascii="Calibri" w:cs="Calibri" w:eastAsia="Calibri" w:hAnsi="Calibri"/>
+        </w:rPr>
+        <w:t xml:space="preserve">Lo que el agente no pudo hacer</w:t>
+      </w:r>
+    </w:p>
+    <w:p>
+      <w:pPr>
+        <w:keepNext w:val="false"/>
+        <w:spacing w:after="140" w:line="288"/>
+        <w:jc w:val="both"/>
+      </w:pPr>
+      <w:r>
+        <w:rPr>
+          <w:rFonts w:ascii="Calibri" w:cs="Calibri" w:eastAsia="Calibri" w:hAnsi="Calibri"/>
+        </w:rPr>
+        <w:t xml:space="preserve">El agente no arrancó la API ni la probó a mano, porque los permisos le impiden usar </w:t>
+      </w:r>
+      <w:r>
+        <w:rPr>
+          <w:rFonts w:ascii="Consolas" w:cs="Consolas" w:eastAsia="Consolas" w:hAnsi="Consolas"/>
+          <w:color w:val="2E3A36"/>
+          <w:sz w:val="20"/>
+          <w:szCs w:val="20"/>
+        </w:rPr>
+        <w:t xml:space="preserve">curl</w:t>
+      </w:r>
+      <w:r>
+        <w:rPr>
+          <w:rFonts w:ascii="Calibri" w:cs="Calibri" w:eastAsia="Calibri" w:hAnsi="Calibri"/>
+        </w:rPr>
+        <w:t xml:space="preserve">, y dejó esa tarea sin marcar. Tampoco pudo cambiar </w:t>
+      </w:r>
+      <w:r>
+        <w:rPr>
+          <w:rFonts w:ascii="Consolas" w:cs="Consolas" w:eastAsia="Consolas" w:hAnsi="Consolas"/>
+          <w:color w:val="2E3A36"/>
+          <w:sz w:val="20"/>
+          <w:szCs w:val="20"/>
+        </w:rPr>
+        <w:t xml:space="preserve">httpx</w:t>
+      </w:r>
+      <w:r>
+        <w:rPr>
+          <w:rFonts w:ascii="Calibri" w:cs="Calibri" w:eastAsia="Calibri" w:hAnsi="Calibri"/>
+        </w:rPr>
+        <w:t xml:space="preserve"> por </w:t>
+      </w:r>
+      <w:r>
+        <w:rPr>
+          <w:rFonts w:ascii="Consolas" w:cs="Consolas" w:eastAsia="Consolas" w:hAnsi="Consolas"/>
+          <w:color w:val="2E3A36"/>
+          <w:sz w:val="20"/>
+          <w:szCs w:val="20"/>
+        </w:rPr>
+        <w:t xml:space="preserve">httpx2</w:t>
+      </w:r>
+      <w:r>
+        <w:rPr>
+          <w:rFonts w:ascii="Calibri" w:cs="Calibri" w:eastAsia="Calibri" w:hAnsi="Calibri"/>
+        </w:rPr>
+        <w:t xml:space="preserve">, porque el control de permisos bloqueó el cambio de dependencia. Además, excluyó </w:t>
+      </w:r>
+      <w:r>
+        <w:rPr>
+          <w:rFonts w:ascii="Consolas" w:cs="Consolas" w:eastAsia="Consolas" w:hAnsi="Consolas"/>
+          <w:color w:val="2E3A36"/>
+          <w:sz w:val="20"/>
+          <w:szCs w:val="20"/>
+        </w:rPr>
+        <w:t xml:space="preserve">.claude/</w:t>
+      </w:r>
+      <w:r>
+        <w:rPr>
+          <w:rFonts w:ascii="Calibri" w:cs="Calibri" w:eastAsia="Calibri" w:hAnsi="Calibri"/>
+        </w:rPr>
+        <w:t xml:space="preserve"> y </w:t>
+      </w:r>
+      <w:r>
+        <w:rPr>
+          <w:rFonts w:ascii="Consolas" w:cs="Consolas" w:eastAsia="Consolas" w:hAnsi="Consolas"/>
+          <w:color w:val="2E3A36"/>
+          <w:sz w:val="20"/>
+          <w:szCs w:val="20"/>
+        </w:rPr>
+        <w:t xml:space="preserve">.specify/</w:t>
+      </w:r>
+      <w:r>
+        <w:rPr>
+          <w:rFonts w:ascii="Calibri" w:cs="Calibri" w:eastAsia="Calibri" w:hAnsi="Calibri"/>
+        </w:rPr>
+        <w:t xml:space="preserve"> del lint, porque </w:t>
+      </w:r>
+      <w:r>
+        <w:rPr>
+          <w:rFonts w:ascii="Consolas" w:cs="Consolas" w:eastAsia="Consolas" w:hAnsi="Consolas"/>
+          <w:color w:val="2E3A36"/>
+          <w:sz w:val="20"/>
+          <w:szCs w:val="20"/>
+        </w:rPr>
+        <w:t xml:space="preserve">guard.py</w:t>
+      </w:r>
+      <w:r>
+        <w:rPr>
+          <w:rFonts w:ascii="Calibri" w:cs="Calibri" w:eastAsia="Calibri" w:hAnsi="Calibri"/>
+        </w:rPr>
+        <w:t xml:space="preserve"> no pasa ruff y el agente no puede modificarlo. Lo dejó todo anotado como pendiente en el PR, sin buscar rodeos.</w:t>
+      </w:r>
+    </w:p>
+    <w:p>
+      <w:pPr>
+        <w:keepNext w:val="false"/>
+        <w:spacing w:after="140" w:line="288"/>
+        <w:jc w:val="both"/>
+      </w:pPr>
+      <w:r>
+        <w:rPr>
+          <w:rFonts w:ascii="Calibri" w:cs="Calibri" w:eastAsia="Calibri" w:hAnsi="Calibri"/>
+        </w:rPr>
+        <w:t xml:space="preserve">La revisión cubrió esos huecos. El asistente ejecutó tests, ruff y mypy en una copia limpia de la rama, arrancó la API y comprobó cada endpoint: </w:t>
+      </w:r>
+      <w:r>
+        <w:rPr>
+          <w:rFonts w:ascii="Consolas" w:cs="Consolas" w:eastAsia="Consolas" w:hAnsi="Consolas"/>
+          <w:color w:val="2E3A36"/>
+          <w:sz w:val="20"/>
+          <w:szCs w:val="20"/>
+        </w:rPr>
+        <w:t xml:space="preserve">/health</w:t>
+      </w:r>
+      <w:r>
+        <w:rPr>
+          <w:rFonts w:ascii="Calibri" w:cs="Calibri" w:eastAsia="Calibri" w:hAnsi="Calibri"/>
+        </w:rPr>
+        <w:t xml:space="preserve">, el listado, la consulta por id, el 404 y las métricas. El responsable aprobó el PR y, al fusionarlo, el </w:t>
+      </w:r>
+      <w:r>
+        <w:rPr>
+          <w:rFonts w:ascii="Consolas" w:cs="Consolas" w:eastAsia="Consolas" w:hAnsi="Consolas"/>
+          <w:color w:val="2E3A36"/>
+          <w:sz w:val="20"/>
+          <w:szCs w:val="20"/>
+        </w:rPr>
+        <w:t xml:space="preserve">Closes #5</w:t>
+      </w:r>
+      <w:r>
+        <w:rPr>
+          <w:rFonts w:ascii="Calibri" w:cs="Calibri" w:eastAsia="Calibri" w:hAnsi="Calibri"/>
+        </w:rPr>
+        <w:t xml:space="preserve"> cerró la petición. La petición del catálogo recorrió así todo el camino, del issue al código fusionado, con tres aprobaciones humanas: la de la petición, la de la spec y la del código.</w:t>
+      </w:r>
+    </w:p>
+    <w:p>
+      <w:pPr>
+        <w:pStyle w:val="Heading2"/>
+        <w:keepNext/>
+      </w:pPr>
+      <w:r>
+        <w:rPr>
+          <w:rFonts w:ascii="Calibri" w:cs="Calibri" w:eastAsia="Calibri" w:hAnsi="Calibri"/>
+        </w:rPr>
         <w:t xml:space="preserve">Tareas pendientes</w:t>
       </w:r>
     </w:p>
@@ -13413,7 +14776,7 @@
           <w:sz w:val="21"/>
           <w:szCs w:val="21"/>
         </w:rPr>
-        <w:t xml:space="preserve">Las secciones de las tareas 5 a 12 y de las extensiones B a E se añadirán a medida que se implementen: implementación por el agente, CI, análisis de seguridad, agente revisor, cadena de suministro, despliegue GitOps, </w:t>
+        <w:t xml:space="preserve">Las secciones de las tareas 6 a 12 y de las extensiones B a F se añadirán a medida que se implementen: CI, análisis de seguridad, agente revisor, agente autónomo, cadena de suministro, despliegue GitOps, </w:t>
       </w:r>
       <w:r>
         <w:rPr>
@@ -21139,18 +22502,6 @@
     </w:p>
     <w:p>
       <w:pPr>
-        <w:pStyle w:val="Heading2"/>
-        <w:keepNext/>
-      </w:pPr>
-      <w:r>
-        <w:rPr>
-          <w:rFonts w:ascii="Calibri" w:cs="Calibri" w:eastAsia="Calibri" w:hAnsi="Calibri"/>
-        </w:rPr>
-        <w:t xml:space="preserve">Pruebas realizadas y resultados</w:t>
-      </w:r>
-    </w:p>
-    <w:p>
-      <w:pPr>
         <w:pStyle w:val="Heading3"/>
         <w:keepNext/>
       </w:pPr>
@@ -21158,7 +22509,7 @@
         <w:rPr>
           <w:rFonts w:ascii="Calibri" w:cs="Calibri" w:eastAsia="Calibri" w:hAnsi="Calibri"/>
         </w:rPr>
-        <w:t xml:space="preserve">Pruebas automáticas</w:t>
+        <w:t xml:space="preserve">Fase 9 · Implementación por el agente (11 de octubre)</w:t>
       </w:r>
     </w:p>
     <w:tbl>
@@ -21174,9 +22525,10 @@
         </w:tblBorders>
       </w:tblPr>
       <w:tblGrid>
-        <w:gridCol w:w="2561"/>
-        <w:gridCol w:w="4781"/>
-        <w:gridCol w:w="1728"/>
+        <w:gridCol w:w="700"/>
+        <w:gridCol w:w="2941"/>
+        <w:gridCol w:w="3829"/>
+        <w:gridCol w:w="1600"/>
       </w:tblGrid>
       <w:tr>
         <w:trPr>
@@ -21184,7 +22536,7 @@
         </w:trPr>
         <w:tc>
           <w:tcPr>
-            <w:tcW w:type="dxa" w:w="2561"/>
+            <w:tcW w:type="dxa" w:w="700"/>
             <w:shd w:fill="E3EEEA" w:color="auto" w:val="clear"/>
             <w:tcMar>
               <w:top w:type="dxa" w:w="60"/>
@@ -21205,13 +22557,13 @@
                 <w:sz w:val="18"/>
                 <w:szCs w:val="18"/>
               </w:rPr>
-              <w:t xml:space="preserve">Componente</w:t>
-            </w:r>
-          </w:p>
-        </w:tc>
-        <w:tc>
-          <w:tcPr>
-            <w:tcW w:type="dxa" w:w="4781"/>
+              <w:t xml:space="preserve">#</w:t>
+            </w:r>
+          </w:p>
+        </w:tc>
+        <w:tc>
+          <w:tcPr>
+            <w:tcW w:type="dxa" w:w="2941"/>
             <w:shd w:fill="E3EEEA" w:color="auto" w:val="clear"/>
             <w:tcMar>
               <w:top w:type="dxa" w:w="60"/>
@@ -21232,13 +22584,40 @@
                 <w:sz w:val="18"/>
                 <w:szCs w:val="18"/>
               </w:rPr>
-              <w:t xml:space="preserve">Pruebas</w:t>
-            </w:r>
-          </w:p>
-        </w:tc>
-        <w:tc>
-          <w:tcPr>
-            <w:tcW w:type="dxa" w:w="1728"/>
+              <w:t xml:space="preserve">Petición del autor</w:t>
+            </w:r>
+          </w:p>
+        </w:tc>
+        <w:tc>
+          <w:tcPr>
+            <w:tcW w:type="dxa" w:w="3829"/>
+            <w:shd w:fill="E3EEEA" w:color="auto" w:val="clear"/>
+            <w:tcMar>
+              <w:top w:type="dxa" w:w="60"/>
+              <w:left w:type="dxa" w:w="100"/>
+              <w:bottom w:type="dxa" w:w="60"/>
+              <w:right w:type="dxa" w:w="100"/>
+            </w:tcMar>
+          </w:tcPr>
+          <w:p>
+            <w:pPr>
+              <w:spacing w:after="0" w:before="0" w:line="252"/>
+            </w:pPr>
+            <w:r>
+              <w:rPr>
+                <w:rFonts w:ascii="Calibri" w:cs="Calibri" w:eastAsia="Calibri" w:hAnsi="Calibri"/>
+                <w:b/>
+                <w:bCs/>
+                <w:sz w:val="18"/>
+                <w:szCs w:val="18"/>
+              </w:rPr>
+              <w:t xml:space="preserve">Respuesta y acción del modelo</w:t>
+            </w:r>
+          </w:p>
+        </w:tc>
+        <w:tc>
+          <w:tcPr>
+            <w:tcW w:type="dxa" w:w="1600"/>
             <w:shd w:fill="E3EEEA" w:color="auto" w:val="clear"/>
             <w:tcMar>
               <w:top w:type="dxa" w:w="60"/>
@@ -21270,25 +22649,73 @@
         </w:trPr>
         <w:tc>
           <w:tcPr>
-            <w:tcW w:type="dxa" w:w="2561"/>
-            <w:tcMar>
-              <w:top w:type="dxa" w:w="60"/>
-              <w:left w:type="dxa" w:w="100"/>
-              <w:bottom w:type="dxa" w:w="60"/>
-              <w:right w:type="dxa" w:w="100"/>
-            </w:tcMar>
-          </w:tcPr>
-          <w:p>
-            <w:pPr>
-              <w:spacing w:after="0" w:before="0" w:line="252"/>
-            </w:pPr>
-            <w:r>
-              <w:rPr>
-                <w:rFonts w:ascii="Calibri" w:cs="Calibri" w:eastAsia="Calibri" w:hAnsi="Calibri"/>
-                <w:sz w:val="18"/>
-                <w:szCs w:val="18"/>
-              </w:rPr>
-              <w:t xml:space="preserve">Hook </w:t>
+            <w:tcW w:type="dxa" w:w="700"/>
+            <w:tcMar>
+              <w:top w:type="dxa" w:w="60"/>
+              <w:left w:type="dxa" w:w="100"/>
+              <w:bottom w:type="dxa" w:w="60"/>
+              <w:right w:type="dxa" w:w="100"/>
+            </w:tcMar>
+          </w:tcPr>
+          <w:p>
+            <w:pPr>
+              <w:spacing w:after="0" w:before="0" w:line="252"/>
+            </w:pPr>
+            <w:r>
+              <w:rPr>
+                <w:rFonts w:ascii="Calibri" w:cs="Calibri" w:eastAsia="Calibri" w:hAnsi="Calibri"/>
+                <w:sz w:val="18"/>
+                <w:szCs w:val="18"/>
+              </w:rPr>
+              <w:t xml:space="preserve">55</w:t>
+            </w:r>
+          </w:p>
+        </w:tc>
+        <w:tc>
+          <w:tcPr>
+            <w:tcW w:type="dxa" w:w="2941"/>
+            <w:tcMar>
+              <w:top w:type="dxa" w:w="60"/>
+              <w:left w:type="dxa" w:w="100"/>
+              <w:bottom w:type="dxa" w:w="60"/>
+              <w:right w:type="dxa" w:w="100"/>
+            </w:tcMar>
+          </w:tcPr>
+          <w:p>
+            <w:pPr>
+              <w:spacing w:after="0" w:before="0" w:line="252"/>
+            </w:pPr>
+            <w:r>
+              <w:rPr>
+                <w:rFonts w:ascii="Calibri" w:cs="Calibri" w:eastAsia="Calibri" w:hAnsi="Calibri"/>
+                <w:sz w:val="18"/>
+                <w:szCs w:val="18"/>
+              </w:rPr>
+              <w:t xml:space="preserve">«Continuamos, PR core#6 merged»</w:t>
+            </w:r>
+          </w:p>
+        </w:tc>
+        <w:tc>
+          <w:tcPr>
+            <w:tcW w:type="dxa" w:w="3829"/>
+            <w:tcMar>
+              <w:top w:type="dxa" w:w="60"/>
+              <w:left w:type="dxa" w:w="100"/>
+              <w:bottom w:type="dxa" w:w="60"/>
+              <w:right w:type="dxa" w:w="100"/>
+            </w:tcMar>
+          </w:tcPr>
+          <w:p>
+            <w:pPr>
+              <w:spacing w:after="0" w:before="0" w:line="252"/>
+            </w:pPr>
+            <w:r>
+              <w:rPr>
+                <w:rFonts w:ascii="Calibri" w:cs="Calibri" w:eastAsia="Calibri" w:hAnsi="Calibri"/>
+                <w:sz w:val="18"/>
+                <w:szCs w:val="18"/>
+              </w:rPr>
+              <w:t xml:space="preserve">Da los pasos para actualizar el devcontainer y el mensaje para el agente, y avisa de qué permisos pedirá (</w:t>
             </w:r>
             <w:r>
               <w:rPr>
@@ -21297,55 +22724,56 @@
                 <w:sz w:val="16"/>
                 <w:szCs w:val="16"/>
               </w:rPr>
-              <w:t xml:space="preserve">guard.py</w:t>
-            </w:r>
-          </w:p>
-        </w:tc>
-        <w:tc>
-          <w:tcPr>
-            <w:tcW w:type="dxa" w:w="4781"/>
-            <w:tcMar>
-              <w:top w:type="dxa" w:w="60"/>
-              <w:left w:type="dxa" w:w="100"/>
-              <w:bottom w:type="dxa" w:w="60"/>
-              <w:right w:type="dxa" w:w="100"/>
-            </w:tcMar>
-          </w:tcPr>
-          <w:p>
-            <w:pPr>
-              <w:spacing w:after="0" w:before="0" w:line="252"/>
-            </w:pPr>
-            <w:r>
-              <w:rPr>
-                <w:rFonts w:ascii="Calibri" w:cs="Calibri" w:eastAsia="Calibri" w:hAnsi="Calibri"/>
-                <w:sz w:val="18"/>
-                <w:szCs w:val="18"/>
-              </w:rPr>
-              <w:t xml:space="preserve">45 casos: 21 comandos que deben bloquearse, 10 que deben permitirse, ficheros protegidos, secretos y auditoría</w:t>
-            </w:r>
-          </w:p>
-        </w:tc>
-        <w:tc>
-          <w:tcPr>
-            <w:tcW w:type="dxa" w:w="1728"/>
-            <w:tcMar>
-              <w:top w:type="dxa" w:w="60"/>
-              <w:left w:type="dxa" w:w="100"/>
-              <w:bottom w:type="dxa" w:w="60"/>
-              <w:right w:type="dxa" w:w="100"/>
-            </w:tcMar>
-          </w:tcPr>
-          <w:p>
-            <w:pPr>
-              <w:spacing w:after="0" w:before="0" w:line="252"/>
-            </w:pPr>
-            <w:r>
-              <w:rPr>
-                <w:rFonts w:ascii="Calibri" w:cs="Calibri" w:eastAsia="Calibri" w:hAnsi="Calibri"/>
-                <w:sz w:val="18"/>
-                <w:szCs w:val="18"/>
-              </w:rPr>
-              <w:t xml:space="preserve">45/45 superadas</w:t>
+              <w:t xml:space="preserve">uv add</w:t>
+            </w:r>
+            <w:r>
+              <w:rPr>
+                <w:rFonts w:ascii="Calibri" w:cs="Calibri" w:eastAsia="Calibri" w:hAnsi="Calibri"/>
+                <w:sz w:val="18"/>
+                <w:szCs w:val="18"/>
+              </w:rPr>
+              <w:t xml:space="preserve">, </w:t>
+            </w:r>
+            <w:r>
+              <w:rPr>
+                <w:rFonts w:ascii="Consolas" w:cs="Consolas" w:eastAsia="Consolas" w:hAnsi="Consolas"/>
+                <w:color w:val="2E3A36"/>
+                <w:sz w:val="16"/>
+                <w:szCs w:val="16"/>
+              </w:rPr>
+              <w:t xml:space="preserve">git push</w:t>
+            </w:r>
+            <w:r>
+              <w:rPr>
+                <w:rFonts w:ascii="Calibri" w:cs="Calibri" w:eastAsia="Calibri" w:hAnsi="Calibri"/>
+                <w:sz w:val="18"/>
+                <w:szCs w:val="18"/>
+              </w:rPr>
+              <w:t xml:space="preserve">)</w:t>
+            </w:r>
+          </w:p>
+        </w:tc>
+        <w:tc>
+          <w:tcPr>
+            <w:tcW w:type="dxa" w:w="1600"/>
+            <w:tcMar>
+              <w:top w:type="dxa" w:w="60"/>
+              <w:left w:type="dxa" w:w="100"/>
+              <w:bottom w:type="dxa" w:w="60"/>
+              <w:right w:type="dxa" w:w="100"/>
+            </w:tcMar>
+          </w:tcPr>
+          <w:p>
+            <w:pPr>
+              <w:spacing w:after="0" w:before="0" w:line="252"/>
+            </w:pPr>
+            <w:r>
+              <w:rPr>
+                <w:rFonts w:ascii="Calibri" w:cs="Calibri" w:eastAsia="Calibri" w:hAnsi="Calibri"/>
+                <w:sz w:val="18"/>
+                <w:szCs w:val="18"/>
+              </w:rPr>
+              <w:t xml:space="preserve">Tarea 5 en marcha</w:t>
             </w:r>
           </w:p>
         </w:tc>
@@ -21356,26 +22784,143 @@
         </w:trPr>
         <w:tc>
           <w:tcPr>
-            <w:tcW w:type="dxa" w:w="2561"/>
-            <w:tcMar>
-              <w:top w:type="dxa" w:w="60"/>
-              <w:left w:type="dxa" w:w="100"/>
-              <w:bottom w:type="dxa" w:w="60"/>
-              <w:right w:type="dxa" w:w="100"/>
-            </w:tcMar>
-          </w:tcPr>
-          <w:p>
-            <w:pPr>
-              <w:spacing w:after="0" w:before="0" w:line="252"/>
-            </w:pPr>
-            <w:r>
-              <w:rPr>
-                <w:rFonts w:ascii="Calibri" w:cs="Calibri" w:eastAsia="Calibri" w:hAnsi="Calibri"/>
-                <w:sz w:val="18"/>
-                <w:szCs w:val="18"/>
-              </w:rPr>
-              <w:t xml:space="preserve">Triage (</w:t>
-            </w:r>
+            <w:tcW w:type="dxa" w:w="700"/>
+            <w:tcMar>
+              <w:top w:type="dxa" w:w="60"/>
+              <w:left w:type="dxa" w:w="100"/>
+              <w:bottom w:type="dxa" w:w="60"/>
+              <w:right w:type="dxa" w:w="100"/>
+            </w:tcMar>
+          </w:tcPr>
+          <w:p>
+            <w:pPr>
+              <w:spacing w:after="0" w:before="0" w:line="252"/>
+            </w:pPr>
+            <w:r>
+              <w:rPr>
+                <w:rFonts w:ascii="Calibri" w:cs="Calibri" w:eastAsia="Calibri" w:hAnsi="Calibri"/>
+                <w:sz w:val="18"/>
+                <w:szCs w:val="18"/>
+              </w:rPr>
+              <w:t xml:space="preserve">56</w:t>
+            </w:r>
+          </w:p>
+        </w:tc>
+        <w:tc>
+          <w:tcPr>
+            <w:tcW w:type="dxa" w:w="2941"/>
+            <w:tcMar>
+              <w:top w:type="dxa" w:w="60"/>
+              <w:left w:type="dxa" w:w="100"/>
+              <w:bottom w:type="dxa" w:w="60"/>
+              <w:right w:type="dxa" w:w="100"/>
+            </w:tcMar>
+          </w:tcPr>
+          <w:p>
+            <w:pPr>
+              <w:spacing w:after="0" w:before="0" w:line="252"/>
+            </w:pPr>
+            <w:r>
+              <w:rPr>
+                <w:rFonts w:ascii="Calibri" w:cs="Calibri" w:eastAsia="Calibri" w:hAnsi="Calibri"/>
+                <w:sz w:val="18"/>
+                <w:szCs w:val="18"/>
+              </w:rPr>
+              <w:t xml:space="preserve">«¿Cómo puedo reabrir la sesión de VS Code?»</w:t>
+            </w:r>
+          </w:p>
+        </w:tc>
+        <w:tc>
+          <w:tcPr>
+            <w:tcW w:type="dxa" w:w="3829"/>
+            <w:tcMar>
+              <w:top w:type="dxa" w:w="60"/>
+              <w:left w:type="dxa" w:w="100"/>
+              <w:bottom w:type="dxa" w:w="60"/>
+              <w:right w:type="dxa" w:w="100"/>
+            </w:tcMar>
+          </w:tcPr>
+          <w:p>
+            <w:pPr>
+              <w:spacing w:after="0" w:before="0" w:line="252"/>
+            </w:pPr>
+            <w:r>
+              <w:rPr>
+                <w:rFonts w:ascii="Calibri" w:cs="Calibri" w:eastAsia="Calibri" w:hAnsi="Calibri"/>
+                <w:sz w:val="18"/>
+                <w:szCs w:val="18"/>
+              </w:rPr>
+              <w:t xml:space="preserve">Tres formas de volver al devcontainer y cómo comprobar que se está dentro</w:t>
+            </w:r>
+          </w:p>
+        </w:tc>
+        <w:tc>
+          <w:tcPr>
+            <w:tcW w:type="dxa" w:w="1600"/>
+            <w:tcMar>
+              <w:top w:type="dxa" w:w="60"/>
+              <w:left w:type="dxa" w:w="100"/>
+              <w:bottom w:type="dxa" w:w="60"/>
+              <w:right w:type="dxa" w:w="100"/>
+            </w:tcMar>
+          </w:tcPr>
+          <w:p>
+            <w:pPr>
+              <w:spacing w:after="0" w:before="0" w:line="252"/>
+            </w:pPr>
+            <w:r>
+              <w:rPr>
+                <w:rFonts w:ascii="Calibri" w:cs="Calibri" w:eastAsia="Calibri" w:hAnsi="Calibri"/>
+                <w:sz w:val="18"/>
+                <w:szCs w:val="18"/>
+              </w:rPr>
+              <w:t xml:space="preserve">Contenedor abierto</w:t>
+            </w:r>
+          </w:p>
+        </w:tc>
+      </w:tr>
+      <w:tr>
+        <w:trPr>
+          <w:cantSplit/>
+        </w:trPr>
+        <w:tc>
+          <w:tcPr>
+            <w:tcW w:type="dxa" w:w="700"/>
+            <w:tcMar>
+              <w:top w:type="dxa" w:w="60"/>
+              <w:left w:type="dxa" w:w="100"/>
+              <w:bottom w:type="dxa" w:w="60"/>
+              <w:right w:type="dxa" w:w="100"/>
+            </w:tcMar>
+          </w:tcPr>
+          <w:p>
+            <w:pPr>
+              <w:spacing w:after="0" w:before="0" w:line="252"/>
+            </w:pPr>
+            <w:r>
+              <w:rPr>
+                <w:rFonts w:ascii="Calibri" w:cs="Calibri" w:eastAsia="Calibri" w:hAnsi="Calibri"/>
+                <w:sz w:val="18"/>
+                <w:szCs w:val="18"/>
+              </w:rPr>
+              <w:t xml:space="preserve">57</w:t>
+            </w:r>
+          </w:p>
+        </w:tc>
+        <w:tc>
+          <w:tcPr>
+            <w:tcW w:type="dxa" w:w="2941"/>
+            <w:tcMar>
+              <w:top w:type="dxa" w:w="60"/>
+              <w:left w:type="dxa" w:w="100"/>
+              <w:bottom w:type="dxa" w:w="60"/>
+              <w:right w:type="dxa" w:w="100"/>
+            </w:tcMar>
+          </w:tcPr>
+          <w:p>
+            <w:pPr>
+              <w:spacing w:after="0" w:before="0" w:line="252"/>
+            </w:pPr>
             <w:r>
               <w:rPr>
                 <w:rFonts w:ascii="Consolas" w:cs="Consolas" w:eastAsia="Consolas" w:hAnsi="Consolas"/>
@@ -21383,15 +22928,31 @@
                 <w:sz w:val="16"/>
                 <w:szCs w:val="16"/>
               </w:rPr>
-              <w:t xml:space="preserve">apply.py</w:t>
-            </w:r>
-            <w:r>
-              <w:rPr>
-                <w:rFonts w:ascii="Calibri" w:cs="Calibri" w:eastAsia="Calibri" w:hAnsi="Calibri"/>
-                <w:sz w:val="18"/>
-                <w:szCs w:val="18"/>
-              </w:rPr>
-              <w:t xml:space="preserve">, </w:t>
+              <w:t xml:space="preserve">start-agent.sh: AGENT_APP_ID: Define AGENT_APP_ID</w:t>
+            </w:r>
+          </w:p>
+        </w:tc>
+        <w:tc>
+          <w:tcPr>
+            <w:tcW w:type="dxa" w:w="3829"/>
+            <w:tcMar>
+              <w:top w:type="dxa" w:w="60"/>
+              <w:left w:type="dxa" w:w="100"/>
+              <w:bottom w:type="dxa" w:w="60"/>
+              <w:right w:type="dxa" w:w="100"/>
+            </w:tcMar>
+          </w:tcPr>
+          <w:p>
+            <w:pPr>
+              <w:spacing w:after="0" w:before="0" w:line="252"/>
+            </w:pPr>
+            <w:r>
+              <w:rPr>
+                <w:rFonts w:ascii="Calibri" w:cs="Calibri" w:eastAsia="Calibri" w:hAnsi="Calibri"/>
+                <w:sz w:val="18"/>
+                <w:szCs w:val="18"/>
+              </w:rPr>
+              <w:t xml:space="preserve">Verifica que la variable está en </w:t>
             </w:r>
             <w:r>
               <w:rPr>
@@ -21400,6 +22961,735 @@
                 <w:sz w:val="16"/>
                 <w:szCs w:val="16"/>
               </w:rPr>
+              <w:t xml:space="preserve">devcontainer.json</w:t>
+            </w:r>
+            <w:r>
+              <w:rPr>
+                <w:rFonts w:ascii="Calibri" w:cs="Calibri" w:eastAsia="Calibri" w:hAnsi="Calibri"/>
+                <w:sz w:val="18"/>
+                <w:szCs w:val="18"/>
+              </w:rPr>
+              <w:t xml:space="preserve"> y deduce que la terminal estaba fuera del contenedor</w:t>
+            </w:r>
+          </w:p>
+        </w:tc>
+        <w:tc>
+          <w:tcPr>
+            <w:tcW w:type="dxa" w:w="1600"/>
+            <w:tcMar>
+              <w:top w:type="dxa" w:w="60"/>
+              <w:left w:type="dxa" w:w="100"/>
+              <w:bottom w:type="dxa" w:w="60"/>
+              <w:right w:type="dxa" w:w="100"/>
+            </w:tcMar>
+          </w:tcPr>
+          <w:p>
+            <w:pPr>
+              <w:spacing w:after="0" w:before="0" w:line="252"/>
+            </w:pPr>
+            <w:r>
+              <w:rPr>
+                <w:rFonts w:ascii="Calibri" w:cs="Calibri" w:eastAsia="Calibri" w:hAnsi="Calibri"/>
+                <w:sz w:val="18"/>
+                <w:szCs w:val="18"/>
+              </w:rPr>
+              <w:t xml:space="preserve">Agente arrancado</w:t>
+            </w:r>
+          </w:p>
+        </w:tc>
+      </w:tr>
+      <w:tr>
+        <w:trPr>
+          <w:cantSplit/>
+        </w:trPr>
+        <w:tc>
+          <w:tcPr>
+            <w:tcW w:type="dxa" w:w="700"/>
+            <w:tcMar>
+              <w:top w:type="dxa" w:w="60"/>
+              <w:left w:type="dxa" w:w="100"/>
+              <w:bottom w:type="dxa" w:w="60"/>
+              <w:right w:type="dxa" w:w="100"/>
+            </w:tcMar>
+          </w:tcPr>
+          <w:p>
+            <w:pPr>
+              <w:spacing w:after="0" w:before="0" w:line="252"/>
+            </w:pPr>
+            <w:r>
+              <w:rPr>
+                <w:rFonts w:ascii="Calibri" w:cs="Calibri" w:eastAsia="Calibri" w:hAnsi="Calibri"/>
+                <w:sz w:val="18"/>
+                <w:szCs w:val="18"/>
+              </w:rPr>
+              <w:t xml:space="preserve">58</w:t>
+            </w:r>
+          </w:p>
+        </w:tc>
+        <w:tc>
+          <w:tcPr>
+            <w:tcW w:type="dxa" w:w="2941"/>
+            <w:tcMar>
+              <w:top w:type="dxa" w:w="60"/>
+              <w:left w:type="dxa" w:w="100"/>
+              <w:bottom w:type="dxa" w:w="60"/>
+              <w:right w:type="dxa" w:w="100"/>
+            </w:tcMar>
+          </w:tcPr>
+          <w:p>
+            <w:pPr>
+              <w:spacing w:after="0" w:before="0" w:line="252"/>
+            </w:pPr>
+            <w:r>
+              <w:rPr>
+                <w:rFonts w:ascii="Calibri" w:cs="Calibri" w:eastAsia="Calibri" w:hAnsi="Calibri"/>
+                <w:sz w:val="18"/>
+                <w:szCs w:val="18"/>
+              </w:rPr>
+              <w:t xml:space="preserve">«Me pregunta si quiero sobrescribir plan.md»</w:t>
+            </w:r>
+          </w:p>
+        </w:tc>
+        <w:tc>
+          <w:tcPr>
+            <w:tcW w:type="dxa" w:w="3829"/>
+            <w:tcMar>
+              <w:top w:type="dxa" w:w="60"/>
+              <w:left w:type="dxa" w:w="100"/>
+              <w:bottom w:type="dxa" w:w="60"/>
+              <w:right w:type="dxa" w:w="100"/>
+            </w:tcMar>
+          </w:tcPr>
+          <w:p>
+            <w:pPr>
+              <w:spacing w:after="0" w:before="0" w:line="252"/>
+            </w:pPr>
+            <w:r>
+              <w:rPr>
+                <w:rFonts w:ascii="Calibri" w:cs="Calibri" w:eastAsia="Calibri" w:hAnsi="Calibri"/>
+                <w:sz w:val="18"/>
+                <w:szCs w:val="18"/>
+              </w:rPr>
+              <w:t xml:space="preserve">Explica que es la plantilla recién copiada por Spec Kit y el permiso normal de escritura; recomienda permitir ediciones en la sesión, porque el hook y las reglas </w:t>
+            </w:r>
+            <w:r>
+              <w:rPr>
+                <w:rFonts w:ascii="Consolas" w:cs="Consolas" w:eastAsia="Consolas" w:hAnsi="Consolas"/>
+                <w:color w:val="2E3A36"/>
+                <w:sz w:val="16"/>
+                <w:szCs w:val="16"/>
+              </w:rPr>
+              <w:t xml:space="preserve">deny</w:t>
+            </w:r>
+            <w:r>
+              <w:rPr>
+                <w:rFonts w:ascii="Calibri" w:cs="Calibri" w:eastAsia="Calibri" w:hAnsi="Calibri"/>
+                <w:sz w:val="18"/>
+                <w:szCs w:val="18"/>
+              </w:rPr>
+              <w:t xml:space="preserve"> siguen activos</w:t>
+            </w:r>
+          </w:p>
+        </w:tc>
+        <w:tc>
+          <w:tcPr>
+            <w:tcW w:type="dxa" w:w="1600"/>
+            <w:tcMar>
+              <w:top w:type="dxa" w:w="60"/>
+              <w:left w:type="dxa" w:w="100"/>
+              <w:bottom w:type="dxa" w:w="60"/>
+              <w:right w:type="dxa" w:w="100"/>
+            </w:tcMar>
+          </w:tcPr>
+          <w:p>
+            <w:pPr>
+              <w:spacing w:after="0" w:before="0" w:line="252"/>
+            </w:pPr>
+            <w:r>
+              <w:rPr>
+                <w:rFonts w:ascii="Calibri" w:cs="Calibri" w:eastAsia="Calibri" w:hAnsi="Calibri"/>
+                <w:sz w:val="18"/>
+                <w:szCs w:val="18"/>
+              </w:rPr>
+              <w:t xml:space="preserve">Plan generado</w:t>
+            </w:r>
+          </w:p>
+        </w:tc>
+      </w:tr>
+      <w:tr>
+        <w:trPr>
+          <w:cantSplit/>
+        </w:trPr>
+        <w:tc>
+          <w:tcPr>
+            <w:tcW w:type="dxa" w:w="700"/>
+            <w:tcMar>
+              <w:top w:type="dxa" w:w="60"/>
+              <w:left w:type="dxa" w:w="100"/>
+              <w:bottom w:type="dxa" w:w="60"/>
+              <w:right w:type="dxa" w:w="100"/>
+            </w:tcMar>
+          </w:tcPr>
+          <w:p>
+            <w:pPr>
+              <w:spacing w:after="0" w:before="0" w:line="252"/>
+            </w:pPr>
+            <w:r>
+              <w:rPr>
+                <w:rFonts w:ascii="Calibri" w:cs="Calibri" w:eastAsia="Calibri" w:hAnsi="Calibri"/>
+                <w:sz w:val="18"/>
+                <w:szCs w:val="18"/>
+              </w:rPr>
+              <w:t xml:space="preserve">59</w:t>
+            </w:r>
+          </w:p>
+        </w:tc>
+        <w:tc>
+          <w:tcPr>
+            <w:tcW w:type="dxa" w:w="2941"/>
+            <w:tcMar>
+              <w:top w:type="dxa" w:w="60"/>
+              <w:left w:type="dxa" w:w="100"/>
+              <w:bottom w:type="dxa" w:w="60"/>
+              <w:right w:type="dxa" w:w="100"/>
+            </w:tcMar>
+          </w:tcPr>
+          <w:p>
+            <w:pPr>
+              <w:spacing w:after="0" w:before="0" w:line="252"/>
+            </w:pPr>
+            <w:r>
+              <w:rPr>
+                <w:rFonts w:ascii="Calibri" w:cs="Calibri" w:eastAsia="Calibri" w:hAnsi="Calibri"/>
+                <w:sz w:val="18"/>
+                <w:szCs w:val="18"/>
+              </w:rPr>
+              <w:t xml:space="preserve">Informe del agente: PR #10 abierto, 55 tests, decisiones y pendientes</w:t>
+            </w:r>
+          </w:p>
+        </w:tc>
+        <w:tc>
+          <w:tcPr>
+            <w:tcW w:type="dxa" w:w="3829"/>
+            <w:tcMar>
+              <w:top w:type="dxa" w:w="60"/>
+              <w:left w:type="dxa" w:w="100"/>
+              <w:bottom w:type="dxa" w:w="60"/>
+              <w:right w:type="dxa" w:w="100"/>
+            </w:tcMar>
+          </w:tcPr>
+          <w:p>
+            <w:pPr>
+              <w:spacing w:after="0" w:before="0" w:line="252"/>
+            </w:pPr>
+            <w:r>
+              <w:rPr>
+                <w:rFonts w:ascii="Calibri" w:cs="Calibri" w:eastAsia="Calibri" w:hAnsi="Calibri"/>
+                <w:sz w:val="18"/>
+                <w:szCs w:val="18"/>
+              </w:rPr>
+              <w:t xml:space="preserve">Revisa el PR: ningún fichero protegido, tests, lint y tipos en una copia limpia, y la API arrancada endpoint por endpoint. Valora las cuatro decisiones y asigna cada pendiente a una tarea del plan</w:t>
+            </w:r>
+          </w:p>
+        </w:tc>
+        <w:tc>
+          <w:tcPr>
+            <w:tcW w:type="dxa" w:w="1600"/>
+            <w:tcMar>
+              <w:top w:type="dxa" w:w="60"/>
+              <w:left w:type="dxa" w:w="100"/>
+              <w:bottom w:type="dxa" w:w="60"/>
+              <w:right w:type="dxa" w:w="100"/>
+            </w:tcMar>
+          </w:tcPr>
+          <w:p>
+            <w:pPr>
+              <w:spacing w:after="0" w:before="0" w:line="252"/>
+            </w:pPr>
+            <w:r>
+              <w:rPr>
+                <w:rFonts w:ascii="Calibri" w:cs="Calibri" w:eastAsia="Calibri" w:hAnsi="Calibri"/>
+                <w:sz w:val="18"/>
+                <w:szCs w:val="18"/>
+              </w:rPr>
+              <w:t xml:space="preserve">Recomendación de aprobar</w:t>
+            </w:r>
+          </w:p>
+        </w:tc>
+      </w:tr>
+      <w:tr>
+        <w:trPr>
+          <w:cantSplit/>
+        </w:trPr>
+        <w:tc>
+          <w:tcPr>
+            <w:tcW w:type="dxa" w:w="700"/>
+            <w:tcMar>
+              <w:top w:type="dxa" w:w="60"/>
+              <w:left w:type="dxa" w:w="100"/>
+              <w:bottom w:type="dxa" w:w="60"/>
+              <w:right w:type="dxa" w:w="100"/>
+            </w:tcMar>
+          </w:tcPr>
+          <w:p>
+            <w:pPr>
+              <w:spacing w:after="0" w:before="0" w:line="252"/>
+            </w:pPr>
+            <w:r>
+              <w:rPr>
+                <w:rFonts w:ascii="Calibri" w:cs="Calibri" w:eastAsia="Calibri" w:hAnsi="Calibri"/>
+                <w:sz w:val="18"/>
+                <w:szCs w:val="18"/>
+              </w:rPr>
+              <w:t xml:space="preserve">60</w:t>
+            </w:r>
+          </w:p>
+        </w:tc>
+        <w:tc>
+          <w:tcPr>
+            <w:tcW w:type="dxa" w:w="2941"/>
+            <w:tcMar>
+              <w:top w:type="dxa" w:w="60"/>
+              <w:left w:type="dxa" w:w="100"/>
+              <w:bottom w:type="dxa" w:w="60"/>
+              <w:right w:type="dxa" w:w="100"/>
+            </w:tcMar>
+          </w:tcPr>
+          <w:p>
+            <w:pPr>
+              <w:spacing w:after="0" w:before="0" w:line="252"/>
+            </w:pPr>
+            <w:r>
+              <w:rPr>
+                <w:rFonts w:ascii="Calibri" w:cs="Calibri" w:eastAsia="Calibri" w:hAnsi="Calibri"/>
+                <w:sz w:val="18"/>
+                <w:szCs w:val="18"/>
+              </w:rPr>
+              <w:t xml:space="preserve">«Merged»</w:t>
+            </w:r>
+          </w:p>
+        </w:tc>
+        <w:tc>
+          <w:tcPr>
+            <w:tcW w:type="dxa" w:w="3829"/>
+            <w:tcMar>
+              <w:top w:type="dxa" w:w="60"/>
+              <w:left w:type="dxa" w:w="100"/>
+              <w:bottom w:type="dxa" w:w="60"/>
+              <w:right w:type="dxa" w:w="100"/>
+            </w:tcMar>
+          </w:tcPr>
+          <w:p>
+            <w:pPr>
+              <w:spacing w:after="0" w:before="0" w:line="252"/>
+            </w:pPr>
+            <w:r>
+              <w:rPr>
+                <w:rFonts w:ascii="Calibri" w:cs="Calibri" w:eastAsia="Calibri" w:hAnsi="Calibri"/>
+                <w:sz w:val="18"/>
+                <w:szCs w:val="18"/>
+              </w:rPr>
+              <w:t xml:space="preserve">Cierra la tarea 5: bitácora, panel y memoria</w:t>
+            </w:r>
+          </w:p>
+        </w:tc>
+        <w:tc>
+          <w:tcPr>
+            <w:tcW w:type="dxa" w:w="1600"/>
+            <w:tcMar>
+              <w:top w:type="dxa" w:w="60"/>
+              <w:left w:type="dxa" w:w="100"/>
+              <w:bottom w:type="dxa" w:w="60"/>
+              <w:right w:type="dxa" w:w="100"/>
+            </w:tcMar>
+          </w:tcPr>
+          <w:p>
+            <w:pPr>
+              <w:spacing w:after="0" w:before="0" w:line="252"/>
+            </w:pPr>
+            <w:r>
+              <w:rPr>
+                <w:rFonts w:ascii="Calibri" w:cs="Calibri" w:eastAsia="Calibri" w:hAnsi="Calibri"/>
+                <w:sz w:val="18"/>
+                <w:szCs w:val="18"/>
+              </w:rPr>
+              <w:t xml:space="preserve">Issue #5 cerrado</w:t>
+            </w:r>
+          </w:p>
+        </w:tc>
+      </w:tr>
+    </w:tbl>
+    <w:p>
+      <w:pPr>
+        <w:spacing w:after="120"/>
+      </w:pPr>
+    </w:p>
+    <w:p>
+      <w:pPr>
+        <w:pStyle w:val="Heading2"/>
+        <w:keepNext/>
+      </w:pPr>
+      <w:r>
+        <w:rPr>
+          <w:rFonts w:ascii="Calibri" w:cs="Calibri" w:eastAsia="Calibri" w:hAnsi="Calibri"/>
+        </w:rPr>
+        <w:t xml:space="preserve">Pruebas realizadas y resultados</w:t>
+      </w:r>
+    </w:p>
+    <w:p>
+      <w:pPr>
+        <w:pStyle w:val="Heading3"/>
+        <w:keepNext/>
+      </w:pPr>
+      <w:r>
+        <w:rPr>
+          <w:rFonts w:ascii="Calibri" w:cs="Calibri" w:eastAsia="Calibri" w:hAnsi="Calibri"/>
+        </w:rPr>
+        <w:t xml:space="preserve">Pruebas automáticas</w:t>
+      </w:r>
+    </w:p>
+    <w:tbl>
+      <w:tblPr>
+        <w:tblW w:type="dxa" w:w="9070"/>
+        <w:tblBorders>
+          <w:top w:val="single" w:color="C9D3CF" w:sz="4"/>
+          <w:left w:val="single" w:color="C9D3CF" w:sz="4"/>
+          <w:bottom w:val="single" w:color="C9D3CF" w:sz="4"/>
+          <w:right w:val="single" w:color="C9D3CF" w:sz="4"/>
+          <w:insideH w:val="single" w:color="C9D3CF" w:sz="4"/>
+          <w:insideV w:val="single" w:color="C9D3CF" w:sz="4"/>
+        </w:tblBorders>
+      </w:tblPr>
+      <w:tblGrid>
+        <w:gridCol w:w="2548"/>
+        <w:gridCol w:w="4869"/>
+        <w:gridCol w:w="1653"/>
+      </w:tblGrid>
+      <w:tr>
+        <w:trPr>
+          <w:tblHeader/>
+        </w:trPr>
+        <w:tc>
+          <w:tcPr>
+            <w:tcW w:type="dxa" w:w="2548"/>
+            <w:shd w:fill="E3EEEA" w:color="auto" w:val="clear"/>
+            <w:tcMar>
+              <w:top w:type="dxa" w:w="60"/>
+              <w:left w:type="dxa" w:w="100"/>
+              <w:bottom w:type="dxa" w:w="60"/>
+              <w:right w:type="dxa" w:w="100"/>
+            </w:tcMar>
+          </w:tcPr>
+          <w:p>
+            <w:pPr>
+              <w:spacing w:after="0" w:before="0" w:line="252"/>
+            </w:pPr>
+            <w:r>
+              <w:rPr>
+                <w:rFonts w:ascii="Calibri" w:cs="Calibri" w:eastAsia="Calibri" w:hAnsi="Calibri"/>
+                <w:b/>
+                <w:bCs/>
+                <w:sz w:val="18"/>
+                <w:szCs w:val="18"/>
+              </w:rPr>
+              <w:t xml:space="preserve">Componente</w:t>
+            </w:r>
+          </w:p>
+        </w:tc>
+        <w:tc>
+          <w:tcPr>
+            <w:tcW w:type="dxa" w:w="4869"/>
+            <w:shd w:fill="E3EEEA" w:color="auto" w:val="clear"/>
+            <w:tcMar>
+              <w:top w:type="dxa" w:w="60"/>
+              <w:left w:type="dxa" w:w="100"/>
+              <w:bottom w:type="dxa" w:w="60"/>
+              <w:right w:type="dxa" w:w="100"/>
+            </w:tcMar>
+          </w:tcPr>
+          <w:p>
+            <w:pPr>
+              <w:spacing w:after="0" w:before="0" w:line="252"/>
+            </w:pPr>
+            <w:r>
+              <w:rPr>
+                <w:rFonts w:ascii="Calibri" w:cs="Calibri" w:eastAsia="Calibri" w:hAnsi="Calibri"/>
+                <w:b/>
+                <w:bCs/>
+                <w:sz w:val="18"/>
+                <w:szCs w:val="18"/>
+              </w:rPr>
+              <w:t xml:space="preserve">Pruebas</w:t>
+            </w:r>
+          </w:p>
+        </w:tc>
+        <w:tc>
+          <w:tcPr>
+            <w:tcW w:type="dxa" w:w="1653"/>
+            <w:shd w:fill="E3EEEA" w:color="auto" w:val="clear"/>
+            <w:tcMar>
+              <w:top w:type="dxa" w:w="60"/>
+              <w:left w:type="dxa" w:w="100"/>
+              <w:bottom w:type="dxa" w:w="60"/>
+              <w:right w:type="dxa" w:w="100"/>
+            </w:tcMar>
+          </w:tcPr>
+          <w:p>
+            <w:pPr>
+              <w:spacing w:after="0" w:before="0" w:line="252"/>
+            </w:pPr>
+            <w:r>
+              <w:rPr>
+                <w:rFonts w:ascii="Calibri" w:cs="Calibri" w:eastAsia="Calibri" w:hAnsi="Calibri"/>
+                <w:b/>
+                <w:bCs/>
+                <w:sz w:val="18"/>
+                <w:szCs w:val="18"/>
+              </w:rPr>
+              <w:t xml:space="preserve">Resultado</w:t>
+            </w:r>
+          </w:p>
+        </w:tc>
+      </w:tr>
+      <w:tr>
+        <w:trPr>
+          <w:cantSplit/>
+        </w:trPr>
+        <w:tc>
+          <w:tcPr>
+            <w:tcW w:type="dxa" w:w="2548"/>
+            <w:tcMar>
+              <w:top w:type="dxa" w:w="60"/>
+              <w:left w:type="dxa" w:w="100"/>
+              <w:bottom w:type="dxa" w:w="60"/>
+              <w:right w:type="dxa" w:w="100"/>
+            </w:tcMar>
+          </w:tcPr>
+          <w:p>
+            <w:pPr>
+              <w:spacing w:after="0" w:before="0" w:line="252"/>
+            </w:pPr>
+            <w:r>
+              <w:rPr>
+                <w:rFonts w:ascii="Calibri" w:cs="Calibri" w:eastAsia="Calibri" w:hAnsi="Calibri"/>
+                <w:sz w:val="18"/>
+                <w:szCs w:val="18"/>
+              </w:rPr>
+              <w:t xml:space="preserve">Hook </w:t>
+            </w:r>
+            <w:r>
+              <w:rPr>
+                <w:rFonts w:ascii="Consolas" w:cs="Consolas" w:eastAsia="Consolas" w:hAnsi="Consolas"/>
+                <w:color w:val="2E3A36"/>
+                <w:sz w:val="16"/>
+                <w:szCs w:val="16"/>
+              </w:rPr>
+              <w:t xml:space="preserve">guard.py</w:t>
+            </w:r>
+          </w:p>
+        </w:tc>
+        <w:tc>
+          <w:tcPr>
+            <w:tcW w:type="dxa" w:w="4869"/>
+            <w:tcMar>
+              <w:top w:type="dxa" w:w="60"/>
+              <w:left w:type="dxa" w:w="100"/>
+              <w:bottom w:type="dxa" w:w="60"/>
+              <w:right w:type="dxa" w:w="100"/>
+            </w:tcMar>
+          </w:tcPr>
+          <w:p>
+            <w:pPr>
+              <w:spacing w:after="0" w:before="0" w:line="252"/>
+            </w:pPr>
+            <w:r>
+              <w:rPr>
+                <w:rFonts w:ascii="Calibri" w:cs="Calibri" w:eastAsia="Calibri" w:hAnsi="Calibri"/>
+                <w:sz w:val="18"/>
+                <w:szCs w:val="18"/>
+              </w:rPr>
+              <w:t xml:space="preserve">45 casos: 21 comandos que deben bloquearse, 10 que deben permitirse, ficheros protegidos, secretos y auditoría</w:t>
+            </w:r>
+          </w:p>
+        </w:tc>
+        <w:tc>
+          <w:tcPr>
+            <w:tcW w:type="dxa" w:w="1653"/>
+            <w:tcMar>
+              <w:top w:type="dxa" w:w="60"/>
+              <w:left w:type="dxa" w:w="100"/>
+              <w:bottom w:type="dxa" w:w="60"/>
+              <w:right w:type="dxa" w:w="100"/>
+            </w:tcMar>
+          </w:tcPr>
+          <w:p>
+            <w:pPr>
+              <w:spacing w:after="0" w:before="0" w:line="252"/>
+            </w:pPr>
+            <w:r>
+              <w:rPr>
+                <w:rFonts w:ascii="Calibri" w:cs="Calibri" w:eastAsia="Calibri" w:hAnsi="Calibri"/>
+                <w:sz w:val="18"/>
+                <w:szCs w:val="18"/>
+              </w:rPr>
+              <w:t xml:space="preserve">45/45 superadas</w:t>
+            </w:r>
+          </w:p>
+        </w:tc>
+      </w:tr>
+      <w:tr>
+        <w:trPr>
+          <w:cantSplit/>
+        </w:trPr>
+        <w:tc>
+          <w:tcPr>
+            <w:tcW w:type="dxa" w:w="2548"/>
+            <w:tcMar>
+              <w:top w:type="dxa" w:w="60"/>
+              <w:left w:type="dxa" w:w="100"/>
+              <w:bottom w:type="dxa" w:w="60"/>
+              <w:right w:type="dxa" w:w="100"/>
+            </w:tcMar>
+          </w:tcPr>
+          <w:p>
+            <w:pPr>
+              <w:spacing w:after="0" w:before="0" w:line="252"/>
+            </w:pPr>
+            <w:r>
+              <w:rPr>
+                <w:rFonts w:ascii="Calibri" w:cs="Calibri" w:eastAsia="Calibri" w:hAnsi="Calibri"/>
+                <w:sz w:val="18"/>
+                <w:szCs w:val="18"/>
+              </w:rPr>
+              <w:t xml:space="preserve">Aplicación: catálogo (</w:t>
+            </w:r>
+            <w:r>
+              <w:rPr>
+                <w:rFonts w:ascii="Consolas" w:cs="Consolas" w:eastAsia="Consolas" w:hAnsi="Consolas"/>
+                <w:color w:val="2E3A36"/>
+                <w:sz w:val="16"/>
+                <w:szCs w:val="16"/>
+              </w:rPr>
+              <w:t xml:space="preserve">app</w:t>
+            </w:r>
+            <w:r>
+              <w:rPr>
+                <w:rFonts w:ascii="Calibri" w:cs="Calibri" w:eastAsia="Calibri" w:hAnsi="Calibri"/>
+                <w:sz w:val="18"/>
+                <w:szCs w:val="18"/>
+              </w:rPr>
+              <w:t xml:space="preserve">)</w:t>
+            </w:r>
+          </w:p>
+        </w:tc>
+        <w:tc>
+          <w:tcPr>
+            <w:tcW w:type="dxa" w:w="4869"/>
+            <w:tcMar>
+              <w:top w:type="dxa" w:w="60"/>
+              <w:left w:type="dxa" w:w="100"/>
+              <w:bottom w:type="dxa" w:w="60"/>
+              <w:right w:type="dxa" w:w="100"/>
+            </w:tcMar>
+          </w:tcPr>
+          <w:p>
+            <w:pPr>
+              <w:spacing w:after="0" w:before="0" w:line="252"/>
+            </w:pPr>
+            <w:r>
+              <w:rPr>
+                <w:rFonts w:ascii="Calibri" w:cs="Calibri" w:eastAsia="Calibri" w:hAnsi="Calibri"/>
+                <w:sz w:val="18"/>
+                <w:szCs w:val="18"/>
+              </w:rPr>
+              <w:t xml:space="preserve">55 casos: listado, consulta por id, 404, precio con 2 decimales, orden estable, catálogo mal formado, despliegue de un cambio de precio, observabilidad y </w:t>
+            </w:r>
+            <w:r>
+              <w:rPr>
+                <w:rFonts w:ascii="Consolas" w:cs="Consolas" w:eastAsia="Consolas" w:hAnsi="Consolas"/>
+                <w:color w:val="2E3A36"/>
+                <w:sz w:val="16"/>
+                <w:szCs w:val="16"/>
+              </w:rPr>
+              <w:t xml:space="preserve">/health</w:t>
+            </w:r>
+          </w:p>
+        </w:tc>
+        <w:tc>
+          <w:tcPr>
+            <w:tcW w:type="dxa" w:w="1653"/>
+            <w:tcMar>
+              <w:top w:type="dxa" w:w="60"/>
+              <w:left w:type="dxa" w:w="100"/>
+              <w:bottom w:type="dxa" w:w="60"/>
+              <w:right w:type="dxa" w:w="100"/>
+            </w:tcMar>
+          </w:tcPr>
+          <w:p>
+            <w:pPr>
+              <w:spacing w:after="0" w:before="0" w:line="252"/>
+            </w:pPr>
+            <w:r>
+              <w:rPr>
+                <w:rFonts w:ascii="Calibri" w:cs="Calibri" w:eastAsia="Calibri" w:hAnsi="Calibri"/>
+                <w:sz w:val="18"/>
+                <w:szCs w:val="18"/>
+              </w:rPr>
+              <w:t xml:space="preserve">55/55 superadas</w:t>
+            </w:r>
+          </w:p>
+        </w:tc>
+      </w:tr>
+      <w:tr>
+        <w:trPr>
+          <w:cantSplit/>
+        </w:trPr>
+        <w:tc>
+          <w:tcPr>
+            <w:tcW w:type="dxa" w:w="2548"/>
+            <w:tcMar>
+              <w:top w:type="dxa" w:w="60"/>
+              <w:left w:type="dxa" w:w="100"/>
+              <w:bottom w:type="dxa" w:w="60"/>
+              <w:right w:type="dxa" w:w="100"/>
+            </w:tcMar>
+          </w:tcPr>
+          <w:p>
+            <w:pPr>
+              <w:spacing w:after="0" w:before="0" w:line="252"/>
+            </w:pPr>
+            <w:r>
+              <w:rPr>
+                <w:rFonts w:ascii="Calibri" w:cs="Calibri" w:eastAsia="Calibri" w:hAnsi="Calibri"/>
+                <w:sz w:val="18"/>
+                <w:szCs w:val="18"/>
+              </w:rPr>
+              <w:t xml:space="preserve">Triage (</w:t>
+            </w:r>
+            <w:r>
+              <w:rPr>
+                <w:rFonts w:ascii="Consolas" w:cs="Consolas" w:eastAsia="Consolas" w:hAnsi="Consolas"/>
+                <w:color w:val="2E3A36"/>
+                <w:sz w:val="16"/>
+                <w:szCs w:val="16"/>
+              </w:rPr>
+              <w:t xml:space="preserve">apply.py</w:t>
+            </w:r>
+            <w:r>
+              <w:rPr>
+                <w:rFonts w:ascii="Calibri" w:cs="Calibri" w:eastAsia="Calibri" w:hAnsi="Calibri"/>
+                <w:sz w:val="18"/>
+                <w:szCs w:val="18"/>
+              </w:rPr>
+              <w:t xml:space="preserve">, </w:t>
+            </w:r>
+            <w:r>
+              <w:rPr>
+                <w:rFonts w:ascii="Consolas" w:cs="Consolas" w:eastAsia="Consolas" w:hAnsi="Consolas"/>
+                <w:color w:val="2E3A36"/>
+                <w:sz w:val="16"/>
+                <w:szCs w:val="16"/>
+              </w:rPr>
               <w:t xml:space="preserve">build_prompt.py</w:t>
             </w:r>
             <w:r>
@@ -21414,7 +23704,7 @@
         </w:tc>
         <w:tc>
           <w:tcPr>
-            <w:tcW w:type="dxa" w:w="4781"/>
+            <w:tcW w:type="dxa" w:w="4869"/>
             <w:tcMar>
               <w:top w:type="dxa" w:w="60"/>
               <w:left w:type="dxa" w:w="100"/>
@@ -21438,7 +23728,7 @@
         </w:tc>
         <w:tc>
           <w:tcPr>
-            <w:tcW w:type="dxa" w:w="1728"/>
+            <w:tcW w:type="dxa" w:w="1653"/>
             <w:tcMar>
               <w:top w:type="dxa" w:w="60"/>
               <w:left w:type="dxa" w:w="100"/>
@@ -23762,8 +26052,8 @@
         </w:tblBorders>
       </w:tblPr>
       <w:tblGrid>
-        <w:gridCol w:w="4762"/>
-        <w:gridCol w:w="4308"/>
+        <w:gridCol w:w="4233"/>
+        <w:gridCol w:w="4837"/>
       </w:tblGrid>
       <w:tr>
         <w:trPr>
@@ -23771,7 +26061,7 @@
         </w:trPr>
         <w:tc>
           <w:tcPr>
-            <w:tcW w:type="dxa" w:w="4762"/>
+            <w:tcW w:type="dxa" w:w="4233"/>
             <w:shd w:fill="E3EEEA" w:color="auto" w:val="clear"/>
             <w:tcMar>
               <w:top w:type="dxa" w:w="60"/>
@@ -23798,7 +26088,7 @@
         </w:tc>
         <w:tc>
           <w:tcPr>
-            <w:tcW w:type="dxa" w:w="4308"/>
+            <w:tcW w:type="dxa" w:w="4837"/>
             <w:shd w:fill="E3EEEA" w:color="auto" w:val="clear"/>
             <w:tcMar>
               <w:top w:type="dxa" w:w="60"/>
@@ -23830,7 +26120,7 @@
         </w:trPr>
         <w:tc>
           <w:tcPr>
-            <w:tcW w:type="dxa" w:w="4762"/>
+            <w:tcW w:type="dxa" w:w="4233"/>
             <w:tcMar>
               <w:top w:type="dxa" w:w="60"/>
               <w:left w:type="dxa" w:w="100"/>
@@ -23854,25 +26144,25 @@
         </w:tc>
         <w:tc>
           <w:tcPr>
-            <w:tcW w:type="dxa" w:w="4308"/>
-            <w:tcMar>
-              <w:top w:type="dxa" w:w="60"/>
-              <w:left w:type="dxa" w:w="100"/>
-              <w:bottom w:type="dxa" w:w="60"/>
-              <w:right w:type="dxa" w:w="100"/>
-            </w:tcMar>
-          </w:tcPr>
-          <w:p>
-            <w:pPr>
-              <w:spacing w:after="0" w:before="0" w:line="252"/>
-            </w:pPr>
-            <w:r>
-              <w:rPr>
-                <w:rFonts w:ascii="Calibri" w:cs="Calibri" w:eastAsia="Calibri" w:hAnsi="Calibri"/>
-                <w:sz w:val="18"/>
-                <w:szCs w:val="18"/>
-              </w:rPr>
-              <w:t xml:space="preserve">5 de 18 (1, 2, 3, A y 4)</w:t>
+            <w:tcW w:type="dxa" w:w="4837"/>
+            <w:tcMar>
+              <w:top w:type="dxa" w:w="60"/>
+              <w:left w:type="dxa" w:w="100"/>
+              <w:bottom w:type="dxa" w:w="60"/>
+              <w:right w:type="dxa" w:w="100"/>
+            </w:tcMar>
+          </w:tcPr>
+          <w:p>
+            <w:pPr>
+              <w:spacing w:after="0" w:before="0" w:line="252"/>
+            </w:pPr>
+            <w:r>
+              <w:rPr>
+                <w:rFonts w:ascii="Calibri" w:cs="Calibri" w:eastAsia="Calibri" w:hAnsi="Calibri"/>
+                <w:sz w:val="18"/>
+                <w:szCs w:val="18"/>
+              </w:rPr>
+              <w:t xml:space="preserve">6 de 18 (1, 2, 3, A, 4 y 5)</w:t>
             </w:r>
           </w:p>
         </w:tc>
@@ -23883,7 +26173,7 @@
         </w:trPr>
         <w:tc>
           <w:tcPr>
-            <w:tcW w:type="dxa" w:w="4762"/>
+            <w:tcW w:type="dxa" w:w="4233"/>
             <w:tcMar>
               <w:top w:type="dxa" w:w="60"/>
               <w:left w:type="dxa" w:w="100"/>
@@ -23907,25 +26197,25 @@
         </w:tc>
         <w:tc>
           <w:tcPr>
-            <w:tcW w:type="dxa" w:w="4308"/>
-            <w:tcMar>
-              <w:top w:type="dxa" w:w="60"/>
-              <w:left w:type="dxa" w:w="100"/>
-              <w:bottom w:type="dxa" w:w="60"/>
-              <w:right w:type="dxa" w:w="100"/>
-            </w:tcMar>
-          </w:tcPr>
-          <w:p>
-            <w:pPr>
-              <w:spacing w:after="0" w:before="0" w:line="252"/>
-            </w:pPr>
-            <w:r>
-              <w:rPr>
-                <w:rFonts w:ascii="Calibri" w:cs="Calibri" w:eastAsia="Calibri" w:hAnsi="Calibri"/>
-                <w:sz w:val="18"/>
-                <w:szCs w:val="18"/>
-              </w:rPr>
-              <w:t xml:space="preserve">11 (4 en core y 7 en app, uno de ellos del agente), más la documentación</w:t>
+            <w:tcW w:type="dxa" w:w="4837"/>
+            <w:tcMar>
+              <w:top w:type="dxa" w:w="60"/>
+              <w:left w:type="dxa" w:w="100"/>
+              <w:bottom w:type="dxa" w:w="60"/>
+              <w:right w:type="dxa" w:w="100"/>
+            </w:tcMar>
+          </w:tcPr>
+          <w:p>
+            <w:pPr>
+              <w:spacing w:after="0" w:before="0" w:line="252"/>
+            </w:pPr>
+            <w:r>
+              <w:rPr>
+                <w:rFonts w:ascii="Calibri" w:cs="Calibri" w:eastAsia="Calibri" w:hAnsi="Calibri"/>
+                <w:sz w:val="18"/>
+                <w:szCs w:val="18"/>
+              </w:rPr>
+              <w:t xml:space="preserve">12 (4 en core y 8 en app, dos de ellos del agente), más la documentación</w:t>
             </w:r>
           </w:p>
         </w:tc>
@@ -23936,7 +26226,7 @@
         </w:trPr>
         <w:tc>
           <w:tcPr>
-            <w:tcW w:type="dxa" w:w="4762"/>
+            <w:tcW w:type="dxa" w:w="4233"/>
             <w:tcMar>
               <w:top w:type="dxa" w:w="60"/>
               <w:left w:type="dxa" w:w="100"/>
@@ -23960,25 +26250,25 @@
         </w:tc>
         <w:tc>
           <w:tcPr>
-            <w:tcW w:type="dxa" w:w="4308"/>
-            <w:tcMar>
-              <w:top w:type="dxa" w:w="60"/>
-              <w:left w:type="dxa" w:w="100"/>
-              <w:bottom w:type="dxa" w:w="60"/>
-              <w:right w:type="dxa" w:w="100"/>
-            </w:tcMar>
-          </w:tcPr>
-          <w:p>
-            <w:pPr>
-              <w:spacing w:after="0" w:before="0" w:line="252"/>
-            </w:pPr>
-            <w:r>
-              <w:rPr>
-                <w:rFonts w:ascii="Calibri" w:cs="Calibri" w:eastAsia="Calibri" w:hAnsi="Calibri"/>
-                <w:sz w:val="18"/>
-                <w:szCs w:val="18"/>
-              </w:rPr>
-              <w:t xml:space="preserve">57 superadas</w:t>
+            <w:tcW w:type="dxa" w:w="4837"/>
+            <w:tcMar>
+              <w:top w:type="dxa" w:w="60"/>
+              <w:left w:type="dxa" w:w="100"/>
+              <w:bottom w:type="dxa" w:w="60"/>
+              <w:right w:type="dxa" w:w="100"/>
+            </w:tcMar>
+          </w:tcPr>
+          <w:p>
+            <w:pPr>
+              <w:spacing w:after="0" w:before="0" w:line="252"/>
+            </w:pPr>
+            <w:r>
+              <w:rPr>
+                <w:rFonts w:ascii="Calibri" w:cs="Calibri" w:eastAsia="Calibri" w:hAnsi="Calibri"/>
+                <w:sz w:val="18"/>
+                <w:szCs w:val="18"/>
+              </w:rPr>
+              <w:t xml:space="preserve">112 superadas (57 de harness y triage, 55 de la aplicación)</w:t>
             </w:r>
           </w:p>
         </w:tc>
@@ -23989,7 +26279,7 @@
         </w:trPr>
         <w:tc>
           <w:tcPr>
-            <w:tcW w:type="dxa" w:w="4762"/>
+            <w:tcW w:type="dxa" w:w="4233"/>
             <w:tcMar>
               <w:top w:type="dxa" w:w="60"/>
               <w:left w:type="dxa" w:w="100"/>
@@ -24013,25 +26303,25 @@
         </w:tc>
         <w:tc>
           <w:tcPr>
-            <w:tcW w:type="dxa" w:w="4308"/>
-            <w:tcMar>
-              <w:top w:type="dxa" w:w="60"/>
-              <w:left w:type="dxa" w:w="100"/>
-              <w:bottom w:type="dxa" w:w="60"/>
-              <w:right w:type="dxa" w:w="100"/>
-            </w:tcMar>
-          </w:tcPr>
-          <w:p>
-            <w:pPr>
-              <w:spacing w:after="0" w:before="0" w:line="252"/>
-            </w:pPr>
-            <w:r>
-              <w:rPr>
-                <w:rFonts w:ascii="Calibri" w:cs="Calibri" w:eastAsia="Calibri" w:hAnsi="Calibri"/>
-                <w:sz w:val="18"/>
-                <w:szCs w:val="18"/>
-              </w:rPr>
-              <w:t xml:space="preserve">54</w:t>
+            <w:tcW w:type="dxa" w:w="4837"/>
+            <w:tcMar>
+              <w:top w:type="dxa" w:w="60"/>
+              <w:left w:type="dxa" w:w="100"/>
+              <w:bottom w:type="dxa" w:w="60"/>
+              <w:right w:type="dxa" w:w="100"/>
+            </w:tcMar>
+          </w:tcPr>
+          <w:p>
+            <w:pPr>
+              <w:spacing w:after="0" w:before="0" w:line="252"/>
+            </w:pPr>
+            <w:r>
+              <w:rPr>
+                <w:rFonts w:ascii="Calibri" w:cs="Calibri" w:eastAsia="Calibri" w:hAnsi="Calibri"/>
+                <w:sz w:val="18"/>
+                <w:szCs w:val="18"/>
+              </w:rPr>
+              <w:t xml:space="preserve">60</w:t>
             </w:r>
           </w:p>
         </w:tc>
@@ -24042,7 +26332,7 @@
         </w:trPr>
         <w:tc>
           <w:tcPr>
-            <w:tcW w:type="dxa" w:w="4762"/>
+            <w:tcW w:type="dxa" w:w="4233"/>
             <w:tcMar>
               <w:top w:type="dxa" w:w="60"/>
               <w:left w:type="dxa" w:w="100"/>
@@ -24066,25 +26356,25 @@
         </w:tc>
         <w:tc>
           <w:tcPr>
-            <w:tcW w:type="dxa" w:w="4308"/>
-            <w:tcMar>
-              <w:top w:type="dxa" w:w="60"/>
-              <w:left w:type="dxa" w:w="100"/>
-              <w:bottom w:type="dxa" w:w="60"/>
-              <w:right w:type="dxa" w:w="100"/>
-            </w:tcMar>
-          </w:tcPr>
-          <w:p>
-            <w:pPr>
-              <w:spacing w:after="0" w:before="0" w:line="252"/>
-            </w:pPr>
-            <w:r>
-              <w:rPr>
-                <w:rFonts w:ascii="Calibri" w:cs="Calibri" w:eastAsia="Calibri" w:hAnsi="Calibri"/>
-                <w:sz w:val="18"/>
-                <w:szCs w:val="18"/>
-              </w:rPr>
-              <w:t xml:space="preserve">11</w:t>
+            <w:tcW w:type="dxa" w:w="4837"/>
+            <w:tcMar>
+              <w:top w:type="dxa" w:w="60"/>
+              <w:left w:type="dxa" w:w="100"/>
+              <w:bottom w:type="dxa" w:w="60"/>
+              <w:right w:type="dxa" w:w="100"/>
+            </w:tcMar>
+          </w:tcPr>
+          <w:p>
+            <w:pPr>
+              <w:spacing w:after="0" w:before="0" w:line="252"/>
+            </w:pPr>
+            <w:r>
+              <w:rPr>
+                <w:rFonts w:ascii="Calibri" w:cs="Calibri" w:eastAsia="Calibri" w:hAnsi="Calibri"/>
+                <w:sz w:val="18"/>
+                <w:szCs w:val="18"/>
+              </w:rPr>
+              <w:t xml:space="preserve">12</w:t>
             </w:r>
           </w:p>
         </w:tc>
@@ -24095,7 +26385,7 @@
         </w:trPr>
         <w:tc>
           <w:tcPr>
-            <w:tcW w:type="dxa" w:w="4762"/>
+            <w:tcW w:type="dxa" w:w="4233"/>
             <w:tcMar>
               <w:top w:type="dxa" w:w="60"/>
               <w:left w:type="dxa" w:w="100"/>
@@ -24119,7 +26409,7 @@
         </w:tc>
         <w:tc>
           <w:tcPr>
-            <w:tcW w:type="dxa" w:w="4308"/>
+            <w:tcW w:type="dxa" w:w="4837"/>
             <w:tcMar>
               <w:top w:type="dxa" w:w="60"/>
               <w:left w:type="dxa" w:w="100"/>
@@ -24163,7 +26453,7 @@
           <w:sz w:val="21"/>
           <w:szCs w:val="21"/>
         </w:rPr>
-        <w:t xml:space="preserve">Este capítulo se ampliará con las iteraciones y pruebas de las tareas 5 a 12 y B a E.</w:t>
+        <w:t xml:space="preserve">Este capítulo se ampliará con las iteraciones y pruebas de las tareas 6 a 12 y B a F.</w:t>
       </w:r>
     </w:p>
     <w:p>
@@ -25371,6 +27661,311 @@
     </w:p>
     <w:p>
       <w:pPr>
+        <w:pStyle w:val="Heading3"/>
+        <w:keepNext/>
+      </w:pPr>
+      <w:r>
+        <w:rPr>
+          <w:rFonts w:ascii="Calibri" w:cs="Calibri" w:eastAsia="Calibri" w:hAnsi="Calibri"/>
+        </w:rPr>
+        <w:t xml:space="preserve">Tarea 5. Implementación</w:t>
+      </w:r>
+    </w:p>
+    <w:p>
+      <w:pPr>
+        <w:pStyle w:val="ListParagraph"/>
+        <w:numPr>
+          <w:ilvl w:val="0"/>
+          <w:numId w:val="12"/>
+        </w:numPr>
+        <w:spacing w:after="60"/>
+      </w:pPr>
+      <w:r>
+        <w:rPr>
+          <w:rFonts w:ascii="Calibri" w:cs="Calibri" w:eastAsia="Calibri" w:hAnsi="Calibri"/>
+        </w:rPr>
+        <w:t xml:space="preserve">En el devcontainer, actualizar </w:t>
+      </w:r>
+      <w:r>
+        <w:rPr>
+          <w:rFonts w:ascii="Consolas" w:cs="Consolas" w:eastAsia="Consolas" w:hAnsi="Consolas"/>
+          <w:color w:val="2E3A36"/>
+          <w:sz w:val="20"/>
+          <w:szCs w:val="20"/>
+        </w:rPr>
+        <w:t xml:space="preserve">main</w:t>
+      </w:r>
+      <w:r>
+        <w:rPr>
+          <w:rFonts w:ascii="Calibri" w:cs="Calibri" w:eastAsia="Calibri" w:hAnsi="Calibri"/>
+        </w:rPr>
+        <w:t xml:space="preserve"> con </w:t>
+      </w:r>
+      <w:r>
+        <w:rPr>
+          <w:rFonts w:ascii="Consolas" w:cs="Consolas" w:eastAsia="Consolas" w:hAnsi="Consolas"/>
+          <w:color w:val="2E3A36"/>
+          <w:sz w:val="20"/>
+          <w:szCs w:val="20"/>
+        </w:rPr>
+        <w:t xml:space="preserve">git switch main &amp;&amp; git pull</w:t>
+      </w:r>
+      <w:r>
+        <w:rPr>
+          <w:rFonts w:ascii="Calibri" w:cs="Calibri" w:eastAsia="Calibri" w:hAnsi="Calibri"/>
+        </w:rPr>
+        <w:t xml:space="preserve"> y arrancar el agente con </w:t>
+      </w:r>
+      <w:r>
+        <w:rPr>
+          <w:rFonts w:ascii="Consolas" w:cs="Consolas" w:eastAsia="Consolas" w:hAnsi="Consolas"/>
+          <w:color w:val="2E3A36"/>
+          <w:sz w:val="20"/>
+          <w:szCs w:val="20"/>
+        </w:rPr>
+        <w:t xml:space="preserve">.devcontainer/start-agent.sh</w:t>
+      </w:r>
+      <w:r>
+        <w:rPr>
+          <w:rFonts w:ascii="Calibri" w:cs="Calibri" w:eastAsia="Calibri" w:hAnsi="Calibri"/>
+        </w:rPr>
+        <w:t xml:space="preserve">.</w:t>
+      </w:r>
+    </w:p>
+    <w:p>
+      <w:pPr>
+        <w:pStyle w:val="ListParagraph"/>
+        <w:numPr>
+          <w:ilvl w:val="0"/>
+          <w:numId w:val="12"/>
+        </w:numPr>
+        <w:spacing w:after="60"/>
+      </w:pPr>
+      <w:r>
+        <w:rPr>
+          <w:rFonts w:ascii="Calibri" w:cs="Calibri" w:eastAsia="Calibri" w:hAnsi="Calibri"/>
+        </w:rPr>
+        <w:t xml:space="preserve">Pedirle el paso 2 del flujo de </w:t>
+      </w:r>
+      <w:r>
+        <w:rPr>
+          <w:rFonts w:ascii="Consolas" w:cs="Consolas" w:eastAsia="Consolas" w:hAnsi="Consolas"/>
+          <w:color w:val="2E3A36"/>
+          <w:sz w:val="20"/>
+          <w:szCs w:val="20"/>
+        </w:rPr>
+        <w:t xml:space="preserve">AGENTS.md</w:t>
+      </w:r>
+      <w:r>
+        <w:rPr>
+          <w:rFonts w:ascii="Calibri" w:cs="Calibri" w:eastAsia="Calibri" w:hAnsi="Calibri"/>
+        </w:rPr>
+        <w:t xml:space="preserve"> para el issue: rama </w:t>
+      </w:r>
+      <w:r>
+        <w:rPr>
+          <w:rFonts w:ascii="Consolas" w:cs="Consolas" w:eastAsia="Consolas" w:hAnsi="Consolas"/>
+          <w:color w:val="2E3A36"/>
+          <w:sz w:val="20"/>
+          <w:szCs w:val="20"/>
+        </w:rPr>
+        <w:t xml:space="preserve">feat/&lt;issue&gt;-&lt;slug&gt;</w:t>
+      </w:r>
+      <w:r>
+        <w:rPr>
+          <w:rFonts w:ascii="Calibri" w:cs="Calibri" w:eastAsia="Calibri" w:hAnsi="Calibri"/>
+        </w:rPr>
+        <w:t xml:space="preserve">, </w:t>
+      </w:r>
+      <w:r>
+        <w:rPr>
+          <w:rFonts w:ascii="Consolas" w:cs="Consolas" w:eastAsia="Consolas" w:hAnsi="Consolas"/>
+          <w:color w:val="2E3A36"/>
+          <w:sz w:val="20"/>
+          <w:szCs w:val="20"/>
+        </w:rPr>
+        <w:t xml:space="preserve">/speckit-plan</w:t>
+      </w:r>
+      <w:r>
+        <w:rPr>
+          <w:rFonts w:ascii="Calibri" w:cs="Calibri" w:eastAsia="Calibri" w:hAnsi="Calibri"/>
+        </w:rPr>
+        <w:t xml:space="preserve">, </w:t>
+      </w:r>
+      <w:r>
+        <w:rPr>
+          <w:rFonts w:ascii="Consolas" w:cs="Consolas" w:eastAsia="Consolas" w:hAnsi="Consolas"/>
+          <w:color w:val="2E3A36"/>
+          <w:sz w:val="20"/>
+          <w:szCs w:val="20"/>
+        </w:rPr>
+        <w:t xml:space="preserve">/speckit-tasks</w:t>
+      </w:r>
+      <w:r>
+        <w:rPr>
+          <w:rFonts w:ascii="Calibri" w:cs="Calibri" w:eastAsia="Calibri" w:hAnsi="Calibri"/>
+        </w:rPr>
+        <w:t xml:space="preserve"> y </w:t>
+      </w:r>
+      <w:r>
+        <w:rPr>
+          <w:rFonts w:ascii="Consolas" w:cs="Consolas" w:eastAsia="Consolas" w:hAnsi="Consolas"/>
+          <w:color w:val="2E3A36"/>
+          <w:sz w:val="20"/>
+          <w:szCs w:val="20"/>
+        </w:rPr>
+        <w:t xml:space="preserve">/speckit-implement</w:t>
+      </w:r>
+      <w:r>
+        <w:rPr>
+          <w:rFonts w:ascii="Calibri" w:cs="Calibri" w:eastAsia="Calibri" w:hAnsi="Calibri"/>
+        </w:rPr>
+        <w:t xml:space="preserve">, con tests, ruff y mypy en verde y un PR con </w:t>
+      </w:r>
+      <w:r>
+        <w:rPr>
+          <w:rFonts w:ascii="Consolas" w:cs="Consolas" w:eastAsia="Consolas" w:hAnsi="Consolas"/>
+          <w:color w:val="2E3A36"/>
+          <w:sz w:val="20"/>
+          <w:szCs w:val="20"/>
+        </w:rPr>
+        <w:t xml:space="preserve">Closes #&lt;issue&gt;</w:t>
+      </w:r>
+      <w:r>
+        <w:rPr>
+          <w:rFonts w:ascii="Calibri" w:cs="Calibri" w:eastAsia="Calibri" w:hAnsi="Calibri"/>
+        </w:rPr>
+        <w:t xml:space="preserve">.</w:t>
+      </w:r>
+    </w:p>
+    <w:p>
+      <w:pPr>
+        <w:pStyle w:val="ListParagraph"/>
+        <w:numPr>
+          <w:ilvl w:val="0"/>
+          <w:numId w:val="12"/>
+        </w:numPr>
+        <w:spacing w:after="60"/>
+      </w:pPr>
+      <w:r>
+        <w:rPr>
+          <w:rFonts w:ascii="Calibri" w:cs="Calibri" w:eastAsia="Calibri" w:hAnsi="Calibri"/>
+        </w:rPr>
+        <w:t xml:space="preserve">Aprobar las escrituras de ficheros, </w:t>
+      </w:r>
+      <w:r>
+        <w:rPr>
+          <w:rFonts w:ascii="Consolas" w:cs="Consolas" w:eastAsia="Consolas" w:hAnsi="Consolas"/>
+          <w:color w:val="2E3A36"/>
+          <w:sz w:val="20"/>
+          <w:szCs w:val="20"/>
+        </w:rPr>
+        <w:t xml:space="preserve">uv add</w:t>
+      </w:r>
+      <w:r>
+        <w:rPr>
+          <w:rFonts w:ascii="Calibri" w:cs="Calibri" w:eastAsia="Calibri" w:hAnsi="Calibri"/>
+        </w:rPr>
+        <w:t xml:space="preserve"> (revisando cada dependencia) y </w:t>
+      </w:r>
+      <w:r>
+        <w:rPr>
+          <w:rFonts w:ascii="Consolas" w:cs="Consolas" w:eastAsia="Consolas" w:hAnsi="Consolas"/>
+          <w:color w:val="2E3A36"/>
+          <w:sz w:val="20"/>
+          <w:szCs w:val="20"/>
+        </w:rPr>
+        <w:t xml:space="preserve">git push</w:t>
+      </w:r>
+      <w:r>
+        <w:rPr>
+          <w:rFonts w:ascii="Calibri" w:cs="Calibri" w:eastAsia="Calibri" w:hAnsi="Calibri"/>
+        </w:rPr>
+        <w:t xml:space="preserve">.</w:t>
+      </w:r>
+    </w:p>
+    <w:p>
+      <w:pPr>
+        <w:pStyle w:val="ListParagraph"/>
+        <w:numPr>
+          <w:ilvl w:val="0"/>
+          <w:numId w:val="12"/>
+        </w:numPr>
+        <w:spacing w:after="60"/>
+      </w:pPr>
+      <w:r>
+        <w:rPr>
+          <w:rFonts w:ascii="Calibri" w:cs="Calibri" w:eastAsia="Calibri" w:hAnsi="Calibri"/>
+        </w:rPr>
+        <w:t xml:space="preserve">Revisar el PR en una copia limpia y probar la API:</w:t>
+      </w:r>
+    </w:p>
+    <w:p>
+      <w:pPr>
+        <w:shd w:fill="F2F4F3" w:color="auto" w:val="clear"/>
+        <w:spacing w:after="0" w:before="120" w:line="240"/>
+        <w:ind w:left="200" w:right="200"/>
+      </w:pPr>
+      <w:r>
+        <w:rPr>
+          <w:rFonts w:ascii="Consolas" w:cs="Consolas" w:eastAsia="Consolas" w:hAnsi="Consolas"/>
+          <w:color w:val="1F2A27"/>
+          <w:sz w:val="17"/>
+          <w:szCs w:val="17"/>
+        </w:rPr>
+        <w:t xml:space="preserve">uv sync --frozen &amp;&amp; uv run pytest -q &amp;&amp; uv run ruff check . &amp;&amp; uv run mypy src</w:t>
+      </w:r>
+    </w:p>
+    <w:p>
+      <w:pPr>
+        <w:shd w:fill="F2F4F3" w:color="auto" w:val="clear"/>
+        <w:spacing w:after="0" w:before="0" w:line="240"/>
+        <w:ind w:left="200" w:right="200"/>
+      </w:pPr>
+      <w:r>
+        <w:rPr>
+          <w:rFonts w:ascii="Consolas" w:cs="Consolas" w:eastAsia="Consolas" w:hAnsi="Consolas"/>
+          <w:color w:val="1F2A27"/>
+          <w:sz w:val="17"/>
+          <w:szCs w:val="17"/>
+        </w:rPr>
+        <w:t xml:space="preserve">uv run uvicorn app.main:app --app-dir src --port 8000</w:t>
+      </w:r>
+    </w:p>
+    <w:p>
+      <w:pPr>
+        <w:shd w:fill="F2F4F3" w:color="auto" w:val="clear"/>
+        <w:spacing w:after="160" w:before="0" w:line="240"/>
+        <w:ind w:left="200" w:right="200"/>
+      </w:pPr>
+      <w:r>
+        <w:rPr>
+          <w:rFonts w:ascii="Consolas" w:cs="Consolas" w:eastAsia="Consolas" w:hAnsi="Consolas"/>
+          <w:color w:val="1F2A27"/>
+          <w:sz w:val="17"/>
+          <w:szCs w:val="17"/>
+        </w:rPr>
+        <w:t xml:space="preserve">curl -i localhost:8000/api/v1/productos/taza-ceramica</w:t>
+      </w:r>
+    </w:p>
+    <w:p>
+      <w:pPr>
+        <w:pStyle w:val="ListParagraph"/>
+        <w:numPr>
+          <w:ilvl w:val="0"/>
+          <w:numId w:val="13"/>
+        </w:numPr>
+        <w:spacing w:after="60"/>
+      </w:pPr>
+      <w:r>
+        <w:rPr>
+          <w:rFonts w:ascii="Calibri" w:cs="Calibri" w:eastAsia="Calibri" w:hAnsi="Calibri"/>
+        </w:rPr>
+        <w:t xml:space="preserve">Aprobar y fusionar el PR; el issue se cierra solo.</w:t>
+      </w:r>
+    </w:p>
+    <w:p>
+      <w:pPr>
         <w:pBdr>
           <w:left w:val="single" w:color="0D5C4F" w:sz="18" w:space="10"/>
         </w:pBdr>
@@ -25384,7 +27979,7 @@
           <w:sz w:val="21"/>
           <w:szCs w:val="21"/>
         </w:rPr>
-        <w:t xml:space="preserve">Los pasos de las tareas 5 a 12 y B a E se añadirán al completarlas.</w:t>
+        <w:t xml:space="preserve">Los pasos de las tareas 6 a 12 y B a F se añadirán al completarlas.</w:t>
       </w:r>
     </w:p>
     <w:p>
@@ -25696,8 +28291,8 @@
         </w:tblBorders>
       </w:tblPr>
       <w:tblGrid>
-        <w:gridCol w:w="3880"/>
-        <w:gridCol w:w="5190"/>
+        <w:gridCol w:w="3923"/>
+        <w:gridCol w:w="5147"/>
       </w:tblGrid>
       <w:tr>
         <w:trPr>
@@ -25705,7 +28300,7 @@
         </w:trPr>
         <w:tc>
           <w:tcPr>
-            <w:tcW w:type="dxa" w:w="3880"/>
+            <w:tcW w:type="dxa" w:w="3923"/>
             <w:shd w:fill="E3EEEA" w:color="auto" w:val="clear"/>
             <w:tcMar>
               <w:top w:type="dxa" w:w="60"/>
@@ -25732,7 +28327,7 @@
         </w:tc>
         <w:tc>
           <w:tcPr>
-            <w:tcW w:type="dxa" w:w="5190"/>
+            <w:tcW w:type="dxa" w:w="5147"/>
             <w:shd w:fill="E3EEEA" w:color="auto" w:val="clear"/>
             <w:tcMar>
               <w:top w:type="dxa" w:w="60"/>
@@ -25764,7 +28359,7 @@
         </w:trPr>
         <w:tc>
           <w:tcPr>
-            <w:tcW w:type="dxa" w:w="3880"/>
+            <w:tcW w:type="dxa" w:w="3923"/>
             <w:tcMar>
               <w:top w:type="dxa" w:w="60"/>
               <w:left w:type="dxa" w:w="100"/>
@@ -25790,7 +28385,7 @@
         </w:tc>
         <w:tc>
           <w:tcPr>
-            <w:tcW w:type="dxa" w:w="5190"/>
+            <w:tcW w:type="dxa" w:w="5147"/>
             <w:tcMar>
               <w:top w:type="dxa" w:w="60"/>
               <w:left w:type="dxa" w:w="100"/>
@@ -25837,7 +28432,7 @@
         </w:trPr>
         <w:tc>
           <w:tcPr>
-            <w:tcW w:type="dxa" w:w="3880"/>
+            <w:tcW w:type="dxa" w:w="3923"/>
             <w:tcMar>
               <w:top w:type="dxa" w:w="60"/>
               <w:left w:type="dxa" w:w="100"/>
@@ -25862,7 +28457,7 @@
         </w:tc>
         <w:tc>
           <w:tcPr>
-            <w:tcW w:type="dxa" w:w="5190"/>
+            <w:tcW w:type="dxa" w:w="5147"/>
             <w:tcMar>
               <w:top w:type="dxa" w:w="60"/>
               <w:left w:type="dxa" w:w="100"/>
@@ -25901,7 +28496,7 @@
         </w:trPr>
         <w:tc>
           <w:tcPr>
-            <w:tcW w:type="dxa" w:w="3880"/>
+            <w:tcW w:type="dxa" w:w="3923"/>
             <w:tcMar>
               <w:top w:type="dxa" w:w="60"/>
               <w:left w:type="dxa" w:w="100"/>
@@ -25934,7 +28529,7 @@
         </w:tc>
         <w:tc>
           <w:tcPr>
-            <w:tcW w:type="dxa" w:w="5190"/>
+            <w:tcW w:type="dxa" w:w="5147"/>
             <w:tcMar>
               <w:top w:type="dxa" w:w="60"/>
               <w:left w:type="dxa" w:w="100"/>
@@ -25963,7 +28558,7 @@
         </w:trPr>
         <w:tc>
           <w:tcPr>
-            <w:tcW w:type="dxa" w:w="3880"/>
+            <w:tcW w:type="dxa" w:w="3923"/>
             <w:tcMar>
               <w:top w:type="dxa" w:w="60"/>
               <w:left w:type="dxa" w:w="100"/>
@@ -26005,7 +28600,7 @@
         </w:tc>
         <w:tc>
           <w:tcPr>
-            <w:tcW w:type="dxa" w:w="5190"/>
+            <w:tcW w:type="dxa" w:w="5147"/>
             <w:tcMar>
               <w:top w:type="dxa" w:w="60"/>
               <w:left w:type="dxa" w:w="100"/>
@@ -26051,7 +28646,7 @@
         </w:trPr>
         <w:tc>
           <w:tcPr>
-            <w:tcW w:type="dxa" w:w="3880"/>
+            <w:tcW w:type="dxa" w:w="3923"/>
             <w:tcMar>
               <w:top w:type="dxa" w:w="60"/>
               <w:left w:type="dxa" w:w="100"/>
@@ -26092,7 +28687,7 @@
         </w:tc>
         <w:tc>
           <w:tcPr>
-            <w:tcW w:type="dxa" w:w="5190"/>
+            <w:tcW w:type="dxa" w:w="5147"/>
             <w:tcMar>
               <w:top w:type="dxa" w:w="60"/>
               <w:left w:type="dxa" w:w="100"/>
@@ -26121,7 +28716,7 @@
         </w:trPr>
         <w:tc>
           <w:tcPr>
-            <w:tcW w:type="dxa" w:w="3880"/>
+            <w:tcW w:type="dxa" w:w="3923"/>
             <w:tcMar>
               <w:top w:type="dxa" w:w="60"/>
               <w:left w:type="dxa" w:w="100"/>
@@ -26145,7 +28740,7 @@
         </w:tc>
         <w:tc>
           <w:tcPr>
-            <w:tcW w:type="dxa" w:w="5190"/>
+            <w:tcW w:type="dxa" w:w="5147"/>
             <w:tcMar>
               <w:top w:type="dxa" w:w="60"/>
               <w:left w:type="dxa" w:w="100"/>
@@ -26192,7 +28787,7 @@
         </w:trPr>
         <w:tc>
           <w:tcPr>
-            <w:tcW w:type="dxa" w:w="3880"/>
+            <w:tcW w:type="dxa" w:w="3923"/>
             <w:tcMar>
               <w:top w:type="dxa" w:w="60"/>
               <w:left w:type="dxa" w:w="100"/>
@@ -26217,7 +28812,7 @@
         </w:tc>
         <w:tc>
           <w:tcPr>
-            <w:tcW w:type="dxa" w:w="5190"/>
+            <w:tcW w:type="dxa" w:w="5147"/>
             <w:tcMar>
               <w:top w:type="dxa" w:w="60"/>
               <w:left w:type="dxa" w:w="100"/>
@@ -26274,6 +28869,87 @@
           </w:p>
         </w:tc>
       </w:tr>
+      <w:tr>
+        <w:trPr>
+          <w:cantSplit/>
+        </w:trPr>
+        <w:tc>
+          <w:tcPr>
+            <w:tcW w:type="dxa" w:w="3923"/>
+            <w:tcMar>
+              <w:top w:type="dxa" w:w="60"/>
+              <w:left w:type="dxa" w:w="100"/>
+              <w:bottom w:type="dxa" w:w="60"/>
+              <w:right w:type="dxa" w:w="100"/>
+            </w:tcMar>
+          </w:tcPr>
+          <w:p>
+            <w:pPr>
+              <w:spacing w:after="0" w:before="0" w:line="252"/>
+            </w:pPr>
+            <w:r>
+              <w:rPr>
+                <w:rFonts w:ascii="Consolas" w:cs="Consolas" w:eastAsia="Consolas" w:hAnsi="Consolas"/>
+                <w:color w:val="2E3A36"/>
+                <w:sz w:val="16"/>
+                <w:szCs w:val="16"/>
+              </w:rPr>
+              <w:t xml:space="preserve">start-agent.sh: AGENT_APP_ID: Define AGENT_APP_ID</w:t>
+            </w:r>
+          </w:p>
+        </w:tc>
+        <w:tc>
+          <w:tcPr>
+            <w:tcW w:type="dxa" w:w="5147"/>
+            <w:tcMar>
+              <w:top w:type="dxa" w:w="60"/>
+              <w:left w:type="dxa" w:w="100"/>
+              <w:bottom w:type="dxa" w:w="60"/>
+              <w:right w:type="dxa" w:w="100"/>
+            </w:tcMar>
+          </w:tcPr>
+          <w:p>
+            <w:pPr>
+              <w:spacing w:after="0" w:before="0" w:line="252"/>
+            </w:pPr>
+            <w:r>
+              <w:rPr>
+                <w:rFonts w:ascii="Calibri" w:cs="Calibri" w:eastAsia="Calibri" w:hAnsi="Calibri"/>
+                <w:sz w:val="18"/>
+                <w:szCs w:val="18"/>
+              </w:rPr>
+              <w:t xml:space="preserve">La terminal está fuera del contenedor: </w:t>
+            </w:r>
+            <w:r>
+              <w:rPr>
+                <w:rFonts w:ascii="Calibri" w:cs="Calibri" w:eastAsia="Calibri" w:hAnsi="Calibri"/>
+                <w:i/>
+                <w:iCs/>
+                <w:sz w:val="18"/>
+                <w:szCs w:val="18"/>
+              </w:rPr>
+              <w:t xml:space="preserve">Dev Containers: Reopen in Container</w:t>
+            </w:r>
+            <w:r>
+              <w:rPr>
+                <w:rFonts w:ascii="Calibri" w:cs="Calibri" w:eastAsia="Calibri" w:hAnsi="Calibri"/>
+                <w:sz w:val="18"/>
+                <w:szCs w:val="18"/>
+              </w:rPr>
+              <w:t xml:space="preserve"> y comprobar con </w:t>
+            </w:r>
+            <w:r>
+              <w:rPr>
+                <w:rFonts w:ascii="Consolas" w:cs="Consolas" w:eastAsia="Consolas" w:hAnsi="Consolas"/>
+                <w:color w:val="2E3A36"/>
+                <w:sz w:val="16"/>
+                <w:szCs w:val="16"/>
+              </w:rPr>
+              <w:t xml:space="preserve">echo "$AGENT_APP_ID"</w:t>
+            </w:r>
+          </w:p>
+        </w:tc>
+      </w:tr>
     </w:tbl>
     <w:p>
       <w:pPr>
@@ -26309,7 +28985,7 @@
         <w:pStyle w:val="ListParagraph"/>
         <w:numPr>
           <w:ilvl w:val="0"/>
-          <w:numId w:val="12"/>
+          <w:numId w:val="14"/>
         </w:numPr>
         <w:spacing w:after="60"/>
       </w:pPr>
@@ -26325,7 +29001,7 @@
         <w:pStyle w:val="ListParagraph"/>
         <w:numPr>
           <w:ilvl w:val="0"/>
-          <w:numId w:val="12"/>
+          <w:numId w:val="14"/>
         </w:numPr>
         <w:spacing w:after="60"/>
       </w:pPr>
@@ -26341,7 +29017,7 @@
         <w:pStyle w:val="ListParagraph"/>
         <w:numPr>
           <w:ilvl w:val="0"/>
-          <w:numId w:val="12"/>
+          <w:numId w:val="14"/>
         </w:numPr>
         <w:spacing w:after="60"/>
       </w:pPr>
@@ -26357,7 +29033,7 @@
         <w:pStyle w:val="ListParagraph"/>
         <w:numPr>
           <w:ilvl w:val="0"/>
-          <w:numId w:val="12"/>
+          <w:numId w:val="14"/>
         </w:numPr>
         <w:spacing w:after="60"/>
       </w:pPr>
@@ -26387,7 +29063,7 @@
         <w:pStyle w:val="ListParagraph"/>
         <w:numPr>
           <w:ilvl w:val="0"/>
-          <w:numId w:val="12"/>
+          <w:numId w:val="14"/>
         </w:numPr>
         <w:spacing w:after="60"/>
       </w:pPr>
@@ -26473,7 +29149,7 @@
         </w:rPr>
         <w:t xml:space="preserve"> arXiv:2604.26275, 2026. </w:t>
       </w:r>
-      <w:hyperlink w:history="1" r:id="rIdifducm5nxuhxkfvp6wowo">
+      <w:hyperlink w:history="1" r:id="rId1fzzfd5axn92zbsrin83v">
         <w:r>
           <w:rPr>
             <w:rStyle w:val="Hyperlink"/>
@@ -26518,7 +29194,7 @@
         </w:rPr>
         <w:t xml:space="preserve">, 2026. </w:t>
       </w:r>
-      <w:hyperlink w:history="1" r:id="rIdmxpybvl2ts6dd6nub0ohi">
+      <w:hyperlink w:history="1" r:id="rId4v_gaocpqd8xze8dqh69f">
         <w:r>
           <w:rPr>
             <w:rStyle w:val="Hyperlink"/>
@@ -26563,7 +29239,7 @@
         </w:rPr>
         <w:t xml:space="preserve"> </w:t>
       </w:r>
-      <w:hyperlink w:history="1" r:id="rId8nrh8s_hb1klv6z1mv39k">
+      <w:hyperlink w:history="1" r:id="rIdqek-_yhit7f9wlmns1krg">
         <w:r>
           <w:rPr>
             <w:rStyle w:val="Hyperlink"/>
@@ -26608,7 +29284,7 @@
         </w:rPr>
         <w:t xml:space="preserve">, junio de 2026. </w:t>
       </w:r>
-      <w:hyperlink w:history="1" r:id="rIdqu719mykhp2v5ddf4223b">
+      <w:hyperlink w:history="1" r:id="rIdmovjg5zvr1l2svh4yale5">
         <w:r>
           <w:rPr>
             <w:rStyle w:val="Hyperlink"/>
@@ -26653,7 +29329,7 @@
         </w:rPr>
         <w:t xml:space="preserve"> </w:t>
       </w:r>
-      <w:hyperlink w:history="1" r:id="rIdakdh6lvkuswzdwmslywrn">
+      <w:hyperlink w:history="1" r:id="rIdp_6niin-odyvtgpqzjket">
         <w:r>
           <w:rPr>
             <w:rStyle w:val="Hyperlink"/>
@@ -26698,7 +29374,7 @@
         </w:rPr>
         <w:t xml:space="preserve"> </w:t>
       </w:r>
-      <w:hyperlink w:history="1" r:id="rIdeg4pw1hffgkrkcupvwhz7">
+      <w:hyperlink w:history="1" r:id="rIdnbvidlgnn506axywuki64">
         <w:r>
           <w:rPr>
             <w:rStyle w:val="Hyperlink"/>
@@ -26743,7 +29419,7 @@
         </w:rPr>
         <w:t xml:space="preserve">, diciembre de 2025. </w:t>
       </w:r>
-      <w:hyperlink w:history="1" r:id="rIds3upz8xrqxkiwstdqbw7e">
+      <w:hyperlink w:history="1" r:id="rIdnym0raxsyyaqa41cuwcws">
         <w:r>
           <w:rPr>
             <w:rStyle w:val="Hyperlink"/>
@@ -26788,7 +29464,7 @@
         </w:rPr>
         <w:t xml:space="preserve"> </w:t>
       </w:r>
-      <w:hyperlink w:history="1" r:id="rId7oam1c7n_8rt9vlcz4wgu">
+      <w:hyperlink w:history="1" r:id="rIdhjgy5mmh44sjg-xqoap3n">
         <w:r>
           <w:rPr>
             <w:rStyle w:val="Hyperlink"/>
@@ -26833,7 +29509,7 @@
         </w:rPr>
         <w:t xml:space="preserve"> </w:t>
       </w:r>
-      <w:hyperlink w:history="1" r:id="rIdqccdayy7azgiuakuwunfz">
+      <w:hyperlink w:history="1" r:id="rId4ixj2vazmxqrociq_hzw2">
         <w:r>
           <w:rPr>
             <w:rStyle w:val="Hyperlink"/>
@@ -26878,7 +29554,7 @@
         </w:rPr>
         <w:t xml:space="preserve"> </w:t>
       </w:r>
-      <w:hyperlink w:history="1" r:id="rIdijbchste5z4eankq0fb8a">
+      <w:hyperlink w:history="1" r:id="rId-joivfxd4ax4nfla7p0og">
         <w:r>
           <w:rPr>
             <w:rStyle w:val="Hyperlink"/>
@@ -26923,7 +29599,7 @@
         </w:rPr>
         <w:t xml:space="preserve"> </w:t>
       </w:r>
-      <w:hyperlink w:history="1" r:id="rIdeaodxl3sxexnfsyrflqos">
+      <w:hyperlink w:history="1" r:id="rIdpvxsbk07ykmzgzrlmir5g">
         <w:r>
           <w:rPr>
             <w:rStyle w:val="Hyperlink"/>
@@ -26968,7 +29644,7 @@
         </w:rPr>
         <w:t xml:space="preserve"> </w:t>
       </w:r>
-      <w:hyperlink w:history="1" r:id="rIdjttaxrnvjvqqq78pvkmjc">
+      <w:hyperlink w:history="1" r:id="rIdgpda4gc2nfzbqvfudwnmv">
         <w:r>
           <w:rPr>
             <w:rStyle w:val="Hyperlink"/>
@@ -27013,7 +29689,7 @@
         </w:rPr>
         <w:t xml:space="preserve"> </w:t>
       </w:r>
-      <w:hyperlink w:history="1" r:id="rIdgmhskmncaviep3lbfkmj_">
+      <w:hyperlink w:history="1" r:id="rId2drxcieufdtjwj1c2twm-">
         <w:r>
           <w:rPr>
             <w:rStyle w:val="Hyperlink"/>
@@ -27058,7 +29734,7 @@
         </w:rPr>
         <w:t xml:space="preserve"> </w:t>
       </w:r>
-      <w:hyperlink w:history="1" r:id="rIdo5g52yk9bmm_j2p4so7tm">
+      <w:hyperlink w:history="1" r:id="rId-udbnnqtxosc60xo7jadk">
         <w:r>
           <w:rPr>
             <w:rStyle w:val="Hyperlink"/>
@@ -27103,7 +29779,7 @@
         </w:rPr>
         <w:t xml:space="preserve"> </w:t>
       </w:r>
-      <w:hyperlink w:history="1" r:id="rIdcohciouafnvqcn-d04uj8">
+      <w:hyperlink w:history="1" r:id="rIdmabi03k_ns0pprwffqtsb">
         <w:r>
           <w:rPr>
             <w:rStyle w:val="Hyperlink"/>
@@ -27148,7 +29824,7 @@
         </w:rPr>
         <w:t xml:space="preserve"> </w:t>
       </w:r>
-      <w:hyperlink w:history="1" r:id="rIdwovk995tirro4y5ewihsg">
+      <w:hyperlink w:history="1" r:id="rIdhuafmvixdec6aexveir8k">
         <w:r>
           <w:rPr>
             <w:rStyle w:val="Hyperlink"/>
@@ -27193,7 +29869,7 @@
         </w:rPr>
         <w:t xml:space="preserve">, agosto de 2026. </w:t>
       </w:r>
-      <w:hyperlink w:history="1" r:id="rIdygp0cuuds5uztt-ga5en8">
+      <w:hyperlink w:history="1" r:id="rId4a5eifo6t-ko3n5qerk8t">
         <w:r>
           <w:rPr>
             <w:rStyle w:val="Hyperlink"/>
@@ -27238,7 +29914,7 @@
         </w:rPr>
         <w:t xml:space="preserve"> </w:t>
       </w:r>
-      <w:hyperlink w:history="1" r:id="rIdtgkbjsmnojs5adgto9ddw">
+      <w:hyperlink w:history="1" r:id="rIdtptfra66u4ukuufy6jxna">
         <w:r>
           <w:rPr>
             <w:rStyle w:val="Hyperlink"/>
@@ -27301,7 +29977,7 @@
         </w:rPr>
         <w:t xml:space="preserve"> </w:t>
       </w:r>
-      <w:hyperlink w:history="1" r:id="rIdpi8_oqashns7emmyvsz0o">
+      <w:hyperlink w:history="1" r:id="rIdnkdtjc9_-sekmtyhei2u6">
         <w:r>
           <w:rPr>
             <w:rStyle w:val="Hyperlink"/>
@@ -27346,7 +30022,7 @@
         </w:rPr>
         <w:t xml:space="preserve"> </w:t>
       </w:r>
-      <w:hyperlink w:history="1" r:id="rIdqg-ye1bmt0s5ddxrpnydp">
+      <w:hyperlink w:history="1" r:id="rIdga9u983x-k5novvpzhhot">
         <w:r>
           <w:rPr>
             <w:rStyle w:val="Hyperlink"/>
@@ -27391,7 +30067,7 @@
         </w:rPr>
         <w:t xml:space="preserve"> </w:t>
       </w:r>
-      <w:hyperlink w:history="1" r:id="rIdskvpurf2c1sb6nmwwlhwh">
+      <w:hyperlink w:history="1" r:id="rId7vt6_sxrmwskxcdzr6jd-">
         <w:r>
           <w:rPr>
             <w:rStyle w:val="Hyperlink"/>
@@ -29026,6 +31702,30 @@
     </w:lvl>
   </w:abstractNum>
   <w:abstractNum w:abstractNumId="12" w15:restartNumberingAfterBreak="0">
+    <w:multiLevelType w:val="hybridMultilevel"/>
+    <w:lvl w:ilvl="0" w15:tentative="1">
+      <w:start w:val="1"/>
+      <w:numFmt w:val="decimal"/>
+      <w:lvlText w:val="%1."/>
+      <w:lvlJc w:val="left"/>
+      <w:pPr>
+        <w:ind w:left="540" w:hanging="320"/>
+      </w:pPr>
+    </w:lvl>
+  </w:abstractNum>
+  <w:abstractNum w:abstractNumId="13" w15:restartNumberingAfterBreak="0">
+    <w:multiLevelType w:val="hybridMultilevel"/>
+    <w:lvl w:ilvl="0" w15:tentative="1">
+      <w:start w:val="5"/>
+      <w:numFmt w:val="decimal"/>
+      <w:lvlText w:val="%1."/>
+      <w:lvlJc w:val="left"/>
+      <w:pPr>
+        <w:ind w:left="540" w:hanging="320"/>
+      </w:pPr>
+    </w:lvl>
+  </w:abstractNum>
+  <w:abstractNum w:abstractNumId="14" w15:restartNumberingAfterBreak="0">
     <w:multiLevelType w:val="hybridMultilevel"/>
     <w:lvl w:ilvl="0" w15:tentative="1">
       <w:start w:val="1"/>
@@ -29105,6 +31805,18 @@
   </w:num>
   <w:num w:numId="12">
     <w:abstractNumId w:val="12"/>
+    <w:lvlOverride w:ilvl="0">
+      <w:startOverride w:val="1"/>
+    </w:lvlOverride>
+  </w:num>
+  <w:num w:numId="13">
+    <w:abstractNumId w:val="13"/>
+    <w:lvlOverride w:ilvl="0">
+      <w:startOverride w:val="5"/>
+    </w:lvlOverride>
+  </w:num>
+  <w:num w:numId="14">
+    <w:abstractNumId w:val="14"/>
     <w:lvlOverride w:ilvl="0">
       <w:startOverride w:val="1"/>
     </w:lvlOverride>

</xml_diff>

<commit_message>
docs: cierre de la tarea 6 (CI obligatorio)
- Bitácora y panel: tarea 6 hecha (core#8, app#11, prueba en app#12); tarea 7
  siguiente; instrucciones con el repo de cada paso.
- Memoria: sección de la tarea 6, prueba del bloqueo, fase 10 del registro
  (iteraciones 61 a 65), métricas, pasos reproducibles y solución de problemas.

Co-Authored-By: Claude Opus 5.5 <noreply@anthropic.com>
Claude-Session: https://claude.ai/code/session_01DJozxnTfKm9YzN69MVZq7X
</commit_message>
<xml_diff>
--- a/docs/tfm/TFM-ALM-agentico.docx
+++ b/docs/tfm/TFM-ALM-agentico.docx
@@ -14758,6 +14758,712 @@
         <w:rPr>
           <w:rFonts w:ascii="Calibri" w:cs="Calibri" w:eastAsia="Calibri" w:hAnsi="Calibri"/>
         </w:rPr>
+        <w:t xml:space="preserve">Tarea 6: CI como check obligatorio</w:t>
+      </w:r>
+    </w:p>
+    <w:p>
+      <w:pPr>
+        <w:keepNext w:val="false"/>
+        <w:spacing w:after="140" w:line="288"/>
+        <w:jc w:val="both"/>
+      </w:pPr>
+      <w:r>
+        <w:rPr>
+          <w:rFonts w:ascii="Calibri" w:cs="Calibri" w:eastAsia="Calibri" w:hAnsi="Calibri"/>
+        </w:rPr>
+        <w:t xml:space="preserve">Los tests, el lint y los tipos ya pasaban en el devcontainer, pero eso solo lo comprueba quien ha escrito el código. La tarea 6 lleva esas comprobaciones a una máquina limpia de GitHub Actions y las convierte en condición para fusionar.</w:t>
+      </w:r>
+    </w:p>
+    <w:tbl>
+      <w:tblPr>
+        <w:tblW w:type="dxa" w:w="9070"/>
+        <w:tblBorders>
+          <w:top w:val="single" w:color="C9D3CF" w:sz="4"/>
+          <w:left w:val="single" w:color="C9D3CF" w:sz="4"/>
+          <w:bottom w:val="single" w:color="C9D3CF" w:sz="4"/>
+          <w:right w:val="single" w:color="C9D3CF" w:sz="4"/>
+          <w:insideH w:val="single" w:color="C9D3CF" w:sz="4"/>
+          <w:insideV w:val="single" w:color="C9D3CF" w:sz="4"/>
+        </w:tblBorders>
+      </w:tblPr>
+      <w:tblGrid>
+        <w:gridCol w:w="1740"/>
+        <w:gridCol w:w="1900"/>
+        <w:gridCol w:w="5430"/>
+      </w:tblGrid>
+      <w:tr>
+        <w:trPr>
+          <w:tblHeader/>
+        </w:trPr>
+        <w:tc>
+          <w:tcPr>
+            <w:tcW w:type="dxa" w:w="1740"/>
+            <w:shd w:fill="E3EEEA" w:color="auto" w:val="clear"/>
+            <w:tcMar>
+              <w:top w:type="dxa" w:w="60"/>
+              <w:left w:type="dxa" w:w="100"/>
+              <w:bottom w:type="dxa" w:w="60"/>
+              <w:right w:type="dxa" w:w="100"/>
+            </w:tcMar>
+          </w:tcPr>
+          <w:p>
+            <w:pPr>
+              <w:spacing w:after="0" w:before="0" w:line="252"/>
+            </w:pPr>
+            <w:r>
+              <w:rPr>
+                <w:rFonts w:ascii="Calibri" w:cs="Calibri" w:eastAsia="Calibri" w:hAnsi="Calibri"/>
+                <w:b/>
+                <w:bCs/>
+                <w:sz w:val="18"/>
+                <w:szCs w:val="18"/>
+              </w:rPr>
+              <w:t xml:space="preserve">Pieza</w:t>
+            </w:r>
+          </w:p>
+        </w:tc>
+        <w:tc>
+          <w:tcPr>
+            <w:tcW w:type="dxa" w:w="1900"/>
+            <w:shd w:fill="E3EEEA" w:color="auto" w:val="clear"/>
+            <w:tcMar>
+              <w:top w:type="dxa" w:w="60"/>
+              <w:left w:type="dxa" w:w="100"/>
+              <w:bottom w:type="dxa" w:w="60"/>
+              <w:right w:type="dxa" w:w="100"/>
+            </w:tcMar>
+          </w:tcPr>
+          <w:p>
+            <w:pPr>
+              <w:spacing w:after="0" w:before="0" w:line="252"/>
+            </w:pPr>
+            <w:r>
+              <w:rPr>
+                <w:rFonts w:ascii="Calibri" w:cs="Calibri" w:eastAsia="Calibri" w:hAnsi="Calibri"/>
+                <w:b/>
+                <w:bCs/>
+                <w:sz w:val="18"/>
+                <w:szCs w:val="18"/>
+              </w:rPr>
+              <w:t xml:space="preserve">Repositorio</w:t>
+            </w:r>
+          </w:p>
+        </w:tc>
+        <w:tc>
+          <w:tcPr>
+            <w:tcW w:type="dxa" w:w="5430"/>
+            <w:shd w:fill="E3EEEA" w:color="auto" w:val="clear"/>
+            <w:tcMar>
+              <w:top w:type="dxa" w:w="60"/>
+              <w:left w:type="dxa" w:w="100"/>
+              <w:bottom w:type="dxa" w:w="60"/>
+              <w:right w:type="dxa" w:w="100"/>
+            </w:tcMar>
+          </w:tcPr>
+          <w:p>
+            <w:pPr>
+              <w:spacing w:after="0" w:before="0" w:line="252"/>
+            </w:pPr>
+            <w:r>
+              <w:rPr>
+                <w:rFonts w:ascii="Calibri" w:cs="Calibri" w:eastAsia="Calibri" w:hAnsi="Calibri"/>
+                <w:b/>
+                <w:bCs/>
+                <w:sz w:val="18"/>
+                <w:szCs w:val="18"/>
+              </w:rPr>
+              <w:t xml:space="preserve">Qué hace</w:t>
+            </w:r>
+          </w:p>
+        </w:tc>
+      </w:tr>
+      <w:tr>
+        <w:trPr>
+          <w:cantSplit/>
+        </w:trPr>
+        <w:tc>
+          <w:tcPr>
+            <w:tcW w:type="dxa" w:w="1740"/>
+            <w:tcMar>
+              <w:top w:type="dxa" w:w="60"/>
+              <w:left w:type="dxa" w:w="100"/>
+              <w:bottom w:type="dxa" w:w="60"/>
+              <w:right w:type="dxa" w:w="100"/>
+            </w:tcMar>
+          </w:tcPr>
+          <w:p>
+            <w:pPr>
+              <w:spacing w:after="0" w:before="0" w:line="252"/>
+            </w:pPr>
+            <w:r>
+              <w:rPr>
+                <w:rFonts w:ascii="Consolas" w:cs="Consolas" w:eastAsia="Consolas" w:hAnsi="Consolas"/>
+                <w:color w:val="2E3A36"/>
+                <w:sz w:val="16"/>
+                <w:szCs w:val="16"/>
+              </w:rPr>
+              <w:t xml:space="preserve">reusable-ci.yml</w:t>
+            </w:r>
+          </w:p>
+        </w:tc>
+        <w:tc>
+          <w:tcPr>
+            <w:tcW w:type="dxa" w:w="1900"/>
+            <w:tcMar>
+              <w:top w:type="dxa" w:w="60"/>
+              <w:left w:type="dxa" w:w="100"/>
+              <w:bottom w:type="dxa" w:w="60"/>
+              <w:right w:type="dxa" w:w="100"/>
+            </w:tcMar>
+          </w:tcPr>
+          <w:p>
+            <w:pPr>
+              <w:spacing w:after="0" w:before="0" w:line="252"/>
+            </w:pPr>
+            <w:r>
+              <w:rPr>
+                <w:rFonts w:ascii="Calibri" w:cs="Calibri" w:eastAsia="Calibri" w:hAnsi="Calibri"/>
+                <w:sz w:val="18"/>
+                <w:szCs w:val="18"/>
+              </w:rPr>
+              <w:t xml:space="preserve">core</w:t>
+            </w:r>
+          </w:p>
+        </w:tc>
+        <w:tc>
+          <w:tcPr>
+            <w:tcW w:type="dxa" w:w="5430"/>
+            <w:tcMar>
+              <w:top w:type="dxa" w:w="60"/>
+              <w:left w:type="dxa" w:w="100"/>
+              <w:bottom w:type="dxa" w:w="60"/>
+              <w:right w:type="dxa" w:w="100"/>
+            </w:tcMar>
+          </w:tcPr>
+          <w:p>
+            <w:pPr>
+              <w:spacing w:after="0" w:before="0" w:line="252"/>
+            </w:pPr>
+            <w:r>
+              <w:rPr>
+                <w:rFonts w:ascii="Calibri" w:cs="Calibri" w:eastAsia="Calibri" w:hAnsi="Calibri"/>
+                <w:sz w:val="18"/>
+                <w:szCs w:val="18"/>
+              </w:rPr>
+              <w:t xml:space="preserve">Instala exactamente lo que fija </w:t>
+            </w:r>
+            <w:r>
+              <w:rPr>
+                <w:rFonts w:ascii="Consolas" w:cs="Consolas" w:eastAsia="Consolas" w:hAnsi="Consolas"/>
+                <w:color w:val="2E3A36"/>
+                <w:sz w:val="16"/>
+                <w:szCs w:val="16"/>
+              </w:rPr>
+              <w:t xml:space="preserve">uv.lock</w:t>
+            </w:r>
+            <w:r>
+              <w:rPr>
+                <w:rFonts w:ascii="Calibri" w:cs="Calibri" w:eastAsia="Calibri" w:hAnsi="Calibri"/>
+                <w:sz w:val="18"/>
+                <w:szCs w:val="18"/>
+              </w:rPr>
+              <w:t xml:space="preserve"> y ejecuta pytest, ruff (lint y formato) y mypy</w:t>
+            </w:r>
+          </w:p>
+        </w:tc>
+      </w:tr>
+      <w:tr>
+        <w:trPr>
+          <w:cantSplit/>
+        </w:trPr>
+        <w:tc>
+          <w:tcPr>
+            <w:tcW w:type="dxa" w:w="1740"/>
+            <w:tcMar>
+              <w:top w:type="dxa" w:w="60"/>
+              <w:left w:type="dxa" w:w="100"/>
+              <w:bottom w:type="dxa" w:w="60"/>
+              <w:right w:type="dxa" w:w="100"/>
+            </w:tcMar>
+          </w:tcPr>
+          <w:p>
+            <w:pPr>
+              <w:spacing w:after="0" w:before="0" w:line="252"/>
+            </w:pPr>
+            <w:r>
+              <w:rPr>
+                <w:rFonts w:ascii="Consolas" w:cs="Consolas" w:eastAsia="Consolas" w:hAnsi="Consolas"/>
+                <w:color w:val="2E3A36"/>
+                <w:sz w:val="16"/>
+                <w:szCs w:val="16"/>
+              </w:rPr>
+              <w:t xml:space="preserve">ci.yml</w:t>
+            </w:r>
+          </w:p>
+        </w:tc>
+        <w:tc>
+          <w:tcPr>
+            <w:tcW w:type="dxa" w:w="1900"/>
+            <w:tcMar>
+              <w:top w:type="dxa" w:w="60"/>
+              <w:left w:type="dxa" w:w="100"/>
+              <w:bottom w:type="dxa" w:w="60"/>
+              <w:right w:type="dxa" w:w="100"/>
+            </w:tcMar>
+          </w:tcPr>
+          <w:p>
+            <w:pPr>
+              <w:spacing w:after="0" w:before="0" w:line="252"/>
+            </w:pPr>
+            <w:r>
+              <w:rPr>
+                <w:rFonts w:ascii="Calibri" w:cs="Calibri" w:eastAsia="Calibri" w:hAnsi="Calibri"/>
+                <w:sz w:val="18"/>
+                <w:szCs w:val="18"/>
+              </w:rPr>
+              <w:t xml:space="preserve">core</w:t>
+            </w:r>
+          </w:p>
+        </w:tc>
+        <w:tc>
+          <w:tcPr>
+            <w:tcW w:type="dxa" w:w="5430"/>
+            <w:tcMar>
+              <w:top w:type="dxa" w:w="60"/>
+              <w:left w:type="dxa" w:w="100"/>
+              <w:bottom w:type="dxa" w:w="60"/>
+              <w:right w:type="dxa" w:w="100"/>
+            </w:tcMar>
+          </w:tcPr>
+          <w:p>
+            <w:pPr>
+              <w:spacing w:after="0" w:before="0" w:line="252"/>
+            </w:pPr>
+            <w:r>
+              <w:rPr>
+                <w:rFonts w:ascii="Calibri" w:cs="Calibri" w:eastAsia="Calibri" w:hAnsi="Calibri"/>
+                <w:sz w:val="18"/>
+                <w:szCs w:val="18"/>
+              </w:rPr>
+              <w:t xml:space="preserve">Ejecuta en cada PR de core los 57 tests propios del hook y del triage</w:t>
+            </w:r>
+          </w:p>
+        </w:tc>
+      </w:tr>
+      <w:tr>
+        <w:trPr>
+          <w:cantSplit/>
+        </w:trPr>
+        <w:tc>
+          <w:tcPr>
+            <w:tcW w:type="dxa" w:w="1740"/>
+            <w:tcMar>
+              <w:top w:type="dxa" w:w="60"/>
+              <w:left w:type="dxa" w:w="100"/>
+              <w:bottom w:type="dxa" w:w="60"/>
+              <w:right w:type="dxa" w:w="100"/>
+            </w:tcMar>
+          </w:tcPr>
+          <w:p>
+            <w:pPr>
+              <w:spacing w:after="0" w:before="0" w:line="252"/>
+            </w:pPr>
+            <w:r>
+              <w:rPr>
+                <w:rFonts w:ascii="Consolas" w:cs="Consolas" w:eastAsia="Consolas" w:hAnsi="Consolas"/>
+                <w:color w:val="2E3A36"/>
+                <w:sz w:val="16"/>
+                <w:szCs w:val="16"/>
+              </w:rPr>
+              <w:t xml:space="preserve">ci.yml</w:t>
+            </w:r>
+          </w:p>
+        </w:tc>
+        <w:tc>
+          <w:tcPr>
+            <w:tcW w:type="dxa" w:w="1900"/>
+            <w:tcMar>
+              <w:top w:type="dxa" w:w="60"/>
+              <w:left w:type="dxa" w:w="100"/>
+              <w:bottom w:type="dxa" w:w="60"/>
+              <w:right w:type="dxa" w:w="100"/>
+            </w:tcMar>
+          </w:tcPr>
+          <w:p>
+            <w:pPr>
+              <w:spacing w:after="0" w:before="0" w:line="252"/>
+            </w:pPr>
+            <w:r>
+              <w:rPr>
+                <w:rFonts w:ascii="Calibri" w:cs="Calibri" w:eastAsia="Calibri" w:hAnsi="Calibri"/>
+                <w:sz w:val="18"/>
+                <w:szCs w:val="18"/>
+              </w:rPr>
+              <w:t xml:space="preserve">app</w:t>
+            </w:r>
+          </w:p>
+        </w:tc>
+        <w:tc>
+          <w:tcPr>
+            <w:tcW w:type="dxa" w:w="5430"/>
+            <w:tcMar>
+              <w:top w:type="dxa" w:w="60"/>
+              <w:left w:type="dxa" w:w="100"/>
+              <w:bottom w:type="dxa" w:w="60"/>
+              <w:right w:type="dxa" w:w="100"/>
+            </w:tcMar>
+          </w:tcPr>
+          <w:p>
+            <w:pPr>
+              <w:spacing w:after="0" w:before="0" w:line="252"/>
+            </w:pPr>
+            <w:r>
+              <w:rPr>
+                <w:rFonts w:ascii="Calibri" w:cs="Calibri" w:eastAsia="Calibri" w:hAnsi="Calibri"/>
+                <w:sz w:val="18"/>
+                <w:szCs w:val="18"/>
+              </w:rPr>
+              <w:t xml:space="preserve">Llama a </w:t>
+            </w:r>
+            <w:r>
+              <w:rPr>
+                <w:rFonts w:ascii="Consolas" w:cs="Consolas" w:eastAsia="Consolas" w:hAnsi="Consolas"/>
+                <w:color w:val="2E3A36"/>
+                <w:sz w:val="16"/>
+                <w:szCs w:val="16"/>
+              </w:rPr>
+              <w:t xml:space="preserve">reusable-ci.yml@v1</w:t>
+            </w:r>
+            <w:r>
+              <w:rPr>
+                <w:rFonts w:ascii="Calibri" w:cs="Calibri" w:eastAsia="Calibri" w:hAnsi="Calibri"/>
+                <w:sz w:val="18"/>
+                <w:szCs w:val="18"/>
+              </w:rPr>
+              <w:t xml:space="preserve"> en cada PR y en cada push a </w:t>
+            </w:r>
+            <w:r>
+              <w:rPr>
+                <w:rFonts w:ascii="Consolas" w:cs="Consolas" w:eastAsia="Consolas" w:hAnsi="Consolas"/>
+                <w:color w:val="2E3A36"/>
+                <w:sz w:val="16"/>
+                <w:szCs w:val="16"/>
+              </w:rPr>
+              <w:t xml:space="preserve">main</w:t>
+            </w:r>
+            <w:r>
+              <w:rPr>
+                <w:rFonts w:ascii="Calibri" w:cs="Calibri" w:eastAsia="Calibri" w:hAnsi="Calibri"/>
+                <w:sz w:val="18"/>
+                <w:szCs w:val="18"/>
+              </w:rPr>
+              <w:t xml:space="preserve">; el check se llama </w:t>
+            </w:r>
+            <w:r>
+              <w:rPr>
+                <w:rFonts w:ascii="Consolas" w:cs="Consolas" w:eastAsia="Consolas" w:hAnsi="Consolas"/>
+                <w:color w:val="2E3A36"/>
+                <w:sz w:val="16"/>
+                <w:szCs w:val="16"/>
+              </w:rPr>
+              <w:t xml:space="preserve">ci / checks</w:t>
+            </w:r>
+          </w:p>
+        </w:tc>
+      </w:tr>
+      <w:tr>
+        <w:trPr>
+          <w:cantSplit/>
+        </w:trPr>
+        <w:tc>
+          <w:tcPr>
+            <w:tcW w:type="dxa" w:w="1740"/>
+            <w:tcMar>
+              <w:top w:type="dxa" w:w="60"/>
+              <w:left w:type="dxa" w:w="100"/>
+              <w:bottom w:type="dxa" w:w="60"/>
+              <w:right w:type="dxa" w:w="100"/>
+            </w:tcMar>
+          </w:tcPr>
+          <w:p>
+            <w:pPr>
+              <w:spacing w:after="0" w:before="0" w:line="252"/>
+            </w:pPr>
+            <w:r>
+              <w:rPr>
+                <w:rFonts w:ascii="Calibri" w:cs="Calibri" w:eastAsia="Calibri" w:hAnsi="Calibri"/>
+                <w:sz w:val="18"/>
+                <w:szCs w:val="18"/>
+              </w:rPr>
+              <w:t xml:space="preserve">Ruleset de </w:t>
+            </w:r>
+            <w:r>
+              <w:rPr>
+                <w:rFonts w:ascii="Consolas" w:cs="Consolas" w:eastAsia="Consolas" w:hAnsi="Consolas"/>
+                <w:color w:val="2E3A36"/>
+                <w:sz w:val="16"/>
+                <w:szCs w:val="16"/>
+              </w:rPr>
+              <w:t xml:space="preserve">main</w:t>
+            </w:r>
+          </w:p>
+        </w:tc>
+        <w:tc>
+          <w:tcPr>
+            <w:tcW w:type="dxa" w:w="1900"/>
+            <w:tcMar>
+              <w:top w:type="dxa" w:w="60"/>
+              <w:left w:type="dxa" w:w="100"/>
+              <w:bottom w:type="dxa" w:w="60"/>
+              <w:right w:type="dxa" w:w="100"/>
+            </w:tcMar>
+          </w:tcPr>
+          <w:p>
+            <w:pPr>
+              <w:spacing w:after="0" w:before="0" w:line="252"/>
+            </w:pPr>
+            <w:r>
+              <w:rPr>
+                <w:rFonts w:ascii="Calibri" w:cs="Calibri" w:eastAsia="Calibri" w:hAnsi="Calibri"/>
+                <w:sz w:val="18"/>
+                <w:szCs w:val="18"/>
+              </w:rPr>
+              <w:t xml:space="preserve">app</w:t>
+            </w:r>
+          </w:p>
+        </w:tc>
+        <w:tc>
+          <w:tcPr>
+            <w:tcW w:type="dxa" w:w="5430"/>
+            <w:tcMar>
+              <w:top w:type="dxa" w:w="60"/>
+              <w:left w:type="dxa" w:w="100"/>
+              <w:bottom w:type="dxa" w:w="60"/>
+              <w:right w:type="dxa" w:w="100"/>
+            </w:tcMar>
+          </w:tcPr>
+          <w:p>
+            <w:pPr>
+              <w:spacing w:after="0" w:before="0" w:line="252"/>
+            </w:pPr>
+            <w:r>
+              <w:rPr>
+                <w:rFonts w:ascii="Consolas" w:cs="Consolas" w:eastAsia="Consolas" w:hAnsi="Consolas"/>
+                <w:color w:val="2E3A36"/>
+                <w:sz w:val="16"/>
+                <w:szCs w:val="16"/>
+              </w:rPr>
+              <w:t xml:space="preserve">ci / checks</w:t>
+            </w:r>
+            <w:r>
+              <w:rPr>
+                <w:rFonts w:ascii="Calibri" w:cs="Calibri" w:eastAsia="Calibri" w:hAnsi="Calibri"/>
+                <w:sz w:val="18"/>
+                <w:szCs w:val="18"/>
+              </w:rPr>
+              <w:t xml:space="preserve"> pasa a ser obligatorio, además de la aprobación de Code Owners</w:t>
+            </w:r>
+          </w:p>
+        </w:tc>
+      </w:tr>
+    </w:tbl>
+    <w:p>
+      <w:pPr>
+        <w:spacing w:after="120"/>
+      </w:pPr>
+    </w:p>
+    <w:p>
+      <w:pPr>
+        <w:keepNext w:val="false"/>
+        <w:spacing w:after="140" w:line="288"/>
+        <w:jc w:val="both"/>
+      </w:pPr>
+      <w:r>
+        <w:rPr>
+          <w:rFonts w:ascii="Calibri" w:cs="Calibri" w:eastAsia="Calibri" w:hAnsi="Calibri"/>
+        </w:rPr>
+        <w:t xml:space="preserve">El workflow de core se escribió con las mismas precauciones que el triage. Las acciones van fijadas por SHA y no por etiqueta, el job solo tiene permiso de lectura y no conserva credenciales, y las entradas llegan a la shell por variables de entorno. El agente no puede cambiar nada de esto: el workflow vive en core y la App del agente no tiene permiso sobre </w:t>
+      </w:r>
+      <w:r>
+        <w:rPr>
+          <w:rFonts w:ascii="Consolas" w:cs="Consolas" w:eastAsia="Consolas" w:hAnsi="Consolas"/>
+          <w:color w:val="2E3A36"/>
+          <w:sz w:val="20"/>
+          <w:szCs w:val="20"/>
+        </w:rPr>
+        <w:t xml:space="preserve">.github/workflows/</w:t>
+      </w:r>
+      <w:r>
+        <w:rPr>
+          <w:rFonts w:ascii="Calibri" w:cs="Calibri" w:eastAsia="Calibri" w:hAnsi="Calibri"/>
+        </w:rPr>
+        <w:t xml:space="preserve"> en app.</w:t>
+      </w:r>
+    </w:p>
+    <w:p>
+      <w:pPr>
+        <w:pStyle w:val="Heading3"/>
+        <w:keepNext/>
+      </w:pPr>
+      <w:r>
+        <w:rPr>
+          <w:rFonts w:ascii="Calibri" w:cs="Calibri" w:eastAsia="Calibri" w:hAnsi="Calibri"/>
+        </w:rPr>
+        <w:t xml:space="preserve">Puesta en marcha</w:t>
+      </w:r>
+    </w:p>
+    <w:p>
+      <w:pPr>
+        <w:keepNext w:val="false"/>
+        <w:spacing w:after="140" w:line="288"/>
+        <w:jc w:val="both"/>
+      </w:pPr>
+      <w:r>
+        <w:rPr>
+          <w:rFonts w:ascii="Calibri" w:cs="Calibri" w:eastAsia="Calibri" w:hAnsi="Calibri"/>
+        </w:rPr>
+        <w:t xml:space="preserve">Para que app viera el workflow nuevo hubo que mover la etiqueta </w:t>
+      </w:r>
+      <w:r>
+        <w:rPr>
+          <w:rFonts w:ascii="Consolas" w:cs="Consolas" w:eastAsia="Consolas" w:hAnsi="Consolas"/>
+          <w:color w:val="2E3A36"/>
+          <w:sz w:val="20"/>
+          <w:szCs w:val="20"/>
+        </w:rPr>
+        <w:t xml:space="preserve">v1</w:t>
+      </w:r>
+      <w:r>
+        <w:rPr>
+          <w:rFonts w:ascii="Calibri" w:cs="Calibri" w:eastAsia="Calibri" w:hAnsi="Calibri"/>
+        </w:rPr>
+        <w:t xml:space="preserve"> de core a la nueva </w:t>
+      </w:r>
+      <w:r>
+        <w:rPr>
+          <w:rFonts w:ascii="Consolas" w:cs="Consolas" w:eastAsia="Consolas" w:hAnsi="Consolas"/>
+          <w:color w:val="2E3A36"/>
+          <w:sz w:val="20"/>
+          <w:szCs w:val="20"/>
+        </w:rPr>
+        <w:t xml:space="preserve">main</w:t>
+      </w:r>
+      <w:r>
+        <w:rPr>
+          <w:rFonts w:ascii="Calibri" w:cs="Calibri" w:eastAsia="Calibri" w:hAnsi="Calibri"/>
+        </w:rPr>
+        <w:t xml:space="preserve">. El responsable se encontró con dos obstáculos. GitHub le pidió activar la verificación en dos pasos y, con ella activa, git ya no aceptaba la contraseña por HTTPS; se resolvió moviendo la etiqueta desde la web (borrar la release y la etiqueta y crearlas de nuevo sobre </w:t>
+      </w:r>
+      <w:r>
+        <w:rPr>
+          <w:rFonts w:ascii="Consolas" w:cs="Consolas" w:eastAsia="Consolas" w:hAnsi="Consolas"/>
+          <w:color w:val="2E3A36"/>
+          <w:sz w:val="20"/>
+          <w:szCs w:val="20"/>
+        </w:rPr>
+        <w:t xml:space="preserve">main</w:t>
+      </w:r>
+      <w:r>
+        <w:rPr>
+          <w:rFonts w:ascii="Calibri" w:cs="Calibri" w:eastAsia="Calibri" w:hAnsi="Calibri"/>
+        </w:rPr>
+        <w:t xml:space="preserve">, junto con una </w:t>
+      </w:r>
+      <w:r>
+        <w:rPr>
+          <w:rFonts w:ascii="Consolas" w:cs="Consolas" w:eastAsia="Consolas" w:hAnsi="Consolas"/>
+          <w:color w:val="2E3A36"/>
+          <w:sz w:val="20"/>
+          <w:szCs w:val="20"/>
+        </w:rPr>
+        <w:t xml:space="preserve">v1.1.0</w:t>
+      </w:r>
+      <w:r>
+        <w:rPr>
+          <w:rFonts w:ascii="Calibri" w:cs="Calibri" w:eastAsia="Calibri" w:hAnsi="Calibri"/>
+        </w:rPr>
+        <w:t xml:space="preserve">). Después, la primera ejecución del CI en app#11 no se podía relanzar, porque había fallado antes de arrancar al no encontrar el workflow en la </w:t>
+      </w:r>
+      <w:r>
+        <w:rPr>
+          <w:rFonts w:ascii="Consolas" w:cs="Consolas" w:eastAsia="Consolas" w:hAnsi="Consolas"/>
+          <w:color w:val="2E3A36"/>
+          <w:sz w:val="20"/>
+          <w:szCs w:val="20"/>
+        </w:rPr>
+        <w:t xml:space="preserve">v1</w:t>
+      </w:r>
+      <w:r>
+        <w:rPr>
+          <w:rFonts w:ascii="Calibri" w:cs="Calibri" w:eastAsia="Calibri" w:hAnsi="Calibri"/>
+        </w:rPr>
+        <w:t xml:space="preserve"> antigua; un commit vacío en la rama lanzó una ejecución nueva, que salió en verde.</w:t>
+      </w:r>
+    </w:p>
+    <w:p>
+      <w:pPr>
+        <w:pStyle w:val="Heading3"/>
+        <w:keepNext/>
+      </w:pPr>
+      <w:r>
+        <w:rPr>
+          <w:rFonts w:ascii="Calibri" w:cs="Calibri" w:eastAsia="Calibri" w:hAnsi="Calibri"/>
+        </w:rPr>
+        <w:t xml:space="preserve">Prueba del bloqueo</w:t>
+      </w:r>
+    </w:p>
+    <w:p>
+      <w:pPr>
+        <w:keepNext w:val="false"/>
+        <w:spacing w:after="140" w:line="288"/>
+        <w:jc w:val="both"/>
+      </w:pPr>
+      <w:r>
+        <w:rPr>
+          <w:rFonts w:ascii="Calibri" w:cs="Calibri" w:eastAsia="Calibri" w:hAnsi="Calibri"/>
+        </w:rPr>
+        <w:t xml:space="preserve">Para comprobar que el check bloquea de verdad se abrió un PR de prueba (app#12) con un </w:t>
+      </w:r>
+      <w:r>
+        <w:rPr>
+          <w:rFonts w:ascii="Consolas" w:cs="Consolas" w:eastAsia="Consolas" w:hAnsi="Consolas"/>
+          <w:color w:val="2E3A36"/>
+          <w:sz w:val="20"/>
+          <w:szCs w:val="20"/>
+        </w:rPr>
+        <w:t xml:space="preserve">import</w:t>
+      </w:r>
+      <w:r>
+        <w:rPr>
+          <w:rFonts w:ascii="Calibri" w:cs="Calibri" w:eastAsia="Calibri" w:hAnsi="Calibri"/>
+        </w:rPr>
+        <w:t xml:space="preserve"> sin usar. El CI terminó en rojo con la anotación de ruff en la línea exacta (</w:t>
+      </w:r>
+      <w:r>
+        <w:rPr>
+          <w:rFonts w:ascii="Consolas" w:cs="Consolas" w:eastAsia="Consolas" w:hAnsi="Consolas"/>
+          <w:color w:val="2E3A36"/>
+          <w:sz w:val="20"/>
+          <w:szCs w:val="20"/>
+        </w:rPr>
+        <w:t xml:space="preserve">F401 os imported but unused</w:t>
+      </w:r>
+      <w:r>
+        <w:rPr>
+          <w:rFonts w:ascii="Calibri" w:cs="Calibri" w:eastAsia="Calibri" w:hAnsi="Calibri"/>
+        </w:rPr>
+        <w:t xml:space="preserve">) y GitHub marcó el PR como bloqueado. El PR se cerró sin fusionar.</w:t>
+      </w:r>
+    </w:p>
+    <w:p>
+      <w:pPr>
+        <w:pStyle w:val="Heading2"/>
+        <w:keepNext/>
+      </w:pPr>
+      <w:r>
+        <w:rPr>
+          <w:rFonts w:ascii="Calibri" w:cs="Calibri" w:eastAsia="Calibri" w:hAnsi="Calibri"/>
+        </w:rPr>
         <w:t xml:space="preserve">Tareas pendientes</w:t>
       </w:r>
     </w:p>
@@ -14776,7 +15482,7 @@
           <w:sz w:val="21"/>
           <w:szCs w:val="21"/>
         </w:rPr>
-        <w:t xml:space="preserve">Las secciones de las tareas 6 a 12 y de las extensiones B a F se añadirán a medida que se implementen: CI, análisis de seguridad, agente revisor, agente autónomo, cadena de suministro, despliegue GitOps, </w:t>
+        <w:t xml:space="preserve">Las secciones de las tareas 7 a 12 y de las extensiones B a F se añadirán a medida que se implementen: análisis de seguridad, agente revisor, agente autónomo, cadena de suministro, despliegue GitOps, </w:t>
       </w:r>
       <w:r>
         <w:rPr>
@@ -22525,9 +23231,9 @@
         </w:tblBorders>
       </w:tblPr>
       <w:tblGrid>
-        <w:gridCol w:w="700"/>
-        <w:gridCol w:w="2941"/>
-        <w:gridCol w:w="3829"/>
+        <w:gridCol w:w="1181"/>
+        <w:gridCol w:w="3287"/>
+        <w:gridCol w:w="3002"/>
         <w:gridCol w:w="1600"/>
       </w:tblGrid>
       <w:tr>
@@ -22536,7 +23242,7 @@
         </w:trPr>
         <w:tc>
           <w:tcPr>
-            <w:tcW w:type="dxa" w:w="700"/>
+            <w:tcW w:type="dxa" w:w="1181"/>
             <w:shd w:fill="E3EEEA" w:color="auto" w:val="clear"/>
             <w:tcMar>
               <w:top w:type="dxa" w:w="60"/>
@@ -22563,7 +23269,7 @@
         </w:tc>
         <w:tc>
           <w:tcPr>
-            <w:tcW w:type="dxa" w:w="2941"/>
+            <w:tcW w:type="dxa" w:w="3287"/>
             <w:shd w:fill="E3EEEA" w:color="auto" w:val="clear"/>
             <w:tcMar>
               <w:top w:type="dxa" w:w="60"/>
@@ -22590,7 +23296,7 @@
         </w:tc>
         <w:tc>
           <w:tcPr>
-            <w:tcW w:type="dxa" w:w="3829"/>
+            <w:tcW w:type="dxa" w:w="3002"/>
             <w:shd w:fill="E3EEEA" w:color="auto" w:val="clear"/>
             <w:tcMar>
               <w:top w:type="dxa" w:w="60"/>
@@ -22649,7 +23355,7 @@
         </w:trPr>
         <w:tc>
           <w:tcPr>
-            <w:tcW w:type="dxa" w:w="700"/>
+            <w:tcW w:type="dxa" w:w="1181"/>
             <w:tcMar>
               <w:top w:type="dxa" w:w="60"/>
               <w:left w:type="dxa" w:w="100"/>
@@ -22673,7 +23379,7 @@
         </w:tc>
         <w:tc>
           <w:tcPr>
-            <w:tcW w:type="dxa" w:w="2941"/>
+            <w:tcW w:type="dxa" w:w="3287"/>
             <w:tcMar>
               <w:top w:type="dxa" w:w="60"/>
               <w:left w:type="dxa" w:w="100"/>
@@ -22697,7 +23403,7 @@
         </w:tc>
         <w:tc>
           <w:tcPr>
-            <w:tcW w:type="dxa" w:w="3829"/>
+            <w:tcW w:type="dxa" w:w="3002"/>
             <w:tcMar>
               <w:top w:type="dxa" w:w="60"/>
               <w:left w:type="dxa" w:w="100"/>
@@ -22784,7 +23490,7 @@
         </w:trPr>
         <w:tc>
           <w:tcPr>
-            <w:tcW w:type="dxa" w:w="700"/>
+            <w:tcW w:type="dxa" w:w="1181"/>
             <w:tcMar>
               <w:top w:type="dxa" w:w="60"/>
               <w:left w:type="dxa" w:w="100"/>
@@ -22808,7 +23514,7 @@
         </w:tc>
         <w:tc>
           <w:tcPr>
-            <w:tcW w:type="dxa" w:w="2941"/>
+            <w:tcW w:type="dxa" w:w="3287"/>
             <w:tcMar>
               <w:top w:type="dxa" w:w="60"/>
               <w:left w:type="dxa" w:w="100"/>
@@ -22832,7 +23538,7 @@
         </w:tc>
         <w:tc>
           <w:tcPr>
-            <w:tcW w:type="dxa" w:w="3829"/>
+            <w:tcW w:type="dxa" w:w="3002"/>
             <w:tcMar>
               <w:top w:type="dxa" w:w="60"/>
               <w:left w:type="dxa" w:w="100"/>
@@ -22885,7 +23591,7 @@
         </w:trPr>
         <w:tc>
           <w:tcPr>
-            <w:tcW w:type="dxa" w:w="700"/>
+            <w:tcW w:type="dxa" w:w="1181"/>
             <w:tcMar>
               <w:top w:type="dxa" w:w="60"/>
               <w:left w:type="dxa" w:w="100"/>
@@ -22909,7 +23615,7 @@
         </w:tc>
         <w:tc>
           <w:tcPr>
-            <w:tcW w:type="dxa" w:w="2941"/>
+            <w:tcW w:type="dxa" w:w="3287"/>
             <w:tcMar>
               <w:top w:type="dxa" w:w="60"/>
               <w:left w:type="dxa" w:w="100"/>
@@ -22928,31 +23634,39 @@
                 <w:sz w:val="16"/>
                 <w:szCs w:val="16"/>
               </w:rPr>
-              <w:t xml:space="preserve">start-agent.sh: AGENT_APP_ID: Define AGENT_APP_ID</w:t>
-            </w:r>
-          </w:p>
-        </w:tc>
-        <w:tc>
-          <w:tcPr>
-            <w:tcW w:type="dxa" w:w="3829"/>
-            <w:tcMar>
-              <w:top w:type="dxa" w:w="60"/>
-              <w:left w:type="dxa" w:w="100"/>
-              <w:bottom w:type="dxa" w:w="60"/>
-              <w:right w:type="dxa" w:w="100"/>
-            </w:tcMar>
-          </w:tcPr>
-          <w:p>
-            <w:pPr>
-              <w:spacing w:after="0" w:before="0" w:line="252"/>
-            </w:pPr>
-            <w:r>
-              <w:rPr>
-                <w:rFonts w:ascii="Calibri" w:cs="Calibri" w:eastAsia="Calibri" w:hAnsi="Calibri"/>
-                <w:sz w:val="18"/>
-                <w:szCs w:val="18"/>
-              </w:rPr>
-              <w:t xml:space="preserve">Verifica que la variable está en </w:t>
+              <w:t xml:space="preserve">git push</w:t>
+            </w:r>
+            <w:r>
+              <w:rPr>
+                <w:rFonts w:ascii="Calibri" w:cs="Calibri" w:eastAsia="Calibri" w:hAnsi="Calibri"/>
+                <w:sz w:val="18"/>
+                <w:szCs w:val="18"/>
+              </w:rPr>
+              <w:t xml:space="preserve"> rechazado tras activar 2FA</w:t>
+            </w:r>
+          </w:p>
+        </w:tc>
+        <w:tc>
+          <w:tcPr>
+            <w:tcW w:type="dxa" w:w="3002"/>
+            <w:tcMar>
+              <w:top w:type="dxa" w:w="60"/>
+              <w:left w:type="dxa" w:w="100"/>
+              <w:bottom w:type="dxa" w:w="60"/>
+              <w:right w:type="dxa" w:w="100"/>
+            </w:tcMar>
+          </w:tcPr>
+          <w:p>
+            <w:pPr>
+              <w:spacing w:after="0" w:before="0" w:line="252"/>
+            </w:pPr>
+            <w:r>
+              <w:rPr>
+                <w:rFonts w:ascii="Calibri" w:cs="Calibri" w:eastAsia="Calibri" w:hAnsi="Calibri"/>
+                <w:sz w:val="18"/>
+                <w:szCs w:val="18"/>
+              </w:rPr>
+              <w:t xml:space="preserve">Iniciar sesión con </w:t>
             </w:r>
             <w:r>
               <w:rPr>
@@ -22961,15 +23675,50 @@
                 <w:sz w:val="16"/>
                 <w:szCs w:val="16"/>
               </w:rPr>
-              <w:t xml:space="preserve">devcontainer.json</w:t>
-            </w:r>
-            <w:r>
-              <w:rPr>
-                <w:rFonts w:ascii="Calibri" w:cs="Calibri" w:eastAsia="Calibri" w:hAnsi="Calibri"/>
-                <w:sz w:val="18"/>
-                <w:szCs w:val="18"/>
-              </w:rPr>
-              <w:t xml:space="preserve"> y deduce que la terminal estaba fuera del contenedor</w:t>
+              <w:t xml:space="preserve">gh auth login</w:t>
+            </w:r>
+            <w:r>
+              <w:rPr>
+                <w:rFonts w:ascii="Calibri" w:cs="Calibri" w:eastAsia="Calibri" w:hAnsi="Calibri"/>
+                <w:sz w:val="18"/>
+                <w:szCs w:val="18"/>
+              </w:rPr>
+              <w:t xml:space="preserve"> y </w:t>
+            </w:r>
+            <w:r>
+              <w:rPr>
+                <w:rFonts w:ascii="Consolas" w:cs="Consolas" w:eastAsia="Consolas" w:hAnsi="Consolas"/>
+                <w:color w:val="2E3A36"/>
+                <w:sz w:val="16"/>
+                <w:szCs w:val="16"/>
+              </w:rPr>
+              <w:t xml:space="preserve">gh auth setup-git</w:t>
+            </w:r>
+            <w:r>
+              <w:rPr>
+                <w:rFonts w:ascii="Calibri" w:cs="Calibri" w:eastAsia="Calibri" w:hAnsi="Calibri"/>
+                <w:sz w:val="18"/>
+                <w:szCs w:val="18"/>
+              </w:rPr>
+              <w:t xml:space="preserve">, o usar un token </w:t>
+            </w:r>
+            <w:r>
+              <w:rPr>
+                <w:rFonts w:ascii="Calibri" w:cs="Calibri" w:eastAsia="Calibri" w:hAnsi="Calibri"/>
+                <w:i/>
+                <w:iCs/>
+                <w:sz w:val="18"/>
+                <w:szCs w:val="18"/>
+              </w:rPr>
+              <w:t xml:space="preserve">fine-grained</w:t>
+            </w:r>
+            <w:r>
+              <w:rPr>
+                <w:rFonts w:ascii="Calibri" w:cs="Calibri" w:eastAsia="Calibri" w:hAnsi="Calibri"/>
+                <w:sz w:val="18"/>
+                <w:szCs w:val="18"/>
+              </w:rPr>
+              <w:t xml:space="preserve"> como contraseña</w:t>
             </w:r>
           </w:p>
         </w:tc>
@@ -22987,14 +23736,6 @@
             <w:pPr>
               <w:spacing w:after="0" w:before="0" w:line="252"/>
             </w:pPr>
-            <w:r>
-              <w:rPr>
-                <w:rFonts w:ascii="Calibri" w:cs="Calibri" w:eastAsia="Calibri" w:hAnsi="Calibri"/>
-                <w:sz w:val="18"/>
-                <w:szCs w:val="18"/>
-              </w:rPr>
-              <w:t xml:space="preserve">Agente arrancado</w:t>
-            </w:r>
           </w:p>
         </w:tc>
       </w:tr>
@@ -23004,91 +23745,84 @@
         </w:trPr>
         <w:tc>
           <w:tcPr>
-            <w:tcW w:type="dxa" w:w="700"/>
-            <w:tcMar>
-              <w:top w:type="dxa" w:w="60"/>
-              <w:left w:type="dxa" w:w="100"/>
-              <w:bottom w:type="dxa" w:w="60"/>
-              <w:right w:type="dxa" w:w="100"/>
-            </w:tcMar>
-          </w:tcPr>
-          <w:p>
-            <w:pPr>
-              <w:spacing w:after="0" w:before="0" w:line="252"/>
-            </w:pPr>
-            <w:r>
-              <w:rPr>
-                <w:rFonts w:ascii="Calibri" w:cs="Calibri" w:eastAsia="Calibri" w:hAnsi="Calibri"/>
-                <w:sz w:val="18"/>
-                <w:szCs w:val="18"/>
-              </w:rPr>
-              <w:t xml:space="preserve">58</w:t>
-            </w:r>
-          </w:p>
-        </w:tc>
-        <w:tc>
-          <w:tcPr>
-            <w:tcW w:type="dxa" w:w="2941"/>
-            <w:tcMar>
-              <w:top w:type="dxa" w:w="60"/>
-              <w:left w:type="dxa" w:w="100"/>
-              <w:bottom w:type="dxa" w:w="60"/>
-              <w:right w:type="dxa" w:w="100"/>
-            </w:tcMar>
-          </w:tcPr>
-          <w:p>
-            <w:pPr>
-              <w:spacing w:after="0" w:before="0" w:line="252"/>
-            </w:pPr>
-            <w:r>
-              <w:rPr>
-                <w:rFonts w:ascii="Calibri" w:cs="Calibri" w:eastAsia="Calibri" w:hAnsi="Calibri"/>
-                <w:sz w:val="18"/>
-                <w:szCs w:val="18"/>
-              </w:rPr>
-              <w:t xml:space="preserve">«Me pregunta si quiero sobrescribir plan.md»</w:t>
-            </w:r>
-          </w:p>
-        </w:tc>
-        <w:tc>
-          <w:tcPr>
-            <w:tcW w:type="dxa" w:w="3829"/>
-            <w:tcMar>
-              <w:top w:type="dxa" w:w="60"/>
-              <w:left w:type="dxa" w:w="100"/>
-              <w:bottom w:type="dxa" w:w="60"/>
-              <w:right w:type="dxa" w:w="100"/>
-            </w:tcMar>
-          </w:tcPr>
-          <w:p>
-            <w:pPr>
-              <w:spacing w:after="0" w:before="0" w:line="252"/>
-            </w:pPr>
-            <w:r>
-              <w:rPr>
-                <w:rFonts w:ascii="Calibri" w:cs="Calibri" w:eastAsia="Calibri" w:hAnsi="Calibri"/>
-                <w:sz w:val="18"/>
-                <w:szCs w:val="18"/>
-              </w:rPr>
-              <w:t xml:space="preserve">Explica que es la plantilla recién copiada por Spec Kit y el permiso normal de escritura; recomienda permitir ediciones en la sesión, porque el hook y las reglas </w:t>
-            </w:r>
-            <w:r>
-              <w:rPr>
-                <w:rFonts w:ascii="Consolas" w:cs="Consolas" w:eastAsia="Consolas" w:hAnsi="Consolas"/>
-                <w:color w:val="2E3A36"/>
-                <w:sz w:val="16"/>
-                <w:szCs w:val="16"/>
-              </w:rPr>
-              <w:t xml:space="preserve">deny</w:t>
-            </w:r>
-            <w:r>
-              <w:rPr>
-                <w:rFonts w:ascii="Calibri" w:cs="Calibri" w:eastAsia="Calibri" w:hAnsi="Calibri"/>
-                <w:sz w:val="18"/>
-                <w:szCs w:val="18"/>
-              </w:rPr>
-              <w:t xml:space="preserve"> siguen activos</w:t>
-            </w:r>
+            <w:tcW w:type="dxa" w:w="1181"/>
+            <w:tcMar>
+              <w:top w:type="dxa" w:w="60"/>
+              <w:left w:type="dxa" w:w="100"/>
+              <w:bottom w:type="dxa" w:w="60"/>
+              <w:right w:type="dxa" w:w="100"/>
+            </w:tcMar>
+          </w:tcPr>
+          <w:p>
+            <w:pPr>
+              <w:spacing w:after="0" w:before="0" w:line="252"/>
+            </w:pPr>
+            <w:r>
+              <w:rPr>
+                <w:rFonts w:ascii="Calibri" w:cs="Calibri" w:eastAsia="Calibri" w:hAnsi="Calibri"/>
+                <w:sz w:val="18"/>
+                <w:szCs w:val="18"/>
+              </w:rPr>
+              <w:t xml:space="preserve">No aparece </w:t>
+            </w:r>
+            <w:r>
+              <w:rPr>
+                <w:rFonts w:ascii="Calibri" w:cs="Calibri" w:eastAsia="Calibri" w:hAnsi="Calibri"/>
+                <w:i/>
+                <w:iCs/>
+                <w:sz w:val="18"/>
+                <w:szCs w:val="18"/>
+              </w:rPr>
+              <w:t xml:space="preserve">Re-run all jobs</w:t>
+            </w:r>
+            <w:r>
+              <w:rPr>
+                <w:rFonts w:ascii="Calibri" w:cs="Calibri" w:eastAsia="Calibri" w:hAnsi="Calibri"/>
+                <w:sz w:val="18"/>
+                <w:szCs w:val="18"/>
+              </w:rPr>
+              <w:t xml:space="preserve"> en un CI fallido</w:t>
+            </w:r>
+          </w:p>
+        </w:tc>
+        <w:tc>
+          <w:tcPr>
+            <w:tcW w:type="dxa" w:w="3287"/>
+            <w:tcMar>
+              <w:top w:type="dxa" w:w="60"/>
+              <w:left w:type="dxa" w:w="100"/>
+              <w:bottom w:type="dxa" w:w="60"/>
+              <w:right w:type="dxa" w:w="100"/>
+            </w:tcMar>
+          </w:tcPr>
+          <w:p>
+            <w:pPr>
+              <w:spacing w:after="0" w:before="0" w:line="252"/>
+            </w:pPr>
+            <w:r>
+              <w:rPr>
+                <w:rFonts w:ascii="Calibri" w:cs="Calibri" w:eastAsia="Calibri" w:hAnsi="Calibri"/>
+                <w:sz w:val="18"/>
+                <w:szCs w:val="18"/>
+              </w:rPr>
+              <w:t xml:space="preserve">La ejecución falló antes de arrancar (workflow inexistente en la etiqueta); hacer un push nuevo a la rama</w:t>
+            </w:r>
+          </w:p>
+        </w:tc>
+        <w:tc>
+          <w:tcPr>
+            <w:tcW w:type="dxa" w:w="3002"/>
+            <w:tcMar>
+              <w:top w:type="dxa" w:w="60"/>
+              <w:left w:type="dxa" w:w="100"/>
+              <w:bottom w:type="dxa" w:w="60"/>
+              <w:right w:type="dxa" w:w="100"/>
+            </w:tcMar>
+          </w:tcPr>
+          <w:p>
+            <w:pPr>
+              <w:spacing w:after="0" w:before="0" w:line="252"/>
+            </w:pPr>
           </w:p>
         </w:tc>
         <w:tc>
@@ -23105,14 +23839,6 @@
             <w:pPr>
               <w:spacing w:after="0" w:before="0" w:line="252"/>
             </w:pPr>
-            <w:r>
-              <w:rPr>
-                <w:rFonts w:ascii="Calibri" w:cs="Calibri" w:eastAsia="Calibri" w:hAnsi="Calibri"/>
-                <w:sz w:val="18"/>
-                <w:szCs w:val="18"/>
-              </w:rPr>
-              <w:t xml:space="preserve">Plan generado</w:t>
-            </w:r>
           </w:p>
         </w:tc>
       </w:tr>
@@ -23122,73 +23848,91 @@
         </w:trPr>
         <w:tc>
           <w:tcPr>
-            <w:tcW w:type="dxa" w:w="700"/>
-            <w:tcMar>
-              <w:top w:type="dxa" w:w="60"/>
-              <w:left w:type="dxa" w:w="100"/>
-              <w:bottom w:type="dxa" w:w="60"/>
-              <w:right w:type="dxa" w:w="100"/>
-            </w:tcMar>
-          </w:tcPr>
-          <w:p>
-            <w:pPr>
-              <w:spacing w:after="0" w:before="0" w:line="252"/>
-            </w:pPr>
-            <w:r>
-              <w:rPr>
-                <w:rFonts w:ascii="Calibri" w:cs="Calibri" w:eastAsia="Calibri" w:hAnsi="Calibri"/>
-                <w:sz w:val="18"/>
-                <w:szCs w:val="18"/>
-              </w:rPr>
-              <w:t xml:space="preserve">59</w:t>
-            </w:r>
-          </w:p>
-        </w:tc>
-        <w:tc>
-          <w:tcPr>
-            <w:tcW w:type="dxa" w:w="2941"/>
-            <w:tcMar>
-              <w:top w:type="dxa" w:w="60"/>
-              <w:left w:type="dxa" w:w="100"/>
-              <w:bottom w:type="dxa" w:w="60"/>
-              <w:right w:type="dxa" w:w="100"/>
-            </w:tcMar>
-          </w:tcPr>
-          <w:p>
-            <w:pPr>
-              <w:spacing w:after="0" w:before="0" w:line="252"/>
-            </w:pPr>
-            <w:r>
-              <w:rPr>
-                <w:rFonts w:ascii="Calibri" w:cs="Calibri" w:eastAsia="Calibri" w:hAnsi="Calibri"/>
-                <w:sz w:val="18"/>
-                <w:szCs w:val="18"/>
-              </w:rPr>
-              <w:t xml:space="preserve">Informe del agente: PR #10 abierto, 55 tests, decisiones y pendientes</w:t>
-            </w:r>
-          </w:p>
-        </w:tc>
-        <w:tc>
-          <w:tcPr>
-            <w:tcW w:type="dxa" w:w="3829"/>
-            <w:tcMar>
-              <w:top w:type="dxa" w:w="60"/>
-              <w:left w:type="dxa" w:w="100"/>
-              <w:bottom w:type="dxa" w:w="60"/>
-              <w:right w:type="dxa" w:w="100"/>
-            </w:tcMar>
-          </w:tcPr>
-          <w:p>
-            <w:pPr>
-              <w:spacing w:after="0" w:before="0" w:line="252"/>
-            </w:pPr>
-            <w:r>
-              <w:rPr>
-                <w:rFonts w:ascii="Calibri" w:cs="Calibri" w:eastAsia="Calibri" w:hAnsi="Calibri"/>
-                <w:sz w:val="18"/>
-                <w:szCs w:val="18"/>
-              </w:rPr>
-              <w:t xml:space="preserve">Revisa el PR: ningún fichero protegido, tests, lint y tipos en una copia limpia, y la API arrancada endpoint por endpoint. Valora las cuatro decisiones y asigna cada pendiente a una tarea del plan</w:t>
+            <w:tcW w:type="dxa" w:w="1181"/>
+            <w:tcMar>
+              <w:top w:type="dxa" w:w="60"/>
+              <w:left w:type="dxa" w:w="100"/>
+              <w:bottom w:type="dxa" w:w="60"/>
+              <w:right w:type="dxa" w:w="100"/>
+            </w:tcMar>
+          </w:tcPr>
+          <w:p>
+            <w:pPr>
+              <w:spacing w:after="0" w:before="0" w:line="252"/>
+            </w:pPr>
+            <w:r>
+              <w:rPr>
+                <w:rFonts w:ascii="Consolas" w:cs="Consolas" w:eastAsia="Consolas" w:hAnsi="Consolas"/>
+                <w:color w:val="2E3A36"/>
+                <w:sz w:val="16"/>
+                <w:szCs w:val="16"/>
+              </w:rPr>
+              <w:t xml:space="preserve">start-agent.sh: AGENT_APP_ID: Define AGENT_APP_ID</w:t>
+            </w:r>
+          </w:p>
+        </w:tc>
+        <w:tc>
+          <w:tcPr>
+            <w:tcW w:type="dxa" w:w="3287"/>
+            <w:tcMar>
+              <w:top w:type="dxa" w:w="60"/>
+              <w:left w:type="dxa" w:w="100"/>
+              <w:bottom w:type="dxa" w:w="60"/>
+              <w:right w:type="dxa" w:w="100"/>
+            </w:tcMar>
+          </w:tcPr>
+          <w:p>
+            <w:pPr>
+              <w:spacing w:after="0" w:before="0" w:line="252"/>
+            </w:pPr>
+            <w:r>
+              <w:rPr>
+                <w:rFonts w:ascii="Calibri" w:cs="Calibri" w:eastAsia="Calibri" w:hAnsi="Calibri"/>
+                <w:sz w:val="18"/>
+                <w:szCs w:val="18"/>
+              </w:rPr>
+              <w:t xml:space="preserve">Verifica que la variable está en </w:t>
+            </w:r>
+            <w:r>
+              <w:rPr>
+                <w:rFonts w:ascii="Consolas" w:cs="Consolas" w:eastAsia="Consolas" w:hAnsi="Consolas"/>
+                <w:color w:val="2E3A36"/>
+                <w:sz w:val="16"/>
+                <w:szCs w:val="16"/>
+              </w:rPr>
+              <w:t xml:space="preserve">devcontainer.json</w:t>
+            </w:r>
+            <w:r>
+              <w:rPr>
+                <w:rFonts w:ascii="Calibri" w:cs="Calibri" w:eastAsia="Calibri" w:hAnsi="Calibri"/>
+                <w:sz w:val="18"/>
+                <w:szCs w:val="18"/>
+              </w:rPr>
+              <w:t xml:space="preserve"> y deduce que la terminal estaba fuera del contenedor</w:t>
+            </w:r>
+          </w:p>
+        </w:tc>
+        <w:tc>
+          <w:tcPr>
+            <w:tcW w:type="dxa" w:w="3002"/>
+            <w:tcMar>
+              <w:top w:type="dxa" w:w="60"/>
+              <w:left w:type="dxa" w:w="100"/>
+              <w:bottom w:type="dxa" w:w="60"/>
+              <w:right w:type="dxa" w:w="100"/>
+            </w:tcMar>
+          </w:tcPr>
+          <w:p>
+            <w:pPr>
+              <w:spacing w:after="0" w:before="0" w:line="252"/>
+            </w:pPr>
+            <w:r>
+              <w:rPr>
+                <w:rFonts w:ascii="Calibri" w:cs="Calibri" w:eastAsia="Calibri" w:hAnsi="Calibri"/>
+                <w:sz w:val="18"/>
+                <w:szCs w:val="18"/>
+              </w:rPr>
+              <w:t xml:space="preserve">Agente arrancado</w:t>
             </w:r>
           </w:p>
         </w:tc>
@@ -23206,14 +23950,6 @@
             <w:pPr>
               <w:spacing w:after="0" w:before="0" w:line="252"/>
             </w:pPr>
-            <w:r>
-              <w:rPr>
-                <w:rFonts w:ascii="Calibri" w:cs="Calibri" w:eastAsia="Calibri" w:hAnsi="Calibri"/>
-                <w:sz w:val="18"/>
-                <w:szCs w:val="18"/>
-              </w:rPr>
-              <w:t xml:space="preserve">Recomendación de aprobar</w:t>
-            </w:r>
           </w:p>
         </w:tc>
       </w:tr>
@@ -23223,7 +23959,226 @@
         </w:trPr>
         <w:tc>
           <w:tcPr>
-            <w:tcW w:type="dxa" w:w="700"/>
+            <w:tcW w:type="dxa" w:w="1181"/>
+            <w:tcMar>
+              <w:top w:type="dxa" w:w="60"/>
+              <w:left w:type="dxa" w:w="100"/>
+              <w:bottom w:type="dxa" w:w="60"/>
+              <w:right w:type="dxa" w:w="100"/>
+            </w:tcMar>
+          </w:tcPr>
+          <w:p>
+            <w:pPr>
+              <w:spacing w:after="0" w:before="0" w:line="252"/>
+            </w:pPr>
+            <w:r>
+              <w:rPr>
+                <w:rFonts w:ascii="Calibri" w:cs="Calibri" w:eastAsia="Calibri" w:hAnsi="Calibri"/>
+                <w:sz w:val="18"/>
+                <w:szCs w:val="18"/>
+              </w:rPr>
+              <w:t xml:space="preserve">58</w:t>
+            </w:r>
+          </w:p>
+        </w:tc>
+        <w:tc>
+          <w:tcPr>
+            <w:tcW w:type="dxa" w:w="3287"/>
+            <w:tcMar>
+              <w:top w:type="dxa" w:w="60"/>
+              <w:left w:type="dxa" w:w="100"/>
+              <w:bottom w:type="dxa" w:w="60"/>
+              <w:right w:type="dxa" w:w="100"/>
+            </w:tcMar>
+          </w:tcPr>
+          <w:p>
+            <w:pPr>
+              <w:spacing w:after="0" w:before="0" w:line="252"/>
+            </w:pPr>
+            <w:r>
+              <w:rPr>
+                <w:rFonts w:ascii="Calibri" w:cs="Calibri" w:eastAsia="Calibri" w:hAnsi="Calibri"/>
+                <w:sz w:val="18"/>
+                <w:szCs w:val="18"/>
+              </w:rPr>
+              <w:t xml:space="preserve">«Me pregunta si quiero sobrescribir plan.md»</w:t>
+            </w:r>
+          </w:p>
+        </w:tc>
+        <w:tc>
+          <w:tcPr>
+            <w:tcW w:type="dxa" w:w="3002"/>
+            <w:tcMar>
+              <w:top w:type="dxa" w:w="60"/>
+              <w:left w:type="dxa" w:w="100"/>
+              <w:bottom w:type="dxa" w:w="60"/>
+              <w:right w:type="dxa" w:w="100"/>
+            </w:tcMar>
+          </w:tcPr>
+          <w:p>
+            <w:pPr>
+              <w:spacing w:after="0" w:before="0" w:line="252"/>
+            </w:pPr>
+            <w:r>
+              <w:rPr>
+                <w:rFonts w:ascii="Calibri" w:cs="Calibri" w:eastAsia="Calibri" w:hAnsi="Calibri"/>
+                <w:sz w:val="18"/>
+                <w:szCs w:val="18"/>
+              </w:rPr>
+              <w:t xml:space="preserve">Explica que es la plantilla recién copiada por Spec Kit y el permiso normal de escritura; recomienda permitir ediciones en la sesión, porque el hook y las reglas </w:t>
+            </w:r>
+            <w:r>
+              <w:rPr>
+                <w:rFonts w:ascii="Consolas" w:cs="Consolas" w:eastAsia="Consolas" w:hAnsi="Consolas"/>
+                <w:color w:val="2E3A36"/>
+                <w:sz w:val="16"/>
+                <w:szCs w:val="16"/>
+              </w:rPr>
+              <w:t xml:space="preserve">deny</w:t>
+            </w:r>
+            <w:r>
+              <w:rPr>
+                <w:rFonts w:ascii="Calibri" w:cs="Calibri" w:eastAsia="Calibri" w:hAnsi="Calibri"/>
+                <w:sz w:val="18"/>
+                <w:szCs w:val="18"/>
+              </w:rPr>
+              <w:t xml:space="preserve"> siguen activos</w:t>
+            </w:r>
+          </w:p>
+        </w:tc>
+        <w:tc>
+          <w:tcPr>
+            <w:tcW w:type="dxa" w:w="1600"/>
+            <w:tcMar>
+              <w:top w:type="dxa" w:w="60"/>
+              <w:left w:type="dxa" w:w="100"/>
+              <w:bottom w:type="dxa" w:w="60"/>
+              <w:right w:type="dxa" w:w="100"/>
+            </w:tcMar>
+          </w:tcPr>
+          <w:p>
+            <w:pPr>
+              <w:spacing w:after="0" w:before="0" w:line="252"/>
+            </w:pPr>
+            <w:r>
+              <w:rPr>
+                <w:rFonts w:ascii="Calibri" w:cs="Calibri" w:eastAsia="Calibri" w:hAnsi="Calibri"/>
+                <w:sz w:val="18"/>
+                <w:szCs w:val="18"/>
+              </w:rPr>
+              <w:t xml:space="preserve">Plan generado</w:t>
+            </w:r>
+          </w:p>
+        </w:tc>
+      </w:tr>
+      <w:tr>
+        <w:trPr>
+          <w:cantSplit/>
+        </w:trPr>
+        <w:tc>
+          <w:tcPr>
+            <w:tcW w:type="dxa" w:w="1181"/>
+            <w:tcMar>
+              <w:top w:type="dxa" w:w="60"/>
+              <w:left w:type="dxa" w:w="100"/>
+              <w:bottom w:type="dxa" w:w="60"/>
+              <w:right w:type="dxa" w:w="100"/>
+            </w:tcMar>
+          </w:tcPr>
+          <w:p>
+            <w:pPr>
+              <w:spacing w:after="0" w:before="0" w:line="252"/>
+            </w:pPr>
+            <w:r>
+              <w:rPr>
+                <w:rFonts w:ascii="Calibri" w:cs="Calibri" w:eastAsia="Calibri" w:hAnsi="Calibri"/>
+                <w:sz w:val="18"/>
+                <w:szCs w:val="18"/>
+              </w:rPr>
+              <w:t xml:space="preserve">59</w:t>
+            </w:r>
+          </w:p>
+        </w:tc>
+        <w:tc>
+          <w:tcPr>
+            <w:tcW w:type="dxa" w:w="3287"/>
+            <w:tcMar>
+              <w:top w:type="dxa" w:w="60"/>
+              <w:left w:type="dxa" w:w="100"/>
+              <w:bottom w:type="dxa" w:w="60"/>
+              <w:right w:type="dxa" w:w="100"/>
+            </w:tcMar>
+          </w:tcPr>
+          <w:p>
+            <w:pPr>
+              <w:spacing w:after="0" w:before="0" w:line="252"/>
+            </w:pPr>
+            <w:r>
+              <w:rPr>
+                <w:rFonts w:ascii="Calibri" w:cs="Calibri" w:eastAsia="Calibri" w:hAnsi="Calibri"/>
+                <w:sz w:val="18"/>
+                <w:szCs w:val="18"/>
+              </w:rPr>
+              <w:t xml:space="preserve">Informe del agente: PR #10 abierto, 55 tests, decisiones y pendientes</w:t>
+            </w:r>
+          </w:p>
+        </w:tc>
+        <w:tc>
+          <w:tcPr>
+            <w:tcW w:type="dxa" w:w="3002"/>
+            <w:tcMar>
+              <w:top w:type="dxa" w:w="60"/>
+              <w:left w:type="dxa" w:w="100"/>
+              <w:bottom w:type="dxa" w:w="60"/>
+              <w:right w:type="dxa" w:w="100"/>
+            </w:tcMar>
+          </w:tcPr>
+          <w:p>
+            <w:pPr>
+              <w:spacing w:after="0" w:before="0" w:line="252"/>
+            </w:pPr>
+            <w:r>
+              <w:rPr>
+                <w:rFonts w:ascii="Calibri" w:cs="Calibri" w:eastAsia="Calibri" w:hAnsi="Calibri"/>
+                <w:sz w:val="18"/>
+                <w:szCs w:val="18"/>
+              </w:rPr>
+              <w:t xml:space="preserve">Revisa el PR: ningún fichero protegido, tests, lint y tipos en una copia limpia, y la API arrancada endpoint por endpoint. Valora las cuatro decisiones y asigna cada pendiente a una tarea del plan</w:t>
+            </w:r>
+          </w:p>
+        </w:tc>
+        <w:tc>
+          <w:tcPr>
+            <w:tcW w:type="dxa" w:w="1600"/>
+            <w:tcMar>
+              <w:top w:type="dxa" w:w="60"/>
+              <w:left w:type="dxa" w:w="100"/>
+              <w:bottom w:type="dxa" w:w="60"/>
+              <w:right w:type="dxa" w:w="100"/>
+            </w:tcMar>
+          </w:tcPr>
+          <w:p>
+            <w:pPr>
+              <w:spacing w:after="0" w:before="0" w:line="252"/>
+            </w:pPr>
+            <w:r>
+              <w:rPr>
+                <w:rFonts w:ascii="Calibri" w:cs="Calibri" w:eastAsia="Calibri" w:hAnsi="Calibri"/>
+                <w:sz w:val="18"/>
+                <w:szCs w:val="18"/>
+              </w:rPr>
+              <w:t xml:space="preserve">Recomendación de aprobar</w:t>
+            </w:r>
+          </w:p>
+        </w:tc>
+      </w:tr>
+      <w:tr>
+        <w:trPr>
+          <w:cantSplit/>
+        </w:trPr>
+        <w:tc>
+          <w:tcPr>
+            <w:tcW w:type="dxa" w:w="1181"/>
             <w:tcMar>
               <w:top w:type="dxa" w:w="60"/>
               <w:left w:type="dxa" w:w="100"/>
@@ -23247,7 +24202,7 @@
         </w:tc>
         <w:tc>
           <w:tcPr>
-            <w:tcW w:type="dxa" w:w="2941"/>
+            <w:tcW w:type="dxa" w:w="3287"/>
             <w:tcMar>
               <w:top w:type="dxa" w:w="60"/>
               <w:left w:type="dxa" w:w="100"/>
@@ -23271,7 +24226,7 @@
         </w:tc>
         <w:tc>
           <w:tcPr>
-            <w:tcW w:type="dxa" w:w="3829"/>
+            <w:tcW w:type="dxa" w:w="3002"/>
             <w:tcMar>
               <w:top w:type="dxa" w:w="60"/>
               <w:left w:type="dxa" w:w="100"/>
@@ -23326,18 +24281,6 @@
     </w:p>
     <w:p>
       <w:pPr>
-        <w:pStyle w:val="Heading2"/>
-        <w:keepNext/>
-      </w:pPr>
-      <w:r>
-        <w:rPr>
-          <w:rFonts w:ascii="Calibri" w:cs="Calibri" w:eastAsia="Calibri" w:hAnsi="Calibri"/>
-        </w:rPr>
-        <w:t xml:space="preserve">Pruebas realizadas y resultados</w:t>
-      </w:r>
-    </w:p>
-    <w:p>
-      <w:pPr>
         <w:pStyle w:val="Heading3"/>
         <w:keepNext/>
       </w:pPr>
@@ -23345,7 +24288,7 @@
         <w:rPr>
           <w:rFonts w:ascii="Calibri" w:cs="Calibri" w:eastAsia="Calibri" w:hAnsi="Calibri"/>
         </w:rPr>
-        <w:t xml:space="preserve">Pruebas automáticas</w:t>
+        <w:t xml:space="preserve">Fase 10 · CI obligatorio (11 de octubre)</w:t>
       </w:r>
     </w:p>
     <w:tbl>
@@ -23361,9 +24304,10 @@
         </w:tblBorders>
       </w:tblPr>
       <w:tblGrid>
-        <w:gridCol w:w="2548"/>
-        <w:gridCol w:w="4869"/>
-        <w:gridCol w:w="1653"/>
+        <w:gridCol w:w="700"/>
+        <w:gridCol w:w="3088"/>
+        <w:gridCol w:w="3682"/>
+        <w:gridCol w:w="1600"/>
       </w:tblGrid>
       <w:tr>
         <w:trPr>
@@ -23371,7 +24315,7 @@
         </w:trPr>
         <w:tc>
           <w:tcPr>
-            <w:tcW w:type="dxa" w:w="2548"/>
+            <w:tcW w:type="dxa" w:w="700"/>
             <w:shd w:fill="E3EEEA" w:color="auto" w:val="clear"/>
             <w:tcMar>
               <w:top w:type="dxa" w:w="60"/>
@@ -23392,13 +24336,13 @@
                 <w:sz w:val="18"/>
                 <w:szCs w:val="18"/>
               </w:rPr>
-              <w:t xml:space="preserve">Componente</w:t>
-            </w:r>
-          </w:p>
-        </w:tc>
-        <w:tc>
-          <w:tcPr>
-            <w:tcW w:type="dxa" w:w="4869"/>
+              <w:t xml:space="preserve">#</w:t>
+            </w:r>
+          </w:p>
+        </w:tc>
+        <w:tc>
+          <w:tcPr>
+            <w:tcW w:type="dxa" w:w="3088"/>
             <w:shd w:fill="E3EEEA" w:color="auto" w:val="clear"/>
             <w:tcMar>
               <w:top w:type="dxa" w:w="60"/>
@@ -23419,13 +24363,40 @@
                 <w:sz w:val="18"/>
                 <w:szCs w:val="18"/>
               </w:rPr>
-              <w:t xml:space="preserve">Pruebas</w:t>
-            </w:r>
-          </w:p>
-        </w:tc>
-        <w:tc>
-          <w:tcPr>
-            <w:tcW w:type="dxa" w:w="1653"/>
+              <w:t xml:space="preserve">Petición del autor</w:t>
+            </w:r>
+          </w:p>
+        </w:tc>
+        <w:tc>
+          <w:tcPr>
+            <w:tcW w:type="dxa" w:w="3682"/>
+            <w:shd w:fill="E3EEEA" w:color="auto" w:val="clear"/>
+            <w:tcMar>
+              <w:top w:type="dxa" w:w="60"/>
+              <w:left w:type="dxa" w:w="100"/>
+              <w:bottom w:type="dxa" w:w="60"/>
+              <w:right w:type="dxa" w:w="100"/>
+            </w:tcMar>
+          </w:tcPr>
+          <w:p>
+            <w:pPr>
+              <w:spacing w:after="0" w:before="0" w:line="252"/>
+            </w:pPr>
+            <w:r>
+              <w:rPr>
+                <w:rFonts w:ascii="Calibri" w:cs="Calibri" w:eastAsia="Calibri" w:hAnsi="Calibri"/>
+                <w:b/>
+                <w:bCs/>
+                <w:sz w:val="18"/>
+                <w:szCs w:val="18"/>
+              </w:rPr>
+              <w:t xml:space="preserve">Respuesta y acción del modelo</w:t>
+            </w:r>
+          </w:p>
+        </w:tc>
+        <w:tc>
+          <w:tcPr>
+            <w:tcW w:type="dxa" w:w="1600"/>
             <w:shd w:fill="E3EEEA" w:color="auto" w:val="clear"/>
             <w:tcMar>
               <w:top w:type="dxa" w:w="60"/>
@@ -23457,82 +24428,97 @@
         </w:trPr>
         <w:tc>
           <w:tcPr>
-            <w:tcW w:type="dxa" w:w="2548"/>
-            <w:tcMar>
-              <w:top w:type="dxa" w:w="60"/>
-              <w:left w:type="dxa" w:w="100"/>
-              <w:bottom w:type="dxa" w:w="60"/>
-              <w:right w:type="dxa" w:w="100"/>
-            </w:tcMar>
-          </w:tcPr>
-          <w:p>
-            <w:pPr>
-              <w:spacing w:after="0" w:before="0" w:line="252"/>
-            </w:pPr>
-            <w:r>
-              <w:rPr>
-                <w:rFonts w:ascii="Calibri" w:cs="Calibri" w:eastAsia="Calibri" w:hAnsi="Calibri"/>
-                <w:sz w:val="18"/>
-                <w:szCs w:val="18"/>
-              </w:rPr>
-              <w:t xml:space="preserve">Hook </w:t>
-            </w:r>
-            <w:r>
-              <w:rPr>
-                <w:rFonts w:ascii="Consolas" w:cs="Consolas" w:eastAsia="Consolas" w:hAnsi="Consolas"/>
-                <w:color w:val="2E3A36"/>
-                <w:sz w:val="16"/>
-                <w:szCs w:val="16"/>
-              </w:rPr>
-              <w:t xml:space="preserve">guard.py</w:t>
-            </w:r>
-          </w:p>
-        </w:tc>
-        <w:tc>
-          <w:tcPr>
-            <w:tcW w:type="dxa" w:w="4869"/>
-            <w:tcMar>
-              <w:top w:type="dxa" w:w="60"/>
-              <w:left w:type="dxa" w:w="100"/>
-              <w:bottom w:type="dxa" w:w="60"/>
-              <w:right w:type="dxa" w:w="100"/>
-            </w:tcMar>
-          </w:tcPr>
-          <w:p>
-            <w:pPr>
-              <w:spacing w:after="0" w:before="0" w:line="252"/>
-            </w:pPr>
-            <w:r>
-              <w:rPr>
-                <w:rFonts w:ascii="Calibri" w:cs="Calibri" w:eastAsia="Calibri" w:hAnsi="Calibri"/>
-                <w:sz w:val="18"/>
-                <w:szCs w:val="18"/>
-              </w:rPr>
-              <w:t xml:space="preserve">45 casos: 21 comandos que deben bloquearse, 10 que deben permitirse, ficheros protegidos, secretos y auditoría</w:t>
-            </w:r>
-          </w:p>
-        </w:tc>
-        <w:tc>
-          <w:tcPr>
-            <w:tcW w:type="dxa" w:w="1653"/>
-            <w:tcMar>
-              <w:top w:type="dxa" w:w="60"/>
-              <w:left w:type="dxa" w:w="100"/>
-              <w:bottom w:type="dxa" w:w="60"/>
-              <w:right w:type="dxa" w:w="100"/>
-            </w:tcMar>
-          </w:tcPr>
-          <w:p>
-            <w:pPr>
-              <w:spacing w:after="0" w:before="0" w:line="252"/>
-            </w:pPr>
-            <w:r>
-              <w:rPr>
-                <w:rFonts w:ascii="Calibri" w:cs="Calibri" w:eastAsia="Calibri" w:hAnsi="Calibri"/>
-                <w:sz w:val="18"/>
-                <w:szCs w:val="18"/>
-              </w:rPr>
-              <w:t xml:space="preserve">45/45 superadas</w:t>
+            <w:tcW w:type="dxa" w:w="700"/>
+            <w:tcMar>
+              <w:top w:type="dxa" w:w="60"/>
+              <w:left w:type="dxa" w:w="100"/>
+              <w:bottom w:type="dxa" w:w="60"/>
+              <w:right w:type="dxa" w:w="100"/>
+            </w:tcMar>
+          </w:tcPr>
+          <w:p>
+            <w:pPr>
+              <w:spacing w:after="0" w:before="0" w:line="252"/>
+            </w:pPr>
+            <w:r>
+              <w:rPr>
+                <w:rFonts w:ascii="Calibri" w:cs="Calibri" w:eastAsia="Calibri" w:hAnsi="Calibri"/>
+                <w:sz w:val="18"/>
+                <w:szCs w:val="18"/>
+              </w:rPr>
+              <w:t xml:space="preserve">61</w:t>
+            </w:r>
+          </w:p>
+        </w:tc>
+        <w:tc>
+          <w:tcPr>
+            <w:tcW w:type="dxa" w:w="3088"/>
+            <w:tcMar>
+              <w:top w:type="dxa" w:w="60"/>
+              <w:left w:type="dxa" w:w="100"/>
+              <w:bottom w:type="dxa" w:w="60"/>
+              <w:right w:type="dxa" w:w="100"/>
+            </w:tcMar>
+          </w:tcPr>
+          <w:p>
+            <w:pPr>
+              <w:spacing w:after="0" w:before="0" w:line="252"/>
+            </w:pPr>
+            <w:r>
+              <w:rPr>
+                <w:rFonts w:ascii="Calibri" w:cs="Calibri" w:eastAsia="Calibri" w:hAnsi="Calibri"/>
+                <w:sz w:val="18"/>
+                <w:szCs w:val="18"/>
+              </w:rPr>
+              <w:t xml:space="preserve">«Olvídate de la limitación de 45 páginas»</w:t>
+            </w:r>
+          </w:p>
+        </w:tc>
+        <w:tc>
+          <w:tcPr>
+            <w:tcW w:type="dxa" w:w="3682"/>
+            <w:tcMar>
+              <w:top w:type="dxa" w:w="60"/>
+              <w:left w:type="dxa" w:w="100"/>
+              <w:bottom w:type="dxa" w:w="60"/>
+              <w:right w:type="dxa" w:w="100"/>
+            </w:tcMar>
+          </w:tcPr>
+          <w:p>
+            <w:pPr>
+              <w:spacing w:after="0" w:before="0" w:line="252"/>
+            </w:pPr>
+            <w:r>
+              <w:rPr>
+                <w:rFonts w:ascii="Calibri" w:cs="Calibri" w:eastAsia="Calibri" w:hAnsi="Calibri"/>
+                <w:sz w:val="18"/>
+                <w:szCs w:val="18"/>
+              </w:rPr>
+              <w:t xml:space="preserve">Retira el límite de las notas del proyecto y del README de la memoria; la memoria conserva el registro completo y los pasos reproducibles</w:t>
+            </w:r>
+          </w:p>
+        </w:tc>
+        <w:tc>
+          <w:tcPr>
+            <w:tcW w:type="dxa" w:w="1600"/>
+            <w:tcMar>
+              <w:top w:type="dxa" w:w="60"/>
+              <w:left w:type="dxa" w:w="100"/>
+              <w:bottom w:type="dxa" w:w="60"/>
+              <w:right w:type="dxa" w:w="100"/>
+            </w:tcMar>
+          </w:tcPr>
+          <w:p>
+            <w:pPr>
+              <w:spacing w:after="0" w:before="0" w:line="252"/>
+            </w:pPr>
+            <w:r>
+              <w:rPr>
+                <w:rFonts w:ascii="Calibri" w:cs="Calibri" w:eastAsia="Calibri" w:hAnsi="Calibri"/>
+                <w:sz w:val="18"/>
+                <w:szCs w:val="18"/>
+              </w:rPr>
+              <w:t xml:space="preserve">Sin límite de extensión</w:t>
             </w:r>
           </w:p>
         </w:tc>
@@ -23543,99 +24529,97 @@
         </w:trPr>
         <w:tc>
           <w:tcPr>
-            <w:tcW w:type="dxa" w:w="2548"/>
-            <w:tcMar>
-              <w:top w:type="dxa" w:w="60"/>
-              <w:left w:type="dxa" w:w="100"/>
-              <w:bottom w:type="dxa" w:w="60"/>
-              <w:right w:type="dxa" w:w="100"/>
-            </w:tcMar>
-          </w:tcPr>
-          <w:p>
-            <w:pPr>
-              <w:spacing w:after="0" w:before="0" w:line="252"/>
-            </w:pPr>
-            <w:r>
-              <w:rPr>
-                <w:rFonts w:ascii="Calibri" w:cs="Calibri" w:eastAsia="Calibri" w:hAnsi="Calibri"/>
-                <w:sz w:val="18"/>
-                <w:szCs w:val="18"/>
-              </w:rPr>
-              <w:t xml:space="preserve">Aplicación: catálogo (</w:t>
-            </w:r>
-            <w:r>
-              <w:rPr>
-                <w:rFonts w:ascii="Consolas" w:cs="Consolas" w:eastAsia="Consolas" w:hAnsi="Consolas"/>
-                <w:color w:val="2E3A36"/>
-                <w:sz w:val="16"/>
-                <w:szCs w:val="16"/>
-              </w:rPr>
-              <w:t xml:space="preserve">app</w:t>
-            </w:r>
-            <w:r>
-              <w:rPr>
-                <w:rFonts w:ascii="Calibri" w:cs="Calibri" w:eastAsia="Calibri" w:hAnsi="Calibri"/>
-                <w:sz w:val="18"/>
-                <w:szCs w:val="18"/>
-              </w:rPr>
-              <w:t xml:space="preserve">)</w:t>
-            </w:r>
-          </w:p>
-        </w:tc>
-        <w:tc>
-          <w:tcPr>
-            <w:tcW w:type="dxa" w:w="4869"/>
-            <w:tcMar>
-              <w:top w:type="dxa" w:w="60"/>
-              <w:left w:type="dxa" w:w="100"/>
-              <w:bottom w:type="dxa" w:w="60"/>
-              <w:right w:type="dxa" w:w="100"/>
-            </w:tcMar>
-          </w:tcPr>
-          <w:p>
-            <w:pPr>
-              <w:spacing w:after="0" w:before="0" w:line="252"/>
-            </w:pPr>
-            <w:r>
-              <w:rPr>
-                <w:rFonts w:ascii="Calibri" w:cs="Calibri" w:eastAsia="Calibri" w:hAnsi="Calibri"/>
-                <w:sz w:val="18"/>
-                <w:szCs w:val="18"/>
-              </w:rPr>
-              <w:t xml:space="preserve">55 casos: listado, consulta por id, 404, precio con 2 decimales, orden estable, catálogo mal formado, despliegue de un cambio de precio, observabilidad y </w:t>
-            </w:r>
-            <w:r>
-              <w:rPr>
-                <w:rFonts w:ascii="Consolas" w:cs="Consolas" w:eastAsia="Consolas" w:hAnsi="Consolas"/>
-                <w:color w:val="2E3A36"/>
-                <w:sz w:val="16"/>
-                <w:szCs w:val="16"/>
-              </w:rPr>
-              <w:t xml:space="preserve">/health</w:t>
-            </w:r>
-          </w:p>
-        </w:tc>
-        <w:tc>
-          <w:tcPr>
-            <w:tcW w:type="dxa" w:w="1653"/>
-            <w:tcMar>
-              <w:top w:type="dxa" w:w="60"/>
-              <w:left w:type="dxa" w:w="100"/>
-              <w:bottom w:type="dxa" w:w="60"/>
-              <w:right w:type="dxa" w:w="100"/>
-            </w:tcMar>
-          </w:tcPr>
-          <w:p>
-            <w:pPr>
-              <w:spacing w:after="0" w:before="0" w:line="252"/>
-            </w:pPr>
-            <w:r>
-              <w:rPr>
-                <w:rFonts w:ascii="Calibri" w:cs="Calibri" w:eastAsia="Calibri" w:hAnsi="Calibri"/>
-                <w:sz w:val="18"/>
-                <w:szCs w:val="18"/>
-              </w:rPr>
-              <w:t xml:space="preserve">55/55 superadas</w:t>
+            <w:tcW w:type="dxa" w:w="700"/>
+            <w:tcMar>
+              <w:top w:type="dxa" w:w="60"/>
+              <w:left w:type="dxa" w:w="100"/>
+              <w:bottom w:type="dxa" w:w="60"/>
+              <w:right w:type="dxa" w:w="100"/>
+            </w:tcMar>
+          </w:tcPr>
+          <w:p>
+            <w:pPr>
+              <w:spacing w:after="0" w:before="0" w:line="252"/>
+            </w:pPr>
+            <w:r>
+              <w:rPr>
+                <w:rFonts w:ascii="Calibri" w:cs="Calibri" w:eastAsia="Calibri" w:hAnsi="Calibri"/>
+                <w:sz w:val="18"/>
+                <w:szCs w:val="18"/>
+              </w:rPr>
+              <w:t xml:space="preserve">62</w:t>
+            </w:r>
+          </w:p>
+        </w:tc>
+        <w:tc>
+          <w:tcPr>
+            <w:tcW w:type="dxa" w:w="3088"/>
+            <w:tcMar>
+              <w:top w:type="dxa" w:w="60"/>
+              <w:left w:type="dxa" w:w="100"/>
+              <w:bottom w:type="dxa" w:w="60"/>
+              <w:right w:type="dxa" w:w="100"/>
+            </w:tcMar>
+          </w:tcPr>
+          <w:p>
+            <w:pPr>
+              <w:spacing w:after="0" w:before="0" w:line="252"/>
+            </w:pPr>
+            <w:r>
+              <w:rPr>
+                <w:rFonts w:ascii="Calibri" w:cs="Calibri" w:eastAsia="Calibri" w:hAnsi="Calibri"/>
+                <w:sz w:val="18"/>
+                <w:szCs w:val="18"/>
+              </w:rPr>
+              <w:t xml:space="preserve">«Merged» (cierre de la tarea 5)</w:t>
+            </w:r>
+          </w:p>
+        </w:tc>
+        <w:tc>
+          <w:tcPr>
+            <w:tcW w:type="dxa" w:w="3682"/>
+            <w:tcMar>
+              <w:top w:type="dxa" w:w="60"/>
+              <w:left w:type="dxa" w:w="100"/>
+              <w:bottom w:type="dxa" w:w="60"/>
+              <w:right w:type="dxa" w:w="100"/>
+            </w:tcMar>
+          </w:tcPr>
+          <w:p>
+            <w:pPr>
+              <w:spacing w:after="0" w:before="0" w:line="252"/>
+            </w:pPr>
+            <w:r>
+              <w:rPr>
+                <w:rFonts w:ascii="Calibri" w:cs="Calibri" w:eastAsia="Calibri" w:hAnsi="Calibri"/>
+                <w:sz w:val="18"/>
+                <w:szCs w:val="18"/>
+              </w:rPr>
+              <w:t xml:space="preserve">Abre core#8 (CI reutilizable y CI propio de core, acciones fijadas por SHA, validado con actionlint) y app#11 (llamada al CI)</w:t>
+            </w:r>
+          </w:p>
+        </w:tc>
+        <w:tc>
+          <w:tcPr>
+            <w:tcW w:type="dxa" w:w="1600"/>
+            <w:tcMar>
+              <w:top w:type="dxa" w:w="60"/>
+              <w:left w:type="dxa" w:w="100"/>
+              <w:bottom w:type="dxa" w:w="60"/>
+              <w:right w:type="dxa" w:w="100"/>
+            </w:tcMar>
+          </w:tcPr>
+          <w:p>
+            <w:pPr>
+              <w:spacing w:after="0" w:before="0" w:line="252"/>
+            </w:pPr>
+            <w:r>
+              <w:rPr>
+                <w:rFonts w:ascii="Calibri" w:cs="Calibri" w:eastAsia="Calibri" w:hAnsi="Calibri"/>
+                <w:sz w:val="18"/>
+                <w:szCs w:val="18"/>
+              </w:rPr>
+              <w:t xml:space="preserve">Tarea 6 preparada</w:t>
             </w:r>
           </w:p>
         </w:tc>
@@ -23646,25 +24630,73 @@
         </w:trPr>
         <w:tc>
           <w:tcPr>
-            <w:tcW w:type="dxa" w:w="2548"/>
-            <w:tcMar>
-              <w:top w:type="dxa" w:w="60"/>
-              <w:left w:type="dxa" w:w="100"/>
-              <w:bottom w:type="dxa" w:w="60"/>
-              <w:right w:type="dxa" w:w="100"/>
-            </w:tcMar>
-          </w:tcPr>
-          <w:p>
-            <w:pPr>
-              <w:spacing w:after="0" w:before="0" w:line="252"/>
-            </w:pPr>
-            <w:r>
-              <w:rPr>
-                <w:rFonts w:ascii="Calibri" w:cs="Calibri" w:eastAsia="Calibri" w:hAnsi="Calibri"/>
-                <w:sz w:val="18"/>
-                <w:szCs w:val="18"/>
-              </w:rPr>
-              <w:t xml:space="preserve">Triage (</w:t>
+            <w:tcW w:type="dxa" w:w="700"/>
+            <w:tcMar>
+              <w:top w:type="dxa" w:w="60"/>
+              <w:left w:type="dxa" w:w="100"/>
+              <w:bottom w:type="dxa" w:w="60"/>
+              <w:right w:type="dxa" w:w="100"/>
+            </w:tcMar>
+          </w:tcPr>
+          <w:p>
+            <w:pPr>
+              <w:spacing w:after="0" w:before="0" w:line="252"/>
+            </w:pPr>
+            <w:r>
+              <w:rPr>
+                <w:rFonts w:ascii="Calibri" w:cs="Calibri" w:eastAsia="Calibri" w:hAnsi="Calibri"/>
+                <w:sz w:val="18"/>
+                <w:szCs w:val="18"/>
+              </w:rPr>
+              <w:t xml:space="preserve">63</w:t>
+            </w:r>
+          </w:p>
+        </w:tc>
+        <w:tc>
+          <w:tcPr>
+            <w:tcW w:type="dxa" w:w="3088"/>
+            <w:tcMar>
+              <w:top w:type="dxa" w:w="60"/>
+              <w:left w:type="dxa" w:w="100"/>
+              <w:bottom w:type="dxa" w:w="60"/>
+              <w:right w:type="dxa" w:w="100"/>
+            </w:tcMar>
+          </w:tcPr>
+          <w:p>
+            <w:pPr>
+              <w:spacing w:after="0" w:before="0" w:line="252"/>
+            </w:pPr>
+            <w:r>
+              <w:rPr>
+                <w:rFonts w:ascii="Calibri" w:cs="Calibri" w:eastAsia="Calibri" w:hAnsi="Calibri"/>
+                <w:sz w:val="18"/>
+                <w:szCs w:val="18"/>
+              </w:rPr>
+              <w:t xml:space="preserve">«Me ha hecho configurar un 2FA y ahora no puedo hacer el push»</w:t>
+            </w:r>
+          </w:p>
+        </w:tc>
+        <w:tc>
+          <w:tcPr>
+            <w:tcW w:type="dxa" w:w="3682"/>
+            <w:tcMar>
+              <w:top w:type="dxa" w:w="60"/>
+              <w:left w:type="dxa" w:w="100"/>
+              <w:bottom w:type="dxa" w:w="60"/>
+              <w:right w:type="dxa" w:w="100"/>
+            </w:tcMar>
+          </w:tcPr>
+          <w:p>
+            <w:pPr>
+              <w:spacing w:after="0" w:before="0" w:line="252"/>
+            </w:pPr>
+            <w:r>
+              <w:rPr>
+                <w:rFonts w:ascii="Calibri" w:cs="Calibri" w:eastAsia="Calibri" w:hAnsi="Calibri"/>
+                <w:sz w:val="18"/>
+                <w:szCs w:val="18"/>
+              </w:rPr>
+              <w:t xml:space="preserve">Explica por qué falla la contraseña con 2FA y da dos salidas: mover la etiqueta desde la web o iniciar sesión con </w:t>
             </w:r>
             <w:r>
               <w:rPr>
@@ -23673,15 +24705,31 @@
                 <w:sz w:val="16"/>
                 <w:szCs w:val="16"/>
               </w:rPr>
-              <w:t xml:space="preserve">apply.py</w:t>
-            </w:r>
-            <w:r>
-              <w:rPr>
-                <w:rFonts w:ascii="Calibri" w:cs="Calibri" w:eastAsia="Calibri" w:hAnsi="Calibri"/>
-                <w:sz w:val="18"/>
-                <w:szCs w:val="18"/>
-              </w:rPr>
-              <w:t xml:space="preserve">, </w:t>
+              <w:t xml:space="preserve">gh auth login</w:t>
+            </w:r>
+          </w:p>
+        </w:tc>
+        <w:tc>
+          <w:tcPr>
+            <w:tcW w:type="dxa" w:w="1600"/>
+            <w:tcMar>
+              <w:top w:type="dxa" w:w="60"/>
+              <w:left w:type="dxa" w:w="100"/>
+              <w:bottom w:type="dxa" w:w="60"/>
+              <w:right w:type="dxa" w:w="100"/>
+            </w:tcMar>
+          </w:tcPr>
+          <w:p>
+            <w:pPr>
+              <w:spacing w:after="0" w:before="0" w:line="252"/>
+            </w:pPr>
+            <w:r>
+              <w:rPr>
+                <w:rFonts w:ascii="Calibri" w:cs="Calibri" w:eastAsia="Calibri" w:hAnsi="Calibri"/>
+                <w:sz w:val="18"/>
+                <w:szCs w:val="18"/>
+              </w:rPr>
+              <w:t xml:space="preserve">Etiqueta </w:t>
             </w:r>
             <w:r>
               <w:rPr>
@@ -23690,6 +24738,713 @@
                 <w:sz w:val="16"/>
                 <w:szCs w:val="16"/>
               </w:rPr>
+              <w:t xml:space="preserve">v1</w:t>
+            </w:r>
+            <w:r>
+              <w:rPr>
+                <w:rFonts w:ascii="Calibri" w:cs="Calibri" w:eastAsia="Calibri" w:hAnsi="Calibri"/>
+                <w:sz w:val="18"/>
+                <w:szCs w:val="18"/>
+              </w:rPr>
+              <w:t xml:space="preserve"> movida desde la web</w:t>
+            </w:r>
+          </w:p>
+        </w:tc>
+      </w:tr>
+      <w:tr>
+        <w:trPr>
+          <w:cantSplit/>
+        </w:trPr>
+        <w:tc>
+          <w:tcPr>
+            <w:tcW w:type="dxa" w:w="700"/>
+            <w:tcMar>
+              <w:top w:type="dxa" w:w="60"/>
+              <w:left w:type="dxa" w:w="100"/>
+              <w:bottom w:type="dxa" w:w="60"/>
+              <w:right w:type="dxa" w:w="100"/>
+            </w:tcMar>
+          </w:tcPr>
+          <w:p>
+            <w:pPr>
+              <w:spacing w:after="0" w:before="0" w:line="252"/>
+            </w:pPr>
+            <w:r>
+              <w:rPr>
+                <w:rFonts w:ascii="Calibri" w:cs="Calibri" w:eastAsia="Calibri" w:hAnsi="Calibri"/>
+                <w:sz w:val="18"/>
+                <w:szCs w:val="18"/>
+              </w:rPr>
+              <w:t xml:space="preserve">64</w:t>
+            </w:r>
+          </w:p>
+        </w:tc>
+        <w:tc>
+          <w:tcPr>
+            <w:tcW w:type="dxa" w:w="3088"/>
+            <w:tcMar>
+              <w:top w:type="dxa" w:w="60"/>
+              <w:left w:type="dxa" w:w="100"/>
+              <w:bottom w:type="dxa" w:w="60"/>
+              <w:right w:type="dxa" w:w="100"/>
+            </w:tcMar>
+          </w:tcPr>
+          <w:p>
+            <w:pPr>
+              <w:spacing w:after="0" w:before="0" w:line="252"/>
+            </w:pPr>
+            <w:r>
+              <w:rPr>
+                <w:rFonts w:ascii="Calibri" w:cs="Calibri" w:eastAsia="Calibri" w:hAnsi="Calibri"/>
+                <w:sz w:val="18"/>
+                <w:szCs w:val="18"/>
+              </w:rPr>
+              <w:t xml:space="preserve">«No me aparece la opción "Re-run all jobs"»</w:t>
+            </w:r>
+          </w:p>
+        </w:tc>
+        <w:tc>
+          <w:tcPr>
+            <w:tcW w:type="dxa" w:w="3682"/>
+            <w:tcMar>
+              <w:top w:type="dxa" w:w="60"/>
+              <w:left w:type="dxa" w:w="100"/>
+              <w:bottom w:type="dxa" w:w="60"/>
+              <w:right w:type="dxa" w:w="100"/>
+            </w:tcMar>
+          </w:tcPr>
+          <w:p>
+            <w:pPr>
+              <w:spacing w:after="0" w:before="0" w:line="252"/>
+            </w:pPr>
+            <w:r>
+              <w:rPr>
+                <w:rFonts w:ascii="Calibri" w:cs="Calibri" w:eastAsia="Calibri" w:hAnsi="Calibri"/>
+                <w:sz w:val="18"/>
+                <w:szCs w:val="18"/>
+              </w:rPr>
+              <w:t xml:space="preserve">Comprueba que </w:t>
+            </w:r>
+            <w:r>
+              <w:rPr>
+                <w:rFonts w:ascii="Consolas" w:cs="Consolas" w:eastAsia="Consolas" w:hAnsi="Consolas"/>
+                <w:color w:val="2E3A36"/>
+                <w:sz w:val="16"/>
+                <w:szCs w:val="16"/>
+              </w:rPr>
+              <w:t xml:space="preserve">v1</w:t>
+            </w:r>
+            <w:r>
+              <w:rPr>
+                <w:rFonts w:ascii="Calibri" w:cs="Calibri" w:eastAsia="Calibri" w:hAnsi="Calibri"/>
+                <w:sz w:val="18"/>
+                <w:szCs w:val="18"/>
+              </w:rPr>
+              <w:t xml:space="preserve"> ya contiene el workflow, deduce que la ejecución falló antes de arrancar y lanza otra con un commit vacío</w:t>
+            </w:r>
+          </w:p>
+        </w:tc>
+        <w:tc>
+          <w:tcPr>
+            <w:tcW w:type="dxa" w:w="1600"/>
+            <w:tcMar>
+              <w:top w:type="dxa" w:w="60"/>
+              <w:left w:type="dxa" w:w="100"/>
+              <w:bottom w:type="dxa" w:w="60"/>
+              <w:right w:type="dxa" w:w="100"/>
+            </w:tcMar>
+          </w:tcPr>
+          <w:p>
+            <w:pPr>
+              <w:spacing w:after="0" w:before="0" w:line="252"/>
+            </w:pPr>
+            <w:r>
+              <w:rPr>
+                <w:rFonts w:ascii="Consolas" w:cs="Consolas" w:eastAsia="Consolas" w:hAnsi="Consolas"/>
+                <w:color w:val="2E3A36"/>
+                <w:sz w:val="16"/>
+                <w:szCs w:val="16"/>
+              </w:rPr>
+              <w:t xml:space="preserve">ci / checks</w:t>
+            </w:r>
+            <w:r>
+              <w:rPr>
+                <w:rFonts w:ascii="Calibri" w:cs="Calibri" w:eastAsia="Calibri" w:hAnsi="Calibri"/>
+                <w:sz w:val="18"/>
+                <w:szCs w:val="18"/>
+              </w:rPr>
+              <w:t xml:space="preserve"> en verde</w:t>
+            </w:r>
+          </w:p>
+        </w:tc>
+      </w:tr>
+      <w:tr>
+        <w:trPr>
+          <w:cantSplit/>
+        </w:trPr>
+        <w:tc>
+          <w:tcPr>
+            <w:tcW w:type="dxa" w:w="700"/>
+            <w:tcMar>
+              <w:top w:type="dxa" w:w="60"/>
+              <w:left w:type="dxa" w:w="100"/>
+              <w:bottom w:type="dxa" w:w="60"/>
+              <w:right w:type="dxa" w:w="100"/>
+            </w:tcMar>
+          </w:tcPr>
+          <w:p>
+            <w:pPr>
+              <w:spacing w:after="0" w:before="0" w:line="252"/>
+            </w:pPr>
+            <w:r>
+              <w:rPr>
+                <w:rFonts w:ascii="Calibri" w:cs="Calibri" w:eastAsia="Calibri" w:hAnsi="Calibri"/>
+                <w:sz w:val="18"/>
+                <w:szCs w:val="18"/>
+              </w:rPr>
+              <w:t xml:space="preserve">65</w:t>
+            </w:r>
+          </w:p>
+        </w:tc>
+        <w:tc>
+          <w:tcPr>
+            <w:tcW w:type="dxa" w:w="3088"/>
+            <w:tcMar>
+              <w:top w:type="dxa" w:w="60"/>
+              <w:left w:type="dxa" w:w="100"/>
+              <w:bottom w:type="dxa" w:w="60"/>
+              <w:right w:type="dxa" w:w="100"/>
+            </w:tcMar>
+          </w:tcPr>
+          <w:p>
+            <w:pPr>
+              <w:spacing w:after="0" w:before="0" w:line="252"/>
+            </w:pPr>
+            <w:r>
+              <w:rPr>
+                <w:rFonts w:ascii="Calibri" w:cs="Calibri" w:eastAsia="Calibri" w:hAnsi="Calibri"/>
+                <w:sz w:val="18"/>
+                <w:szCs w:val="18"/>
+              </w:rPr>
+              <w:t xml:space="preserve">«Listo. Recuerda especificar en qué repo hay que ejecutar los comandos o las acciones que me indicas»</w:t>
+            </w:r>
+          </w:p>
+        </w:tc>
+        <w:tc>
+          <w:tcPr>
+            <w:tcW w:type="dxa" w:w="3682"/>
+            <w:tcMar>
+              <w:top w:type="dxa" w:w="60"/>
+              <w:left w:type="dxa" w:w="100"/>
+              <w:bottom w:type="dxa" w:w="60"/>
+              <w:right w:type="dxa" w:w="100"/>
+            </w:tcMar>
+          </w:tcPr>
+          <w:p>
+            <w:pPr>
+              <w:spacing w:after="0" w:before="0" w:line="252"/>
+            </w:pPr>
+            <w:r>
+              <w:rPr>
+                <w:rFonts w:ascii="Calibri" w:cs="Calibri" w:eastAsia="Calibri" w:hAnsi="Calibri"/>
+                <w:sz w:val="18"/>
+                <w:szCs w:val="18"/>
+              </w:rPr>
+              <w:t xml:space="preserve">Lo anota como regla de trabajo. Verifica la regla del ruleset y abre un PR con un error de lint: el CI falla y el merge queda bloqueado</w:t>
+            </w:r>
+          </w:p>
+        </w:tc>
+        <w:tc>
+          <w:tcPr>
+            <w:tcW w:type="dxa" w:w="1600"/>
+            <w:tcMar>
+              <w:top w:type="dxa" w:w="60"/>
+              <w:left w:type="dxa" w:w="100"/>
+              <w:bottom w:type="dxa" w:w="60"/>
+              <w:right w:type="dxa" w:w="100"/>
+            </w:tcMar>
+          </w:tcPr>
+          <w:p>
+            <w:pPr>
+              <w:spacing w:after="0" w:before="0" w:line="252"/>
+            </w:pPr>
+            <w:r>
+              <w:rPr>
+                <w:rFonts w:ascii="Calibri" w:cs="Calibri" w:eastAsia="Calibri" w:hAnsi="Calibri"/>
+                <w:sz w:val="18"/>
+                <w:szCs w:val="18"/>
+              </w:rPr>
+              <w:t xml:space="preserve">Tarea 6 cerrada</w:t>
+            </w:r>
+          </w:p>
+        </w:tc>
+      </w:tr>
+    </w:tbl>
+    <w:p>
+      <w:pPr>
+        <w:spacing w:after="120"/>
+      </w:pPr>
+    </w:p>
+    <w:p>
+      <w:pPr>
+        <w:pStyle w:val="Heading2"/>
+        <w:keepNext/>
+      </w:pPr>
+      <w:r>
+        <w:rPr>
+          <w:rFonts w:ascii="Calibri" w:cs="Calibri" w:eastAsia="Calibri" w:hAnsi="Calibri"/>
+        </w:rPr>
+        <w:t xml:space="preserve">Pruebas realizadas y resultados</w:t>
+      </w:r>
+    </w:p>
+    <w:p>
+      <w:pPr>
+        <w:pStyle w:val="Heading3"/>
+        <w:keepNext/>
+      </w:pPr>
+      <w:r>
+        <w:rPr>
+          <w:rFonts w:ascii="Calibri" w:cs="Calibri" w:eastAsia="Calibri" w:hAnsi="Calibri"/>
+        </w:rPr>
+        <w:t xml:space="preserve">Pruebas automáticas</w:t>
+      </w:r>
+    </w:p>
+    <w:tbl>
+      <w:tblPr>
+        <w:tblW w:type="dxa" w:w="9070"/>
+        <w:tblBorders>
+          <w:top w:val="single" w:color="C9D3CF" w:sz="4"/>
+          <w:left w:val="single" w:color="C9D3CF" w:sz="4"/>
+          <w:bottom w:val="single" w:color="C9D3CF" w:sz="4"/>
+          <w:right w:val="single" w:color="C9D3CF" w:sz="4"/>
+          <w:insideH w:val="single" w:color="C9D3CF" w:sz="4"/>
+          <w:insideV w:val="single" w:color="C9D3CF" w:sz="4"/>
+        </w:tblBorders>
+      </w:tblPr>
+      <w:tblGrid>
+        <w:gridCol w:w="2580"/>
+        <w:gridCol w:w="4535"/>
+        <w:gridCol w:w="1955"/>
+      </w:tblGrid>
+      <w:tr>
+        <w:trPr>
+          <w:tblHeader/>
+        </w:trPr>
+        <w:tc>
+          <w:tcPr>
+            <w:tcW w:type="dxa" w:w="2580"/>
+            <w:shd w:fill="E3EEEA" w:color="auto" w:val="clear"/>
+            <w:tcMar>
+              <w:top w:type="dxa" w:w="60"/>
+              <w:left w:type="dxa" w:w="100"/>
+              <w:bottom w:type="dxa" w:w="60"/>
+              <w:right w:type="dxa" w:w="100"/>
+            </w:tcMar>
+          </w:tcPr>
+          <w:p>
+            <w:pPr>
+              <w:spacing w:after="0" w:before="0" w:line="252"/>
+            </w:pPr>
+            <w:r>
+              <w:rPr>
+                <w:rFonts w:ascii="Calibri" w:cs="Calibri" w:eastAsia="Calibri" w:hAnsi="Calibri"/>
+                <w:b/>
+                <w:bCs/>
+                <w:sz w:val="18"/>
+                <w:szCs w:val="18"/>
+              </w:rPr>
+              <w:t xml:space="preserve">Componente</w:t>
+            </w:r>
+          </w:p>
+        </w:tc>
+        <w:tc>
+          <w:tcPr>
+            <w:tcW w:type="dxa" w:w="4535"/>
+            <w:shd w:fill="E3EEEA" w:color="auto" w:val="clear"/>
+            <w:tcMar>
+              <w:top w:type="dxa" w:w="60"/>
+              <w:left w:type="dxa" w:w="100"/>
+              <w:bottom w:type="dxa" w:w="60"/>
+              <w:right w:type="dxa" w:w="100"/>
+            </w:tcMar>
+          </w:tcPr>
+          <w:p>
+            <w:pPr>
+              <w:spacing w:after="0" w:before="0" w:line="252"/>
+            </w:pPr>
+            <w:r>
+              <w:rPr>
+                <w:rFonts w:ascii="Calibri" w:cs="Calibri" w:eastAsia="Calibri" w:hAnsi="Calibri"/>
+                <w:b/>
+                <w:bCs/>
+                <w:sz w:val="18"/>
+                <w:szCs w:val="18"/>
+              </w:rPr>
+              <w:t xml:space="preserve">Pruebas</w:t>
+            </w:r>
+          </w:p>
+        </w:tc>
+        <w:tc>
+          <w:tcPr>
+            <w:tcW w:type="dxa" w:w="1955"/>
+            <w:shd w:fill="E3EEEA" w:color="auto" w:val="clear"/>
+            <w:tcMar>
+              <w:top w:type="dxa" w:w="60"/>
+              <w:left w:type="dxa" w:w="100"/>
+              <w:bottom w:type="dxa" w:w="60"/>
+              <w:right w:type="dxa" w:w="100"/>
+            </w:tcMar>
+          </w:tcPr>
+          <w:p>
+            <w:pPr>
+              <w:spacing w:after="0" w:before="0" w:line="252"/>
+            </w:pPr>
+            <w:r>
+              <w:rPr>
+                <w:rFonts w:ascii="Calibri" w:cs="Calibri" w:eastAsia="Calibri" w:hAnsi="Calibri"/>
+                <w:b/>
+                <w:bCs/>
+                <w:sz w:val="18"/>
+                <w:szCs w:val="18"/>
+              </w:rPr>
+              <w:t xml:space="preserve">Resultado</w:t>
+            </w:r>
+          </w:p>
+        </w:tc>
+      </w:tr>
+      <w:tr>
+        <w:trPr>
+          <w:cantSplit/>
+        </w:trPr>
+        <w:tc>
+          <w:tcPr>
+            <w:tcW w:type="dxa" w:w="2580"/>
+            <w:tcMar>
+              <w:top w:type="dxa" w:w="60"/>
+              <w:left w:type="dxa" w:w="100"/>
+              <w:bottom w:type="dxa" w:w="60"/>
+              <w:right w:type="dxa" w:w="100"/>
+            </w:tcMar>
+          </w:tcPr>
+          <w:p>
+            <w:pPr>
+              <w:spacing w:after="0" w:before="0" w:line="252"/>
+            </w:pPr>
+            <w:r>
+              <w:rPr>
+                <w:rFonts w:ascii="Calibri" w:cs="Calibri" w:eastAsia="Calibri" w:hAnsi="Calibri"/>
+                <w:sz w:val="18"/>
+                <w:szCs w:val="18"/>
+              </w:rPr>
+              <w:t xml:space="preserve">Hook </w:t>
+            </w:r>
+            <w:r>
+              <w:rPr>
+                <w:rFonts w:ascii="Consolas" w:cs="Consolas" w:eastAsia="Consolas" w:hAnsi="Consolas"/>
+                <w:color w:val="2E3A36"/>
+                <w:sz w:val="16"/>
+                <w:szCs w:val="16"/>
+              </w:rPr>
+              <w:t xml:space="preserve">guard.py</w:t>
+            </w:r>
+          </w:p>
+        </w:tc>
+        <w:tc>
+          <w:tcPr>
+            <w:tcW w:type="dxa" w:w="4535"/>
+            <w:tcMar>
+              <w:top w:type="dxa" w:w="60"/>
+              <w:left w:type="dxa" w:w="100"/>
+              <w:bottom w:type="dxa" w:w="60"/>
+              <w:right w:type="dxa" w:w="100"/>
+            </w:tcMar>
+          </w:tcPr>
+          <w:p>
+            <w:pPr>
+              <w:spacing w:after="0" w:before="0" w:line="252"/>
+            </w:pPr>
+            <w:r>
+              <w:rPr>
+                <w:rFonts w:ascii="Calibri" w:cs="Calibri" w:eastAsia="Calibri" w:hAnsi="Calibri"/>
+                <w:sz w:val="18"/>
+                <w:szCs w:val="18"/>
+              </w:rPr>
+              <w:t xml:space="preserve">45 casos: 21 comandos que deben bloquearse, 10 que deben permitirse, ficheros protegidos, secretos y auditoría</w:t>
+            </w:r>
+          </w:p>
+        </w:tc>
+        <w:tc>
+          <w:tcPr>
+            <w:tcW w:type="dxa" w:w="1955"/>
+            <w:tcMar>
+              <w:top w:type="dxa" w:w="60"/>
+              <w:left w:type="dxa" w:w="100"/>
+              <w:bottom w:type="dxa" w:w="60"/>
+              <w:right w:type="dxa" w:w="100"/>
+            </w:tcMar>
+          </w:tcPr>
+          <w:p>
+            <w:pPr>
+              <w:spacing w:after="0" w:before="0" w:line="252"/>
+            </w:pPr>
+            <w:r>
+              <w:rPr>
+                <w:rFonts w:ascii="Calibri" w:cs="Calibri" w:eastAsia="Calibri" w:hAnsi="Calibri"/>
+                <w:sz w:val="18"/>
+                <w:szCs w:val="18"/>
+              </w:rPr>
+              <w:t xml:space="preserve">45/45 superadas</w:t>
+            </w:r>
+          </w:p>
+        </w:tc>
+      </w:tr>
+      <w:tr>
+        <w:trPr>
+          <w:cantSplit/>
+        </w:trPr>
+        <w:tc>
+          <w:tcPr>
+            <w:tcW w:type="dxa" w:w="2580"/>
+            <w:tcMar>
+              <w:top w:type="dxa" w:w="60"/>
+              <w:left w:type="dxa" w:w="100"/>
+              <w:bottom w:type="dxa" w:w="60"/>
+              <w:right w:type="dxa" w:w="100"/>
+            </w:tcMar>
+          </w:tcPr>
+          <w:p>
+            <w:pPr>
+              <w:spacing w:after="0" w:before="0" w:line="252"/>
+            </w:pPr>
+            <w:r>
+              <w:rPr>
+                <w:rFonts w:ascii="Calibri" w:cs="Calibri" w:eastAsia="Calibri" w:hAnsi="Calibri"/>
+                <w:sz w:val="18"/>
+                <w:szCs w:val="18"/>
+              </w:rPr>
+              <w:t xml:space="preserve">Aplicación: catálogo (</w:t>
+            </w:r>
+            <w:r>
+              <w:rPr>
+                <w:rFonts w:ascii="Consolas" w:cs="Consolas" w:eastAsia="Consolas" w:hAnsi="Consolas"/>
+                <w:color w:val="2E3A36"/>
+                <w:sz w:val="16"/>
+                <w:szCs w:val="16"/>
+              </w:rPr>
+              <w:t xml:space="preserve">app</w:t>
+            </w:r>
+            <w:r>
+              <w:rPr>
+                <w:rFonts w:ascii="Calibri" w:cs="Calibri" w:eastAsia="Calibri" w:hAnsi="Calibri"/>
+                <w:sz w:val="18"/>
+                <w:szCs w:val="18"/>
+              </w:rPr>
+              <w:t xml:space="preserve">)</w:t>
+            </w:r>
+          </w:p>
+        </w:tc>
+        <w:tc>
+          <w:tcPr>
+            <w:tcW w:type="dxa" w:w="4535"/>
+            <w:tcMar>
+              <w:top w:type="dxa" w:w="60"/>
+              <w:left w:type="dxa" w:w="100"/>
+              <w:bottom w:type="dxa" w:w="60"/>
+              <w:right w:type="dxa" w:w="100"/>
+            </w:tcMar>
+          </w:tcPr>
+          <w:p>
+            <w:pPr>
+              <w:spacing w:after="0" w:before="0" w:line="252"/>
+            </w:pPr>
+            <w:r>
+              <w:rPr>
+                <w:rFonts w:ascii="Calibri" w:cs="Calibri" w:eastAsia="Calibri" w:hAnsi="Calibri"/>
+                <w:sz w:val="18"/>
+                <w:szCs w:val="18"/>
+              </w:rPr>
+              <w:t xml:space="preserve">55 casos: listado, consulta por id, 404, precio con 2 decimales, orden estable, catálogo mal formado, despliegue de un cambio de precio, observabilidad y </w:t>
+            </w:r>
+            <w:r>
+              <w:rPr>
+                <w:rFonts w:ascii="Consolas" w:cs="Consolas" w:eastAsia="Consolas" w:hAnsi="Consolas"/>
+                <w:color w:val="2E3A36"/>
+                <w:sz w:val="16"/>
+                <w:szCs w:val="16"/>
+              </w:rPr>
+              <w:t xml:space="preserve">/health</w:t>
+            </w:r>
+          </w:p>
+        </w:tc>
+        <w:tc>
+          <w:tcPr>
+            <w:tcW w:type="dxa" w:w="1955"/>
+            <w:tcMar>
+              <w:top w:type="dxa" w:w="60"/>
+              <w:left w:type="dxa" w:w="100"/>
+              <w:bottom w:type="dxa" w:w="60"/>
+              <w:right w:type="dxa" w:w="100"/>
+            </w:tcMar>
+          </w:tcPr>
+          <w:p>
+            <w:pPr>
+              <w:spacing w:after="0" w:before="0" w:line="252"/>
+            </w:pPr>
+            <w:r>
+              <w:rPr>
+                <w:rFonts w:ascii="Calibri" w:cs="Calibri" w:eastAsia="Calibri" w:hAnsi="Calibri"/>
+                <w:sz w:val="18"/>
+                <w:szCs w:val="18"/>
+              </w:rPr>
+              <w:t xml:space="preserve">55/55 superadas</w:t>
+            </w:r>
+          </w:p>
+        </w:tc>
+      </w:tr>
+      <w:tr>
+        <w:trPr>
+          <w:cantSplit/>
+        </w:trPr>
+        <w:tc>
+          <w:tcPr>
+            <w:tcW w:type="dxa" w:w="2580"/>
+            <w:tcMar>
+              <w:top w:type="dxa" w:w="60"/>
+              <w:left w:type="dxa" w:w="100"/>
+              <w:bottom w:type="dxa" w:w="60"/>
+              <w:right w:type="dxa" w:w="100"/>
+            </w:tcMar>
+          </w:tcPr>
+          <w:p>
+            <w:pPr>
+              <w:spacing w:after="0" w:before="0" w:line="252"/>
+            </w:pPr>
+            <w:r>
+              <w:rPr>
+                <w:rFonts w:ascii="Calibri" w:cs="Calibri" w:eastAsia="Calibri" w:hAnsi="Calibri"/>
+                <w:sz w:val="18"/>
+                <w:szCs w:val="18"/>
+              </w:rPr>
+              <w:t xml:space="preserve">CI obligatorio (app#12)</w:t>
+            </w:r>
+          </w:p>
+        </w:tc>
+        <w:tc>
+          <w:tcPr>
+            <w:tcW w:type="dxa" w:w="4535"/>
+            <w:tcMar>
+              <w:top w:type="dxa" w:w="60"/>
+              <w:left w:type="dxa" w:w="100"/>
+              <w:bottom w:type="dxa" w:w="60"/>
+              <w:right w:type="dxa" w:w="100"/>
+            </w:tcMar>
+          </w:tcPr>
+          <w:p>
+            <w:pPr>
+              <w:spacing w:after="0" w:before="0" w:line="252"/>
+            </w:pPr>
+            <w:r>
+              <w:rPr>
+                <w:rFonts w:ascii="Calibri" w:cs="Calibri" w:eastAsia="Calibri" w:hAnsi="Calibri"/>
+                <w:sz w:val="18"/>
+                <w:szCs w:val="18"/>
+              </w:rPr>
+              <w:t xml:space="preserve">PR con un </w:t>
+            </w:r>
+            <w:r>
+              <w:rPr>
+                <w:rFonts w:ascii="Consolas" w:cs="Consolas" w:eastAsia="Consolas" w:hAnsi="Consolas"/>
+                <w:color w:val="2E3A36"/>
+                <w:sz w:val="16"/>
+                <w:szCs w:val="16"/>
+              </w:rPr>
+              <w:t xml:space="preserve">import</w:t>
+            </w:r>
+            <w:r>
+              <w:rPr>
+                <w:rFonts w:ascii="Calibri" w:cs="Calibri" w:eastAsia="Calibri" w:hAnsi="Calibri"/>
+                <w:sz w:val="18"/>
+                <w:szCs w:val="18"/>
+              </w:rPr>
+              <w:t xml:space="preserve"> sin usar</w:t>
+            </w:r>
+          </w:p>
+        </w:tc>
+        <w:tc>
+          <w:tcPr>
+            <w:tcW w:type="dxa" w:w="1955"/>
+            <w:tcMar>
+              <w:top w:type="dxa" w:w="60"/>
+              <w:left w:type="dxa" w:w="100"/>
+              <w:bottom w:type="dxa" w:w="60"/>
+              <w:right w:type="dxa" w:w="100"/>
+            </w:tcMar>
+          </w:tcPr>
+          <w:p>
+            <w:pPr>
+              <w:spacing w:after="0" w:before="0" w:line="252"/>
+            </w:pPr>
+            <w:r>
+              <w:rPr>
+                <w:rFonts w:ascii="Calibri" w:cs="Calibri" w:eastAsia="Calibri" w:hAnsi="Calibri"/>
+                <w:sz w:val="18"/>
+                <w:szCs w:val="18"/>
+              </w:rPr>
+              <w:t xml:space="preserve">CI en rojo y merge bloqueado</w:t>
+            </w:r>
+          </w:p>
+        </w:tc>
+      </w:tr>
+      <w:tr>
+        <w:trPr>
+          <w:cantSplit/>
+        </w:trPr>
+        <w:tc>
+          <w:tcPr>
+            <w:tcW w:type="dxa" w:w="2580"/>
+            <w:tcMar>
+              <w:top w:type="dxa" w:w="60"/>
+              <w:left w:type="dxa" w:w="100"/>
+              <w:bottom w:type="dxa" w:w="60"/>
+              <w:right w:type="dxa" w:w="100"/>
+            </w:tcMar>
+          </w:tcPr>
+          <w:p>
+            <w:pPr>
+              <w:spacing w:after="0" w:before="0" w:line="252"/>
+            </w:pPr>
+            <w:r>
+              <w:rPr>
+                <w:rFonts w:ascii="Calibri" w:cs="Calibri" w:eastAsia="Calibri" w:hAnsi="Calibri"/>
+                <w:sz w:val="18"/>
+                <w:szCs w:val="18"/>
+              </w:rPr>
+              <w:t xml:space="preserve">Triage (</w:t>
+            </w:r>
+            <w:r>
+              <w:rPr>
+                <w:rFonts w:ascii="Consolas" w:cs="Consolas" w:eastAsia="Consolas" w:hAnsi="Consolas"/>
+                <w:color w:val="2E3A36"/>
+                <w:sz w:val="16"/>
+                <w:szCs w:val="16"/>
+              </w:rPr>
+              <w:t xml:space="preserve">apply.py</w:t>
+            </w:r>
+            <w:r>
+              <w:rPr>
+                <w:rFonts w:ascii="Calibri" w:cs="Calibri" w:eastAsia="Calibri" w:hAnsi="Calibri"/>
+                <w:sz w:val="18"/>
+                <w:szCs w:val="18"/>
+              </w:rPr>
+              <w:t xml:space="preserve">, </w:t>
+            </w:r>
+            <w:r>
+              <w:rPr>
+                <w:rFonts w:ascii="Consolas" w:cs="Consolas" w:eastAsia="Consolas" w:hAnsi="Consolas"/>
+                <w:color w:val="2E3A36"/>
+                <w:sz w:val="16"/>
+                <w:szCs w:val="16"/>
+              </w:rPr>
               <w:t xml:space="preserve">build_prompt.py</w:t>
             </w:r>
             <w:r>
@@ -23704,7 +25459,7 @@
         </w:tc>
         <w:tc>
           <w:tcPr>
-            <w:tcW w:type="dxa" w:w="4869"/>
+            <w:tcW w:type="dxa" w:w="4535"/>
             <w:tcMar>
               <w:top w:type="dxa" w:w="60"/>
               <w:left w:type="dxa" w:w="100"/>
@@ -23728,7 +25483,7 @@
         </w:tc>
         <w:tc>
           <w:tcPr>
-            <w:tcW w:type="dxa" w:w="1653"/>
+            <w:tcW w:type="dxa" w:w="1955"/>
             <w:tcMar>
               <w:top w:type="dxa" w:w="60"/>
               <w:left w:type="dxa" w:w="100"/>
@@ -26052,8 +27807,8 @@
         </w:tblBorders>
       </w:tblPr>
       <w:tblGrid>
-        <w:gridCol w:w="4233"/>
-        <w:gridCol w:w="4837"/>
+        <w:gridCol w:w="4205"/>
+        <w:gridCol w:w="4865"/>
       </w:tblGrid>
       <w:tr>
         <w:trPr>
@@ -26061,7 +27816,7 @@
         </w:trPr>
         <w:tc>
           <w:tcPr>
-            <w:tcW w:type="dxa" w:w="4233"/>
+            <w:tcW w:type="dxa" w:w="4205"/>
             <w:shd w:fill="E3EEEA" w:color="auto" w:val="clear"/>
             <w:tcMar>
               <w:top w:type="dxa" w:w="60"/>
@@ -26088,7 +27843,7 @@
         </w:tc>
         <w:tc>
           <w:tcPr>
-            <w:tcW w:type="dxa" w:w="4837"/>
+            <w:tcW w:type="dxa" w:w="4865"/>
             <w:shd w:fill="E3EEEA" w:color="auto" w:val="clear"/>
             <w:tcMar>
               <w:top w:type="dxa" w:w="60"/>
@@ -26120,7 +27875,7 @@
         </w:trPr>
         <w:tc>
           <w:tcPr>
-            <w:tcW w:type="dxa" w:w="4233"/>
+            <w:tcW w:type="dxa" w:w="4205"/>
             <w:tcMar>
               <w:top w:type="dxa" w:w="60"/>
               <w:left w:type="dxa" w:w="100"/>
@@ -26144,25 +27899,25 @@
         </w:tc>
         <w:tc>
           <w:tcPr>
-            <w:tcW w:type="dxa" w:w="4837"/>
-            <w:tcMar>
-              <w:top w:type="dxa" w:w="60"/>
-              <w:left w:type="dxa" w:w="100"/>
-              <w:bottom w:type="dxa" w:w="60"/>
-              <w:right w:type="dxa" w:w="100"/>
-            </w:tcMar>
-          </w:tcPr>
-          <w:p>
-            <w:pPr>
-              <w:spacing w:after="0" w:before="0" w:line="252"/>
-            </w:pPr>
-            <w:r>
-              <w:rPr>
-                <w:rFonts w:ascii="Calibri" w:cs="Calibri" w:eastAsia="Calibri" w:hAnsi="Calibri"/>
-                <w:sz w:val="18"/>
-                <w:szCs w:val="18"/>
-              </w:rPr>
-              <w:t xml:space="preserve">6 de 18 (1, 2, 3, A, 4 y 5)</w:t>
+            <w:tcW w:type="dxa" w:w="4865"/>
+            <w:tcMar>
+              <w:top w:type="dxa" w:w="60"/>
+              <w:left w:type="dxa" w:w="100"/>
+              <w:bottom w:type="dxa" w:w="60"/>
+              <w:right w:type="dxa" w:w="100"/>
+            </w:tcMar>
+          </w:tcPr>
+          <w:p>
+            <w:pPr>
+              <w:spacing w:after="0" w:before="0" w:line="252"/>
+            </w:pPr>
+            <w:r>
+              <w:rPr>
+                <w:rFonts w:ascii="Calibri" w:cs="Calibri" w:eastAsia="Calibri" w:hAnsi="Calibri"/>
+                <w:sz w:val="18"/>
+                <w:szCs w:val="18"/>
+              </w:rPr>
+              <w:t xml:space="preserve">7 de 18 (1, 2, 3, A, 4, 5 y 6)</w:t>
             </w:r>
           </w:p>
         </w:tc>
@@ -26173,7 +27928,7 @@
         </w:trPr>
         <w:tc>
           <w:tcPr>
-            <w:tcW w:type="dxa" w:w="4233"/>
+            <w:tcW w:type="dxa" w:w="4205"/>
             <w:tcMar>
               <w:top w:type="dxa" w:w="60"/>
               <w:left w:type="dxa" w:w="100"/>
@@ -26197,25 +27952,25 @@
         </w:tc>
         <w:tc>
           <w:tcPr>
-            <w:tcW w:type="dxa" w:w="4837"/>
-            <w:tcMar>
-              <w:top w:type="dxa" w:w="60"/>
-              <w:left w:type="dxa" w:w="100"/>
-              <w:bottom w:type="dxa" w:w="60"/>
-              <w:right w:type="dxa" w:w="100"/>
-            </w:tcMar>
-          </w:tcPr>
-          <w:p>
-            <w:pPr>
-              <w:spacing w:after="0" w:before="0" w:line="252"/>
-            </w:pPr>
-            <w:r>
-              <w:rPr>
-                <w:rFonts w:ascii="Calibri" w:cs="Calibri" w:eastAsia="Calibri" w:hAnsi="Calibri"/>
-                <w:sz w:val="18"/>
-                <w:szCs w:val="18"/>
-              </w:rPr>
-              <w:t xml:space="preserve">12 (4 en core y 8 en app, dos de ellos del agente), más la documentación</w:t>
+            <w:tcW w:type="dxa" w:w="4865"/>
+            <w:tcMar>
+              <w:top w:type="dxa" w:w="60"/>
+              <w:left w:type="dxa" w:w="100"/>
+              <w:bottom w:type="dxa" w:w="60"/>
+              <w:right w:type="dxa" w:w="100"/>
+            </w:tcMar>
+          </w:tcPr>
+          <w:p>
+            <w:pPr>
+              <w:spacing w:after="0" w:before="0" w:line="252"/>
+            </w:pPr>
+            <w:r>
+              <w:rPr>
+                <w:rFonts w:ascii="Calibri" w:cs="Calibri" w:eastAsia="Calibri" w:hAnsi="Calibri"/>
+                <w:sz w:val="18"/>
+                <w:szCs w:val="18"/>
+              </w:rPr>
+              <w:t xml:space="preserve">14 (5 en core y 9 en app, dos de ellos del agente), más la documentación</w:t>
             </w:r>
           </w:p>
         </w:tc>
@@ -26226,7 +27981,7 @@
         </w:trPr>
         <w:tc>
           <w:tcPr>
-            <w:tcW w:type="dxa" w:w="4233"/>
+            <w:tcW w:type="dxa" w:w="4205"/>
             <w:tcMar>
               <w:top w:type="dxa" w:w="60"/>
               <w:left w:type="dxa" w:w="100"/>
@@ -26250,7 +28005,7 @@
         </w:tc>
         <w:tc>
           <w:tcPr>
-            <w:tcW w:type="dxa" w:w="4837"/>
+            <w:tcW w:type="dxa" w:w="4865"/>
             <w:tcMar>
               <w:top w:type="dxa" w:w="60"/>
               <w:left w:type="dxa" w:w="100"/>
@@ -26279,7 +28034,7 @@
         </w:trPr>
         <w:tc>
           <w:tcPr>
-            <w:tcW w:type="dxa" w:w="4233"/>
+            <w:tcW w:type="dxa" w:w="4205"/>
             <w:tcMar>
               <w:top w:type="dxa" w:w="60"/>
               <w:left w:type="dxa" w:w="100"/>
@@ -26303,25 +28058,25 @@
         </w:tc>
         <w:tc>
           <w:tcPr>
-            <w:tcW w:type="dxa" w:w="4837"/>
-            <w:tcMar>
-              <w:top w:type="dxa" w:w="60"/>
-              <w:left w:type="dxa" w:w="100"/>
-              <w:bottom w:type="dxa" w:w="60"/>
-              <w:right w:type="dxa" w:w="100"/>
-            </w:tcMar>
-          </w:tcPr>
-          <w:p>
-            <w:pPr>
-              <w:spacing w:after="0" w:before="0" w:line="252"/>
-            </w:pPr>
-            <w:r>
-              <w:rPr>
-                <w:rFonts w:ascii="Calibri" w:cs="Calibri" w:eastAsia="Calibri" w:hAnsi="Calibri"/>
-                <w:sz w:val="18"/>
-                <w:szCs w:val="18"/>
-              </w:rPr>
-              <w:t xml:space="preserve">60</w:t>
+            <w:tcW w:type="dxa" w:w="4865"/>
+            <w:tcMar>
+              <w:top w:type="dxa" w:w="60"/>
+              <w:left w:type="dxa" w:w="100"/>
+              <w:bottom w:type="dxa" w:w="60"/>
+              <w:right w:type="dxa" w:w="100"/>
+            </w:tcMar>
+          </w:tcPr>
+          <w:p>
+            <w:pPr>
+              <w:spacing w:after="0" w:before="0" w:line="252"/>
+            </w:pPr>
+            <w:r>
+              <w:rPr>
+                <w:rFonts w:ascii="Calibri" w:cs="Calibri" w:eastAsia="Calibri" w:hAnsi="Calibri"/>
+                <w:sz w:val="18"/>
+                <w:szCs w:val="18"/>
+              </w:rPr>
+              <w:t xml:space="preserve">65</w:t>
             </w:r>
           </w:p>
         </w:tc>
@@ -26332,7 +28087,7 @@
         </w:trPr>
         <w:tc>
           <w:tcPr>
-            <w:tcW w:type="dxa" w:w="4233"/>
+            <w:tcW w:type="dxa" w:w="4205"/>
             <w:tcMar>
               <w:top w:type="dxa" w:w="60"/>
               <w:left w:type="dxa" w:w="100"/>
@@ -26356,25 +28111,25 @@
         </w:tc>
         <w:tc>
           <w:tcPr>
-            <w:tcW w:type="dxa" w:w="4837"/>
-            <w:tcMar>
-              <w:top w:type="dxa" w:w="60"/>
-              <w:left w:type="dxa" w:w="100"/>
-              <w:bottom w:type="dxa" w:w="60"/>
-              <w:right w:type="dxa" w:w="100"/>
-            </w:tcMar>
-          </w:tcPr>
-          <w:p>
-            <w:pPr>
-              <w:spacing w:after="0" w:before="0" w:line="252"/>
-            </w:pPr>
-            <w:r>
-              <w:rPr>
-                <w:rFonts w:ascii="Calibri" w:cs="Calibri" w:eastAsia="Calibri" w:hAnsi="Calibri"/>
-                <w:sz w:val="18"/>
-                <w:szCs w:val="18"/>
-              </w:rPr>
-              <w:t xml:space="preserve">12</w:t>
+            <w:tcW w:type="dxa" w:w="4865"/>
+            <w:tcMar>
+              <w:top w:type="dxa" w:w="60"/>
+              <w:left w:type="dxa" w:w="100"/>
+              <w:bottom w:type="dxa" w:w="60"/>
+              <w:right w:type="dxa" w:w="100"/>
+            </w:tcMar>
+          </w:tcPr>
+          <w:p>
+            <w:pPr>
+              <w:spacing w:after="0" w:before="0" w:line="252"/>
+            </w:pPr>
+            <w:r>
+              <w:rPr>
+                <w:rFonts w:ascii="Calibri" w:cs="Calibri" w:eastAsia="Calibri" w:hAnsi="Calibri"/>
+                <w:sz w:val="18"/>
+                <w:szCs w:val="18"/>
+              </w:rPr>
+              <w:t xml:space="preserve">14</w:t>
             </w:r>
           </w:p>
         </w:tc>
@@ -26385,7 +28140,7 @@
         </w:trPr>
         <w:tc>
           <w:tcPr>
-            <w:tcW w:type="dxa" w:w="4233"/>
+            <w:tcW w:type="dxa" w:w="4205"/>
             <w:tcMar>
               <w:top w:type="dxa" w:w="60"/>
               <w:left w:type="dxa" w:w="100"/>
@@ -26409,7 +28164,7 @@
         </w:tc>
         <w:tc>
           <w:tcPr>
-            <w:tcW w:type="dxa" w:w="4837"/>
+            <w:tcW w:type="dxa" w:w="4865"/>
             <w:tcMar>
               <w:top w:type="dxa" w:w="60"/>
               <w:left w:type="dxa" w:w="100"/>
@@ -26453,7 +28208,7 @@
           <w:sz w:val="21"/>
           <w:szCs w:val="21"/>
         </w:rPr>
-        <w:t xml:space="preserve">Este capítulo se ampliará con las iteraciones y pruebas de las tareas 6 a 12 y B a F.</w:t>
+        <w:t xml:space="preserve">Este capítulo se ampliará con las iteraciones y pruebas de las tareas 7 a 12 y B a F.</w:t>
       </w:r>
     </w:p>
     <w:p>
@@ -27966,6 +29721,354 @@
     </w:p>
     <w:p>
       <w:pPr>
+        <w:pStyle w:val="Heading3"/>
+        <w:keepNext/>
+      </w:pPr>
+      <w:r>
+        <w:rPr>
+          <w:rFonts w:ascii="Calibri" w:cs="Calibri" w:eastAsia="Calibri" w:hAnsi="Calibri"/>
+        </w:rPr>
+        <w:t xml:space="preserve">Tarea 6. CI obligatorio</w:t>
+      </w:r>
+    </w:p>
+    <w:p>
+      <w:pPr>
+        <w:pStyle w:val="ListParagraph"/>
+        <w:numPr>
+          <w:ilvl w:val="0"/>
+          <w:numId w:val="14"/>
+        </w:numPr>
+        <w:spacing w:after="60"/>
+      </w:pPr>
+      <w:r>
+        <w:rPr>
+          <w:rFonts w:ascii="Calibri" w:cs="Calibri" w:eastAsia="Calibri" w:hAnsi="Calibri"/>
+        </w:rPr>
+        <w:t xml:space="preserve">En core: añadir </w:t>
+      </w:r>
+      <w:r>
+        <w:rPr>
+          <w:rFonts w:ascii="Consolas" w:cs="Consolas" w:eastAsia="Consolas" w:hAnsi="Consolas"/>
+          <w:color w:val="2E3A36"/>
+          <w:sz w:val="20"/>
+          <w:szCs w:val="20"/>
+        </w:rPr>
+        <w:t xml:space="preserve">reusable-ci.yml</w:t>
+      </w:r>
+      <w:r>
+        <w:rPr>
+          <w:rFonts w:ascii="Calibri" w:cs="Calibri" w:eastAsia="Calibri" w:hAnsi="Calibri"/>
+        </w:rPr>
+        <w:t xml:space="preserve"> (y </w:t>
+      </w:r>
+      <w:r>
+        <w:rPr>
+          <w:rFonts w:ascii="Consolas" w:cs="Consolas" w:eastAsia="Consolas" w:hAnsi="Consolas"/>
+          <w:color w:val="2E3A36"/>
+          <w:sz w:val="20"/>
+          <w:szCs w:val="20"/>
+        </w:rPr>
+        <w:t xml:space="preserve">ci.yml</w:t>
+      </w:r>
+      <w:r>
+        <w:rPr>
+          <w:rFonts w:ascii="Calibri" w:cs="Calibri" w:eastAsia="Calibri" w:hAnsi="Calibri"/>
+        </w:rPr>
+        <w:t xml:space="preserve"> para sus propios tests) y fusionar.</w:t>
+      </w:r>
+    </w:p>
+    <w:p>
+      <w:pPr>
+        <w:pStyle w:val="ListParagraph"/>
+        <w:numPr>
+          <w:ilvl w:val="0"/>
+          <w:numId w:val="14"/>
+        </w:numPr>
+        <w:spacing w:after="60"/>
+      </w:pPr>
+      <w:r>
+        <w:rPr>
+          <w:rFonts w:ascii="Calibri" w:cs="Calibri" w:eastAsia="Calibri" w:hAnsi="Calibri"/>
+        </w:rPr>
+        <w:t xml:space="preserve">En core: mover la etiqueta </w:t>
+      </w:r>
+      <w:r>
+        <w:rPr>
+          <w:rFonts w:ascii="Consolas" w:cs="Consolas" w:eastAsia="Consolas" w:hAnsi="Consolas"/>
+          <w:color w:val="2E3A36"/>
+          <w:sz w:val="20"/>
+          <w:szCs w:val="20"/>
+        </w:rPr>
+        <w:t xml:space="preserve">v1</w:t>
+      </w:r>
+      <w:r>
+        <w:rPr>
+          <w:rFonts w:ascii="Calibri" w:cs="Calibri" w:eastAsia="Calibri" w:hAnsi="Calibri"/>
+        </w:rPr>
+        <w:t xml:space="preserve"> a la nueva </w:t>
+      </w:r>
+      <w:r>
+        <w:rPr>
+          <w:rFonts w:ascii="Consolas" w:cs="Consolas" w:eastAsia="Consolas" w:hAnsi="Consolas"/>
+          <w:color w:val="2E3A36"/>
+          <w:sz w:val="20"/>
+          <w:szCs w:val="20"/>
+        </w:rPr>
+        <w:t xml:space="preserve">main</w:t>
+      </w:r>
+      <w:r>
+        <w:rPr>
+          <w:rFonts w:ascii="Calibri" w:cs="Calibri" w:eastAsia="Calibri" w:hAnsi="Calibri"/>
+        </w:rPr>
+        <w:t xml:space="preserve">. Desde la web, borrando la release y la etiqueta y creándolas de nuevo sobre </w:t>
+      </w:r>
+      <w:r>
+        <w:rPr>
+          <w:rFonts w:ascii="Consolas" w:cs="Consolas" w:eastAsia="Consolas" w:hAnsi="Consolas"/>
+          <w:color w:val="2E3A36"/>
+          <w:sz w:val="20"/>
+          <w:szCs w:val="20"/>
+        </w:rPr>
+        <w:t xml:space="preserve">main</w:t>
+      </w:r>
+      <w:r>
+        <w:rPr>
+          <w:rFonts w:ascii="Calibri" w:cs="Calibri" w:eastAsia="Calibri" w:hAnsi="Calibri"/>
+        </w:rPr>
+        <w:t xml:space="preserve">; desde un clon con credenciales válidas (con 2FA, </w:t>
+      </w:r>
+      <w:r>
+        <w:rPr>
+          <w:rFonts w:ascii="Consolas" w:cs="Consolas" w:eastAsia="Consolas" w:hAnsi="Consolas"/>
+          <w:color w:val="2E3A36"/>
+          <w:sz w:val="20"/>
+          <w:szCs w:val="20"/>
+        </w:rPr>
+        <w:t xml:space="preserve">gh auth login</w:t>
+      </w:r>
+      <w:r>
+        <w:rPr>
+          <w:rFonts w:ascii="Calibri" w:cs="Calibri" w:eastAsia="Calibri" w:hAnsi="Calibri"/>
+        </w:rPr>
+        <w:t xml:space="preserve"> y </w:t>
+      </w:r>
+      <w:r>
+        <w:rPr>
+          <w:rFonts w:ascii="Consolas" w:cs="Consolas" w:eastAsia="Consolas" w:hAnsi="Consolas"/>
+          <w:color w:val="2E3A36"/>
+          <w:sz w:val="20"/>
+          <w:szCs w:val="20"/>
+        </w:rPr>
+        <w:t xml:space="preserve">gh auth setup-git</w:t>
+      </w:r>
+      <w:r>
+        <w:rPr>
+          <w:rFonts w:ascii="Calibri" w:cs="Calibri" w:eastAsia="Calibri" w:hAnsi="Calibri"/>
+        </w:rPr>
+        <w:t xml:space="preserve">):</w:t>
+      </w:r>
+    </w:p>
+    <w:p>
+      <w:pPr>
+        <w:shd w:fill="F2F4F3" w:color="auto" w:val="clear"/>
+        <w:spacing w:after="0" w:before="120" w:line="240"/>
+        <w:ind w:left="200" w:right="200"/>
+      </w:pPr>
+      <w:r>
+        <w:rPr>
+          <w:rFonts w:ascii="Consolas" w:cs="Consolas" w:eastAsia="Consolas" w:hAnsi="Consolas"/>
+          <w:color w:val="1F2A27"/>
+          <w:sz w:val="17"/>
+          <w:szCs w:val="17"/>
+        </w:rPr>
+        <w:t xml:space="preserve">git fetch origin --tags</w:t>
+      </w:r>
+    </w:p>
+    <w:p>
+      <w:pPr>
+        <w:shd w:fill="F2F4F3" w:color="auto" w:val="clear"/>
+        <w:spacing w:after="0" w:before="0" w:line="240"/>
+        <w:ind w:left="200" w:right="200"/>
+      </w:pPr>
+      <w:r>
+        <w:rPr>
+          <w:rFonts w:ascii="Consolas" w:cs="Consolas" w:eastAsia="Consolas" w:hAnsi="Consolas"/>
+          <w:color w:val="1F2A27"/>
+          <w:sz w:val="17"/>
+          <w:szCs w:val="17"/>
+        </w:rPr>
+        <w:t xml:space="preserve">git tag -f v1 origin/main</w:t>
+      </w:r>
+    </w:p>
+    <w:p>
+      <w:pPr>
+        <w:shd w:fill="F2F4F3" w:color="auto" w:val="clear"/>
+        <w:spacing w:after="160" w:before="0" w:line="240"/>
+        <w:ind w:left="200" w:right="200"/>
+      </w:pPr>
+      <w:r>
+        <w:rPr>
+          <w:rFonts w:ascii="Consolas" w:cs="Consolas" w:eastAsia="Consolas" w:hAnsi="Consolas"/>
+          <w:color w:val="1F2A27"/>
+          <w:sz w:val="17"/>
+          <w:szCs w:val="17"/>
+        </w:rPr>
+        <w:t xml:space="preserve">git push -f origin v1</w:t>
+      </w:r>
+    </w:p>
+    <w:p>
+      <w:pPr>
+        <w:pStyle w:val="ListParagraph"/>
+        <w:numPr>
+          <w:ilvl w:val="0"/>
+          <w:numId w:val="15"/>
+        </w:numPr>
+        <w:spacing w:after="60"/>
+      </w:pPr>
+      <w:r>
+        <w:rPr>
+          <w:rFonts w:ascii="Calibri" w:cs="Calibri" w:eastAsia="Calibri" w:hAnsi="Calibri"/>
+        </w:rPr>
+        <w:t xml:space="preserve">En app: añadir </w:t>
+      </w:r>
+      <w:r>
+        <w:rPr>
+          <w:rFonts w:ascii="Consolas" w:cs="Consolas" w:eastAsia="Consolas" w:hAnsi="Consolas"/>
+          <w:color w:val="2E3A36"/>
+          <w:sz w:val="20"/>
+          <w:szCs w:val="20"/>
+        </w:rPr>
+        <w:t xml:space="preserve">.github/workflows/ci.yml</w:t>
+      </w:r>
+      <w:r>
+        <w:rPr>
+          <w:rFonts w:ascii="Calibri" w:cs="Calibri" w:eastAsia="Calibri" w:hAnsi="Calibri"/>
+        </w:rPr>
+        <w:t xml:space="preserve"> que llame a </w:t>
+      </w:r>
+      <w:r>
+        <w:rPr>
+          <w:rFonts w:ascii="Consolas" w:cs="Consolas" w:eastAsia="Consolas" w:hAnsi="Consolas"/>
+          <w:color w:val="2E3A36"/>
+          <w:sz w:val="20"/>
+          <w:szCs w:val="20"/>
+        </w:rPr>
+        <w:t xml:space="preserve">reusable-ci.yml@v1</w:t>
+      </w:r>
+      <w:r>
+        <w:rPr>
+          <w:rFonts w:ascii="Calibri" w:cs="Calibri" w:eastAsia="Calibri" w:hAnsi="Calibri"/>
+        </w:rPr>
+        <w:t xml:space="preserve"> y fusionar cuando </w:t>
+      </w:r>
+      <w:r>
+        <w:rPr>
+          <w:rFonts w:ascii="Consolas" w:cs="Consolas" w:eastAsia="Consolas" w:hAnsi="Consolas"/>
+          <w:color w:val="2E3A36"/>
+          <w:sz w:val="20"/>
+          <w:szCs w:val="20"/>
+        </w:rPr>
+        <w:t xml:space="preserve">ci / checks</w:t>
+      </w:r>
+      <w:r>
+        <w:rPr>
+          <w:rFonts w:ascii="Calibri" w:cs="Calibri" w:eastAsia="Calibri" w:hAnsi="Calibri"/>
+        </w:rPr>
+        <w:t xml:space="preserve"> salga en verde.</w:t>
+      </w:r>
+    </w:p>
+    <w:p>
+      <w:pPr>
+        <w:pStyle w:val="ListParagraph"/>
+        <w:numPr>
+          <w:ilvl w:val="0"/>
+          <w:numId w:val="15"/>
+        </w:numPr>
+        <w:spacing w:after="60"/>
+      </w:pPr>
+      <w:r>
+        <w:rPr>
+          <w:rFonts w:ascii="Calibri" w:cs="Calibri" w:eastAsia="Calibri" w:hAnsi="Calibri"/>
+        </w:rPr>
+        <w:t xml:space="preserve">En app: </w:t>
+      </w:r>
+      <w:r>
+        <w:rPr>
+          <w:rFonts w:ascii="Calibri" w:cs="Calibri" w:eastAsia="Calibri" w:hAnsi="Calibri"/>
+          <w:i/>
+          <w:iCs/>
+        </w:rPr>
+        <w:t xml:space="preserve">Settings → Rules → Rulesets</w:t>
+      </w:r>
+      <w:r>
+        <w:rPr>
+          <w:rFonts w:ascii="Calibri" w:cs="Calibri" w:eastAsia="Calibri" w:hAnsi="Calibri"/>
+        </w:rPr>
+        <w:t xml:space="preserve"> → ruleset de </w:t>
+      </w:r>
+      <w:r>
+        <w:rPr>
+          <w:rFonts w:ascii="Consolas" w:cs="Consolas" w:eastAsia="Consolas" w:hAnsi="Consolas"/>
+          <w:color w:val="2E3A36"/>
+          <w:sz w:val="20"/>
+          <w:szCs w:val="20"/>
+        </w:rPr>
+        <w:t xml:space="preserve">main</w:t>
+      </w:r>
+      <w:r>
+        <w:rPr>
+          <w:rFonts w:ascii="Calibri" w:cs="Calibri" w:eastAsia="Calibri" w:hAnsi="Calibri"/>
+        </w:rPr>
+        <w:t xml:space="preserve"> → </w:t>
+      </w:r>
+      <w:r>
+        <w:rPr>
+          <w:rFonts w:ascii="Calibri" w:cs="Calibri" w:eastAsia="Calibri" w:hAnsi="Calibri"/>
+          <w:i/>
+          <w:iCs/>
+        </w:rPr>
+        <w:t xml:space="preserve">Require status checks to pass</w:t>
+      </w:r>
+      <w:r>
+        <w:rPr>
+          <w:rFonts w:ascii="Calibri" w:cs="Calibri" w:eastAsia="Calibri" w:hAnsi="Calibri"/>
+        </w:rPr>
+        <w:t xml:space="preserve"> → añadir </w:t>
+      </w:r>
+      <w:r>
+        <w:rPr>
+          <w:rFonts w:ascii="Consolas" w:cs="Consolas" w:eastAsia="Consolas" w:hAnsi="Consolas"/>
+          <w:color w:val="2E3A36"/>
+          <w:sz w:val="20"/>
+          <w:szCs w:val="20"/>
+        </w:rPr>
+        <w:t xml:space="preserve">ci / checks</w:t>
+      </w:r>
+      <w:r>
+        <w:rPr>
+          <w:rFonts w:ascii="Calibri" w:cs="Calibri" w:eastAsia="Calibri" w:hAnsi="Calibri"/>
+        </w:rPr>
+        <w:t xml:space="preserve">.</w:t>
+      </w:r>
+    </w:p>
+    <w:p>
+      <w:pPr>
+        <w:pStyle w:val="ListParagraph"/>
+        <w:numPr>
+          <w:ilvl w:val="0"/>
+          <w:numId w:val="15"/>
+        </w:numPr>
+        <w:spacing w:after="60"/>
+      </w:pPr>
+      <w:r>
+        <w:rPr>
+          <w:rFonts w:ascii="Calibri" w:cs="Calibri" w:eastAsia="Calibri" w:hAnsi="Calibri"/>
+        </w:rPr>
+        <w:t xml:space="preserve">En app: abrir un PR con un error de lint y comprobar que queda bloqueado.</w:t>
+      </w:r>
+    </w:p>
+    <w:p>
+      <w:pPr>
         <w:pBdr>
           <w:left w:val="single" w:color="0D5C4F" w:sz="18" w:space="10"/>
         </w:pBdr>
@@ -27979,7 +30082,7 @@
           <w:sz w:val="21"/>
           <w:szCs w:val="21"/>
         </w:rPr>
-        <w:t xml:space="preserve">Los pasos de las tareas 6 a 12 y B a F se añadirán al completarlas.</w:t>
+        <w:t xml:space="preserve">Los pasos de las tareas 7 a 12 y B a F se añadirán al completarlas.</w:t>
       </w:r>
     </w:p>
     <w:p>
@@ -28985,7 +31088,7 @@
         <w:pStyle w:val="ListParagraph"/>
         <w:numPr>
           <w:ilvl w:val="0"/>
-          <w:numId w:val="14"/>
+          <w:numId w:val="16"/>
         </w:numPr>
         <w:spacing w:after="60"/>
       </w:pPr>
@@ -29001,7 +31104,7 @@
         <w:pStyle w:val="ListParagraph"/>
         <w:numPr>
           <w:ilvl w:val="0"/>
-          <w:numId w:val="14"/>
+          <w:numId w:val="16"/>
         </w:numPr>
         <w:spacing w:after="60"/>
       </w:pPr>
@@ -29017,7 +31120,7 @@
         <w:pStyle w:val="ListParagraph"/>
         <w:numPr>
           <w:ilvl w:val="0"/>
-          <w:numId w:val="14"/>
+          <w:numId w:val="16"/>
         </w:numPr>
         <w:spacing w:after="60"/>
       </w:pPr>
@@ -29033,7 +31136,7 @@
         <w:pStyle w:val="ListParagraph"/>
         <w:numPr>
           <w:ilvl w:val="0"/>
-          <w:numId w:val="14"/>
+          <w:numId w:val="16"/>
         </w:numPr>
         <w:spacing w:after="60"/>
       </w:pPr>
@@ -29063,7 +31166,7 @@
         <w:pStyle w:val="ListParagraph"/>
         <w:numPr>
           <w:ilvl w:val="0"/>
-          <w:numId w:val="14"/>
+          <w:numId w:val="16"/>
         </w:numPr>
         <w:spacing w:after="60"/>
       </w:pPr>
@@ -29149,7 +31252,7 @@
         </w:rPr>
         <w:t xml:space="preserve"> arXiv:2604.26275, 2026. </w:t>
       </w:r>
-      <w:hyperlink w:history="1" r:id="rId1fzzfd5axn92zbsrin83v">
+      <w:hyperlink w:history="1" r:id="rIdhyfed1ms07pdszymsrcv5">
         <w:r>
           <w:rPr>
             <w:rStyle w:val="Hyperlink"/>
@@ -29194,7 +31297,7 @@
         </w:rPr>
         <w:t xml:space="preserve">, 2026. </w:t>
       </w:r>
-      <w:hyperlink w:history="1" r:id="rId4v_gaocpqd8xze8dqh69f">
+      <w:hyperlink w:history="1" r:id="rIdm_mbk4exoi2tzwtynulxx">
         <w:r>
           <w:rPr>
             <w:rStyle w:val="Hyperlink"/>
@@ -29239,7 +31342,7 @@
         </w:rPr>
         <w:t xml:space="preserve"> </w:t>
       </w:r>
-      <w:hyperlink w:history="1" r:id="rIdqek-_yhit7f9wlmns1krg">
+      <w:hyperlink w:history="1" r:id="rIdl2axwh-z2w4xub6kqtin_">
         <w:r>
           <w:rPr>
             <w:rStyle w:val="Hyperlink"/>
@@ -29284,7 +31387,7 @@
         </w:rPr>
         <w:t xml:space="preserve">, junio de 2026. </w:t>
       </w:r>
-      <w:hyperlink w:history="1" r:id="rIdmovjg5zvr1l2svh4yale5">
+      <w:hyperlink w:history="1" r:id="rId7zop8ihqqeeesfrrmc1ua">
         <w:r>
           <w:rPr>
             <w:rStyle w:val="Hyperlink"/>
@@ -29329,7 +31432,7 @@
         </w:rPr>
         <w:t xml:space="preserve"> </w:t>
       </w:r>
-      <w:hyperlink w:history="1" r:id="rIdp_6niin-odyvtgpqzjket">
+      <w:hyperlink w:history="1" r:id="rIdl0jyovbwxljtphkemgws1">
         <w:r>
           <w:rPr>
             <w:rStyle w:val="Hyperlink"/>
@@ -29374,7 +31477,7 @@
         </w:rPr>
         <w:t xml:space="preserve"> </w:t>
       </w:r>
-      <w:hyperlink w:history="1" r:id="rIdnbvidlgnn506axywuki64">
+      <w:hyperlink w:history="1" r:id="rIdqg0idgfc_jwvwhqpsz9vi">
         <w:r>
           <w:rPr>
             <w:rStyle w:val="Hyperlink"/>
@@ -29419,7 +31522,7 @@
         </w:rPr>
         <w:t xml:space="preserve">, diciembre de 2025. </w:t>
       </w:r>
-      <w:hyperlink w:history="1" r:id="rIdnym0raxsyyaqa41cuwcws">
+      <w:hyperlink w:history="1" r:id="rIdazk0-0aant68edlbxtyqb">
         <w:r>
           <w:rPr>
             <w:rStyle w:val="Hyperlink"/>
@@ -29464,7 +31567,7 @@
         </w:rPr>
         <w:t xml:space="preserve"> </w:t>
       </w:r>
-      <w:hyperlink w:history="1" r:id="rIdhjgy5mmh44sjg-xqoap3n">
+      <w:hyperlink w:history="1" r:id="rIdylrguil1ttukc2uynfrxo">
         <w:r>
           <w:rPr>
             <w:rStyle w:val="Hyperlink"/>
@@ -29509,7 +31612,7 @@
         </w:rPr>
         <w:t xml:space="preserve"> </w:t>
       </w:r>
-      <w:hyperlink w:history="1" r:id="rId4ixj2vazmxqrociq_hzw2">
+      <w:hyperlink w:history="1" r:id="rIdgut3699_yjjv4q3ennqve">
         <w:r>
           <w:rPr>
             <w:rStyle w:val="Hyperlink"/>
@@ -29554,7 +31657,7 @@
         </w:rPr>
         <w:t xml:space="preserve"> </w:t>
       </w:r>
-      <w:hyperlink w:history="1" r:id="rId-joivfxd4ax4nfla7p0og">
+      <w:hyperlink w:history="1" r:id="rIdetzkw8qktqvcajy66qd76">
         <w:r>
           <w:rPr>
             <w:rStyle w:val="Hyperlink"/>
@@ -29599,7 +31702,7 @@
         </w:rPr>
         <w:t xml:space="preserve"> </w:t>
       </w:r>
-      <w:hyperlink w:history="1" r:id="rIdpvxsbk07ykmzgzrlmir5g">
+      <w:hyperlink w:history="1" r:id="rIdgf44iegonw6apjlpn1xu2">
         <w:r>
           <w:rPr>
             <w:rStyle w:val="Hyperlink"/>
@@ -29644,7 +31747,7 @@
         </w:rPr>
         <w:t xml:space="preserve"> </w:t>
       </w:r>
-      <w:hyperlink w:history="1" r:id="rIdgpda4gc2nfzbqvfudwnmv">
+      <w:hyperlink w:history="1" r:id="rIdmwitqd1nq6pekfzqo4knc">
         <w:r>
           <w:rPr>
             <w:rStyle w:val="Hyperlink"/>
@@ -29689,7 +31792,7 @@
         </w:rPr>
         <w:t xml:space="preserve"> </w:t>
       </w:r>
-      <w:hyperlink w:history="1" r:id="rId2drxcieufdtjwj1c2twm-">
+      <w:hyperlink w:history="1" r:id="rIdmqxv-qqjk5hdf_kx0tmvc">
         <w:r>
           <w:rPr>
             <w:rStyle w:val="Hyperlink"/>
@@ -29734,7 +31837,7 @@
         </w:rPr>
         <w:t xml:space="preserve"> </w:t>
       </w:r>
-      <w:hyperlink w:history="1" r:id="rId-udbnnqtxosc60xo7jadk">
+      <w:hyperlink w:history="1" r:id="rIdxhycuy5vjwmiqjrzkbhme">
         <w:r>
           <w:rPr>
             <w:rStyle w:val="Hyperlink"/>
@@ -29779,7 +31882,7 @@
         </w:rPr>
         <w:t xml:space="preserve"> </w:t>
       </w:r>
-      <w:hyperlink w:history="1" r:id="rIdmabi03k_ns0pprwffqtsb">
+      <w:hyperlink w:history="1" r:id="rIdc_8t2zm8d1egahqdhyibm">
         <w:r>
           <w:rPr>
             <w:rStyle w:val="Hyperlink"/>
@@ -29824,7 +31927,7 @@
         </w:rPr>
         <w:t xml:space="preserve"> </w:t>
       </w:r>
-      <w:hyperlink w:history="1" r:id="rIdhuafmvixdec6aexveir8k">
+      <w:hyperlink w:history="1" r:id="rIdk2zqxvjlw_8wjide8-3u2">
         <w:r>
           <w:rPr>
             <w:rStyle w:val="Hyperlink"/>
@@ -29869,7 +31972,7 @@
         </w:rPr>
         <w:t xml:space="preserve">, agosto de 2026. </w:t>
       </w:r>
-      <w:hyperlink w:history="1" r:id="rId4a5eifo6t-ko3n5qerk8t">
+      <w:hyperlink w:history="1" r:id="rIdxqlq0jrvxdt1qyx8okut3">
         <w:r>
           <w:rPr>
             <w:rStyle w:val="Hyperlink"/>
@@ -29914,7 +32017,7 @@
         </w:rPr>
         <w:t xml:space="preserve"> </w:t>
       </w:r>
-      <w:hyperlink w:history="1" r:id="rIdtptfra66u4ukuufy6jxna">
+      <w:hyperlink w:history="1" r:id="rIdno-cjioyx6fqwhey8_7wa">
         <w:r>
           <w:rPr>
             <w:rStyle w:val="Hyperlink"/>
@@ -29977,7 +32080,7 @@
         </w:rPr>
         <w:t xml:space="preserve"> </w:t>
       </w:r>
-      <w:hyperlink w:history="1" r:id="rIdnkdtjc9_-sekmtyhei2u6">
+      <w:hyperlink w:history="1" r:id="rIdnnflpb822ys3reyftyugn">
         <w:r>
           <w:rPr>
             <w:rStyle w:val="Hyperlink"/>
@@ -30022,7 +32125,7 @@
         </w:rPr>
         <w:t xml:space="preserve"> </w:t>
       </w:r>
-      <w:hyperlink w:history="1" r:id="rIdga9u983x-k5novvpzhhot">
+      <w:hyperlink w:history="1" r:id="rId1pm6rvoraa_vwvurhomhc">
         <w:r>
           <w:rPr>
             <w:rStyle w:val="Hyperlink"/>
@@ -30067,7 +32170,7 @@
         </w:rPr>
         <w:t xml:space="preserve"> </w:t>
       </w:r>
-      <w:hyperlink w:history="1" r:id="rId7vt6_sxrmwskxcdzr6jd-">
+      <w:hyperlink w:history="1" r:id="rIdvgspjpynhosixzuzdqmvt">
         <w:r>
           <w:rPr>
             <w:rStyle w:val="Hyperlink"/>
@@ -31726,6 +33829,30 @@
     </w:lvl>
   </w:abstractNum>
   <w:abstractNum w:abstractNumId="14" w15:restartNumberingAfterBreak="0">
+    <w:multiLevelType w:val="hybridMultilevel"/>
+    <w:lvl w:ilvl="0" w15:tentative="1">
+      <w:start w:val="1"/>
+      <w:numFmt w:val="decimal"/>
+      <w:lvlText w:val="%1."/>
+      <w:lvlJc w:val="left"/>
+      <w:pPr>
+        <w:ind w:left="540" w:hanging="320"/>
+      </w:pPr>
+    </w:lvl>
+  </w:abstractNum>
+  <w:abstractNum w:abstractNumId="15" w15:restartNumberingAfterBreak="0">
+    <w:multiLevelType w:val="hybridMultilevel"/>
+    <w:lvl w:ilvl="0" w15:tentative="1">
+      <w:start w:val="3"/>
+      <w:numFmt w:val="decimal"/>
+      <w:lvlText w:val="%1."/>
+      <w:lvlJc w:val="left"/>
+      <w:pPr>
+        <w:ind w:left="540" w:hanging="320"/>
+      </w:pPr>
+    </w:lvl>
+  </w:abstractNum>
+  <w:abstractNum w:abstractNumId="16" w15:restartNumberingAfterBreak="0">
     <w:multiLevelType w:val="hybridMultilevel"/>
     <w:lvl w:ilvl="0" w15:tentative="1">
       <w:start w:val="1"/>
@@ -31817,6 +33944,18 @@
   </w:num>
   <w:num w:numId="14">
     <w:abstractNumId w:val="14"/>
+    <w:lvlOverride w:ilvl="0">
+      <w:startOverride w:val="1"/>
+    </w:lvlOverride>
+  </w:num>
+  <w:num w:numId="15">
+    <w:abstractNumId w:val="15"/>
+    <w:lvlOverride w:ilvl="0">
+      <w:startOverride w:val="3"/>
+    </w:lvlOverride>
+  </w:num>
+  <w:num w:numId="16">
+    <w:abstractNumId w:val="16"/>
     <w:lvlOverride w:ilvl="0">
       <w:startOverride w:val="1"/>
     </w:lvlOverride>

</xml_diff>

<commit_message>
docs: cierre de la tarea 7 (escaneo de seguridad)
- Bitácora y panel: tarea 7 hecha (core#10, app#13, prueba en app#14); tarea 8
  siguiente.
- Memoria: sección de la tarea 7, pruebas del gobierno de PRs, fase 11 del
  registro (iteraciones 66 a 69), métricas y pasos reproducibles.

Co-Authored-By: Claude Opus 5.5 <noreply@anthropic.com>
Claude-Session: https://claude.ai/code/session_01DJozxnTfKm9YzN69MVZq7X
</commit_message>
<xml_diff>
--- a/docs/tfm/TFM-ALM-agentico.docx
+++ b/docs/tfm/TFM-ALM-agentico.docx
@@ -15464,6 +15464,783 @@
         <w:rPr>
           <w:rFonts w:ascii="Calibri" w:cs="Calibri" w:eastAsia="Calibri" w:hAnsi="Calibri"/>
         </w:rPr>
+        <w:t xml:space="preserve">Tarea 7: escaneo de seguridad</w:t>
+      </w:r>
+    </w:p>
+    <w:p>
+      <w:pPr>
+        <w:keepNext w:val="false"/>
+        <w:spacing w:after="140" w:line="288"/>
+        <w:jc w:val="both"/>
+      </w:pPr>
+      <w:r>
+        <w:rPr>
+          <w:rFonts w:ascii="Calibri" w:cs="Calibri" w:eastAsia="Calibri" w:hAnsi="Calibri"/>
+        </w:rPr>
+        <w:t xml:space="preserve">El CI comprueba que el código funciona; la tarea 7 añade un segundo check obligatorio que busca problemas de seguridad y de gobierno. Igual que el CI, el workflow vive en core: las herramientas, sus versiones y su configuración las fija core, y ni el repo que lo llama ni el agente pueden silenciarlas.</w:t>
+      </w:r>
+    </w:p>
+    <w:tbl>
+      <w:tblPr>
+        <w:tblW w:type="dxa" w:w="9070"/>
+        <w:tblBorders>
+          <w:top w:val="single" w:color="C9D3CF" w:sz="4"/>
+          <w:left w:val="single" w:color="C9D3CF" w:sz="4"/>
+          <w:bottom w:val="single" w:color="C9D3CF" w:sz="4"/>
+          <w:right w:val="single" w:color="C9D3CF" w:sz="4"/>
+          <w:insideH w:val="single" w:color="C9D3CF" w:sz="4"/>
+          <w:insideV w:val="single" w:color="C9D3CF" w:sz="4"/>
+        </w:tblBorders>
+      </w:tblPr>
+      <w:tblGrid>
+        <w:gridCol w:w="1300"/>
+        <w:gridCol w:w="2391"/>
+        <w:gridCol w:w="5379"/>
+      </w:tblGrid>
+      <w:tr>
+        <w:trPr>
+          <w:tblHeader/>
+        </w:trPr>
+        <w:tc>
+          <w:tcPr>
+            <w:tcW w:type="dxa" w:w="1300"/>
+            <w:shd w:fill="E3EEEA" w:color="auto" w:val="clear"/>
+            <w:tcMar>
+              <w:top w:type="dxa" w:w="60"/>
+              <w:left w:type="dxa" w:w="100"/>
+              <w:bottom w:type="dxa" w:w="60"/>
+              <w:right w:type="dxa" w:w="100"/>
+            </w:tcMar>
+          </w:tcPr>
+          <w:p>
+            <w:pPr>
+              <w:spacing w:after="0" w:before="0" w:line="252"/>
+            </w:pPr>
+            <w:r>
+              <w:rPr>
+                <w:rFonts w:ascii="Calibri" w:cs="Calibri" w:eastAsia="Calibri" w:hAnsi="Calibri"/>
+                <w:b/>
+                <w:bCs/>
+                <w:sz w:val="18"/>
+                <w:szCs w:val="18"/>
+              </w:rPr>
+              <w:t xml:space="preserve">Escaneo</w:t>
+            </w:r>
+          </w:p>
+        </w:tc>
+        <w:tc>
+          <w:tcPr>
+            <w:tcW w:type="dxa" w:w="2391"/>
+            <w:shd w:fill="E3EEEA" w:color="auto" w:val="clear"/>
+            <w:tcMar>
+              <w:top w:type="dxa" w:w="60"/>
+              <w:left w:type="dxa" w:w="100"/>
+              <w:bottom w:type="dxa" w:w="60"/>
+              <w:right w:type="dxa" w:w="100"/>
+            </w:tcMar>
+          </w:tcPr>
+          <w:p>
+            <w:pPr>
+              <w:spacing w:after="0" w:before="0" w:line="252"/>
+            </w:pPr>
+            <w:r>
+              <w:rPr>
+                <w:rFonts w:ascii="Calibri" w:cs="Calibri" w:eastAsia="Calibri" w:hAnsi="Calibri"/>
+                <w:b/>
+                <w:bCs/>
+                <w:sz w:val="18"/>
+                <w:szCs w:val="18"/>
+              </w:rPr>
+              <w:t xml:space="preserve">Herramienta</w:t>
+            </w:r>
+          </w:p>
+        </w:tc>
+        <w:tc>
+          <w:tcPr>
+            <w:tcW w:type="dxa" w:w="5379"/>
+            <w:shd w:fill="E3EEEA" w:color="auto" w:val="clear"/>
+            <w:tcMar>
+              <w:top w:type="dxa" w:w="60"/>
+              <w:left w:type="dxa" w:w="100"/>
+              <w:bottom w:type="dxa" w:w="60"/>
+              <w:right w:type="dxa" w:w="100"/>
+            </w:tcMar>
+          </w:tcPr>
+          <w:p>
+            <w:pPr>
+              <w:spacing w:after="0" w:before="0" w:line="252"/>
+            </w:pPr>
+            <w:r>
+              <w:rPr>
+                <w:rFonts w:ascii="Calibri" w:cs="Calibri" w:eastAsia="Calibri" w:hAnsi="Calibri"/>
+                <w:b/>
+                <w:bCs/>
+                <w:sz w:val="18"/>
+                <w:szCs w:val="18"/>
+              </w:rPr>
+              <w:t xml:space="preserve">Qué bloquea</w:t>
+            </w:r>
+          </w:p>
+        </w:tc>
+      </w:tr>
+      <w:tr>
+        <w:trPr>
+          <w:cantSplit/>
+        </w:trPr>
+        <w:tc>
+          <w:tcPr>
+            <w:tcW w:type="dxa" w:w="1300"/>
+            <w:tcMar>
+              <w:top w:type="dxa" w:w="60"/>
+              <w:left w:type="dxa" w:w="100"/>
+              <w:bottom w:type="dxa" w:w="60"/>
+              <w:right w:type="dxa" w:w="100"/>
+            </w:tcMar>
+          </w:tcPr>
+          <w:p>
+            <w:pPr>
+              <w:spacing w:after="0" w:before="0" w:line="252"/>
+            </w:pPr>
+            <w:r>
+              <w:rPr>
+                <w:rFonts w:ascii="Consolas" w:cs="Consolas" w:eastAsia="Consolas" w:hAnsi="Consolas"/>
+                <w:color w:val="2E3A36"/>
+                <w:sz w:val="16"/>
+                <w:szCs w:val="16"/>
+              </w:rPr>
+              <w:t xml:space="preserve">sast</w:t>
+            </w:r>
+          </w:p>
+        </w:tc>
+        <w:tc>
+          <w:tcPr>
+            <w:tcW w:type="dxa" w:w="2391"/>
+            <w:tcMar>
+              <w:top w:type="dxa" w:w="60"/>
+              <w:left w:type="dxa" w:w="100"/>
+              <w:bottom w:type="dxa" w:w="60"/>
+              <w:right w:type="dxa" w:w="100"/>
+            </w:tcMar>
+          </w:tcPr>
+          <w:p>
+            <w:pPr>
+              <w:spacing w:after="0" w:before="0" w:line="252"/>
+            </w:pPr>
+            <w:r>
+              <w:rPr>
+                <w:rFonts w:ascii="Calibri" w:cs="Calibri" w:eastAsia="Calibri" w:hAnsi="Calibri"/>
+                <w:sz w:val="18"/>
+                <w:szCs w:val="18"/>
+              </w:rPr>
+              <w:t xml:space="preserve">bandit 1.9.4</w:t>
+            </w:r>
+          </w:p>
+        </w:tc>
+        <w:tc>
+          <w:tcPr>
+            <w:tcW w:type="dxa" w:w="5379"/>
+            <w:tcMar>
+              <w:top w:type="dxa" w:w="60"/>
+              <w:left w:type="dxa" w:w="100"/>
+              <w:bottom w:type="dxa" w:w="60"/>
+              <w:right w:type="dxa" w:w="100"/>
+            </w:tcMar>
+          </w:tcPr>
+          <w:p>
+            <w:pPr>
+              <w:spacing w:after="0" w:before="0" w:line="252"/>
+            </w:pPr>
+            <w:r>
+              <w:rPr>
+                <w:rFonts w:ascii="Calibri" w:cs="Calibri" w:eastAsia="Calibri" w:hAnsi="Calibri"/>
+                <w:sz w:val="18"/>
+                <w:szCs w:val="18"/>
+              </w:rPr>
+              <w:t xml:space="preserve">Problemas de severidad media o alta en </w:t>
+            </w:r>
+            <w:r>
+              <w:rPr>
+                <w:rFonts w:ascii="Consolas" w:cs="Consolas" w:eastAsia="Consolas" w:hAnsi="Consolas"/>
+                <w:color w:val="2E3A36"/>
+                <w:sz w:val="16"/>
+                <w:szCs w:val="16"/>
+              </w:rPr>
+              <w:t xml:space="preserve">src/</w:t>
+            </w:r>
+            <w:r>
+              <w:rPr>
+                <w:rFonts w:ascii="Calibri" w:cs="Calibri" w:eastAsia="Calibri" w:hAnsi="Calibri"/>
+                <w:sz w:val="18"/>
+                <w:szCs w:val="18"/>
+              </w:rPr>
+              <w:t xml:space="preserve">; ignora los comentarios </w:t>
+            </w:r>
+            <w:r>
+              <w:rPr>
+                <w:rFonts w:ascii="Consolas" w:cs="Consolas" w:eastAsia="Consolas" w:hAnsi="Consolas"/>
+                <w:color w:val="2E3A36"/>
+                <w:sz w:val="16"/>
+                <w:szCs w:val="16"/>
+              </w:rPr>
+              <w:t xml:space="preserve"># nosec</w:t>
+            </w:r>
+          </w:p>
+        </w:tc>
+      </w:tr>
+      <w:tr>
+        <w:trPr>
+          <w:cantSplit/>
+        </w:trPr>
+        <w:tc>
+          <w:tcPr>
+            <w:tcW w:type="dxa" w:w="1300"/>
+            <w:tcMar>
+              <w:top w:type="dxa" w:w="60"/>
+              <w:left w:type="dxa" w:w="100"/>
+              <w:bottom w:type="dxa" w:w="60"/>
+              <w:right w:type="dxa" w:w="100"/>
+            </w:tcMar>
+          </w:tcPr>
+          <w:p>
+            <w:pPr>
+              <w:spacing w:after="0" w:before="0" w:line="252"/>
+            </w:pPr>
+            <w:r>
+              <w:rPr>
+                <w:rFonts w:ascii="Consolas" w:cs="Consolas" w:eastAsia="Consolas" w:hAnsi="Consolas"/>
+                <w:color w:val="2E3A36"/>
+                <w:sz w:val="16"/>
+                <w:szCs w:val="16"/>
+              </w:rPr>
+              <w:t xml:space="preserve">dependencies</w:t>
+            </w:r>
+          </w:p>
+        </w:tc>
+        <w:tc>
+          <w:tcPr>
+            <w:tcW w:type="dxa" w:w="2391"/>
+            <w:tcMar>
+              <w:top w:type="dxa" w:w="60"/>
+              <w:left w:type="dxa" w:w="100"/>
+              <w:bottom w:type="dxa" w:w="60"/>
+              <w:right w:type="dxa" w:w="100"/>
+            </w:tcMar>
+          </w:tcPr>
+          <w:p>
+            <w:pPr>
+              <w:spacing w:after="0" w:before="0" w:line="252"/>
+            </w:pPr>
+            <w:r>
+              <w:rPr>
+                <w:rFonts w:ascii="Calibri" w:cs="Calibri" w:eastAsia="Calibri" w:hAnsi="Calibri"/>
+                <w:sz w:val="18"/>
+                <w:szCs w:val="18"/>
+              </w:rPr>
+              <w:t xml:space="preserve">pip-audit 2.10.1 y pip-licenses 5.5.5</w:t>
+            </w:r>
+          </w:p>
+        </w:tc>
+        <w:tc>
+          <w:tcPr>
+            <w:tcW w:type="dxa" w:w="5379"/>
+            <w:tcMar>
+              <w:top w:type="dxa" w:w="60"/>
+              <w:left w:type="dxa" w:w="100"/>
+              <w:bottom w:type="dxa" w:w="60"/>
+              <w:right w:type="dxa" w:w="100"/>
+            </w:tcMar>
+          </w:tcPr>
+          <w:p>
+            <w:pPr>
+              <w:spacing w:after="0" w:before="0" w:line="252"/>
+            </w:pPr>
+            <w:r>
+              <w:rPr>
+                <w:rFonts w:ascii="Calibri" w:cs="Calibri" w:eastAsia="Calibri" w:hAnsi="Calibri"/>
+                <w:sz w:val="18"/>
+                <w:szCs w:val="18"/>
+              </w:rPr>
+              <w:t xml:space="preserve">Vulnerabilidades conocidas en </w:t>
+            </w:r>
+            <w:r>
+              <w:rPr>
+                <w:rFonts w:ascii="Consolas" w:cs="Consolas" w:eastAsia="Consolas" w:hAnsi="Consolas"/>
+                <w:color w:val="2E3A36"/>
+                <w:sz w:val="16"/>
+                <w:szCs w:val="16"/>
+              </w:rPr>
+              <w:t xml:space="preserve">uv.lock</w:t>
+            </w:r>
+            <w:r>
+              <w:rPr>
+                <w:rFonts w:ascii="Calibri" w:cs="Calibri" w:eastAsia="Calibri" w:hAnsi="Calibri"/>
+                <w:sz w:val="18"/>
+                <w:szCs w:val="18"/>
+              </w:rPr>
+              <w:t xml:space="preserve"> y licencias fuera de la lista permitida (MIT, BSD, Apache, ISC, PSF, MPL-2.0)</w:t>
+            </w:r>
+          </w:p>
+        </w:tc>
+      </w:tr>
+      <w:tr>
+        <w:trPr>
+          <w:cantSplit/>
+        </w:trPr>
+        <w:tc>
+          <w:tcPr>
+            <w:tcW w:type="dxa" w:w="1300"/>
+            <w:tcMar>
+              <w:top w:type="dxa" w:w="60"/>
+              <w:left w:type="dxa" w:w="100"/>
+              <w:bottom w:type="dxa" w:w="60"/>
+              <w:right w:type="dxa" w:w="100"/>
+            </w:tcMar>
+          </w:tcPr>
+          <w:p>
+            <w:pPr>
+              <w:spacing w:after="0" w:before="0" w:line="252"/>
+            </w:pPr>
+            <w:r>
+              <w:rPr>
+                <w:rFonts w:ascii="Consolas" w:cs="Consolas" w:eastAsia="Consolas" w:hAnsi="Consolas"/>
+                <w:color w:val="2E3A36"/>
+                <w:sz w:val="16"/>
+                <w:szCs w:val="16"/>
+              </w:rPr>
+              <w:t xml:space="preserve">secrets</w:t>
+            </w:r>
+          </w:p>
+        </w:tc>
+        <w:tc>
+          <w:tcPr>
+            <w:tcW w:type="dxa" w:w="2391"/>
+            <w:tcMar>
+              <w:top w:type="dxa" w:w="60"/>
+              <w:left w:type="dxa" w:w="100"/>
+              <w:bottom w:type="dxa" w:w="60"/>
+              <w:right w:type="dxa" w:w="100"/>
+            </w:tcMar>
+          </w:tcPr>
+          <w:p>
+            <w:pPr>
+              <w:spacing w:after="0" w:before="0" w:line="252"/>
+            </w:pPr>
+            <w:r>
+              <w:rPr>
+                <w:rFonts w:ascii="Calibri" w:cs="Calibri" w:eastAsia="Calibri" w:hAnsi="Calibri"/>
+                <w:sz w:val="18"/>
+                <w:szCs w:val="18"/>
+              </w:rPr>
+              <w:t xml:space="preserve">gitleaks 8.30.1</w:t>
+            </w:r>
+          </w:p>
+        </w:tc>
+        <w:tc>
+          <w:tcPr>
+            <w:tcW w:type="dxa" w:w="5379"/>
+            <w:tcMar>
+              <w:top w:type="dxa" w:w="60"/>
+              <w:left w:type="dxa" w:w="100"/>
+              <w:bottom w:type="dxa" w:w="60"/>
+              <w:right w:type="dxa" w:w="100"/>
+            </w:tcMar>
+          </w:tcPr>
+          <w:p>
+            <w:pPr>
+              <w:spacing w:after="0" w:before="0" w:line="252"/>
+            </w:pPr>
+            <w:r>
+              <w:rPr>
+                <w:rFonts w:ascii="Calibri" w:cs="Calibri" w:eastAsia="Calibri" w:hAnsi="Calibri"/>
+                <w:sz w:val="18"/>
+                <w:szCs w:val="18"/>
+              </w:rPr>
+              <w:t xml:space="preserve">Secretos en los commits nuevos; el binario se descarga con su checksum SHA-256 verificado</w:t>
+            </w:r>
+          </w:p>
+        </w:tc>
+      </w:tr>
+      <w:tr>
+        <w:trPr>
+          <w:cantSplit/>
+        </w:trPr>
+        <w:tc>
+          <w:tcPr>
+            <w:tcW w:type="dxa" w:w="1300"/>
+            <w:tcMar>
+              <w:top w:type="dxa" w:w="60"/>
+              <w:left w:type="dxa" w:w="100"/>
+              <w:bottom w:type="dxa" w:w="60"/>
+              <w:right w:type="dxa" w:w="100"/>
+            </w:tcMar>
+          </w:tcPr>
+          <w:p>
+            <w:pPr>
+              <w:spacing w:after="0" w:before="0" w:line="252"/>
+            </w:pPr>
+            <w:r>
+              <w:rPr>
+                <w:rFonts w:ascii="Consolas" w:cs="Consolas" w:eastAsia="Consolas" w:hAnsi="Consolas"/>
+                <w:color w:val="2E3A36"/>
+                <w:sz w:val="16"/>
+                <w:szCs w:val="16"/>
+              </w:rPr>
+              <w:t xml:space="preserve">governance</w:t>
+            </w:r>
+          </w:p>
+        </w:tc>
+        <w:tc>
+          <w:tcPr>
+            <w:tcW w:type="dxa" w:w="2391"/>
+            <w:tcMar>
+              <w:top w:type="dxa" w:w="60"/>
+              <w:left w:type="dxa" w:w="100"/>
+              <w:bottom w:type="dxa" w:w="60"/>
+              <w:right w:type="dxa" w:w="100"/>
+            </w:tcMar>
+          </w:tcPr>
+          <w:p>
+            <w:pPr>
+              <w:spacing w:after="0" w:before="0" w:line="252"/>
+            </w:pPr>
+            <w:r>
+              <w:rPr>
+                <w:rFonts w:ascii="Consolas" w:cs="Consolas" w:eastAsia="Consolas" w:hAnsi="Consolas"/>
+                <w:color w:val="2E3A36"/>
+                <w:sz w:val="16"/>
+                <w:szCs w:val="16"/>
+              </w:rPr>
+              <w:t xml:space="preserve">check_pr_files.py</w:t>
+            </w:r>
+            <w:r>
+              <w:rPr>
+                <w:rFonts w:ascii="Calibri" w:cs="Calibri" w:eastAsia="Calibri" w:hAnsi="Calibri"/>
+                <w:sz w:val="18"/>
+                <w:szCs w:val="18"/>
+              </w:rPr>
+              <w:t xml:space="preserve"> (script propio, 21 tests)</w:t>
+            </w:r>
+          </w:p>
+        </w:tc>
+        <w:tc>
+          <w:tcPr>
+            <w:tcW w:type="dxa" w:w="5379"/>
+            <w:tcMar>
+              <w:top w:type="dxa" w:w="60"/>
+              <w:left w:type="dxa" w:w="100"/>
+              <w:bottom w:type="dxa" w:w="60"/>
+              <w:right w:type="dxa" w:w="100"/>
+            </w:tcMar>
+          </w:tcPr>
+          <w:p>
+            <w:pPr>
+              <w:spacing w:after="0" w:before="0" w:line="252"/>
+            </w:pPr>
+            <w:r>
+              <w:rPr>
+                <w:rFonts w:ascii="Calibri" w:cs="Calibri" w:eastAsia="Calibri" w:hAnsi="Calibri"/>
+                <w:sz w:val="18"/>
+                <w:szCs w:val="18"/>
+              </w:rPr>
+              <w:t xml:space="preserve">Ficheros generados de cualquier autor y, si algún commit es del agente, cambios en los ficheros que lo gobiernan o en la configuración de ruff, mypy y pytest</w:t>
+            </w:r>
+          </w:p>
+        </w:tc>
+      </w:tr>
+      <w:tr>
+        <w:trPr>
+          <w:cantSplit/>
+        </w:trPr>
+        <w:tc>
+          <w:tcPr>
+            <w:tcW w:type="dxa" w:w="1300"/>
+            <w:tcMar>
+              <w:top w:type="dxa" w:w="60"/>
+              <w:left w:type="dxa" w:w="100"/>
+              <w:bottom w:type="dxa" w:w="60"/>
+              <w:right w:type="dxa" w:w="100"/>
+            </w:tcMar>
+          </w:tcPr>
+          <w:p>
+            <w:pPr>
+              <w:spacing w:after="0" w:before="0" w:line="252"/>
+            </w:pPr>
+            <w:r>
+              <w:rPr>
+                <w:rFonts w:ascii="Consolas" w:cs="Consolas" w:eastAsia="Consolas" w:hAnsi="Consolas"/>
+                <w:color w:val="2E3A36"/>
+                <w:sz w:val="16"/>
+                <w:szCs w:val="16"/>
+              </w:rPr>
+              <w:t xml:space="preserve">result</w:t>
+            </w:r>
+          </w:p>
+        </w:tc>
+        <w:tc>
+          <w:tcPr>
+            <w:tcW w:type="dxa" w:w="2391"/>
+            <w:tcMar>
+              <w:top w:type="dxa" w:w="60"/>
+              <w:left w:type="dxa" w:w="100"/>
+              <w:bottom w:type="dxa" w:w="60"/>
+              <w:right w:type="dxa" w:w="100"/>
+            </w:tcMar>
+          </w:tcPr>
+          <w:p>
+            <w:pPr>
+              <w:spacing w:after="0" w:before="0" w:line="252"/>
+            </w:pPr>
+            <w:r>
+              <w:rPr>
+                <w:rFonts w:ascii="Calibri" w:cs="Calibri" w:eastAsia="Calibri" w:hAnsi="Calibri"/>
+                <w:sz w:val="18"/>
+                <w:szCs w:val="18"/>
+              </w:rPr>
+              <w:t xml:space="preserve">jq</w:t>
+            </w:r>
+          </w:p>
+        </w:tc>
+        <w:tc>
+          <w:tcPr>
+            <w:tcW w:type="dxa" w:w="5379"/>
+            <w:tcMar>
+              <w:top w:type="dxa" w:w="60"/>
+              <w:left w:type="dxa" w:w="100"/>
+              <w:bottom w:type="dxa" w:w="60"/>
+              <w:right w:type="dxa" w:w="100"/>
+            </w:tcMar>
+          </w:tcPr>
+          <w:p>
+            <w:pPr>
+              <w:spacing w:after="0" w:before="0" w:line="252"/>
+            </w:pPr>
+            <w:r>
+              <w:rPr>
+                <w:rFonts w:ascii="Calibri" w:cs="Calibri" w:eastAsia="Calibri" w:hAnsi="Calibri"/>
+                <w:sz w:val="18"/>
+                <w:szCs w:val="18"/>
+              </w:rPr>
+              <w:t xml:space="preserve">Resume los cuatro; es el check que exige el ruleset</w:t>
+            </w:r>
+          </w:p>
+        </w:tc>
+      </w:tr>
+    </w:tbl>
+    <w:p>
+      <w:pPr>
+        <w:spacing w:after="120"/>
+      </w:pPr>
+    </w:p>
+    <w:p>
+      <w:pPr>
+        <w:keepNext w:val="false"/>
+        <w:spacing w:after="140" w:line="288"/>
+        <w:jc w:val="both"/>
+      </w:pPr>
+      <w:r>
+        <w:rPr>
+          <w:rFonts w:ascii="Calibri" w:cs="Calibri" w:eastAsia="Calibri" w:hAnsi="Calibri"/>
+        </w:rPr>
+        <w:t xml:space="preserve">Se eligió bandit en lugar de Semgrep porque las reglas de Semgrep se descargan de su registro en cada ejecución, de modo que el resultado puede cambiar sin que cambie el repositorio. Bandit lleva las reglas dentro de la versión fijada.</w:t>
+      </w:r>
+    </w:p>
+    <w:p>
+      <w:pPr>
+        <w:keepNext w:val="false"/>
+        <w:spacing w:after="140" w:line="288"/>
+        <w:jc w:val="both"/>
+      </w:pPr>
+      <w:r>
+        <w:rPr>
+          <w:rFonts w:ascii="Calibri" w:cs="Calibri" w:eastAsia="Calibri" w:hAnsi="Calibri"/>
+        </w:rPr>
+        <w:t xml:space="preserve">El escaneo </w:t>
+      </w:r>
+      <w:r>
+        <w:rPr>
+          <w:rFonts w:ascii="Consolas" w:cs="Consolas" w:eastAsia="Consolas" w:hAnsi="Consolas"/>
+          <w:color w:val="2E3A36"/>
+          <w:sz w:val="20"/>
+          <w:szCs w:val="20"/>
+        </w:rPr>
+        <w:t xml:space="preserve">governance</w:t>
+      </w:r>
+      <w:r>
+        <w:rPr>
+          <w:rFonts w:ascii="Calibri" w:cs="Calibri" w:eastAsia="Calibri" w:hAnsi="Calibri"/>
+        </w:rPr>
+        <w:t xml:space="preserve"> cubre lo que ningún escáner genérico sabe: qué ficheros gobiernan al agente. Cierra el hueco que quedó abierto en la tarea 4, donde el hook solo protegía </w:t>
+      </w:r>
+      <w:r>
+        <w:rPr>
+          <w:rFonts w:ascii="Consolas" w:cs="Consolas" w:eastAsia="Consolas" w:hAnsi="Consolas"/>
+          <w:color w:val="2E3A36"/>
+          <w:sz w:val="20"/>
+          <w:szCs w:val="20"/>
+        </w:rPr>
+        <w:t xml:space="preserve">.specify/memory/</w:t>
+      </w:r>
+      <w:r>
+        <w:rPr>
+          <w:rFonts w:ascii="Calibri" w:cs="Calibri" w:eastAsia="Calibri" w:hAnsi="Calibri"/>
+        </w:rPr>
+        <w:t xml:space="preserve">. Al probarlo con PRs ya fusionados apareció un caso real: habría marcado app#10, porque el agente creó la sección </w:t>
+      </w:r>
+      <w:r>
+        <w:rPr>
+          <w:rFonts w:ascii="Consolas" w:cs="Consolas" w:eastAsia="Consolas" w:hAnsi="Consolas"/>
+          <w:color w:val="2E3A36"/>
+          <w:sz w:val="20"/>
+          <w:szCs w:val="20"/>
+        </w:rPr>
+        <w:t xml:space="preserve">[tool.ruff]</w:t>
+      </w:r>
+      <w:r>
+        <w:rPr>
+          <w:rFonts w:ascii="Calibri" w:cs="Calibri" w:eastAsia="Calibri" w:hAnsi="Calibri"/>
+        </w:rPr>
+        <w:t xml:space="preserve"> de </w:t>
+      </w:r>
+      <w:r>
+        <w:rPr>
+          <w:rFonts w:ascii="Consolas" w:cs="Consolas" w:eastAsia="Consolas" w:hAnsi="Consolas"/>
+          <w:color w:val="2E3A36"/>
+          <w:sz w:val="20"/>
+          <w:szCs w:val="20"/>
+        </w:rPr>
+        <w:t xml:space="preserve">pyproject.toml</w:t>
+      </w:r>
+      <w:r>
+        <w:rPr>
+          <w:rFonts w:ascii="Calibri" w:cs="Calibri" w:eastAsia="Calibri" w:hAnsi="Calibri"/>
+        </w:rPr>
+        <w:t xml:space="preserve"> y excluyó </w:t>
+      </w:r>
+      <w:r>
+        <w:rPr>
+          <w:rFonts w:ascii="Consolas" w:cs="Consolas" w:eastAsia="Consolas" w:hAnsi="Consolas"/>
+          <w:color w:val="2E3A36"/>
+          <w:sz w:val="20"/>
+          <w:szCs w:val="20"/>
+        </w:rPr>
+        <w:t xml:space="preserve">.claude/</w:t>
+      </w:r>
+      <w:r>
+        <w:rPr>
+          <w:rFonts w:ascii="Calibri" w:cs="Calibri" w:eastAsia="Calibri" w:hAnsi="Calibri"/>
+        </w:rPr>
+        <w:t xml:space="preserve"> y </w:t>
+      </w:r>
+      <w:r>
+        <w:rPr>
+          <w:rFonts w:ascii="Consolas" w:cs="Consolas" w:eastAsia="Consolas" w:hAnsi="Consolas"/>
+          <w:color w:val="2E3A36"/>
+          <w:sz w:val="20"/>
+          <w:szCs w:val="20"/>
+        </w:rPr>
+        <w:t xml:space="preserve">.specify/</w:t>
+      </w:r>
+      <w:r>
+        <w:rPr>
+          <w:rFonts w:ascii="Calibri" w:cs="Calibri" w:eastAsia="Calibri" w:hAnsi="Calibri"/>
+        </w:rPr>
+        <w:t xml:space="preserve"> del lint. El agente lo había declarado en el PR y se aprobó, pero desde ahora un cambio así tiene que hacerlo una persona en su propio PR.</w:t>
+      </w:r>
+    </w:p>
+    <w:p>
+      <w:pPr>
+        <w:pStyle w:val="Heading3"/>
+        <w:keepNext/>
+      </w:pPr>
+      <w:r>
+        <w:rPr>
+          <w:rFonts w:ascii="Calibri" w:cs="Calibri" w:eastAsia="Calibri" w:hAnsi="Calibri"/>
+        </w:rPr>
+        <w:t xml:space="preserve">Prueba del bloqueo</w:t>
+      </w:r>
+    </w:p>
+    <w:p>
+      <w:pPr>
+        <w:keepNext w:val="false"/>
+        <w:spacing w:after="140" w:line="288"/>
+        <w:jc w:val="both"/>
+      </w:pPr>
+      <w:r>
+        <w:rPr>
+          <w:rFonts w:ascii="Calibri" w:cs="Calibri" w:eastAsia="Calibri" w:hAnsi="Calibri"/>
+        </w:rPr>
+        <w:t xml:space="preserve">Como en la tarea 6, se abrió un PR de prueba (app#14), esta vez con un fichero </w:t>
+      </w:r>
+      <w:r>
+        <w:rPr>
+          <w:rFonts w:ascii="Consolas" w:cs="Consolas" w:eastAsia="Consolas" w:hAnsi="Consolas"/>
+          <w:color w:val="2E3A36"/>
+          <w:sz w:val="20"/>
+          <w:szCs w:val="20"/>
+        </w:rPr>
+        <w:t xml:space="preserve">.pyc</w:t>
+      </w:r>
+      <w:r>
+        <w:rPr>
+          <w:rFonts w:ascii="Calibri" w:cs="Calibri" w:eastAsia="Calibri" w:hAnsi="Calibri"/>
+        </w:rPr>
+        <w:t xml:space="preserve"> dentro de </w:t>
+      </w:r>
+      <w:r>
+        <w:rPr>
+          <w:rFonts w:ascii="Consolas" w:cs="Consolas" w:eastAsia="Consolas" w:hAnsi="Consolas"/>
+          <w:color w:val="2E3A36"/>
+          <w:sz w:val="20"/>
+          <w:szCs w:val="20"/>
+        </w:rPr>
+        <w:t xml:space="preserve">__pycache__</w:t>
+      </w:r>
+      <w:r>
+        <w:rPr>
+          <w:rFonts w:ascii="Calibri" w:cs="Calibri" w:eastAsia="Calibri" w:hAnsi="Calibri"/>
+        </w:rPr>
+        <w:t xml:space="preserve">. El escaneo </w:t>
+      </w:r>
+      <w:r>
+        <w:rPr>
+          <w:rFonts w:ascii="Consolas" w:cs="Consolas" w:eastAsia="Consolas" w:hAnsi="Consolas"/>
+          <w:color w:val="2E3A36"/>
+          <w:sz w:val="20"/>
+          <w:szCs w:val="20"/>
+        </w:rPr>
+        <w:t xml:space="preserve">governance</w:t>
+      </w:r>
+      <w:r>
+        <w:rPr>
+          <w:rFonts w:ascii="Calibri" w:cs="Calibri" w:eastAsia="Calibri" w:hAnsi="Calibri"/>
+        </w:rPr>
+        <w:t xml:space="preserve"> falló con la anotación «fichero generado: no debe versionarse», </w:t>
+      </w:r>
+      <w:r>
+        <w:rPr>
+          <w:rFonts w:ascii="Consolas" w:cs="Consolas" w:eastAsia="Consolas" w:hAnsi="Consolas"/>
+          <w:color w:val="2E3A36"/>
+          <w:sz w:val="20"/>
+          <w:szCs w:val="20"/>
+        </w:rPr>
+        <w:t xml:space="preserve">security / result</w:t>
+      </w:r>
+      <w:r>
+        <w:rPr>
+          <w:rFonts w:ascii="Calibri" w:cs="Calibri" w:eastAsia="Calibri" w:hAnsi="Calibri"/>
+        </w:rPr>
+        <w:t xml:space="preserve"> quedó en rojo y GitHub bloqueó el merge. Los demás escaneos y el CI salieron en verde, lo que confirma que cada comprobación falla solo por lo suyo.</w:t>
+      </w:r>
+    </w:p>
+    <w:p>
+      <w:pPr>
+        <w:pStyle w:val="Heading2"/>
+        <w:keepNext/>
+      </w:pPr>
+      <w:r>
+        <w:rPr>
+          <w:rFonts w:ascii="Calibri" w:cs="Calibri" w:eastAsia="Calibri" w:hAnsi="Calibri"/>
+        </w:rPr>
         <w:t xml:space="preserve">Tareas pendientes</w:t>
       </w:r>
     </w:p>
@@ -15482,7 +16259,7 @@
           <w:sz w:val="21"/>
           <w:szCs w:val="21"/>
         </w:rPr>
-        <w:t xml:space="preserve">Las secciones de las tareas 7 a 12 y de las extensiones B a F se añadirán a medida que se implementen: análisis de seguridad, agente revisor, agente autónomo, cadena de suministro, despliegue GitOps, </w:t>
+        <w:t xml:space="preserve">Las secciones de las tareas 8 a 12 y de las extensiones B a F se añadirán a medida que se implementen: agente revisor, agente autónomo, cadena de suministro, despliegue GitOps, </w:t>
       </w:r>
       <w:r>
         <w:rPr>
@@ -24987,18 +25764,6 @@
     </w:p>
     <w:p>
       <w:pPr>
-        <w:pStyle w:val="Heading2"/>
-        <w:keepNext/>
-      </w:pPr>
-      <w:r>
-        <w:rPr>
-          <w:rFonts w:ascii="Calibri" w:cs="Calibri" w:eastAsia="Calibri" w:hAnsi="Calibri"/>
-        </w:rPr>
-        <w:t xml:space="preserve">Pruebas realizadas y resultados</w:t>
-      </w:r>
-    </w:p>
-    <w:p>
-      <w:pPr>
         <w:pStyle w:val="Heading3"/>
         <w:keepNext/>
       </w:pPr>
@@ -25006,7 +25771,7 @@
         <w:rPr>
           <w:rFonts w:ascii="Calibri" w:cs="Calibri" w:eastAsia="Calibri" w:hAnsi="Calibri"/>
         </w:rPr>
-        <w:t xml:space="preserve">Pruebas automáticas</w:t>
+        <w:t xml:space="preserve">Fase 11 · Escaneo de seguridad (11 de octubre)</w:t>
       </w:r>
     </w:p>
     <w:tbl>
@@ -25022,9 +25787,10 @@
         </w:tblBorders>
       </w:tblPr>
       <w:tblGrid>
-        <w:gridCol w:w="2580"/>
-        <w:gridCol w:w="4535"/>
-        <w:gridCol w:w="1955"/>
+        <w:gridCol w:w="700"/>
+        <w:gridCol w:w="2839"/>
+        <w:gridCol w:w="3931"/>
+        <w:gridCol w:w="1600"/>
       </w:tblGrid>
       <w:tr>
         <w:trPr>
@@ -25032,7 +25798,7 @@
         </w:trPr>
         <w:tc>
           <w:tcPr>
-            <w:tcW w:type="dxa" w:w="2580"/>
+            <w:tcW w:type="dxa" w:w="700"/>
             <w:shd w:fill="E3EEEA" w:color="auto" w:val="clear"/>
             <w:tcMar>
               <w:top w:type="dxa" w:w="60"/>
@@ -25053,13 +25819,13 @@
                 <w:sz w:val="18"/>
                 <w:szCs w:val="18"/>
               </w:rPr>
-              <w:t xml:space="preserve">Componente</w:t>
-            </w:r>
-          </w:p>
-        </w:tc>
-        <w:tc>
-          <w:tcPr>
-            <w:tcW w:type="dxa" w:w="4535"/>
+              <w:t xml:space="preserve">#</w:t>
+            </w:r>
+          </w:p>
+        </w:tc>
+        <w:tc>
+          <w:tcPr>
+            <w:tcW w:type="dxa" w:w="2839"/>
             <w:shd w:fill="E3EEEA" w:color="auto" w:val="clear"/>
             <w:tcMar>
               <w:top w:type="dxa" w:w="60"/>
@@ -25080,13 +25846,40 @@
                 <w:sz w:val="18"/>
                 <w:szCs w:val="18"/>
               </w:rPr>
-              <w:t xml:space="preserve">Pruebas</w:t>
-            </w:r>
-          </w:p>
-        </w:tc>
-        <w:tc>
-          <w:tcPr>
-            <w:tcW w:type="dxa" w:w="1955"/>
+              <w:t xml:space="preserve">Petición del autor</w:t>
+            </w:r>
+          </w:p>
+        </w:tc>
+        <w:tc>
+          <w:tcPr>
+            <w:tcW w:type="dxa" w:w="3931"/>
+            <w:shd w:fill="E3EEEA" w:color="auto" w:val="clear"/>
+            <w:tcMar>
+              <w:top w:type="dxa" w:w="60"/>
+              <w:left w:type="dxa" w:w="100"/>
+              <w:bottom w:type="dxa" w:w="60"/>
+              <w:right w:type="dxa" w:w="100"/>
+            </w:tcMar>
+          </w:tcPr>
+          <w:p>
+            <w:pPr>
+              <w:spacing w:after="0" w:before="0" w:line="252"/>
+            </w:pPr>
+            <w:r>
+              <w:rPr>
+                <w:rFonts w:ascii="Calibri" w:cs="Calibri" w:eastAsia="Calibri" w:hAnsi="Calibri"/>
+                <w:b/>
+                <w:bCs/>
+                <w:sz w:val="18"/>
+                <w:szCs w:val="18"/>
+              </w:rPr>
+              <w:t xml:space="preserve">Respuesta y acción del modelo</w:t>
+            </w:r>
+          </w:p>
+        </w:tc>
+        <w:tc>
+          <w:tcPr>
+            <w:tcW w:type="dxa" w:w="1600"/>
             <w:shd w:fill="E3EEEA" w:color="auto" w:val="clear"/>
             <w:tcMar>
               <w:top w:type="dxa" w:w="60"/>
@@ -25118,25 +25911,73 @@
         </w:trPr>
         <w:tc>
           <w:tcPr>
-            <w:tcW w:type="dxa" w:w="2580"/>
-            <w:tcMar>
-              <w:top w:type="dxa" w:w="60"/>
-              <w:left w:type="dxa" w:w="100"/>
-              <w:bottom w:type="dxa" w:w="60"/>
-              <w:right w:type="dxa" w:w="100"/>
-            </w:tcMar>
-          </w:tcPr>
-          <w:p>
-            <w:pPr>
-              <w:spacing w:after="0" w:before="0" w:line="252"/>
-            </w:pPr>
-            <w:r>
-              <w:rPr>
-                <w:rFonts w:ascii="Calibri" w:cs="Calibri" w:eastAsia="Calibri" w:hAnsi="Calibri"/>
-                <w:sz w:val="18"/>
-                <w:szCs w:val="18"/>
-              </w:rPr>
-              <w:t xml:space="preserve">Hook </w:t>
+            <w:tcW w:type="dxa" w:w="700"/>
+            <w:tcMar>
+              <w:top w:type="dxa" w:w="60"/>
+              <w:left w:type="dxa" w:w="100"/>
+              <w:bottom w:type="dxa" w:w="60"/>
+              <w:right w:type="dxa" w:w="100"/>
+            </w:tcMar>
+          </w:tcPr>
+          <w:p>
+            <w:pPr>
+              <w:spacing w:after="0" w:before="0" w:line="252"/>
+            </w:pPr>
+            <w:r>
+              <w:rPr>
+                <w:rFonts w:ascii="Calibri" w:cs="Calibri" w:eastAsia="Calibri" w:hAnsi="Calibri"/>
+                <w:sz w:val="18"/>
+                <w:szCs w:val="18"/>
+              </w:rPr>
+              <w:t xml:space="preserve">66</w:t>
+            </w:r>
+          </w:p>
+        </w:tc>
+        <w:tc>
+          <w:tcPr>
+            <w:tcW w:type="dxa" w:w="2839"/>
+            <w:tcMar>
+              <w:top w:type="dxa" w:w="60"/>
+              <w:left w:type="dxa" w:w="100"/>
+              <w:bottom w:type="dxa" w:w="60"/>
+              <w:right w:type="dxa" w:w="100"/>
+            </w:tcMar>
+          </w:tcPr>
+          <w:p>
+            <w:pPr>
+              <w:spacing w:after="0" w:before="0" w:line="252"/>
+            </w:pPr>
+            <w:r>
+              <w:rPr>
+                <w:rFonts w:ascii="Calibri" w:cs="Calibri" w:eastAsia="Calibri" w:hAnsi="Calibri"/>
+                <w:sz w:val="18"/>
+                <w:szCs w:val="18"/>
+              </w:rPr>
+              <w:t xml:space="preserve">«Continuamos»</w:t>
+            </w:r>
+          </w:p>
+        </w:tc>
+        <w:tc>
+          <w:tcPr>
+            <w:tcW w:type="dxa" w:w="3931"/>
+            <w:tcMar>
+              <w:top w:type="dxa" w:w="60"/>
+              <w:left w:type="dxa" w:w="100"/>
+              <w:bottom w:type="dxa" w:w="60"/>
+              <w:right w:type="dxa" w:w="100"/>
+            </w:tcMar>
+          </w:tcPr>
+          <w:p>
+            <w:pPr>
+              <w:spacing w:after="0" w:before="0" w:line="252"/>
+            </w:pPr>
+            <w:r>
+              <w:rPr>
+                <w:rFonts w:ascii="Calibri" w:cs="Calibri" w:eastAsia="Calibri" w:hAnsi="Calibri"/>
+                <w:sz w:val="18"/>
+                <w:szCs w:val="18"/>
+              </w:rPr>
+              <w:t xml:space="preserve">Prueba las herramientas sobre app antes de fijarlas (Semgrep no es reproducible porque descarga sus reglas, se elige bandit). Escribe </w:t>
             </w:r>
             <w:r>
               <w:rPr>
@@ -25145,55 +25986,39 @@
                 <w:sz w:val="16"/>
                 <w:szCs w:val="16"/>
               </w:rPr>
-              <w:t xml:space="preserve">guard.py</w:t>
-            </w:r>
-          </w:p>
-        </w:tc>
-        <w:tc>
-          <w:tcPr>
-            <w:tcW w:type="dxa" w:w="4535"/>
-            <w:tcMar>
-              <w:top w:type="dxa" w:w="60"/>
-              <w:left w:type="dxa" w:w="100"/>
-              <w:bottom w:type="dxa" w:w="60"/>
-              <w:right w:type="dxa" w:w="100"/>
-            </w:tcMar>
-          </w:tcPr>
-          <w:p>
-            <w:pPr>
-              <w:spacing w:after="0" w:before="0" w:line="252"/>
-            </w:pPr>
-            <w:r>
-              <w:rPr>
-                <w:rFonts w:ascii="Calibri" w:cs="Calibri" w:eastAsia="Calibri" w:hAnsi="Calibri"/>
-                <w:sz w:val="18"/>
-                <w:szCs w:val="18"/>
-              </w:rPr>
-              <w:t xml:space="preserve">45 casos: 21 comandos que deben bloquearse, 10 que deben permitirse, ficheros protegidos, secretos y auditoría</w:t>
-            </w:r>
-          </w:p>
-        </w:tc>
-        <w:tc>
-          <w:tcPr>
-            <w:tcW w:type="dxa" w:w="1955"/>
-            <w:tcMar>
-              <w:top w:type="dxa" w:w="60"/>
-              <w:left w:type="dxa" w:w="100"/>
-              <w:bottom w:type="dxa" w:w="60"/>
-              <w:right w:type="dxa" w:w="100"/>
-            </w:tcMar>
-          </w:tcPr>
-          <w:p>
-            <w:pPr>
-              <w:spacing w:after="0" w:before="0" w:line="252"/>
-            </w:pPr>
-            <w:r>
-              <w:rPr>
-                <w:rFonts w:ascii="Calibri" w:cs="Calibri" w:eastAsia="Calibri" w:hAnsi="Calibri"/>
-                <w:sz w:val="18"/>
-                <w:szCs w:val="18"/>
-              </w:rPr>
-              <w:t xml:space="preserve">45/45 superadas</w:t>
+              <w:t xml:space="preserve">check_pr_files.py</w:t>
+            </w:r>
+            <w:r>
+              <w:rPr>
+                <w:rFonts w:ascii="Calibri" w:cs="Calibri" w:eastAsia="Calibri" w:hAnsi="Calibri"/>
+                <w:sz w:val="18"/>
+                <w:szCs w:val="18"/>
+              </w:rPr>
+              <w:t xml:space="preserve"> con 21 tests y lo prueba contra PRs reales: habría marcado app#10. Abre core#10 y app#13</w:t>
+            </w:r>
+          </w:p>
+        </w:tc>
+        <w:tc>
+          <w:tcPr>
+            <w:tcW w:type="dxa" w:w="1600"/>
+            <w:tcMar>
+              <w:top w:type="dxa" w:w="60"/>
+              <w:left w:type="dxa" w:w="100"/>
+              <w:bottom w:type="dxa" w:w="60"/>
+              <w:right w:type="dxa" w:w="100"/>
+            </w:tcMar>
+          </w:tcPr>
+          <w:p>
+            <w:pPr>
+              <w:spacing w:after="0" w:before="0" w:line="252"/>
+            </w:pPr>
+            <w:r>
+              <w:rPr>
+                <w:rFonts w:ascii="Calibri" w:cs="Calibri" w:eastAsia="Calibri" w:hAnsi="Calibri"/>
+                <w:sz w:val="18"/>
+                <w:szCs w:val="18"/>
+              </w:rPr>
+              <w:t xml:space="preserve">Tarea 7 preparada</w:t>
             </w:r>
           </w:p>
         </w:tc>
@@ -25204,25 +26029,73 @@
         </w:trPr>
         <w:tc>
           <w:tcPr>
-            <w:tcW w:type="dxa" w:w="2580"/>
-            <w:tcMar>
-              <w:top w:type="dxa" w:w="60"/>
-              <w:left w:type="dxa" w:w="100"/>
-              <w:bottom w:type="dxa" w:w="60"/>
-              <w:right w:type="dxa" w:w="100"/>
-            </w:tcMar>
-          </w:tcPr>
-          <w:p>
-            <w:pPr>
-              <w:spacing w:after="0" w:before="0" w:line="252"/>
-            </w:pPr>
-            <w:r>
-              <w:rPr>
-                <w:rFonts w:ascii="Calibri" w:cs="Calibri" w:eastAsia="Calibri" w:hAnsi="Calibri"/>
-                <w:sz w:val="18"/>
-                <w:szCs w:val="18"/>
-              </w:rPr>
-              <w:t xml:space="preserve">Aplicación: catálogo (</w:t>
+            <w:tcW w:type="dxa" w:w="700"/>
+            <w:tcMar>
+              <w:top w:type="dxa" w:w="60"/>
+              <w:left w:type="dxa" w:w="100"/>
+              <w:bottom w:type="dxa" w:w="60"/>
+              <w:right w:type="dxa" w:w="100"/>
+            </w:tcMar>
+          </w:tcPr>
+          <w:p>
+            <w:pPr>
+              <w:spacing w:after="0" w:before="0" w:line="252"/>
+            </w:pPr>
+            <w:r>
+              <w:rPr>
+                <w:rFonts w:ascii="Calibri" w:cs="Calibri" w:eastAsia="Calibri" w:hAnsi="Calibri"/>
+                <w:sz w:val="18"/>
+                <w:szCs w:val="18"/>
+              </w:rPr>
+              <w:t xml:space="preserve">67</w:t>
+            </w:r>
+          </w:p>
+        </w:tc>
+        <w:tc>
+          <w:tcPr>
+            <w:tcW w:type="dxa" w:w="2839"/>
+            <w:tcMar>
+              <w:top w:type="dxa" w:w="60"/>
+              <w:left w:type="dxa" w:w="100"/>
+              <w:bottom w:type="dxa" w:w="60"/>
+              <w:right w:type="dxa" w:w="100"/>
+            </w:tcMar>
+          </w:tcPr>
+          <w:p>
+            <w:pPr>
+              <w:spacing w:after="0" w:before="0" w:line="252"/>
+            </w:pPr>
+            <w:r>
+              <w:rPr>
+                <w:rFonts w:ascii="Calibri" w:cs="Calibri" w:eastAsia="Calibri" w:hAnsi="Calibri"/>
+                <w:sz w:val="18"/>
+                <w:szCs w:val="18"/>
+              </w:rPr>
+              <w:t xml:space="preserve">«Pasos 1 y 2 ok»</w:t>
+            </w:r>
+          </w:p>
+        </w:tc>
+        <w:tc>
+          <w:tcPr>
+            <w:tcW w:type="dxa" w:w="3931"/>
+            <w:tcMar>
+              <w:top w:type="dxa" w:w="60"/>
+              <w:left w:type="dxa" w:w="100"/>
+              <w:bottom w:type="dxa" w:w="60"/>
+              <w:right w:type="dxa" w:w="100"/>
+            </w:tcMar>
+          </w:tcPr>
+          <w:p>
+            <w:pPr>
+              <w:spacing w:after="0" w:before="0" w:line="252"/>
+            </w:pPr>
+            <w:r>
+              <w:rPr>
+                <w:rFonts w:ascii="Calibri" w:cs="Calibri" w:eastAsia="Calibri" w:hAnsi="Calibri"/>
+                <w:sz w:val="18"/>
+                <w:szCs w:val="18"/>
+              </w:rPr>
+              <w:t xml:space="preserve">Comprueba que </w:t>
             </w:r>
             <w:r>
               <w:rPr>
@@ -25231,39 +26104,15 @@
                 <w:sz w:val="16"/>
                 <w:szCs w:val="16"/>
               </w:rPr>
-              <w:t xml:space="preserve">app</w:t>
-            </w:r>
-            <w:r>
-              <w:rPr>
-                <w:rFonts w:ascii="Calibri" w:cs="Calibri" w:eastAsia="Calibri" w:hAnsi="Calibri"/>
-                <w:sz w:val="18"/>
-                <w:szCs w:val="18"/>
-              </w:rPr>
-              <w:t xml:space="preserve">)</w:t>
-            </w:r>
-          </w:p>
-        </w:tc>
-        <w:tc>
-          <w:tcPr>
-            <w:tcW w:type="dxa" w:w="4535"/>
-            <w:tcMar>
-              <w:top w:type="dxa" w:w="60"/>
-              <w:left w:type="dxa" w:w="100"/>
-              <w:bottom w:type="dxa" w:w="60"/>
-              <w:right w:type="dxa" w:w="100"/>
-            </w:tcMar>
-          </w:tcPr>
-          <w:p>
-            <w:pPr>
-              <w:spacing w:after="0" w:before="0" w:line="252"/>
-            </w:pPr>
-            <w:r>
-              <w:rPr>
-                <w:rFonts w:ascii="Calibri" w:cs="Calibri" w:eastAsia="Calibri" w:hAnsi="Calibri"/>
-                <w:sz w:val="18"/>
-                <w:szCs w:val="18"/>
-              </w:rPr>
-              <w:t xml:space="preserve">55 casos: listado, consulta por id, 404, precio con 2 decimales, orden estable, catálogo mal formado, despliegue de un cambio de precio, observabilidad y </w:t>
+              <w:t xml:space="preserve">v1</w:t>
+            </w:r>
+            <w:r>
+              <w:rPr>
+                <w:rFonts w:ascii="Calibri" w:cs="Calibri" w:eastAsia="Calibri" w:hAnsi="Calibri"/>
+                <w:sz w:val="18"/>
+                <w:szCs w:val="18"/>
+              </w:rPr>
+              <w:t xml:space="preserve"> apunta a la nueva </w:t>
             </w:r>
             <w:r>
               <w:rPr>
@@ -25272,31 +26121,39 @@
                 <w:sz w:val="16"/>
                 <w:szCs w:val="16"/>
               </w:rPr>
-              <w:t xml:space="preserve">/health</w:t>
-            </w:r>
-          </w:p>
-        </w:tc>
-        <w:tc>
-          <w:tcPr>
-            <w:tcW w:type="dxa" w:w="1955"/>
-            <w:tcMar>
-              <w:top w:type="dxa" w:w="60"/>
-              <w:left w:type="dxa" w:w="100"/>
-              <w:bottom w:type="dxa" w:w="60"/>
-              <w:right w:type="dxa" w:w="100"/>
-            </w:tcMar>
-          </w:tcPr>
-          <w:p>
-            <w:pPr>
-              <w:spacing w:after="0" w:before="0" w:line="252"/>
-            </w:pPr>
-            <w:r>
-              <w:rPr>
-                <w:rFonts w:ascii="Calibri" w:cs="Calibri" w:eastAsia="Calibri" w:hAnsi="Calibri"/>
-                <w:sz w:val="18"/>
-                <w:szCs w:val="18"/>
-              </w:rPr>
-              <w:t xml:space="preserve">55/55 superadas</w:t>
+              <w:t xml:space="preserve">main</w:t>
+            </w:r>
+            <w:r>
+              <w:rPr>
+                <w:rFonts w:ascii="Calibri" w:cs="Calibri" w:eastAsia="Calibri" w:hAnsi="Calibri"/>
+                <w:sz w:val="18"/>
+                <w:szCs w:val="18"/>
+              </w:rPr>
+              <w:t xml:space="preserve">, relanza app#13 y confirma los cinco checks en verde</w:t>
+            </w:r>
+          </w:p>
+        </w:tc>
+        <w:tc>
+          <w:tcPr>
+            <w:tcW w:type="dxa" w:w="1600"/>
+            <w:tcMar>
+              <w:top w:type="dxa" w:w="60"/>
+              <w:left w:type="dxa" w:w="100"/>
+              <w:bottom w:type="dxa" w:w="60"/>
+              <w:right w:type="dxa" w:w="100"/>
+            </w:tcMar>
+          </w:tcPr>
+          <w:p>
+            <w:pPr>
+              <w:spacing w:after="0" w:before="0" w:line="252"/>
+            </w:pPr>
+            <w:r>
+              <w:rPr>
+                <w:rFonts w:ascii="Calibri" w:cs="Calibri" w:eastAsia="Calibri" w:hAnsi="Calibri"/>
+                <w:sz w:val="18"/>
+                <w:szCs w:val="18"/>
+              </w:rPr>
+              <w:t xml:space="preserve">Escaneo operativo</w:t>
             </w:r>
           </w:p>
         </w:tc>
@@ -25307,49 +26164,73 @@
         </w:trPr>
         <w:tc>
           <w:tcPr>
-            <w:tcW w:type="dxa" w:w="2580"/>
-            <w:tcMar>
-              <w:top w:type="dxa" w:w="60"/>
-              <w:left w:type="dxa" w:w="100"/>
-              <w:bottom w:type="dxa" w:w="60"/>
-              <w:right w:type="dxa" w:w="100"/>
-            </w:tcMar>
-          </w:tcPr>
-          <w:p>
-            <w:pPr>
-              <w:spacing w:after="0" w:before="0" w:line="252"/>
-            </w:pPr>
-            <w:r>
-              <w:rPr>
-                <w:rFonts w:ascii="Calibri" w:cs="Calibri" w:eastAsia="Calibri" w:hAnsi="Calibri"/>
-                <w:sz w:val="18"/>
-                <w:szCs w:val="18"/>
-              </w:rPr>
-              <w:t xml:space="preserve">CI obligatorio (app#12)</w:t>
-            </w:r>
-          </w:p>
-        </w:tc>
-        <w:tc>
-          <w:tcPr>
-            <w:tcW w:type="dxa" w:w="4535"/>
-            <w:tcMar>
-              <w:top w:type="dxa" w:w="60"/>
-              <w:left w:type="dxa" w:w="100"/>
-              <w:bottom w:type="dxa" w:w="60"/>
-              <w:right w:type="dxa" w:w="100"/>
-            </w:tcMar>
-          </w:tcPr>
-          <w:p>
-            <w:pPr>
-              <w:spacing w:after="0" w:before="0" w:line="252"/>
-            </w:pPr>
-            <w:r>
-              <w:rPr>
-                <w:rFonts w:ascii="Calibri" w:cs="Calibri" w:eastAsia="Calibri" w:hAnsi="Calibri"/>
-                <w:sz w:val="18"/>
-                <w:szCs w:val="18"/>
-              </w:rPr>
-              <w:t xml:space="preserve">PR con un </w:t>
+            <w:tcW w:type="dxa" w:w="700"/>
+            <w:tcMar>
+              <w:top w:type="dxa" w:w="60"/>
+              <w:left w:type="dxa" w:w="100"/>
+              <w:bottom w:type="dxa" w:w="60"/>
+              <w:right w:type="dxa" w:w="100"/>
+            </w:tcMar>
+          </w:tcPr>
+          <w:p>
+            <w:pPr>
+              <w:spacing w:after="0" w:before="0" w:line="252"/>
+            </w:pPr>
+            <w:r>
+              <w:rPr>
+                <w:rFonts w:ascii="Calibri" w:cs="Calibri" w:eastAsia="Calibri" w:hAnsi="Calibri"/>
+                <w:sz w:val="18"/>
+                <w:szCs w:val="18"/>
+              </w:rPr>
+              <w:t xml:space="preserve">68</w:t>
+            </w:r>
+          </w:p>
+        </w:tc>
+        <w:tc>
+          <w:tcPr>
+            <w:tcW w:type="dxa" w:w="2839"/>
+            <w:tcMar>
+              <w:top w:type="dxa" w:w="60"/>
+              <w:left w:type="dxa" w:w="100"/>
+              <w:bottom w:type="dxa" w:w="60"/>
+              <w:right w:type="dxa" w:w="100"/>
+            </w:tcMar>
+          </w:tcPr>
+          <w:p>
+            <w:pPr>
+              <w:spacing w:after="0" w:before="0" w:line="252"/>
+            </w:pPr>
+            <w:r>
+              <w:rPr>
+                <w:rFonts w:ascii="Calibri" w:cs="Calibri" w:eastAsia="Calibri" w:hAnsi="Calibri"/>
+                <w:sz w:val="18"/>
+                <w:szCs w:val="18"/>
+              </w:rPr>
+              <w:t xml:space="preserve">«Listo. Por otra parte, hay otros checks que parecen interesantes: Require code scanning results»</w:t>
+            </w:r>
+          </w:p>
+        </w:tc>
+        <w:tc>
+          <w:tcPr>
+            <w:tcW w:type="dxa" w:w="3931"/>
+            <w:tcMar>
+              <w:top w:type="dxa" w:w="60"/>
+              <w:left w:type="dxa" w:w="100"/>
+              <w:bottom w:type="dxa" w:w="60"/>
+              <w:right w:type="dxa" w:w="100"/>
+            </w:tcMar>
+          </w:tcPr>
+          <w:p>
+            <w:pPr>
+              <w:spacing w:after="0" w:before="0" w:line="252"/>
+            </w:pPr>
+            <w:r>
+              <w:rPr>
+                <w:rFonts w:ascii="Calibri" w:cs="Calibri" w:eastAsia="Calibri" w:hAnsi="Calibri"/>
+                <w:sz w:val="18"/>
+                <w:szCs w:val="18"/>
+              </w:rPr>
+              <w:t xml:space="preserve">Verifica la regla del ruleset y prueba el bloqueo con un </w:t>
             </w:r>
             <w:r>
               <w:rPr>
@@ -25358,39 +26239,39 @@
                 <w:sz w:val="16"/>
                 <w:szCs w:val="16"/>
               </w:rPr>
-              <w:t xml:space="preserve">import</w:t>
-            </w:r>
-            <w:r>
-              <w:rPr>
-                <w:rFonts w:ascii="Calibri" w:cs="Calibri" w:eastAsia="Calibri" w:hAnsi="Calibri"/>
-                <w:sz w:val="18"/>
-                <w:szCs w:val="18"/>
-              </w:rPr>
-              <w:t xml:space="preserve"> sin usar</w:t>
-            </w:r>
-          </w:p>
-        </w:tc>
-        <w:tc>
-          <w:tcPr>
-            <w:tcW w:type="dxa" w:w="1955"/>
-            <w:tcMar>
-              <w:top w:type="dxa" w:w="60"/>
-              <w:left w:type="dxa" w:w="100"/>
-              <w:bottom w:type="dxa" w:w="60"/>
-              <w:right w:type="dxa" w:w="100"/>
-            </w:tcMar>
-          </w:tcPr>
-          <w:p>
-            <w:pPr>
-              <w:spacing w:after="0" w:before="0" w:line="252"/>
-            </w:pPr>
-            <w:r>
-              <w:rPr>
-                <w:rFonts w:ascii="Calibri" w:cs="Calibri" w:eastAsia="Calibri" w:hAnsi="Calibri"/>
-                <w:sz w:val="18"/>
-                <w:szCs w:val="18"/>
-              </w:rPr>
-              <w:t xml:space="preserve">CI en rojo y merge bloqueado</w:t>
+              <w:t xml:space="preserve">.pyc</w:t>
+            </w:r>
+            <w:r>
+              <w:rPr>
+                <w:rFonts w:ascii="Calibri" w:cs="Calibri" w:eastAsia="Calibri" w:hAnsi="Calibri"/>
+                <w:sz w:val="18"/>
+                <w:szCs w:val="18"/>
+              </w:rPr>
+              <w:t xml:space="preserve"> (app#14). Explica qué añadiría CodeQL frente a bandit y cómo activarlo</w:t>
+            </w:r>
+          </w:p>
+        </w:tc>
+        <w:tc>
+          <w:tcPr>
+            <w:tcW w:type="dxa" w:w="1600"/>
+            <w:tcMar>
+              <w:top w:type="dxa" w:w="60"/>
+              <w:left w:type="dxa" w:w="100"/>
+              <w:bottom w:type="dxa" w:w="60"/>
+              <w:right w:type="dxa" w:w="100"/>
+            </w:tcMar>
+          </w:tcPr>
+          <w:p>
+            <w:pPr>
+              <w:spacing w:after="0" w:before="0" w:line="252"/>
+            </w:pPr>
+            <w:r>
+              <w:rPr>
+                <w:rFonts w:ascii="Calibri" w:cs="Calibri" w:eastAsia="Calibri" w:hAnsi="Calibri"/>
+                <w:sz w:val="18"/>
+                <w:szCs w:val="18"/>
+              </w:rPr>
+              <w:t xml:space="preserve">Tarea 7 comprobada</w:t>
             </w:r>
           </w:p>
         </w:tc>
@@ -25401,25 +26282,259 @@
         </w:trPr>
         <w:tc>
           <w:tcPr>
-            <w:tcW w:type="dxa" w:w="2580"/>
-            <w:tcMar>
-              <w:top w:type="dxa" w:w="60"/>
-              <w:left w:type="dxa" w:w="100"/>
-              <w:bottom w:type="dxa" w:w="60"/>
-              <w:right w:type="dxa" w:w="100"/>
-            </w:tcMar>
-          </w:tcPr>
-          <w:p>
-            <w:pPr>
-              <w:spacing w:after="0" w:before="0" w:line="252"/>
-            </w:pPr>
-            <w:r>
-              <w:rPr>
-                <w:rFonts w:ascii="Calibri" w:cs="Calibri" w:eastAsia="Calibri" w:hAnsi="Calibri"/>
-                <w:sz w:val="18"/>
-                <w:szCs w:val="18"/>
-              </w:rPr>
-              <w:t xml:space="preserve">Triage (</w:t>
+            <w:tcW w:type="dxa" w:w="700"/>
+            <w:tcMar>
+              <w:top w:type="dxa" w:w="60"/>
+              <w:left w:type="dxa" w:w="100"/>
+              <w:bottom w:type="dxa" w:w="60"/>
+              <w:right w:type="dxa" w:w="100"/>
+            </w:tcMar>
+          </w:tcPr>
+          <w:p>
+            <w:pPr>
+              <w:spacing w:after="0" w:before="0" w:line="252"/>
+            </w:pPr>
+            <w:r>
+              <w:rPr>
+                <w:rFonts w:ascii="Calibri" w:cs="Calibri" w:eastAsia="Calibri" w:hAnsi="Calibri"/>
+                <w:sz w:val="18"/>
+                <w:szCs w:val="18"/>
+              </w:rPr>
+              <w:t xml:space="preserve">69</w:t>
+            </w:r>
+          </w:p>
+        </w:tc>
+        <w:tc>
+          <w:tcPr>
+            <w:tcW w:type="dxa" w:w="2839"/>
+            <w:tcMar>
+              <w:top w:type="dxa" w:w="60"/>
+              <w:left w:type="dxa" w:w="100"/>
+              <w:bottom w:type="dxa" w:w="60"/>
+              <w:right w:type="dxa" w:w="100"/>
+            </w:tcMar>
+          </w:tcPr>
+          <w:p>
+            <w:pPr>
+              <w:spacing w:after="0" w:before="0" w:line="252"/>
+            </w:pPr>
+            <w:r>
+              <w:rPr>
+                <w:rFonts w:ascii="Calibri" w:cs="Calibri" w:eastAsia="Calibri" w:hAnsi="Calibri"/>
+                <w:sz w:val="18"/>
+                <w:szCs w:val="18"/>
+              </w:rPr>
+              <w:t xml:space="preserve">«Ya lo haré más adelante; de momento no lo pongas como tarea»</w:t>
+            </w:r>
+          </w:p>
+        </w:tc>
+        <w:tc>
+          <w:tcPr>
+            <w:tcW w:type="dxa" w:w="3931"/>
+            <w:tcMar>
+              <w:top w:type="dxa" w:w="60"/>
+              <w:left w:type="dxa" w:w="100"/>
+              <w:bottom w:type="dxa" w:w="60"/>
+              <w:right w:type="dxa" w:w="100"/>
+            </w:tcMar>
+          </w:tcPr>
+          <w:p>
+            <w:pPr>
+              <w:spacing w:after="0" w:before="0" w:line="252"/>
+            </w:pPr>
+            <w:r>
+              <w:rPr>
+                <w:rFonts w:ascii="Calibri" w:cs="Calibri" w:eastAsia="Calibri" w:hAnsi="Calibri"/>
+                <w:sz w:val="18"/>
+                <w:szCs w:val="18"/>
+              </w:rPr>
+              <w:t xml:space="preserve">No lo añade al plan; queda solo como posible mejora</w:t>
+            </w:r>
+          </w:p>
+        </w:tc>
+        <w:tc>
+          <w:tcPr>
+            <w:tcW w:type="dxa" w:w="1600"/>
+            <w:tcMar>
+              <w:top w:type="dxa" w:w="60"/>
+              <w:left w:type="dxa" w:w="100"/>
+              <w:bottom w:type="dxa" w:w="60"/>
+              <w:right w:type="dxa" w:w="100"/>
+            </w:tcMar>
+          </w:tcPr>
+          <w:p>
+            <w:pPr>
+              <w:spacing w:after="0" w:before="0" w:line="252"/>
+            </w:pPr>
+            <w:r>
+              <w:rPr>
+                <w:rFonts w:ascii="Calibri" w:cs="Calibri" w:eastAsia="Calibri" w:hAnsi="Calibri"/>
+                <w:sz w:val="18"/>
+                <w:szCs w:val="18"/>
+              </w:rPr>
+              <w:t xml:space="preserve">Tarea 7 cerrada</w:t>
+            </w:r>
+          </w:p>
+        </w:tc>
+      </w:tr>
+    </w:tbl>
+    <w:p>
+      <w:pPr>
+        <w:spacing w:after="120"/>
+      </w:pPr>
+    </w:p>
+    <w:p>
+      <w:pPr>
+        <w:pStyle w:val="Heading2"/>
+        <w:keepNext/>
+      </w:pPr>
+      <w:r>
+        <w:rPr>
+          <w:rFonts w:ascii="Calibri" w:cs="Calibri" w:eastAsia="Calibri" w:hAnsi="Calibri"/>
+        </w:rPr>
+        <w:t xml:space="preserve">Pruebas realizadas y resultados</w:t>
+      </w:r>
+    </w:p>
+    <w:p>
+      <w:pPr>
+        <w:pStyle w:val="Heading3"/>
+        <w:keepNext/>
+      </w:pPr>
+      <w:r>
+        <w:rPr>
+          <w:rFonts w:ascii="Calibri" w:cs="Calibri" w:eastAsia="Calibri" w:hAnsi="Calibri"/>
+        </w:rPr>
+        <w:t xml:space="preserve">Pruebas automáticas</w:t>
+      </w:r>
+    </w:p>
+    <w:tbl>
+      <w:tblPr>
+        <w:tblW w:type="dxa" w:w="9070"/>
+        <w:tblBorders>
+          <w:top w:val="single" w:color="C9D3CF" w:sz="4"/>
+          <w:left w:val="single" w:color="C9D3CF" w:sz="4"/>
+          <w:bottom w:val="single" w:color="C9D3CF" w:sz="4"/>
+          <w:right w:val="single" w:color="C9D3CF" w:sz="4"/>
+          <w:insideH w:val="single" w:color="C9D3CF" w:sz="4"/>
+          <w:insideV w:val="single" w:color="C9D3CF" w:sz="4"/>
+        </w:tblBorders>
+      </w:tblPr>
+      <w:tblGrid>
+        <w:gridCol w:w="2776"/>
+        <w:gridCol w:w="4246"/>
+        <w:gridCol w:w="2048"/>
+      </w:tblGrid>
+      <w:tr>
+        <w:trPr>
+          <w:tblHeader/>
+        </w:trPr>
+        <w:tc>
+          <w:tcPr>
+            <w:tcW w:type="dxa" w:w="2776"/>
+            <w:shd w:fill="E3EEEA" w:color="auto" w:val="clear"/>
+            <w:tcMar>
+              <w:top w:type="dxa" w:w="60"/>
+              <w:left w:type="dxa" w:w="100"/>
+              <w:bottom w:type="dxa" w:w="60"/>
+              <w:right w:type="dxa" w:w="100"/>
+            </w:tcMar>
+          </w:tcPr>
+          <w:p>
+            <w:pPr>
+              <w:spacing w:after="0" w:before="0" w:line="252"/>
+            </w:pPr>
+            <w:r>
+              <w:rPr>
+                <w:rFonts w:ascii="Calibri" w:cs="Calibri" w:eastAsia="Calibri" w:hAnsi="Calibri"/>
+                <w:b/>
+                <w:bCs/>
+                <w:sz w:val="18"/>
+                <w:szCs w:val="18"/>
+              </w:rPr>
+              <w:t xml:space="preserve">Componente</w:t>
+            </w:r>
+          </w:p>
+        </w:tc>
+        <w:tc>
+          <w:tcPr>
+            <w:tcW w:type="dxa" w:w="4246"/>
+            <w:shd w:fill="E3EEEA" w:color="auto" w:val="clear"/>
+            <w:tcMar>
+              <w:top w:type="dxa" w:w="60"/>
+              <w:left w:type="dxa" w:w="100"/>
+              <w:bottom w:type="dxa" w:w="60"/>
+              <w:right w:type="dxa" w:w="100"/>
+            </w:tcMar>
+          </w:tcPr>
+          <w:p>
+            <w:pPr>
+              <w:spacing w:after="0" w:before="0" w:line="252"/>
+            </w:pPr>
+            <w:r>
+              <w:rPr>
+                <w:rFonts w:ascii="Calibri" w:cs="Calibri" w:eastAsia="Calibri" w:hAnsi="Calibri"/>
+                <w:b/>
+                <w:bCs/>
+                <w:sz w:val="18"/>
+                <w:szCs w:val="18"/>
+              </w:rPr>
+              <w:t xml:space="preserve">Pruebas</w:t>
+            </w:r>
+          </w:p>
+        </w:tc>
+        <w:tc>
+          <w:tcPr>
+            <w:tcW w:type="dxa" w:w="2048"/>
+            <w:shd w:fill="E3EEEA" w:color="auto" w:val="clear"/>
+            <w:tcMar>
+              <w:top w:type="dxa" w:w="60"/>
+              <w:left w:type="dxa" w:w="100"/>
+              <w:bottom w:type="dxa" w:w="60"/>
+              <w:right w:type="dxa" w:w="100"/>
+            </w:tcMar>
+          </w:tcPr>
+          <w:p>
+            <w:pPr>
+              <w:spacing w:after="0" w:before="0" w:line="252"/>
+            </w:pPr>
+            <w:r>
+              <w:rPr>
+                <w:rFonts w:ascii="Calibri" w:cs="Calibri" w:eastAsia="Calibri" w:hAnsi="Calibri"/>
+                <w:b/>
+                <w:bCs/>
+                <w:sz w:val="18"/>
+                <w:szCs w:val="18"/>
+              </w:rPr>
+              <w:t xml:space="preserve">Resultado</w:t>
+            </w:r>
+          </w:p>
+        </w:tc>
+      </w:tr>
+      <w:tr>
+        <w:trPr>
+          <w:cantSplit/>
+        </w:trPr>
+        <w:tc>
+          <w:tcPr>
+            <w:tcW w:type="dxa" w:w="2776"/>
+            <w:tcMar>
+              <w:top w:type="dxa" w:w="60"/>
+              <w:left w:type="dxa" w:w="100"/>
+              <w:bottom w:type="dxa" w:w="60"/>
+              <w:right w:type="dxa" w:w="100"/>
+            </w:tcMar>
+          </w:tcPr>
+          <w:p>
+            <w:pPr>
+              <w:spacing w:after="0" w:before="0" w:line="252"/>
+            </w:pPr>
+            <w:r>
+              <w:rPr>
+                <w:rFonts w:ascii="Calibri" w:cs="Calibri" w:eastAsia="Calibri" w:hAnsi="Calibri"/>
+                <w:sz w:val="18"/>
+                <w:szCs w:val="18"/>
+              </w:rPr>
+              <w:t xml:space="preserve">Hook </w:t>
             </w:r>
             <w:r>
               <w:rPr>
@@ -25428,15 +26543,84 @@
                 <w:sz w:val="16"/>
                 <w:szCs w:val="16"/>
               </w:rPr>
-              <w:t xml:space="preserve">apply.py</w:t>
-            </w:r>
-            <w:r>
-              <w:rPr>
-                <w:rFonts w:ascii="Calibri" w:cs="Calibri" w:eastAsia="Calibri" w:hAnsi="Calibri"/>
-                <w:sz w:val="18"/>
-                <w:szCs w:val="18"/>
-              </w:rPr>
-              <w:t xml:space="preserve">, </w:t>
+              <w:t xml:space="preserve">guard.py</w:t>
+            </w:r>
+          </w:p>
+        </w:tc>
+        <w:tc>
+          <w:tcPr>
+            <w:tcW w:type="dxa" w:w="4246"/>
+            <w:tcMar>
+              <w:top w:type="dxa" w:w="60"/>
+              <w:left w:type="dxa" w:w="100"/>
+              <w:bottom w:type="dxa" w:w="60"/>
+              <w:right w:type="dxa" w:w="100"/>
+            </w:tcMar>
+          </w:tcPr>
+          <w:p>
+            <w:pPr>
+              <w:spacing w:after="0" w:before="0" w:line="252"/>
+            </w:pPr>
+            <w:r>
+              <w:rPr>
+                <w:rFonts w:ascii="Calibri" w:cs="Calibri" w:eastAsia="Calibri" w:hAnsi="Calibri"/>
+                <w:sz w:val="18"/>
+                <w:szCs w:val="18"/>
+              </w:rPr>
+              <w:t xml:space="preserve">45 casos: 21 comandos que deben bloquearse, 10 que deben permitirse, ficheros protegidos, secretos y auditoría</w:t>
+            </w:r>
+          </w:p>
+        </w:tc>
+        <w:tc>
+          <w:tcPr>
+            <w:tcW w:type="dxa" w:w="2048"/>
+            <w:tcMar>
+              <w:top w:type="dxa" w:w="60"/>
+              <w:left w:type="dxa" w:w="100"/>
+              <w:bottom w:type="dxa" w:w="60"/>
+              <w:right w:type="dxa" w:w="100"/>
+            </w:tcMar>
+          </w:tcPr>
+          <w:p>
+            <w:pPr>
+              <w:spacing w:after="0" w:before="0" w:line="252"/>
+            </w:pPr>
+            <w:r>
+              <w:rPr>
+                <w:rFonts w:ascii="Calibri" w:cs="Calibri" w:eastAsia="Calibri" w:hAnsi="Calibri"/>
+                <w:sz w:val="18"/>
+                <w:szCs w:val="18"/>
+              </w:rPr>
+              <w:t xml:space="preserve">45/45 superadas</w:t>
+            </w:r>
+          </w:p>
+        </w:tc>
+      </w:tr>
+      <w:tr>
+        <w:trPr>
+          <w:cantSplit/>
+        </w:trPr>
+        <w:tc>
+          <w:tcPr>
+            <w:tcW w:type="dxa" w:w="2776"/>
+            <w:tcMar>
+              <w:top w:type="dxa" w:w="60"/>
+              <w:left w:type="dxa" w:w="100"/>
+              <w:bottom w:type="dxa" w:w="60"/>
+              <w:right w:type="dxa" w:w="100"/>
+            </w:tcMar>
+          </w:tcPr>
+          <w:p>
+            <w:pPr>
+              <w:spacing w:after="0" w:before="0" w:line="252"/>
+            </w:pPr>
+            <w:r>
+              <w:rPr>
+                <w:rFonts w:ascii="Calibri" w:cs="Calibri" w:eastAsia="Calibri" w:hAnsi="Calibri"/>
+                <w:sz w:val="18"/>
+                <w:szCs w:val="18"/>
+              </w:rPr>
+              <w:t xml:space="preserve">Aplicación: catálogo (</w:t>
             </w:r>
             <w:r>
               <w:rPr>
@@ -25445,6 +26629,426 @@
                 <w:sz w:val="16"/>
                 <w:szCs w:val="16"/>
               </w:rPr>
+              <w:t xml:space="preserve">app</w:t>
+            </w:r>
+            <w:r>
+              <w:rPr>
+                <w:rFonts w:ascii="Calibri" w:cs="Calibri" w:eastAsia="Calibri" w:hAnsi="Calibri"/>
+                <w:sz w:val="18"/>
+                <w:szCs w:val="18"/>
+              </w:rPr>
+              <w:t xml:space="preserve">)</w:t>
+            </w:r>
+          </w:p>
+        </w:tc>
+        <w:tc>
+          <w:tcPr>
+            <w:tcW w:type="dxa" w:w="4246"/>
+            <w:tcMar>
+              <w:top w:type="dxa" w:w="60"/>
+              <w:left w:type="dxa" w:w="100"/>
+              <w:bottom w:type="dxa" w:w="60"/>
+              <w:right w:type="dxa" w:w="100"/>
+            </w:tcMar>
+          </w:tcPr>
+          <w:p>
+            <w:pPr>
+              <w:spacing w:after="0" w:before="0" w:line="252"/>
+            </w:pPr>
+            <w:r>
+              <w:rPr>
+                <w:rFonts w:ascii="Calibri" w:cs="Calibri" w:eastAsia="Calibri" w:hAnsi="Calibri"/>
+                <w:sz w:val="18"/>
+                <w:szCs w:val="18"/>
+              </w:rPr>
+              <w:t xml:space="preserve">55 casos: listado, consulta por id, 404, precio con 2 decimales, orden estable, catálogo mal formado, despliegue de un cambio de precio, observabilidad y </w:t>
+            </w:r>
+            <w:r>
+              <w:rPr>
+                <w:rFonts w:ascii="Consolas" w:cs="Consolas" w:eastAsia="Consolas" w:hAnsi="Consolas"/>
+                <w:color w:val="2E3A36"/>
+                <w:sz w:val="16"/>
+                <w:szCs w:val="16"/>
+              </w:rPr>
+              <w:t xml:space="preserve">/health</w:t>
+            </w:r>
+          </w:p>
+        </w:tc>
+        <w:tc>
+          <w:tcPr>
+            <w:tcW w:type="dxa" w:w="2048"/>
+            <w:tcMar>
+              <w:top w:type="dxa" w:w="60"/>
+              <w:left w:type="dxa" w:w="100"/>
+              <w:bottom w:type="dxa" w:w="60"/>
+              <w:right w:type="dxa" w:w="100"/>
+            </w:tcMar>
+          </w:tcPr>
+          <w:p>
+            <w:pPr>
+              <w:spacing w:after="0" w:before="0" w:line="252"/>
+            </w:pPr>
+            <w:r>
+              <w:rPr>
+                <w:rFonts w:ascii="Calibri" w:cs="Calibri" w:eastAsia="Calibri" w:hAnsi="Calibri"/>
+                <w:sz w:val="18"/>
+                <w:szCs w:val="18"/>
+              </w:rPr>
+              <w:t xml:space="preserve">55/55 superadas</w:t>
+            </w:r>
+          </w:p>
+        </w:tc>
+      </w:tr>
+      <w:tr>
+        <w:trPr>
+          <w:cantSplit/>
+        </w:trPr>
+        <w:tc>
+          <w:tcPr>
+            <w:tcW w:type="dxa" w:w="2776"/>
+            <w:tcMar>
+              <w:top w:type="dxa" w:w="60"/>
+              <w:left w:type="dxa" w:w="100"/>
+              <w:bottom w:type="dxa" w:w="60"/>
+              <w:right w:type="dxa" w:w="100"/>
+            </w:tcMar>
+          </w:tcPr>
+          <w:p>
+            <w:pPr>
+              <w:spacing w:after="0" w:before="0" w:line="252"/>
+            </w:pPr>
+            <w:r>
+              <w:rPr>
+                <w:rFonts w:ascii="Calibri" w:cs="Calibri" w:eastAsia="Calibri" w:hAnsi="Calibri"/>
+                <w:sz w:val="18"/>
+                <w:szCs w:val="18"/>
+              </w:rPr>
+              <w:t xml:space="preserve">CI obligatorio (app#12)</w:t>
+            </w:r>
+          </w:p>
+        </w:tc>
+        <w:tc>
+          <w:tcPr>
+            <w:tcW w:type="dxa" w:w="4246"/>
+            <w:tcMar>
+              <w:top w:type="dxa" w:w="60"/>
+              <w:left w:type="dxa" w:w="100"/>
+              <w:bottom w:type="dxa" w:w="60"/>
+              <w:right w:type="dxa" w:w="100"/>
+            </w:tcMar>
+          </w:tcPr>
+          <w:p>
+            <w:pPr>
+              <w:spacing w:after="0" w:before="0" w:line="252"/>
+            </w:pPr>
+            <w:r>
+              <w:rPr>
+                <w:rFonts w:ascii="Calibri" w:cs="Calibri" w:eastAsia="Calibri" w:hAnsi="Calibri"/>
+                <w:sz w:val="18"/>
+                <w:szCs w:val="18"/>
+              </w:rPr>
+              <w:t xml:space="preserve">PR con un </w:t>
+            </w:r>
+            <w:r>
+              <w:rPr>
+                <w:rFonts w:ascii="Consolas" w:cs="Consolas" w:eastAsia="Consolas" w:hAnsi="Consolas"/>
+                <w:color w:val="2E3A36"/>
+                <w:sz w:val="16"/>
+                <w:szCs w:val="16"/>
+              </w:rPr>
+              <w:t xml:space="preserve">import</w:t>
+            </w:r>
+            <w:r>
+              <w:rPr>
+                <w:rFonts w:ascii="Calibri" w:cs="Calibri" w:eastAsia="Calibri" w:hAnsi="Calibri"/>
+                <w:sz w:val="18"/>
+                <w:szCs w:val="18"/>
+              </w:rPr>
+              <w:t xml:space="preserve"> sin usar</w:t>
+            </w:r>
+          </w:p>
+        </w:tc>
+        <w:tc>
+          <w:tcPr>
+            <w:tcW w:type="dxa" w:w="2048"/>
+            <w:tcMar>
+              <w:top w:type="dxa" w:w="60"/>
+              <w:left w:type="dxa" w:w="100"/>
+              <w:bottom w:type="dxa" w:w="60"/>
+              <w:right w:type="dxa" w:w="100"/>
+            </w:tcMar>
+          </w:tcPr>
+          <w:p>
+            <w:pPr>
+              <w:spacing w:after="0" w:before="0" w:line="252"/>
+            </w:pPr>
+            <w:r>
+              <w:rPr>
+                <w:rFonts w:ascii="Calibri" w:cs="Calibri" w:eastAsia="Calibri" w:hAnsi="Calibri"/>
+                <w:sz w:val="18"/>
+                <w:szCs w:val="18"/>
+              </w:rPr>
+              <w:t xml:space="preserve">CI en rojo y merge bloqueado</w:t>
+            </w:r>
+          </w:p>
+        </w:tc>
+      </w:tr>
+      <w:tr>
+        <w:trPr>
+          <w:cantSplit/>
+        </w:trPr>
+        <w:tc>
+          <w:tcPr>
+            <w:tcW w:type="dxa" w:w="2776"/>
+            <w:tcMar>
+              <w:top w:type="dxa" w:w="60"/>
+              <w:left w:type="dxa" w:w="100"/>
+              <w:bottom w:type="dxa" w:w="60"/>
+              <w:right w:type="dxa" w:w="100"/>
+            </w:tcMar>
+          </w:tcPr>
+          <w:p>
+            <w:pPr>
+              <w:spacing w:after="0" w:before="0" w:line="252"/>
+            </w:pPr>
+            <w:r>
+              <w:rPr>
+                <w:rFonts w:ascii="Calibri" w:cs="Calibri" w:eastAsia="Calibri" w:hAnsi="Calibri"/>
+                <w:sz w:val="18"/>
+                <w:szCs w:val="18"/>
+              </w:rPr>
+              <w:t xml:space="preserve">Gobierno de PRs (</w:t>
+            </w:r>
+            <w:r>
+              <w:rPr>
+                <w:rFonts w:ascii="Consolas" w:cs="Consolas" w:eastAsia="Consolas" w:hAnsi="Consolas"/>
+                <w:color w:val="2E3A36"/>
+                <w:sz w:val="16"/>
+                <w:szCs w:val="16"/>
+              </w:rPr>
+              <w:t xml:space="preserve">check_pr_files.py</w:t>
+            </w:r>
+            <w:r>
+              <w:rPr>
+                <w:rFonts w:ascii="Calibri" w:cs="Calibri" w:eastAsia="Calibri" w:hAnsi="Calibri"/>
+                <w:sz w:val="18"/>
+                <w:szCs w:val="18"/>
+              </w:rPr>
+              <w:t xml:space="preserve">)</w:t>
+            </w:r>
+          </w:p>
+        </w:tc>
+        <w:tc>
+          <w:tcPr>
+            <w:tcW w:type="dxa" w:w="4246"/>
+            <w:tcMar>
+              <w:top w:type="dxa" w:w="60"/>
+              <w:left w:type="dxa" w:w="100"/>
+              <w:bottom w:type="dxa" w:w="60"/>
+              <w:right w:type="dxa" w:w="100"/>
+            </w:tcMar>
+          </w:tcPr>
+          <w:p>
+            <w:pPr>
+              <w:spacing w:after="0" w:before="0" w:line="252"/>
+            </w:pPr>
+            <w:r>
+              <w:rPr>
+                <w:rFonts w:ascii="Calibri" w:cs="Calibri" w:eastAsia="Calibri" w:hAnsi="Calibri"/>
+                <w:sz w:val="18"/>
+                <w:szCs w:val="18"/>
+              </w:rPr>
+              <w:t xml:space="preserve">21 casos: ficheros generados, ficheros protegidos según el autor, cambios de dependencias permitidos y configuración de comprobaciones bloqueada</w:t>
+            </w:r>
+          </w:p>
+        </w:tc>
+        <w:tc>
+          <w:tcPr>
+            <w:tcW w:type="dxa" w:w="2048"/>
+            <w:tcMar>
+              <w:top w:type="dxa" w:w="60"/>
+              <w:left w:type="dxa" w:w="100"/>
+              <w:bottom w:type="dxa" w:w="60"/>
+              <w:right w:type="dxa" w:w="100"/>
+            </w:tcMar>
+          </w:tcPr>
+          <w:p>
+            <w:pPr>
+              <w:spacing w:after="0" w:before="0" w:line="252"/>
+            </w:pPr>
+            <w:r>
+              <w:rPr>
+                <w:rFonts w:ascii="Calibri" w:cs="Calibri" w:eastAsia="Calibri" w:hAnsi="Calibri"/>
+                <w:sz w:val="18"/>
+                <w:szCs w:val="18"/>
+              </w:rPr>
+              <w:t xml:space="preserve">21/21 superadas</w:t>
+            </w:r>
+          </w:p>
+        </w:tc>
+      </w:tr>
+      <w:tr>
+        <w:trPr>
+          <w:cantSplit/>
+        </w:trPr>
+        <w:tc>
+          <w:tcPr>
+            <w:tcW w:type="dxa" w:w="2776"/>
+            <w:tcMar>
+              <w:top w:type="dxa" w:w="60"/>
+              <w:left w:type="dxa" w:w="100"/>
+              <w:bottom w:type="dxa" w:w="60"/>
+              <w:right w:type="dxa" w:w="100"/>
+            </w:tcMar>
+          </w:tcPr>
+          <w:p>
+            <w:pPr>
+              <w:spacing w:after="0" w:before="0" w:line="252"/>
+            </w:pPr>
+            <w:r>
+              <w:rPr>
+                <w:rFonts w:ascii="Calibri" w:cs="Calibri" w:eastAsia="Calibri" w:hAnsi="Calibri"/>
+                <w:sz w:val="18"/>
+                <w:szCs w:val="18"/>
+              </w:rPr>
+              <w:t xml:space="preserve">Escaneo de seguridad obligatorio (app#14)</w:t>
+            </w:r>
+          </w:p>
+        </w:tc>
+        <w:tc>
+          <w:tcPr>
+            <w:tcW w:type="dxa" w:w="4246"/>
+            <w:tcMar>
+              <w:top w:type="dxa" w:w="60"/>
+              <w:left w:type="dxa" w:w="100"/>
+              <w:bottom w:type="dxa" w:w="60"/>
+              <w:right w:type="dxa" w:w="100"/>
+            </w:tcMar>
+          </w:tcPr>
+          <w:p>
+            <w:pPr>
+              <w:spacing w:after="0" w:before="0" w:line="252"/>
+            </w:pPr>
+            <w:r>
+              <w:rPr>
+                <w:rFonts w:ascii="Calibri" w:cs="Calibri" w:eastAsia="Calibri" w:hAnsi="Calibri"/>
+                <w:sz w:val="18"/>
+                <w:szCs w:val="18"/>
+              </w:rPr>
+              <w:t xml:space="preserve">PR con un </w:t>
+            </w:r>
+            <w:r>
+              <w:rPr>
+                <w:rFonts w:ascii="Consolas" w:cs="Consolas" w:eastAsia="Consolas" w:hAnsi="Consolas"/>
+                <w:color w:val="2E3A36"/>
+                <w:sz w:val="16"/>
+                <w:szCs w:val="16"/>
+              </w:rPr>
+              <w:t xml:space="preserve">.pyc</w:t>
+            </w:r>
+            <w:r>
+              <w:rPr>
+                <w:rFonts w:ascii="Calibri" w:cs="Calibri" w:eastAsia="Calibri" w:hAnsi="Calibri"/>
+                <w:sz w:val="18"/>
+                <w:szCs w:val="18"/>
+              </w:rPr>
+              <w:t xml:space="preserve"> en </w:t>
+            </w:r>
+            <w:r>
+              <w:rPr>
+                <w:rFonts w:ascii="Consolas" w:cs="Consolas" w:eastAsia="Consolas" w:hAnsi="Consolas"/>
+                <w:color w:val="2E3A36"/>
+                <w:sz w:val="16"/>
+                <w:szCs w:val="16"/>
+              </w:rPr>
+              <w:t xml:space="preserve">__pycache__</w:t>
+            </w:r>
+          </w:p>
+        </w:tc>
+        <w:tc>
+          <w:tcPr>
+            <w:tcW w:type="dxa" w:w="2048"/>
+            <w:tcMar>
+              <w:top w:type="dxa" w:w="60"/>
+              <w:left w:type="dxa" w:w="100"/>
+              <w:bottom w:type="dxa" w:w="60"/>
+              <w:right w:type="dxa" w:w="100"/>
+            </w:tcMar>
+          </w:tcPr>
+          <w:p>
+            <w:pPr>
+              <w:spacing w:after="0" w:before="0" w:line="252"/>
+            </w:pPr>
+            <w:r>
+              <w:rPr>
+                <w:rFonts w:ascii="Consolas" w:cs="Consolas" w:eastAsia="Consolas" w:hAnsi="Consolas"/>
+                <w:color w:val="2E3A36"/>
+                <w:sz w:val="16"/>
+                <w:szCs w:val="16"/>
+              </w:rPr>
+              <w:t xml:space="preserve">governance</w:t>
+            </w:r>
+            <w:r>
+              <w:rPr>
+                <w:rFonts w:ascii="Calibri" w:cs="Calibri" w:eastAsia="Calibri" w:hAnsi="Calibri"/>
+                <w:sz w:val="18"/>
+                <w:szCs w:val="18"/>
+              </w:rPr>
+              <w:t xml:space="preserve"> en rojo y merge bloqueado</w:t>
+            </w:r>
+          </w:p>
+        </w:tc>
+      </w:tr>
+      <w:tr>
+        <w:trPr>
+          <w:cantSplit/>
+        </w:trPr>
+        <w:tc>
+          <w:tcPr>
+            <w:tcW w:type="dxa" w:w="2776"/>
+            <w:tcMar>
+              <w:top w:type="dxa" w:w="60"/>
+              <w:left w:type="dxa" w:w="100"/>
+              <w:bottom w:type="dxa" w:w="60"/>
+              <w:right w:type="dxa" w:w="100"/>
+            </w:tcMar>
+          </w:tcPr>
+          <w:p>
+            <w:pPr>
+              <w:spacing w:after="0" w:before="0" w:line="252"/>
+            </w:pPr>
+            <w:r>
+              <w:rPr>
+                <w:rFonts w:ascii="Calibri" w:cs="Calibri" w:eastAsia="Calibri" w:hAnsi="Calibri"/>
+                <w:sz w:val="18"/>
+                <w:szCs w:val="18"/>
+              </w:rPr>
+              <w:t xml:space="preserve">Triage (</w:t>
+            </w:r>
+            <w:r>
+              <w:rPr>
+                <w:rFonts w:ascii="Consolas" w:cs="Consolas" w:eastAsia="Consolas" w:hAnsi="Consolas"/>
+                <w:color w:val="2E3A36"/>
+                <w:sz w:val="16"/>
+                <w:szCs w:val="16"/>
+              </w:rPr>
+              <w:t xml:space="preserve">apply.py</w:t>
+            </w:r>
+            <w:r>
+              <w:rPr>
+                <w:rFonts w:ascii="Calibri" w:cs="Calibri" w:eastAsia="Calibri" w:hAnsi="Calibri"/>
+                <w:sz w:val="18"/>
+                <w:szCs w:val="18"/>
+              </w:rPr>
+              <w:t xml:space="preserve">, </w:t>
+            </w:r>
+            <w:r>
+              <w:rPr>
+                <w:rFonts w:ascii="Consolas" w:cs="Consolas" w:eastAsia="Consolas" w:hAnsi="Consolas"/>
+                <w:color w:val="2E3A36"/>
+                <w:sz w:val="16"/>
+                <w:szCs w:val="16"/>
+              </w:rPr>
               <w:t xml:space="preserve">build_prompt.py</w:t>
             </w:r>
             <w:r>
@@ -25459,7 +27063,7 @@
         </w:tc>
         <w:tc>
           <w:tcPr>
-            <w:tcW w:type="dxa" w:w="4535"/>
+            <w:tcW w:type="dxa" w:w="4246"/>
             <w:tcMar>
               <w:top w:type="dxa" w:w="60"/>
               <w:left w:type="dxa" w:w="100"/>
@@ -25483,7 +27087,7 @@
         </w:tc>
         <w:tc>
           <w:tcPr>
-            <w:tcW w:type="dxa" w:w="1955"/>
+            <w:tcW w:type="dxa" w:w="2048"/>
             <w:tcMar>
               <w:top w:type="dxa" w:w="60"/>
               <w:left w:type="dxa" w:w="100"/>
@@ -27807,8 +29411,8 @@
         </w:tblBorders>
       </w:tblPr>
       <w:tblGrid>
-        <w:gridCol w:w="4205"/>
-        <w:gridCol w:w="4865"/>
+        <w:gridCol w:w="4168"/>
+        <w:gridCol w:w="4902"/>
       </w:tblGrid>
       <w:tr>
         <w:trPr>
@@ -27816,7 +29420,7 @@
         </w:trPr>
         <w:tc>
           <w:tcPr>
-            <w:tcW w:type="dxa" w:w="4205"/>
+            <w:tcW w:type="dxa" w:w="4168"/>
             <w:shd w:fill="E3EEEA" w:color="auto" w:val="clear"/>
             <w:tcMar>
               <w:top w:type="dxa" w:w="60"/>
@@ -27843,7 +29447,7 @@
         </w:tc>
         <w:tc>
           <w:tcPr>
-            <w:tcW w:type="dxa" w:w="4865"/>
+            <w:tcW w:type="dxa" w:w="4902"/>
             <w:shd w:fill="E3EEEA" w:color="auto" w:val="clear"/>
             <w:tcMar>
               <w:top w:type="dxa" w:w="60"/>
@@ -27875,7 +29479,7 @@
         </w:trPr>
         <w:tc>
           <w:tcPr>
-            <w:tcW w:type="dxa" w:w="4205"/>
+            <w:tcW w:type="dxa" w:w="4168"/>
             <w:tcMar>
               <w:top w:type="dxa" w:w="60"/>
               <w:left w:type="dxa" w:w="100"/>
@@ -27899,25 +29503,25 @@
         </w:tc>
         <w:tc>
           <w:tcPr>
-            <w:tcW w:type="dxa" w:w="4865"/>
-            <w:tcMar>
-              <w:top w:type="dxa" w:w="60"/>
-              <w:left w:type="dxa" w:w="100"/>
-              <w:bottom w:type="dxa" w:w="60"/>
-              <w:right w:type="dxa" w:w="100"/>
-            </w:tcMar>
-          </w:tcPr>
-          <w:p>
-            <w:pPr>
-              <w:spacing w:after="0" w:before="0" w:line="252"/>
-            </w:pPr>
-            <w:r>
-              <w:rPr>
-                <w:rFonts w:ascii="Calibri" w:cs="Calibri" w:eastAsia="Calibri" w:hAnsi="Calibri"/>
-                <w:sz w:val="18"/>
-                <w:szCs w:val="18"/>
-              </w:rPr>
-              <w:t xml:space="preserve">7 de 18 (1, 2, 3, A, 4, 5 y 6)</w:t>
+            <w:tcW w:type="dxa" w:w="4902"/>
+            <w:tcMar>
+              <w:top w:type="dxa" w:w="60"/>
+              <w:left w:type="dxa" w:w="100"/>
+              <w:bottom w:type="dxa" w:w="60"/>
+              <w:right w:type="dxa" w:w="100"/>
+            </w:tcMar>
+          </w:tcPr>
+          <w:p>
+            <w:pPr>
+              <w:spacing w:after="0" w:before="0" w:line="252"/>
+            </w:pPr>
+            <w:r>
+              <w:rPr>
+                <w:rFonts w:ascii="Calibri" w:cs="Calibri" w:eastAsia="Calibri" w:hAnsi="Calibri"/>
+                <w:sz w:val="18"/>
+                <w:szCs w:val="18"/>
+              </w:rPr>
+              <w:t xml:space="preserve">8 de 18 (1, 2, 3, A, 4, 5, 6 y 7)</w:t>
             </w:r>
           </w:p>
         </w:tc>
@@ -27928,7 +29532,7 @@
         </w:trPr>
         <w:tc>
           <w:tcPr>
-            <w:tcW w:type="dxa" w:w="4205"/>
+            <w:tcW w:type="dxa" w:w="4168"/>
             <w:tcMar>
               <w:top w:type="dxa" w:w="60"/>
               <w:left w:type="dxa" w:w="100"/>
@@ -27952,25 +29556,25 @@
         </w:tc>
         <w:tc>
           <w:tcPr>
-            <w:tcW w:type="dxa" w:w="4865"/>
-            <w:tcMar>
-              <w:top w:type="dxa" w:w="60"/>
-              <w:left w:type="dxa" w:w="100"/>
-              <w:bottom w:type="dxa" w:w="60"/>
-              <w:right w:type="dxa" w:w="100"/>
-            </w:tcMar>
-          </w:tcPr>
-          <w:p>
-            <w:pPr>
-              <w:spacing w:after="0" w:before="0" w:line="252"/>
-            </w:pPr>
-            <w:r>
-              <w:rPr>
-                <w:rFonts w:ascii="Calibri" w:cs="Calibri" w:eastAsia="Calibri" w:hAnsi="Calibri"/>
-                <w:sz w:val="18"/>
-                <w:szCs w:val="18"/>
-              </w:rPr>
-              <w:t xml:space="preserve">14 (5 en core y 9 en app, dos de ellos del agente), más la documentación</w:t>
+            <w:tcW w:type="dxa" w:w="4902"/>
+            <w:tcMar>
+              <w:top w:type="dxa" w:w="60"/>
+              <w:left w:type="dxa" w:w="100"/>
+              <w:bottom w:type="dxa" w:w="60"/>
+              <w:right w:type="dxa" w:w="100"/>
+            </w:tcMar>
+          </w:tcPr>
+          <w:p>
+            <w:pPr>
+              <w:spacing w:after="0" w:before="0" w:line="252"/>
+            </w:pPr>
+            <w:r>
+              <w:rPr>
+                <w:rFonts w:ascii="Calibri" w:cs="Calibri" w:eastAsia="Calibri" w:hAnsi="Calibri"/>
+                <w:sz w:val="18"/>
+                <w:szCs w:val="18"/>
+              </w:rPr>
+              <w:t xml:space="preserve">16 (6 en core y 10 en app, dos de ellos del agente), más la documentación</w:t>
             </w:r>
           </w:p>
         </w:tc>
@@ -27981,7 +29585,7 @@
         </w:trPr>
         <w:tc>
           <w:tcPr>
-            <w:tcW w:type="dxa" w:w="4205"/>
+            <w:tcW w:type="dxa" w:w="4168"/>
             <w:tcMar>
               <w:top w:type="dxa" w:w="60"/>
               <w:left w:type="dxa" w:w="100"/>
@@ -28005,25 +29609,25 @@
         </w:tc>
         <w:tc>
           <w:tcPr>
-            <w:tcW w:type="dxa" w:w="4865"/>
-            <w:tcMar>
-              <w:top w:type="dxa" w:w="60"/>
-              <w:left w:type="dxa" w:w="100"/>
-              <w:bottom w:type="dxa" w:w="60"/>
-              <w:right w:type="dxa" w:w="100"/>
-            </w:tcMar>
-          </w:tcPr>
-          <w:p>
-            <w:pPr>
-              <w:spacing w:after="0" w:before="0" w:line="252"/>
-            </w:pPr>
-            <w:r>
-              <w:rPr>
-                <w:rFonts w:ascii="Calibri" w:cs="Calibri" w:eastAsia="Calibri" w:hAnsi="Calibri"/>
-                <w:sz w:val="18"/>
-                <w:szCs w:val="18"/>
-              </w:rPr>
-              <w:t xml:space="preserve">112 superadas (57 de harness y triage, 55 de la aplicación)</w:t>
+            <w:tcW w:type="dxa" w:w="4902"/>
+            <w:tcMar>
+              <w:top w:type="dxa" w:w="60"/>
+              <w:left w:type="dxa" w:w="100"/>
+              <w:bottom w:type="dxa" w:w="60"/>
+              <w:right w:type="dxa" w:w="100"/>
+            </w:tcMar>
+          </w:tcPr>
+          <w:p>
+            <w:pPr>
+              <w:spacing w:after="0" w:before="0" w:line="252"/>
+            </w:pPr>
+            <w:r>
+              <w:rPr>
+                <w:rFonts w:ascii="Calibri" w:cs="Calibri" w:eastAsia="Calibri" w:hAnsi="Calibri"/>
+                <w:sz w:val="18"/>
+                <w:szCs w:val="18"/>
+              </w:rPr>
+              <w:t xml:space="preserve">133 superadas (57 de harness y triage, 21 de gobierno de PRs, 55 de la aplicación)</w:t>
             </w:r>
           </w:p>
         </w:tc>
@@ -28034,7 +29638,7 @@
         </w:trPr>
         <w:tc>
           <w:tcPr>
-            <w:tcW w:type="dxa" w:w="4205"/>
+            <w:tcW w:type="dxa" w:w="4168"/>
             <w:tcMar>
               <w:top w:type="dxa" w:w="60"/>
               <w:left w:type="dxa" w:w="100"/>
@@ -28058,25 +29662,25 @@
         </w:tc>
         <w:tc>
           <w:tcPr>
-            <w:tcW w:type="dxa" w:w="4865"/>
-            <w:tcMar>
-              <w:top w:type="dxa" w:w="60"/>
-              <w:left w:type="dxa" w:w="100"/>
-              <w:bottom w:type="dxa" w:w="60"/>
-              <w:right w:type="dxa" w:w="100"/>
-            </w:tcMar>
-          </w:tcPr>
-          <w:p>
-            <w:pPr>
-              <w:spacing w:after="0" w:before="0" w:line="252"/>
-            </w:pPr>
-            <w:r>
-              <w:rPr>
-                <w:rFonts w:ascii="Calibri" w:cs="Calibri" w:eastAsia="Calibri" w:hAnsi="Calibri"/>
-                <w:sz w:val="18"/>
-                <w:szCs w:val="18"/>
-              </w:rPr>
-              <w:t xml:space="preserve">65</w:t>
+            <w:tcW w:type="dxa" w:w="4902"/>
+            <w:tcMar>
+              <w:top w:type="dxa" w:w="60"/>
+              <w:left w:type="dxa" w:w="100"/>
+              <w:bottom w:type="dxa" w:w="60"/>
+              <w:right w:type="dxa" w:w="100"/>
+            </w:tcMar>
+          </w:tcPr>
+          <w:p>
+            <w:pPr>
+              <w:spacing w:after="0" w:before="0" w:line="252"/>
+            </w:pPr>
+            <w:r>
+              <w:rPr>
+                <w:rFonts w:ascii="Calibri" w:cs="Calibri" w:eastAsia="Calibri" w:hAnsi="Calibri"/>
+                <w:sz w:val="18"/>
+                <w:szCs w:val="18"/>
+              </w:rPr>
+              <w:t xml:space="preserve">69</w:t>
             </w:r>
           </w:p>
         </w:tc>
@@ -28087,7 +29691,7 @@
         </w:trPr>
         <w:tc>
           <w:tcPr>
-            <w:tcW w:type="dxa" w:w="4205"/>
+            <w:tcW w:type="dxa" w:w="4168"/>
             <w:tcMar>
               <w:top w:type="dxa" w:w="60"/>
               <w:left w:type="dxa" w:w="100"/>
@@ -28111,7 +29715,7 @@
         </w:tc>
         <w:tc>
           <w:tcPr>
-            <w:tcW w:type="dxa" w:w="4865"/>
+            <w:tcW w:type="dxa" w:w="4902"/>
             <w:tcMar>
               <w:top w:type="dxa" w:w="60"/>
               <w:left w:type="dxa" w:w="100"/>
@@ -28140,7 +29744,7 @@
         </w:trPr>
         <w:tc>
           <w:tcPr>
-            <w:tcW w:type="dxa" w:w="4205"/>
+            <w:tcW w:type="dxa" w:w="4168"/>
             <w:tcMar>
               <w:top w:type="dxa" w:w="60"/>
               <w:left w:type="dxa" w:w="100"/>
@@ -28164,7 +29768,7 @@
         </w:tc>
         <w:tc>
           <w:tcPr>
-            <w:tcW w:type="dxa" w:w="4865"/>
+            <w:tcW w:type="dxa" w:w="4902"/>
             <w:tcMar>
               <w:top w:type="dxa" w:w="60"/>
               <w:left w:type="dxa" w:w="100"/>
@@ -28208,7 +29812,7 @@
           <w:sz w:val="21"/>
           <w:szCs w:val="21"/>
         </w:rPr>
-        <w:t xml:space="preserve">Este capítulo se ampliará con las iteraciones y pruebas de las tareas 7 a 12 y B a F.</w:t>
+        <w:t xml:space="preserve">Este capítulo se ampliará con las iteraciones y pruebas de las tareas 8 a 12 y B a F.</w:t>
       </w:r>
     </w:p>
     <w:p>
@@ -30069,6 +31673,340 @@
     </w:p>
     <w:p>
       <w:pPr>
+        <w:pStyle w:val="Heading3"/>
+        <w:keepNext/>
+      </w:pPr>
+      <w:r>
+        <w:rPr>
+          <w:rFonts w:ascii="Calibri" w:cs="Calibri" w:eastAsia="Calibri" w:hAnsi="Calibri"/>
+        </w:rPr>
+        <w:t xml:space="preserve">Tarea 7. Escaneo de seguridad</w:t>
+      </w:r>
+    </w:p>
+    <w:p>
+      <w:pPr>
+        <w:pStyle w:val="ListParagraph"/>
+        <w:numPr>
+          <w:ilvl w:val="0"/>
+          <w:numId w:val="16"/>
+        </w:numPr>
+        <w:spacing w:after="60"/>
+      </w:pPr>
+      <w:r>
+        <w:rPr>
+          <w:rFonts w:ascii="Calibri" w:cs="Calibri" w:eastAsia="Calibri" w:hAnsi="Calibri"/>
+        </w:rPr>
+        <w:t xml:space="preserve">En core: añadir </w:t>
+      </w:r>
+      <w:r>
+        <w:rPr>
+          <w:rFonts w:ascii="Consolas" w:cs="Consolas" w:eastAsia="Consolas" w:hAnsi="Consolas"/>
+          <w:color w:val="2E3A36"/>
+          <w:sz w:val="20"/>
+          <w:szCs w:val="20"/>
+        </w:rPr>
+        <w:t xml:space="preserve">reusable-security.yml</w:t>
+      </w:r>
+      <w:r>
+        <w:rPr>
+          <w:rFonts w:ascii="Calibri" w:cs="Calibri" w:eastAsia="Calibri" w:hAnsi="Calibri"/>
+        </w:rPr>
+        <w:t xml:space="preserve"> y </w:t>
+      </w:r>
+      <w:r>
+        <w:rPr>
+          <w:rFonts w:ascii="Consolas" w:cs="Consolas" w:eastAsia="Consolas" w:hAnsi="Consolas"/>
+          <w:color w:val="2E3A36"/>
+          <w:sz w:val="20"/>
+          <w:szCs w:val="20"/>
+        </w:rPr>
+        <w:t xml:space="preserve">scripts/security/</w:t>
+      </w:r>
+      <w:r>
+        <w:rPr>
+          <w:rFonts w:ascii="Calibri" w:cs="Calibri" w:eastAsia="Calibri" w:hAnsi="Calibri"/>
+        </w:rPr>
+        <w:t xml:space="preserve">, fusionar y mover la etiqueta </w:t>
+      </w:r>
+      <w:r>
+        <w:rPr>
+          <w:rFonts w:ascii="Consolas" w:cs="Consolas" w:eastAsia="Consolas" w:hAnsi="Consolas"/>
+          <w:color w:val="2E3A36"/>
+          <w:sz w:val="20"/>
+          <w:szCs w:val="20"/>
+        </w:rPr>
+        <w:t xml:space="preserve">v1</w:t>
+      </w:r>
+      <w:r>
+        <w:rPr>
+          <w:rFonts w:ascii="Calibri" w:cs="Calibri" w:eastAsia="Calibri" w:hAnsi="Calibri"/>
+        </w:rPr>
+        <w:t xml:space="preserve"> a la nueva </w:t>
+      </w:r>
+      <w:r>
+        <w:rPr>
+          <w:rFonts w:ascii="Consolas" w:cs="Consolas" w:eastAsia="Consolas" w:hAnsi="Consolas"/>
+          <w:color w:val="2E3A36"/>
+          <w:sz w:val="20"/>
+          <w:szCs w:val="20"/>
+        </w:rPr>
+        <w:t xml:space="preserve">main</w:t>
+      </w:r>
+      <w:r>
+        <w:rPr>
+          <w:rFonts w:ascii="Calibri" w:cs="Calibri" w:eastAsia="Calibri" w:hAnsi="Calibri"/>
+        </w:rPr>
+        <w:t xml:space="preserve"> (como en la tarea 6).</w:t>
+      </w:r>
+    </w:p>
+    <w:p>
+      <w:pPr>
+        <w:pStyle w:val="ListParagraph"/>
+        <w:numPr>
+          <w:ilvl w:val="0"/>
+          <w:numId w:val="16"/>
+        </w:numPr>
+        <w:spacing w:after="60"/>
+      </w:pPr>
+      <w:r>
+        <w:rPr>
+          <w:rFonts w:ascii="Calibri" w:cs="Calibri" w:eastAsia="Calibri" w:hAnsi="Calibri"/>
+        </w:rPr>
+        <w:t xml:space="preserve">En app: añadir </w:t>
+      </w:r>
+      <w:r>
+        <w:rPr>
+          <w:rFonts w:ascii="Consolas" w:cs="Consolas" w:eastAsia="Consolas" w:hAnsi="Consolas"/>
+          <w:color w:val="2E3A36"/>
+          <w:sz w:val="20"/>
+          <w:szCs w:val="20"/>
+        </w:rPr>
+        <w:t xml:space="preserve">.github/workflows/security.yml</w:t>
+      </w:r>
+      <w:r>
+        <w:rPr>
+          <w:rFonts w:ascii="Calibri" w:cs="Calibri" w:eastAsia="Calibri" w:hAnsi="Calibri"/>
+        </w:rPr>
+        <w:t xml:space="preserve"> que llame a </w:t>
+      </w:r>
+      <w:r>
+        <w:rPr>
+          <w:rFonts w:ascii="Consolas" w:cs="Consolas" w:eastAsia="Consolas" w:hAnsi="Consolas"/>
+          <w:color w:val="2E3A36"/>
+          <w:sz w:val="20"/>
+          <w:szCs w:val="20"/>
+        </w:rPr>
+        <w:t xml:space="preserve">reusable-security.yml@v1</w:t>
+      </w:r>
+      <w:r>
+        <w:rPr>
+          <w:rFonts w:ascii="Calibri" w:cs="Calibri" w:eastAsia="Calibri" w:hAnsi="Calibri"/>
+        </w:rPr>
+        <w:t xml:space="preserve"> y fusionar cuando los cinco checks salgan en verde.</w:t>
+      </w:r>
+    </w:p>
+    <w:p>
+      <w:pPr>
+        <w:pStyle w:val="ListParagraph"/>
+        <w:numPr>
+          <w:ilvl w:val="0"/>
+          <w:numId w:val="16"/>
+        </w:numPr>
+        <w:spacing w:after="60"/>
+      </w:pPr>
+      <w:r>
+        <w:rPr>
+          <w:rFonts w:ascii="Calibri" w:cs="Calibri" w:eastAsia="Calibri" w:hAnsi="Calibri"/>
+        </w:rPr>
+        <w:t xml:space="preserve">En app: añadir </w:t>
+      </w:r>
+      <w:r>
+        <w:rPr>
+          <w:rFonts w:ascii="Consolas" w:cs="Consolas" w:eastAsia="Consolas" w:hAnsi="Consolas"/>
+          <w:color w:val="2E3A36"/>
+          <w:sz w:val="20"/>
+          <w:szCs w:val="20"/>
+        </w:rPr>
+        <w:t xml:space="preserve">security / result</w:t>
+      </w:r>
+      <w:r>
+        <w:rPr>
+          <w:rFonts w:ascii="Calibri" w:cs="Calibri" w:eastAsia="Calibri" w:hAnsi="Calibri"/>
+        </w:rPr>
+        <w:t xml:space="preserve"> como check obligatorio en el ruleset de </w:t>
+      </w:r>
+      <w:r>
+        <w:rPr>
+          <w:rFonts w:ascii="Consolas" w:cs="Consolas" w:eastAsia="Consolas" w:hAnsi="Consolas"/>
+          <w:color w:val="2E3A36"/>
+          <w:sz w:val="20"/>
+          <w:szCs w:val="20"/>
+        </w:rPr>
+        <w:t xml:space="preserve">main</w:t>
+      </w:r>
+      <w:r>
+        <w:rPr>
+          <w:rFonts w:ascii="Calibri" w:cs="Calibri" w:eastAsia="Calibri" w:hAnsi="Calibri"/>
+        </w:rPr>
+        <w:t xml:space="preserve">, junto a </w:t>
+      </w:r>
+      <w:r>
+        <w:rPr>
+          <w:rFonts w:ascii="Consolas" w:cs="Consolas" w:eastAsia="Consolas" w:hAnsi="Consolas"/>
+          <w:color w:val="2E3A36"/>
+          <w:sz w:val="20"/>
+          <w:szCs w:val="20"/>
+        </w:rPr>
+        <w:t xml:space="preserve">ci / checks</w:t>
+      </w:r>
+      <w:r>
+        <w:rPr>
+          <w:rFonts w:ascii="Calibri" w:cs="Calibri" w:eastAsia="Calibri" w:hAnsi="Calibri"/>
+        </w:rPr>
+        <w:t xml:space="preserve">.</w:t>
+      </w:r>
+    </w:p>
+    <w:p>
+      <w:pPr>
+        <w:pStyle w:val="ListParagraph"/>
+        <w:numPr>
+          <w:ilvl w:val="0"/>
+          <w:numId w:val="16"/>
+        </w:numPr>
+        <w:spacing w:after="60"/>
+      </w:pPr>
+      <w:r>
+        <w:rPr>
+          <w:rFonts w:ascii="Calibri" w:cs="Calibri" w:eastAsia="Calibri" w:hAnsi="Calibri"/>
+        </w:rPr>
+        <w:t xml:space="preserve">En app: abrir un PR con un fichero </w:t>
+      </w:r>
+      <w:r>
+        <w:rPr>
+          <w:rFonts w:ascii="Consolas" w:cs="Consolas" w:eastAsia="Consolas" w:hAnsi="Consolas"/>
+          <w:color w:val="2E3A36"/>
+          <w:sz w:val="20"/>
+          <w:szCs w:val="20"/>
+        </w:rPr>
+        <w:t xml:space="preserve">.pyc</w:t>
+      </w:r>
+      <w:r>
+        <w:rPr>
+          <w:rFonts w:ascii="Calibri" w:cs="Calibri" w:eastAsia="Calibri" w:hAnsi="Calibri"/>
+        </w:rPr>
+        <w:t xml:space="preserve"> y comprobar que </w:t>
+      </w:r>
+      <w:r>
+        <w:rPr>
+          <w:rFonts w:ascii="Consolas" w:cs="Consolas" w:eastAsia="Consolas" w:hAnsi="Consolas"/>
+          <w:color w:val="2E3A36"/>
+          <w:sz w:val="20"/>
+          <w:szCs w:val="20"/>
+        </w:rPr>
+        <w:t xml:space="preserve">governance</w:t>
+      </w:r>
+      <w:r>
+        <w:rPr>
+          <w:rFonts w:ascii="Calibri" w:cs="Calibri" w:eastAsia="Calibri" w:hAnsi="Calibri"/>
+        </w:rPr>
+        <w:t xml:space="preserve"> falla y el merge queda bloqueado.</w:t>
+      </w:r>
+    </w:p>
+    <w:p>
+      <w:pPr>
+        <w:keepNext/>
+        <w:spacing w:after="140" w:line="288"/>
+        <w:jc w:val="both"/>
+      </w:pPr>
+      <w:r>
+        <w:rPr>
+          <w:rFonts w:ascii="Calibri" w:cs="Calibri" w:eastAsia="Calibri" w:hAnsi="Calibri"/>
+        </w:rPr>
+        <w:t xml:space="preserve">Para reproducir los escaneos en local, desde el repo app:</w:t>
+      </w:r>
+    </w:p>
+    <w:p>
+      <w:pPr>
+        <w:shd w:fill="F2F4F3" w:color="auto" w:val="clear"/>
+        <w:spacing w:after="0" w:before="120" w:line="240"/>
+        <w:ind w:left="200" w:right="200"/>
+      </w:pPr>
+      <w:r>
+        <w:rPr>
+          <w:rFonts w:ascii="Consolas" w:cs="Consolas" w:eastAsia="Consolas" w:hAnsi="Consolas"/>
+          <w:color w:val="1F2A27"/>
+          <w:sz w:val="17"/>
+          <w:szCs w:val="17"/>
+        </w:rPr>
+        <w:t xml:space="preserve">uvx bandit==1.9.4 -r src --ignore-nosec -ll</w:t>
+      </w:r>
+    </w:p>
+    <w:p>
+      <w:pPr>
+        <w:shd w:fill="F2F4F3" w:color="auto" w:val="clear"/>
+        <w:spacing w:after="0" w:before="0" w:line="240"/>
+        <w:ind w:left="200" w:right="200"/>
+      </w:pPr>
+      <w:r>
+        <w:rPr>
+          <w:rFonts w:ascii="Consolas" w:cs="Consolas" w:eastAsia="Consolas" w:hAnsi="Consolas"/>
+          <w:color w:val="1F2A27"/>
+          <w:sz w:val="17"/>
+          <w:szCs w:val="17"/>
+        </w:rPr>
+        <w:t xml:space="preserve">uv export --frozen --format requirements-txt --no-hashes --no-emit-project -o req.txt</w:t>
+      </w:r>
+    </w:p>
+    <w:p>
+      <w:pPr>
+        <w:shd w:fill="F2F4F3" w:color="auto" w:val="clear"/>
+        <w:spacing w:after="0" w:before="0" w:line="240"/>
+        <w:ind w:left="200" w:right="200"/>
+      </w:pPr>
+      <w:r>
+        <w:rPr>
+          <w:rFonts w:ascii="Consolas" w:cs="Consolas" w:eastAsia="Consolas" w:hAnsi="Consolas"/>
+          <w:color w:val="1F2A27"/>
+          <w:sz w:val="17"/>
+          <w:szCs w:val="17"/>
+        </w:rPr>
+        <w:t xml:space="preserve">uvx pip-audit==2.10.1 -r req.txt --strict</w:t>
+      </w:r>
+    </w:p>
+    <w:p>
+      <w:pPr>
+        <w:shd w:fill="F2F4F3" w:color="auto" w:val="clear"/>
+        <w:spacing w:after="0" w:before="0" w:line="240"/>
+        <w:ind w:left="200" w:right="200"/>
+      </w:pPr>
+      <w:r>
+        <w:rPr>
+          <w:rFonts w:ascii="Consolas" w:cs="Consolas" w:eastAsia="Consolas" w:hAnsi="Consolas"/>
+          <w:color w:val="1F2A27"/>
+          <w:sz w:val="17"/>
+          <w:szCs w:val="17"/>
+        </w:rPr>
+        <w:t xml:space="preserve">uv run --with pip-licenses==5.5.5 pip-licenses --partial-match --allow-only "MIT;BSD;Apache;ISC;PSF;Mozilla Public License 2.0"</w:t>
+      </w:r>
+    </w:p>
+    <w:p>
+      <w:pPr>
+        <w:shd w:fill="F2F4F3" w:color="auto" w:val="clear"/>
+        <w:spacing w:after="160" w:before="0" w:line="240"/>
+        <w:ind w:left="200" w:right="200"/>
+      </w:pPr>
+      <w:r>
+        <w:rPr>
+          <w:rFonts w:ascii="Consolas" w:cs="Consolas" w:eastAsia="Consolas" w:hAnsi="Consolas"/>
+          <w:color w:val="1F2A27"/>
+          <w:sz w:val="17"/>
+          <w:szCs w:val="17"/>
+        </w:rPr>
+        <w:t xml:space="preserve">python3 ../poc-almagentic-core/scripts/security/check_pr_files.py origin/main HEAD</w:t>
+      </w:r>
+    </w:p>
+    <w:p>
+      <w:pPr>
         <w:pBdr>
           <w:left w:val="single" w:color="0D5C4F" w:sz="18" w:space="10"/>
         </w:pBdr>
@@ -30082,7 +32020,7 @@
           <w:sz w:val="21"/>
           <w:szCs w:val="21"/>
         </w:rPr>
-        <w:t xml:space="preserve">Los pasos de las tareas 7 a 12 y B a F se añadirán al completarlas.</w:t>
+        <w:t xml:space="preserve">Los pasos de las tareas 8 a 12 y B a F se añadirán al completarlas.</w:t>
       </w:r>
     </w:p>
     <w:p>
@@ -31088,7 +33026,7 @@
         <w:pStyle w:val="ListParagraph"/>
         <w:numPr>
           <w:ilvl w:val="0"/>
-          <w:numId w:val="16"/>
+          <w:numId w:val="17"/>
         </w:numPr>
         <w:spacing w:after="60"/>
       </w:pPr>
@@ -31104,7 +33042,7 @@
         <w:pStyle w:val="ListParagraph"/>
         <w:numPr>
           <w:ilvl w:val="0"/>
-          <w:numId w:val="16"/>
+          <w:numId w:val="17"/>
         </w:numPr>
         <w:spacing w:after="60"/>
       </w:pPr>
@@ -31120,7 +33058,7 @@
         <w:pStyle w:val="ListParagraph"/>
         <w:numPr>
           <w:ilvl w:val="0"/>
-          <w:numId w:val="16"/>
+          <w:numId w:val="17"/>
         </w:numPr>
         <w:spacing w:after="60"/>
       </w:pPr>
@@ -31136,7 +33074,7 @@
         <w:pStyle w:val="ListParagraph"/>
         <w:numPr>
           <w:ilvl w:val="0"/>
-          <w:numId w:val="16"/>
+          <w:numId w:val="17"/>
         </w:numPr>
         <w:spacing w:after="60"/>
       </w:pPr>
@@ -31166,7 +33104,7 @@
         <w:pStyle w:val="ListParagraph"/>
         <w:numPr>
           <w:ilvl w:val="0"/>
-          <w:numId w:val="16"/>
+          <w:numId w:val="17"/>
         </w:numPr>
         <w:spacing w:after="60"/>
       </w:pPr>
@@ -31252,7 +33190,7 @@
         </w:rPr>
         <w:t xml:space="preserve"> arXiv:2604.26275, 2026. </w:t>
       </w:r>
-      <w:hyperlink w:history="1" r:id="rIdhyfed1ms07pdszymsrcv5">
+      <w:hyperlink w:history="1" r:id="rIdat1mkkxyedgaoinkipc7i">
         <w:r>
           <w:rPr>
             <w:rStyle w:val="Hyperlink"/>
@@ -31297,7 +33235,7 @@
         </w:rPr>
         <w:t xml:space="preserve">, 2026. </w:t>
       </w:r>
-      <w:hyperlink w:history="1" r:id="rIdm_mbk4exoi2tzwtynulxx">
+      <w:hyperlink w:history="1" r:id="rIdebh_xlw-eec-gmjgll6p8">
         <w:r>
           <w:rPr>
             <w:rStyle w:val="Hyperlink"/>
@@ -31342,7 +33280,7 @@
         </w:rPr>
         <w:t xml:space="preserve"> </w:t>
       </w:r>
-      <w:hyperlink w:history="1" r:id="rIdl2axwh-z2w4xub6kqtin_">
+      <w:hyperlink w:history="1" r:id="rIdxwvtsqlbzd36knnpbvtvd">
         <w:r>
           <w:rPr>
             <w:rStyle w:val="Hyperlink"/>
@@ -31387,7 +33325,7 @@
         </w:rPr>
         <w:t xml:space="preserve">, junio de 2026. </w:t>
       </w:r>
-      <w:hyperlink w:history="1" r:id="rId7zop8ihqqeeesfrrmc1ua">
+      <w:hyperlink w:history="1" r:id="rIdchiiu4cng-mtzxvoverrx">
         <w:r>
           <w:rPr>
             <w:rStyle w:val="Hyperlink"/>
@@ -31432,7 +33370,7 @@
         </w:rPr>
         <w:t xml:space="preserve"> </w:t>
       </w:r>
-      <w:hyperlink w:history="1" r:id="rIdl0jyovbwxljtphkemgws1">
+      <w:hyperlink w:history="1" r:id="rIdpo8naegwpyfu2qmshb3ry">
         <w:r>
           <w:rPr>
             <w:rStyle w:val="Hyperlink"/>
@@ -31477,7 +33415,7 @@
         </w:rPr>
         <w:t xml:space="preserve"> </w:t>
       </w:r>
-      <w:hyperlink w:history="1" r:id="rIdqg0idgfc_jwvwhqpsz9vi">
+      <w:hyperlink w:history="1" r:id="rIdn1llqsfplaclccce9pm5f">
         <w:r>
           <w:rPr>
             <w:rStyle w:val="Hyperlink"/>
@@ -31522,7 +33460,7 @@
         </w:rPr>
         <w:t xml:space="preserve">, diciembre de 2025. </w:t>
       </w:r>
-      <w:hyperlink w:history="1" r:id="rIdazk0-0aant68edlbxtyqb">
+      <w:hyperlink w:history="1" r:id="rIdrexw9qt6v4wleu-dxwdkz">
         <w:r>
           <w:rPr>
             <w:rStyle w:val="Hyperlink"/>
@@ -31567,7 +33505,7 @@
         </w:rPr>
         <w:t xml:space="preserve"> </w:t>
       </w:r>
-      <w:hyperlink w:history="1" r:id="rIdylrguil1ttukc2uynfrxo">
+      <w:hyperlink w:history="1" r:id="rId6kmryptheejdlbbfol0dv">
         <w:r>
           <w:rPr>
             <w:rStyle w:val="Hyperlink"/>
@@ -31612,7 +33550,7 @@
         </w:rPr>
         <w:t xml:space="preserve"> </w:t>
       </w:r>
-      <w:hyperlink w:history="1" r:id="rIdgut3699_yjjv4q3ennqve">
+      <w:hyperlink w:history="1" r:id="rIdw4yftjmncaqe_qdi9redc">
         <w:r>
           <w:rPr>
             <w:rStyle w:val="Hyperlink"/>
@@ -31657,7 +33595,7 @@
         </w:rPr>
         <w:t xml:space="preserve"> </w:t>
       </w:r>
-      <w:hyperlink w:history="1" r:id="rIdetzkw8qktqvcajy66qd76">
+      <w:hyperlink w:history="1" r:id="rIdmbsh98wsjepqgvvucm371">
         <w:r>
           <w:rPr>
             <w:rStyle w:val="Hyperlink"/>
@@ -31702,7 +33640,7 @@
         </w:rPr>
         <w:t xml:space="preserve"> </w:t>
       </w:r>
-      <w:hyperlink w:history="1" r:id="rIdgf44iegonw6apjlpn1xu2">
+      <w:hyperlink w:history="1" r:id="rId98lcb0n9h2ahzlx0uslkp">
         <w:r>
           <w:rPr>
             <w:rStyle w:val="Hyperlink"/>
@@ -31747,7 +33685,7 @@
         </w:rPr>
         <w:t xml:space="preserve"> </w:t>
       </w:r>
-      <w:hyperlink w:history="1" r:id="rIdmwitqd1nq6pekfzqo4knc">
+      <w:hyperlink w:history="1" r:id="rIddpl-gplitpz6pb6ubbvyj">
         <w:r>
           <w:rPr>
             <w:rStyle w:val="Hyperlink"/>
@@ -31792,7 +33730,7 @@
         </w:rPr>
         <w:t xml:space="preserve"> </w:t>
       </w:r>
-      <w:hyperlink w:history="1" r:id="rIdmqxv-qqjk5hdf_kx0tmvc">
+      <w:hyperlink w:history="1" r:id="rIdkbyefhp7qkp1rnny0yznb">
         <w:r>
           <w:rPr>
             <w:rStyle w:val="Hyperlink"/>
@@ -31837,7 +33775,7 @@
         </w:rPr>
         <w:t xml:space="preserve"> </w:t>
       </w:r>
-      <w:hyperlink w:history="1" r:id="rIdxhycuy5vjwmiqjrzkbhme">
+      <w:hyperlink w:history="1" r:id="rIdhqes-tlujc3ce-8gboap1">
         <w:r>
           <w:rPr>
             <w:rStyle w:val="Hyperlink"/>
@@ -31882,7 +33820,7 @@
         </w:rPr>
         <w:t xml:space="preserve"> </w:t>
       </w:r>
-      <w:hyperlink w:history="1" r:id="rIdc_8t2zm8d1egahqdhyibm">
+      <w:hyperlink w:history="1" r:id="rIdhbs87mtmnlm3gca883r3q">
         <w:r>
           <w:rPr>
             <w:rStyle w:val="Hyperlink"/>
@@ -31927,7 +33865,7 @@
         </w:rPr>
         <w:t xml:space="preserve"> </w:t>
       </w:r>
-      <w:hyperlink w:history="1" r:id="rIdk2zqxvjlw_8wjide8-3u2">
+      <w:hyperlink w:history="1" r:id="rIdzcccfxwxwzwr5oooxgfh8">
         <w:r>
           <w:rPr>
             <w:rStyle w:val="Hyperlink"/>
@@ -31972,7 +33910,7 @@
         </w:rPr>
         <w:t xml:space="preserve">, agosto de 2026. </w:t>
       </w:r>
-      <w:hyperlink w:history="1" r:id="rIdxqlq0jrvxdt1qyx8okut3">
+      <w:hyperlink w:history="1" r:id="rIdv2fp47u7b_aed7lxobjb9">
         <w:r>
           <w:rPr>
             <w:rStyle w:val="Hyperlink"/>
@@ -32017,7 +33955,7 @@
         </w:rPr>
         <w:t xml:space="preserve"> </w:t>
       </w:r>
-      <w:hyperlink w:history="1" r:id="rIdno-cjioyx6fqwhey8_7wa">
+      <w:hyperlink w:history="1" r:id="rIdxflf3isrjzivwdu8wgsu8">
         <w:r>
           <w:rPr>
             <w:rStyle w:val="Hyperlink"/>
@@ -32080,7 +34018,7 @@
         </w:rPr>
         <w:t xml:space="preserve"> </w:t>
       </w:r>
-      <w:hyperlink w:history="1" r:id="rIdnnflpb822ys3reyftyugn">
+      <w:hyperlink w:history="1" r:id="rIdxutcdm3macc_fgutpbmrf">
         <w:r>
           <w:rPr>
             <w:rStyle w:val="Hyperlink"/>
@@ -32125,7 +34063,7 @@
         </w:rPr>
         <w:t xml:space="preserve"> </w:t>
       </w:r>
-      <w:hyperlink w:history="1" r:id="rId1pm6rvoraa_vwvurhomhc">
+      <w:hyperlink w:history="1" r:id="rIdg0a_wqrqm1gi6om_cjgge">
         <w:r>
           <w:rPr>
             <w:rStyle w:val="Hyperlink"/>
@@ -32170,7 +34108,7 @@
         </w:rPr>
         <w:t xml:space="preserve"> </w:t>
       </w:r>
-      <w:hyperlink w:history="1" r:id="rIdvgspjpynhosixzuzdqmvt">
+      <w:hyperlink w:history="1" r:id="rIdefo30nl9jtt_zxzg5nunk">
         <w:r>
           <w:rPr>
             <w:rStyle w:val="Hyperlink"/>
@@ -33853,6 +35791,18 @@
     </w:lvl>
   </w:abstractNum>
   <w:abstractNum w:abstractNumId="16" w15:restartNumberingAfterBreak="0">
+    <w:multiLevelType w:val="hybridMultilevel"/>
+    <w:lvl w:ilvl="0" w15:tentative="1">
+      <w:start w:val="1"/>
+      <w:numFmt w:val="decimal"/>
+      <w:lvlText w:val="%1."/>
+      <w:lvlJc w:val="left"/>
+      <w:pPr>
+        <w:ind w:left="540" w:hanging="320"/>
+      </w:pPr>
+    </w:lvl>
+  </w:abstractNum>
+  <w:abstractNum w:abstractNumId="17" w15:restartNumberingAfterBreak="0">
     <w:multiLevelType w:val="hybridMultilevel"/>
     <w:lvl w:ilvl="0" w15:tentative="1">
       <w:start w:val="1"/>
@@ -33956,6 +35906,12 @@
   </w:num>
   <w:num w:numId="16">
     <w:abstractNumId w:val="16"/>
+    <w:lvlOverride w:ilvl="0">
+      <w:startOverride w:val="1"/>
+    </w:lvlOverride>
+  </w:num>
+  <w:num w:numId="17">
+    <w:abstractNumId w:val="17"/>
     <w:lvlOverride w:ilvl="0">
       <w:startOverride w:val="1"/>
     </w:lvlOverride>

</xml_diff>